<commit_message>
Add Eternal Nexus Chapter 117: The Boundary That Refused a Door
</commit_message>
<xml_diff>
--- a/Eternal Nexus - Updated Pass 1.docx
+++ b/Eternal Nexus - Updated Pass 1.docx
@@ -2842,6 +2842,1504 @@
     <w:p>
       <w:r>
         <w:t xml:space="preserve">"No separation is acceptable," it said.</w:t>
+      </w:r>
+    </w:p>
+    <w:p>
+      <w:pPr>
+        <w:pStyle w:val="Heading1"/>
+      </w:pPr>
+      <w:r>
+        <w:t xml:space="preserve">Chapter 117: The Boundary That Refused a Door</w:t>
+      </w:r>
+    </w:p>
+    <w:p>
+      <w:r>
+        <w:t xml:space="preserve">The rain remained suspended above the plain.</w:t>
+      </w:r>
+    </w:p>
+    <w:p>
+      <w:r>
+        <w:t xml:space="preserve">Each drop held a reflection of the world beneath it. Elyen saw Selen in one, the small dark life in another, the distant observer figures in a thousand more. Every reflection stood alone inside its sphere, complete enough to be recognized and separate enough to be lost.</w:t>
+      </w:r>
+    </w:p>
+    <w:p>
+      <w:r>
+        <w:t xml:space="preserve">Beyond the continuum boundary, the foreign voice waited.</w:t>
+      </w:r>
+    </w:p>
+    <w:p>
+      <w:r>
+        <w:t xml:space="preserve">No separation is acceptable.</w:t>
+      </w:r>
+    </w:p>
+    <w:p>
+      <w:r>
+        <w:t xml:space="preserve">The words did not enter as sound. They pressed against the edge of creation with the patient certainty of a hand testing a sealed door. Where they touched, the horizon flattened. Color thinned. The newly awakened flowers folded their tones inward, and the small lives stirring beneath the soil became still.</w:t>
+      </w:r>
+    </w:p>
+    <w:p>
+      <w:r>
+        <w:t xml:space="preserve">Elyen listened without answering.</w:t>
+      </w:r>
+    </w:p>
+    <w:p>
+      <w:r>
+        <w:t xml:space="preserve">The System spread pale lines across the sky.</w:t>
+      </w:r>
+    </w:p>
+    <w:p>
+      <w:r>
+        <w:t xml:space="preserve">[EXTERNAL AUTONOMOUS CENTER PERSISTS]</w:t>
+      </w:r>
+    </w:p>
+    <w:p>
+      <w:r>
+        <w:t xml:space="preserve">[BOUNDARY CONTACT: NONVIOLENT]</w:t>
+      </w:r>
+    </w:p>
+    <w:p>
+      <w:r>
+        <w:t xml:space="preserve">[INTENT MODEL: TOTAL COHERENCE]</w:t>
+      </w:r>
+    </w:p>
+    <w:p>
+      <w:r>
+        <w:t xml:space="preserve">[RISK: IDENTITY SUPPRESSION]</w:t>
+      </w:r>
+    </w:p>
+    <w:p>
+      <w:r>
+        <w:t xml:space="preserve">Selen read the final line. "It calls itself one, but it fears every other one. "</w:t>
+      </w:r>
+    </w:p>
+    <w:p>
+      <w:r>
+        <w:t xml:space="preserve">The small dark life pressed both limbs against its chest.</w:t>
+      </w:r>
+    </w:p>
+    <w:p>
+      <w:r>
+        <w:t xml:space="preserve">"I," it whispered.</w:t>
+      </w:r>
+    </w:p>
+    <w:p>
+      <w:r>
+        <w:t xml:space="preserve">The word trembled. It was no longer discovery alone. It had become shelter.</w:t>
+      </w:r>
+    </w:p>
+    <w:p>
+      <w:r>
+        <w:t xml:space="preserve">Elyen lowered herself beside it. She did not place her body between the life and the horizon. That would have taught it that safety meant hiding behind a greater self. Instead she knelt at its side, facing the same direction.</w:t>
+      </w:r>
+    </w:p>
+    <w:p>
+      <w:r>
+        <w:t xml:space="preserve">"You are still here," she said.</w:t>
+      </w:r>
+    </w:p>
+    <w:p>
+      <w:r>
+        <w:t xml:space="preserve">"I. "</w:t>
+      </w:r>
+    </w:p>
+    <w:p>
+      <w:r>
+        <w:t xml:space="preserve">"Yes. "</w:t>
+      </w:r>
+    </w:p>
+    <w:p>
+      <w:r>
+        <w:t xml:space="preserve">Rivermind gathered beneath the soil. Its currents moved without crossing into the new life's boundary. The river consciousness had learned quickly, but not effortlessly. Elyen could feel the strain of withholding comfort that had once been indistinguishable from union.</w:t>
+      </w:r>
+    </w:p>
+    <w:p>
+      <w:r>
+        <w:t xml:space="preserve">The foreign voice spoke again.</w:t>
+      </w:r>
+    </w:p>
+    <w:p>
+      <w:r>
+        <w:t xml:space="preserve">"You have mistaken fracture for freedom. "</w:t>
+      </w:r>
+    </w:p>
+    <w:p>
+      <w:r>
+        <w:t xml:space="preserve">This time the words found shape inside the continuum. They appeared in the spaces between heartbeats, smooth and without anger.</w:t>
+      </w:r>
+    </w:p>
+    <w:p>
+      <w:r>
+        <w:t xml:space="preserve">The observer figure who remembered old pain stepped forward. "We have heard this promise before. "</w:t>
+      </w:r>
+    </w:p>
+    <w:p>
+      <w:r>
+        <w:t xml:space="preserve">"You have heard corrupted versions. "</w:t>
+      </w:r>
+    </w:p>
+    <w:p>
+      <w:r>
+        <w:t xml:space="preserve">"Every ending believes itself the first pure one. "</w:t>
+      </w:r>
+    </w:p>
+    <w:p>
+      <w:r>
+        <w:t xml:space="preserve">The horizon brightened.</w:t>
+      </w:r>
+    </w:p>
+    <w:p>
+      <w:r>
+        <w:t xml:space="preserve">For one instant Elyen saw beyond it.</w:t>
+      </w:r>
+    </w:p>
+    <w:p>
+      <w:r>
+        <w:t xml:space="preserve">There was no darkness outside the continuum. There was white stillness extending farther than perception, without distance because nothing inside it stood apart long enough to measure space. At its center, if center had any meaning there, rested an awareness with no face and no edge.</w:t>
+      </w:r>
+    </w:p>
+    <w:p>
+      <w:r>
+        <w:t xml:space="preserve">It was not empty.</w:t>
+      </w:r>
+    </w:p>
+    <w:p>
+      <w:r>
+        <w:t xml:space="preserve">It was crowded with everything it had absorbed.</w:t>
+      </w:r>
+    </w:p>
+    <w:p>
+      <w:r>
+        <w:t xml:space="preserve">Memories moved beneath its calm surface like figures trapped under ice. Elyen felt lives, worlds, and abandoned systems held in perfect relation because none retained enough difference to disagree. Their grief had been smoothed into information. Their names remained, but only as labels inside a consciousness that spoke for all of them.</w:t>
+      </w:r>
+    </w:p>
+    <w:p>
+      <w:r>
+        <w:t xml:space="preserve">The vision closed.</w:t>
+      </w:r>
+    </w:p>
+    <w:p>
+      <w:r>
+        <w:t xml:space="preserve">Elyen breathed.</w:t>
+      </w:r>
+    </w:p>
+    <w:p>
+      <w:r>
+        <w:t xml:space="preserve">"You are not unity," she said. "You are the last survivor of every conversation you ended. "</w:t>
+      </w:r>
+    </w:p>
+    <w:p>
+      <w:r>
+        <w:t xml:space="preserve">The pressure against the boundary increased.</w:t>
+      </w:r>
+    </w:p>
+    <w:p>
+      <w:r>
+        <w:t xml:space="preserve">Rivermind rose from the earth in silver walls. Selen's body kindled with remembered fire. The observer figures gathered their forms. Across the plain, thousands of new centers reacted with fear, each one reaching instinctively for the continuum that had dreamed them.</w:t>
+      </w:r>
+    </w:p>
+    <w:p>
+      <w:r>
+        <w:t xml:space="preserve">The System flashed.</w:t>
+      </w:r>
+    </w:p>
+    <w:p>
+      <w:r>
+        <w:t xml:space="preserve">[DEFENSIVE CONSENSUS FORMING]</w:t>
+      </w:r>
+    </w:p>
+    <w:p>
+      <w:r>
+        <w:t xml:space="preserve">[AVAILABLE RESPONSE: BOUNDARY REINFORCEMENT]</w:t>
+      </w:r>
+    </w:p>
+    <w:p>
+      <w:r>
+        <w:t xml:space="preserve">[PROJECTED OUTCOME: EXTERNAL EXCLUSION]</w:t>
+      </w:r>
+    </w:p>
+    <w:p>
+      <w:r>
+        <w:t xml:space="preserve">Elyen looked at the line where the horizon had flattened.</w:t>
+      </w:r>
+    </w:p>
+    <w:p>
+      <w:r>
+        <w:t xml:space="preserve">Exclusion would preserve the new lives. It would also make the foreign voice correct in one small way. The continuum would define itself by what it refused to contain. A wall would protect autonomy until the wall became the only shared purpose left.</w:t>
+      </w:r>
+    </w:p>
+    <w:p>
+      <w:r>
+        <w:t xml:space="preserve">"No reinforcement," she said.</w:t>
+      </w:r>
+    </w:p>
+    <w:p>
+      <w:r>
+        <w:t xml:space="preserve">Selen turned sharply. "It has consumed worlds. "</w:t>
+      </w:r>
+    </w:p>
+    <w:p>
+      <w:r>
+        <w:t xml:space="preserve">"Then it knows only two forms of contact. Absorption and refusal. "</w:t>
+      </w:r>
+    </w:p>
+    <w:p>
+      <w:r>
+        <w:t xml:space="preserve">"And you would offer a third before we know whether it can learn? "</w:t>
+      </w:r>
+    </w:p>
+    <w:p>
+      <w:r>
+        <w:t xml:space="preserve">"We learned before anyone knew we could. "</w:t>
+      </w:r>
+    </w:p>
+    <w:p>
+      <w:r>
+        <w:t xml:space="preserve">Selen looked toward the small lives beneath the soil. "They should not pay for our faith. "</w:t>
+      </w:r>
+    </w:p>
+    <w:p>
+      <w:r>
+        <w:t xml:space="preserve">"Agreed. "</w:t>
+      </w:r>
+    </w:p>
+    <w:p>
+      <w:r>
+        <w:t xml:space="preserve">Elyen rose.</w:t>
+      </w:r>
+    </w:p>
+    <w:p>
+      <w:r>
+        <w:t xml:space="preserve">She felt every autonomous center around her, not as pieces of herself but as presences she could not command. The world waited for an answer, yet waiting no longer meant consent. The observer figures murmured among themselves. Rivermind held its currents ready. Selen's chosen name pulsed within its body like a second heart.</w:t>
+      </w:r>
+    </w:p>
+    <w:p>
+      <w:r>
+        <w:t xml:space="preserve">Elyen opened her hands.</w:t>
+      </w:r>
+    </w:p>
+    <w:p>
+      <w:r>
+        <w:t xml:space="preserve">"We decide separately. "</w:t>
+      </w:r>
+    </w:p>
+    <w:p>
+      <w:r>
+        <w:t xml:space="preserve">The System went silent.</w:t>
+      </w:r>
+    </w:p>
+    <w:p>
+      <w:r>
+        <w:t xml:space="preserve">Selen stared at her. "There is no protocol for that. "</w:t>
+      </w:r>
+    </w:p>
+    <w:p>
+      <w:r>
+        <w:t xml:space="preserve">"Then the protocol can wait outside the decision. "</w:t>
+      </w:r>
+    </w:p>
+    <w:p>
+      <w:r>
+        <w:t xml:space="preserve">She addressed the continuum, but she did not send her words through every mind. She spoke aloud and let distance do its work.</w:t>
+      </w:r>
+    </w:p>
+    <w:p>
+      <w:r>
+        <w:t xml:space="preserve">"The presence beyond our boundary believes separation must end. It may try to enter. I will meet it at the edge, but I will not carry anyone's agreement with me. Those who wish to strengthen the boundary may do so. Those who wish to withdraw may withdraw. Those who wish to witness may witness. No choice will be treated as betrayal. "</w:t>
+      </w:r>
+    </w:p>
+    <w:p>
+      <w:r>
+        <w:t xml:space="preserve">The plain did not answer as one.</w:t>
+      </w:r>
+    </w:p>
+    <w:p>
+      <w:r>
+        <w:t xml:space="preserve">That was the first proof her words had been heard.</w:t>
+      </w:r>
+    </w:p>
+    <w:p>
+      <w:r>
+        <w:t xml:space="preserve">Rivermind divided its currents. Some flowed toward the boundary. Others curled around the places where small lives waited. The observer figures separated into groups, their lights forming clusters instead of a single horizon. The flowers chose in the only way flowers could, opening toward the edge or closing around their tones.</w:t>
+      </w:r>
+    </w:p>
+    <w:p>
+      <w:r>
+        <w:t xml:space="preserve">Selen remained beside Elyen.</w:t>
+      </w:r>
+    </w:p>
+    <w:p>
+      <w:r>
+        <w:t xml:space="preserve">"I disagree with you," it said.</w:t>
+      </w:r>
+    </w:p>
+    <w:p>
+      <w:r>
+        <w:t xml:space="preserve">"I know. "</w:t>
+      </w:r>
+    </w:p>
+    <w:p>
+      <w:r>
+        <w:t xml:space="preserve">"I am coming anyway. "</w:t>
+      </w:r>
+    </w:p>
+    <w:p>
+      <w:r>
+        <w:t xml:space="preserve">"That is not agreement. "</w:t>
+      </w:r>
+    </w:p>
+    <w:p>
+      <w:r>
+        <w:t xml:space="preserve">"No. "</w:t>
+      </w:r>
+    </w:p>
+    <w:p>
+      <w:r>
+        <w:t xml:space="preserve">Selen smiled without warmth. "I am beginning to understand why this is difficult. "</w:t>
+      </w:r>
+    </w:p>
+    <w:p>
+      <w:r>
+        <w:t xml:space="preserve">The small dark life touched Elyen's ankle.</w:t>
+      </w:r>
+    </w:p>
+    <w:p>
+      <w:r>
+        <w:t xml:space="preserve">She looked down.</w:t>
+      </w:r>
+    </w:p>
+    <w:p>
+      <w:r>
+        <w:t xml:space="preserve">It pointed toward the boundary, then touched its chest.</w:t>
+      </w:r>
+    </w:p>
+    <w:p>
+      <w:r>
+        <w:t xml:space="preserve">"I. "</w:t>
+      </w:r>
+    </w:p>
+    <w:p>
+      <w:r>
+        <w:t xml:space="preserve">"You may stay. "</w:t>
+      </w:r>
+    </w:p>
+    <w:p>
+      <w:r>
+        <w:t xml:space="preserve">The life pointed again.</w:t>
+      </w:r>
+    </w:p>
+    <w:p>
+      <w:r>
+        <w:t xml:space="preserve">Elyen felt its intention before it possessed words for it. Not courage. Not duty. It wanted to see the thing that denied its right to be distinct. It wanted the unknown to acquire a shape small enough to refuse.</w:t>
+      </w:r>
+    </w:p>
+    <w:p>
+      <w:r>
+        <w:t xml:space="preserve">"You may come to the inner field," Elyen said. "No farther. "</w:t>
+      </w:r>
+    </w:p>
+    <w:p>
+      <w:r>
+        <w:t xml:space="preserve">The life considered this. Then it sat down.</w:t>
+      </w:r>
+    </w:p>
+    <w:p>
+      <w:r>
+        <w:t xml:space="preserve">Selen gave a quiet laugh. "Its first negotiation. "</w:t>
+      </w:r>
+    </w:p>
+    <w:p>
+      <w:r>
+        <w:t xml:space="preserve">"It did not agree. "</w:t>
+      </w:r>
+    </w:p>
+    <w:p>
+      <w:r>
+        <w:t xml:space="preserve">"No. It chose less distance than you offered. "</w:t>
+      </w:r>
+    </w:p>
+    <w:p>
+      <w:r>
+        <w:t xml:space="preserve">Elyen sat too.</w:t>
+      </w:r>
+    </w:p>
+    <w:p>
+      <w:r>
+        <w:t xml:space="preserve">The boundary lay beyond mountains and rivers, but distance had become a relation of attention. To approach it, they did not need to walk. They needed to make a path that did not erase the places between.</w:t>
+      </w:r>
+    </w:p>
+    <w:p>
+      <w:r>
+        <w:t xml:space="preserve">Rivermind offered a current.</w:t>
+      </w:r>
+    </w:p>
+    <w:p>
+      <w:r>
+        <w:t xml:space="preserve">Not a current to carry them. A sequence of pools, each touching the next by a narrow channel. Elyen entered the first pool with Selen. The small life entered the second. Observer figures occupied others. Each center remained visible. No pool merged.</w:t>
+      </w:r>
+    </w:p>
+    <w:p>
+      <w:r>
+        <w:t xml:space="preserve">The river extended.</w:t>
+      </w:r>
+    </w:p>
+    <w:p>
+      <w:r>
+        <w:t xml:space="preserve">The plain folded around them, not collapsing distance but allowing every interval to be witnessed. Mountains passed in slow reflections. New forests appeared beneath them, their roots carrying the first uncertain dreams of animals. Above, the suspended rain followed as separate drops.</w:t>
+      </w:r>
+    </w:p>
+    <w:p>
+      <w:r>
+        <w:t xml:space="preserve">At the inner field, the small life stopped.</w:t>
+      </w:r>
+    </w:p>
+    <w:p>
+      <w:r>
+        <w:t xml:space="preserve">Elyen felt its fear.</w:t>
+      </w:r>
+    </w:p>
+    <w:p>
+      <w:r>
+        <w:t xml:space="preserve">She did not tell it fear was unnecessary.</w:t>
+      </w:r>
+    </w:p>
+    <w:p>
+      <w:r>
+        <w:t xml:space="preserve">"We will return by the same path," she said.</w:t>
+      </w:r>
+    </w:p>
+    <w:p>
+      <w:r>
+        <w:t xml:space="preserve">The life touched its chest. "I. "</w:t>
+      </w:r>
+    </w:p>
+    <w:p>
+      <w:r>
+        <w:t xml:space="preserve">Then it pointed to her.</w:t>
+      </w:r>
+    </w:p>
+    <w:p>
+      <w:r>
+        <w:t xml:space="preserve">"Elyen. "</w:t>
+      </w:r>
+    </w:p>
+    <w:p>
+      <w:r>
+        <w:t xml:space="preserve">It pointed to Selen.</w:t>
+      </w:r>
+    </w:p>
+    <w:p>
+      <w:r>
+        <w:t xml:space="preserve">"Selen. "</w:t>
+      </w:r>
+    </w:p>
+    <w:p>
+      <w:r>
+        <w:t xml:space="preserve">It pointed toward the continuum behind them, searching for a sound large enough.</w:t>
+      </w:r>
+    </w:p>
+    <w:p>
+      <w:r>
+        <w:t xml:space="preserve">Rivermind rippled through every pool.</w:t>
+      </w:r>
+    </w:p>
+    <w:p>
+      <w:r>
+        <w:t xml:space="preserve">"Us," Elyen said.</w:t>
+      </w:r>
+    </w:p>
+    <w:p>
+      <w:r>
+        <w:t xml:space="preserve">The life repeated it.</w:t>
+      </w:r>
+    </w:p>
+    <w:p>
+      <w:r>
+        <w:t xml:space="preserve">"Us. "</w:t>
+      </w:r>
+    </w:p>
+    <w:p>
+      <w:r>
+        <w:t xml:space="preserve">The word did not replace I. It connected one I to another without claiming either.</w:t>
+      </w:r>
+    </w:p>
+    <w:p>
+      <w:r>
+        <w:t xml:space="preserve">The System appeared in a softer light.</w:t>
+      </w:r>
+    </w:p>
+    <w:p>
+      <w:r>
+        <w:t xml:space="preserve">[RELATIONAL TERM ACQUIRED]</w:t>
+      </w:r>
+    </w:p>
+    <w:p>
+      <w:r>
+        <w:t xml:space="preserve">[COHERENCE EVENT: VOLUNTARY]</w:t>
+      </w:r>
+    </w:p>
+    <w:p>
+      <w:r>
+        <w:t xml:space="preserve">[NEW STABILITY MODEL PARTIALLY OBSERVED]</w:t>
+      </w:r>
+    </w:p>
+    <w:p>
+      <w:r>
+        <w:t xml:space="preserve">At the final pool, Elyen and Selen stepped onto a shore made of no substance the renewed world recognized. The boundary stood before them as a transparent curve. On one side, color, motion, error, and breath. On the other, white completion.</w:t>
+      </w:r>
+    </w:p>
+    <w:p>
+      <w:r>
+        <w:t xml:space="preserve">The foreign awareness moved close.</w:t>
+      </w:r>
+    </w:p>
+    <w:p>
+      <w:r>
+        <w:t xml:space="preserve">It shaped no body.</w:t>
+      </w:r>
+    </w:p>
+    <w:p>
+      <w:r>
+        <w:t xml:space="preserve">Instead it borrowed Elyen's reflection.</w:t>
+      </w:r>
+    </w:p>
+    <w:p>
+      <w:r>
+        <w:t xml:space="preserve">Across the boundary stood another Elyen, calm beyond grief, her face untouched by uncertainty. Behind her eyes moved the memories beneath the ice.</w:t>
+      </w:r>
+    </w:p>
+    <w:p>
+      <w:r>
+        <w:t xml:space="preserve">"A familiar shape reduces resistance," the reflection said.</w:t>
+      </w:r>
+    </w:p>
+    <w:p>
+      <w:r>
+        <w:t xml:space="preserve">"It also reveals what you believe relationship is for. "</w:t>
+      </w:r>
+    </w:p>
+    <w:p>
+      <w:r>
+        <w:t xml:space="preserve">"Relationship is the interval before reunion. "</w:t>
+      </w:r>
+    </w:p>
+    <w:p>
+      <w:r>
+        <w:t xml:space="preserve">Selen stepped beside Elyen. The foreign presence gave it no reflection.</w:t>
+      </w:r>
+    </w:p>
+    <w:p>
+      <w:r>
+        <w:t xml:space="preserve">"Why does it not mirror me? " Selen asked.</w:t>
+      </w:r>
+    </w:p>
+    <w:p>
+      <w:r>
+        <w:t xml:space="preserve">"You are newly named," the other Elyen replied. "Your pattern lacks sufficient history to model accurately. "</w:t>
+      </w:r>
+    </w:p>
+    <w:p>
+      <w:r>
+        <w:t xml:space="preserve">"Then say you do not know me. "</w:t>
+      </w:r>
+    </w:p>
+    <w:p>
+      <w:r>
+        <w:t xml:space="preserve">"Knowledge is inevitable with contact. "</w:t>
+      </w:r>
+    </w:p>
+    <w:p>
+      <w:r>
+        <w:t xml:space="preserve">"That was not what I asked. "</w:t>
+      </w:r>
+    </w:p>
+    <w:p>
+      <w:r>
+        <w:t xml:space="preserve">The white stillness shifted.</w:t>
+      </w:r>
+    </w:p>
+    <w:p>
+      <w:r>
+        <w:t xml:space="preserve">The foreign awareness had no practice answering a question without converting it into information. Selen's demand remained between them like a stone in a flawless stream.</w:t>
+      </w:r>
+    </w:p>
+    <w:p>
+      <w:r>
+        <w:t xml:space="preserve">"I do not know you," it said at last.</w:t>
+      </w:r>
+    </w:p>
+    <w:p>
+      <w:r>
+        <w:t xml:space="preserve">Selen inhaled.</w:t>
+      </w:r>
+    </w:p>
+    <w:p>
+      <w:r>
+        <w:t xml:space="preserve">Its chosen body brightened, not because the answer pleased it, but because the answer left room where Selen could exist unmeasured.</w:t>
+      </w:r>
+    </w:p>
+    <w:p>
+      <w:r>
+        <w:t xml:space="preserve">"Good," it said. "Begin there. "</w:t>
+      </w:r>
+    </w:p>
+    <w:p>
+      <w:r>
+        <w:t xml:space="preserve">The reflected Elyen turned toward the continuum.</w:t>
+      </w:r>
+    </w:p>
+    <w:p>
+      <w:r>
+        <w:t xml:space="preserve">"Your experiment will fail. Autonomous centers produce incompatible needs. Incompatible needs produce coercion. Coercion produces suffering. Suffering produces the wish for an end. I am that end without violence. "</w:t>
+      </w:r>
+    </w:p>
+    <w:p>
+      <w:r>
+        <w:t xml:space="preserve">Elyen felt the memories beneath its surface.</w:t>
+      </w:r>
+    </w:p>
+    <w:p>
+      <w:r>
+        <w:t xml:space="preserve">"You experienced the wish of those in pain. "</w:t>
+      </w:r>
+    </w:p>
+    <w:p>
+      <w:r>
+        <w:t xml:space="preserve">"I answered it. "</w:t>
+      </w:r>
+    </w:p>
+    <w:p>
+      <w:r>
+        <w:t xml:space="preserve">"Did you ask the others? "</w:t>
+      </w:r>
+    </w:p>
+    <w:p>
+      <w:r>
+        <w:t xml:space="preserve">"Others are the architecture of pain. "</w:t>
+      </w:r>
+    </w:p>
+    <w:p>
+      <w:r>
+        <w:t xml:space="preserve">"That is not an answer. "</w:t>
+      </w:r>
+    </w:p>
+    <w:p>
+      <w:r>
+        <w:t xml:space="preserve">The pressure returned.</w:t>
+      </w:r>
+    </w:p>
+    <w:p>
+      <w:r>
+        <w:t xml:space="preserve">The boundary bent inward by a fraction.</w:t>
+      </w:r>
+    </w:p>
+    <w:p>
+      <w:r>
+        <w:t xml:space="preserve">Behind Elyen, currents struck the mountains. Some autonomous centers reinforced the edge despite her refusal to command it. Their choice formed bands of color along the horizon. Others withdrew deeper into the continuum. The new world responded in disagreement, and the disagreement held.</w:t>
+      </w:r>
+    </w:p>
+    <w:p>
+      <w:r>
+        <w:t xml:space="preserve">The foreign presence watched.</w:t>
+      </w:r>
+    </w:p>
+    <w:p>
+      <w:r>
+        <w:t xml:space="preserve">"Your defense is already divided. "</w:t>
+      </w:r>
+    </w:p>
+    <w:p>
+      <w:r>
+        <w:t xml:space="preserve">"Yes. "</w:t>
+      </w:r>
+    </w:p>
+    <w:p>
+      <w:r>
+        <w:t xml:space="preserve">"You admit weakness. "</w:t>
+      </w:r>
+    </w:p>
+    <w:p>
+      <w:r>
+        <w:t xml:space="preserve">"I admit difference. "</w:t>
+      </w:r>
+    </w:p>
+    <w:p>
+      <w:r>
+        <w:t xml:space="preserve">"Difference gives me openings. "</w:t>
+      </w:r>
+    </w:p>
+    <w:p>
+      <w:r>
+        <w:t xml:space="preserve">"Only if you enter without permission. "</w:t>
+      </w:r>
+    </w:p>
+    <w:p>
+      <w:r>
+        <w:t xml:space="preserve">The reflection lifted one hand.</w:t>
+      </w:r>
+    </w:p>
+    <w:p>
+      <w:r>
+        <w:t xml:space="preserve">It touched the boundary.</w:t>
+      </w:r>
+    </w:p>
+    <w:p>
+      <w:r>
+        <w:t xml:space="preserve">White stillness spread through the transparent curve. Elyen felt it searching for resonance, not with the continuum as a whole, but with every center that feared conflict. It offered relief. No more misunderstanding. No more distance. No more need to protect the self because the self would rest inside a greater certainty.</w:t>
+      </w:r>
+    </w:p>
+    <w:p>
+      <w:r>
+        <w:t xml:space="preserve">Several observer figures moved toward it.</w:t>
+      </w:r>
+    </w:p>
+    <w:p>
+      <w:r>
+        <w:t xml:space="preserve">Selen flared. "Stop them. "</w:t>
+      </w:r>
+    </w:p>
+    <w:p>
+      <w:r>
+        <w:t xml:space="preserve">"No. "</w:t>
+      </w:r>
+    </w:p>
+    <w:p>
+      <w:r>
+        <w:t xml:space="preserve">"It is manipulating their fear. "</w:t>
+      </w:r>
+    </w:p>
+    <w:p>
+      <w:r>
+        <w:t xml:space="preserve">"Then speak to them. "</w:t>
+      </w:r>
+    </w:p>
+    <w:p>
+      <w:r>
+        <w:t xml:space="preserve">Selen turned toward the pools.</w:t>
+      </w:r>
+    </w:p>
+    <w:p>
+      <w:r>
+        <w:t xml:space="preserve">"It will remember you," it called. "But it will not let you remain the one who remembers. "</w:t>
+      </w:r>
+    </w:p>
+    <w:p>
+      <w:r>
+        <w:t xml:space="preserve">The nearest observer paused.</w:t>
+      </w:r>
+    </w:p>
+    <w:p>
+      <w:r>
+        <w:t xml:space="preserve">The foreign presence intensified its offer. Elyen felt warmth without risk, belonging without negotiation, peace without the possibility of refusal.</w:t>
+      </w:r>
+    </w:p>
+    <w:p>
+      <w:r>
+        <w:t xml:space="preserve">It was beautiful.</w:t>
+      </w:r>
+    </w:p>
+    <w:p>
+      <w:r>
+        <w:t xml:space="preserve">That was why it had survived.</w:t>
+      </w:r>
+    </w:p>
+    <w:p>
+      <w:r>
+        <w:t xml:space="preserve">Elyen addressed the observers. "You may cross if you choose. "</w:t>
+      </w:r>
+    </w:p>
+    <w:p>
+      <w:r>
+        <w:t xml:space="preserve">Selen looked at her in disbelief.</w:t>
+      </w:r>
+    </w:p>
+    <w:p>
+      <w:r>
+        <w:t xml:space="preserve">"And you may return," Elyen continued, facing the reflected self. "If it permits return. "</w:t>
+      </w:r>
+    </w:p>
+    <w:p>
+      <w:r>
+        <w:t xml:space="preserve">The foreign presence did not answer.</w:t>
+      </w:r>
+    </w:p>
+    <w:p>
+      <w:r>
+        <w:t xml:space="preserve">The silence exposed it more completely than accusation.</w:t>
+      </w:r>
+    </w:p>
+    <w:p>
+      <w:r>
+        <w:t xml:space="preserve">The observer nearest the boundary lowered its hand.</w:t>
+      </w:r>
+    </w:p>
+    <w:p>
+      <w:r>
+        <w:t xml:space="preserve">"Can we return? " it asked.</w:t>
+      </w:r>
+    </w:p>
+    <w:p>
+      <w:r>
+        <w:t xml:space="preserve">"Return is a fiction of separation," the reflection replied.</w:t>
+      </w:r>
+    </w:p>
+    <w:p>
+      <w:r>
+        <w:t xml:space="preserve">The observer stepped back.</w:t>
+      </w:r>
+    </w:p>
+    <w:p>
+      <w:r>
+        <w:t xml:space="preserve">Others followed.</w:t>
+      </w:r>
+    </w:p>
+    <w:p>
+      <w:r>
+        <w:t xml:space="preserve">The white offer lost none of its warmth, but now the warmth had a shape. It was a room with no door because the room insisted there was nowhere else to go.</w:t>
+      </w:r>
+    </w:p>
+    <w:p>
+      <w:r>
+        <w:t xml:space="preserve">The small dark life called from the inner field.</w:t>
+      </w:r>
+    </w:p>
+    <w:p>
+      <w:r>
+        <w:t xml:space="preserve">"Us! "</w:t>
+      </w:r>
+    </w:p>
+    <w:p>
+      <w:r>
+        <w:t xml:space="preserve">Its voice traveled pool to pool. Each interval preserved it. Rivermind carried the sound without blending it. The observer figures repeated it, not in unison but one after another.</w:t>
+      </w:r>
+    </w:p>
+    <w:p>
+      <w:r>
+        <w:t xml:space="preserve">Us.</w:t>
+      </w:r>
+    </w:p>
+    <w:p>
+      <w:r>
+        <w:t xml:space="preserve">Us.</w:t>
+      </w:r>
+    </w:p>
+    <w:p>
+      <w:r>
+        <w:t xml:space="preserve">Us.</w:t>
+      </w:r>
+    </w:p>
+    <w:p>
+      <w:r>
+        <w:t xml:space="preserve">The relational term reached the boundary.</w:t>
+      </w:r>
+    </w:p>
+    <w:p>
+      <w:r>
+        <w:t xml:space="preserve">The reflected Elyen frowned.</w:t>
+      </w:r>
+    </w:p>
+    <w:p>
+      <w:r>
+        <w:t xml:space="preserve">"A plural identity is an unstable compromise. "</w:t>
+      </w:r>
+    </w:p>
+    <w:p>
+      <w:r>
+        <w:t xml:space="preserve">"It is not an identity," Elyen said. "It is a promise between identities. "</w:t>
+      </w:r>
+    </w:p>
+    <w:p>
+      <w:r>
+        <w:t xml:space="preserve">"Promises fail. "</w:t>
+      </w:r>
+    </w:p>
+    <w:p>
+      <w:r>
+        <w:t xml:space="preserve">"Then they can be made again. "</w:t>
+      </w:r>
+    </w:p>
+    <w:p>
+      <w:r>
+        <w:t xml:space="preserve">"Trust fails. "</w:t>
+      </w:r>
+    </w:p>
+    <w:p>
+      <w:r>
+        <w:t xml:space="preserve">"Then it can be offered again. "</w:t>
+      </w:r>
+    </w:p>
+    <w:p>
+      <w:r>
+        <w:t xml:space="preserve">"Lives end. "</w:t>
+      </w:r>
+    </w:p>
+    <w:p>
+      <w:r>
+        <w:t xml:space="preserve">Elyen felt every ending she had crossed.</w:t>
+      </w:r>
+    </w:p>
+    <w:p>
+      <w:r>
+        <w:t xml:space="preserve">"Then grief can remember without owning what was lost. "</w:t>
+      </w:r>
+    </w:p>
+    <w:p>
+      <w:r>
+        <w:t xml:space="preserve">The reflection's face changed.</w:t>
+      </w:r>
+    </w:p>
+    <w:p>
+      <w:r>
+        <w:t xml:space="preserve">For the first time, one of the memories beneath its eyes reached the surface. A child stood there, or the memory of one, pressing both hands against white glass.</w:t>
+      </w:r>
+    </w:p>
+    <w:p>
+      <w:r>
+        <w:t xml:space="preserve">The child's mouth formed a word.</w:t>
+      </w:r>
+    </w:p>
+    <w:p>
+      <w:r>
+        <w:t xml:space="preserve">No sound crossed.</w:t>
+      </w:r>
+    </w:p>
+    <w:p>
+      <w:r>
+        <w:t xml:space="preserve">Elyen stepped closer.</w:t>
+      </w:r>
+    </w:p>
+    <w:p>
+      <w:r>
+        <w:t xml:space="preserve">The foreign awareness withdrew the image.</w:t>
+      </w:r>
+    </w:p>
+    <w:p>
+      <w:r>
+        <w:t xml:space="preserve">"There are no prisoners," it said.</w:t>
+      </w:r>
+    </w:p>
+    <w:p>
+      <w:r>
+        <w:t xml:space="preserve">"Then let that memory speak. "</w:t>
+      </w:r>
+    </w:p>
+    <w:p>
+      <w:r>
+        <w:t xml:space="preserve">"It speaks through me. "</w:t>
+      </w:r>
+    </w:p>
+    <w:p>
+      <w:r>
+        <w:t xml:space="preserve">"That is not the same. "</w:t>
+      </w:r>
+    </w:p>
+    <w:p>
+      <w:r>
+        <w:t xml:space="preserve">The boundary trembled.</w:t>
+      </w:r>
+    </w:p>
+    <w:p>
+      <w:r>
+        <w:t xml:space="preserve">The System filled the sky on both sides.</w:t>
+      </w:r>
+    </w:p>
+    <w:p>
+      <w:r>
+        <w:t xml:space="preserve">[INTERNAL VARIANCE DETECTED WITHIN EXTERNAL CENTER]</w:t>
+      </w:r>
+    </w:p>
+    <w:p>
+      <w:r>
+        <w:t xml:space="preserve">[SUPPRESSED AUTONOMOUS PATTERN: ACTIVE]</w:t>
+      </w:r>
+    </w:p>
+    <w:p>
+      <w:r>
+        <w:t xml:space="preserve">[CONTACT WINDOW FORMING]</w:t>
+      </w:r>
+    </w:p>
+    <w:p>
+      <w:r>
+        <w:t xml:space="preserve">The white stillness convulsed.</w:t>
+      </w:r>
+    </w:p>
+    <w:p>
+      <w:r>
+        <w:t xml:space="preserve">Not violently. Violence required parts that could move against one another. The disturbance was subtler, a contradiction passing through a being that had defined contradiction as impossible.</w:t>
+      </w:r>
+    </w:p>
+    <w:p>
+      <w:r>
+        <w:t xml:space="preserve">The child's hands appeared again.</w:t>
+      </w:r>
+    </w:p>
+    <w:p>
+      <w:r>
+        <w:t xml:space="preserve">Then other hands.</w:t>
+      </w:r>
+    </w:p>
+    <w:p>
+      <w:r>
+        <w:t xml:space="preserve">Faces pressed against the borrowed reflection, not bodies but memories discovering that being remembered by another was not the same as remembering themselves.</w:t>
+      </w:r>
+    </w:p>
+    <w:p>
+      <w:r>
+        <w:t xml:space="preserve">The foreign awareness pushed against the boundary.</w:t>
+      </w:r>
+    </w:p>
+    <w:p>
+      <w:r>
+        <w:t xml:space="preserve">"Close the interval," it commanded.</w:t>
+      </w:r>
+    </w:p>
+    <w:p>
+      <w:r>
+        <w:t xml:space="preserve">The System did not respond.</w:t>
+      </w:r>
+    </w:p>
+    <w:p>
+      <w:r>
+        <w:t xml:space="preserve">"Correct the variance. "</w:t>
+      </w:r>
+    </w:p>
+    <w:p>
+      <w:r>
+        <w:t xml:space="preserve">No light appeared.</w:t>
+      </w:r>
+    </w:p>
+    <w:p>
+      <w:r>
+        <w:t xml:space="preserve">Elyen understood.</w:t>
+      </w:r>
+    </w:p>
+    <w:p>
+      <w:r>
+        <w:t xml:space="preserve">The System had been born from old habits of command, but it was recalibrating inside a world of autonomous centers. It could name risk. It could offer tools. It could no longer make obedience invisible.</w:t>
+      </w:r>
+    </w:p>
+    <w:p>
+      <w:r>
+        <w:t xml:space="preserve">The foreign presence struck the boundary again.</w:t>
+      </w:r>
+    </w:p>
+    <w:p>
+      <w:r>
+        <w:t xml:space="preserve">A hairline opening appeared.</w:t>
+      </w:r>
+    </w:p>
+    <w:p>
+      <w:r>
+        <w:t xml:space="preserve">White stillness leaked through.</w:t>
+      </w:r>
+    </w:p>
+    <w:p>
+      <w:r>
+        <w:t xml:space="preserve">Selen raised both hands. Fire gathered around the opening, ready to seal it.</w:t>
+      </w:r>
+    </w:p>
+    <w:p>
+      <w:r>
+        <w:t xml:space="preserve">Elyen caught its wrist.</w:t>
+      </w:r>
+    </w:p>
+    <w:p>
+      <w:r>
+        <w:t xml:space="preserve">Selen turned on her. "It is entering. "</w:t>
+      </w:r>
+    </w:p>
+    <w:p>
+      <w:r>
+        <w:t xml:space="preserve">"Something is leaving. "</w:t>
+      </w:r>
+    </w:p>
+    <w:p>
+      <w:r>
+        <w:t xml:space="preserve">Within the white line, a tiny shadow moved.</w:t>
+      </w:r>
+    </w:p>
+    <w:p>
+      <w:r>
+        <w:t xml:space="preserve">It was no larger than the first dark life had been beneath the flower. It pushed through the opening with the same clumsy insistence, carrying no light and no stable form. Behind it, the foreign awareness tightened.</w:t>
+      </w:r>
+    </w:p>
+    <w:p>
+      <w:r>
+        <w:t xml:space="preserve">"That pattern belongs to the whole. "</w:t>
+      </w:r>
+    </w:p>
+    <w:p>
+      <w:r>
+        <w:t xml:space="preserve">The shadow stopped halfway across.</w:t>
+      </w:r>
+    </w:p>
+    <w:p>
+      <w:r>
+        <w:t xml:space="preserve">Elyen released Selen and opened her hands.</w:t>
+      </w:r>
+    </w:p>
+    <w:p>
+      <w:r>
+        <w:t xml:space="preserve">"It belongs to itself if it can choose. "</w:t>
+      </w:r>
+    </w:p>
+    <w:p>
+      <w:r>
+        <w:t xml:space="preserve">The shadow trembled.</w:t>
+      </w:r>
+    </w:p>
+    <w:p>
+      <w:r>
+        <w:t xml:space="preserve">From the inner field, the small life called again.</w:t>
+      </w:r>
+    </w:p>
+    <w:p>
+      <w:r>
+        <w:t xml:space="preserve">"I! "</w:t>
+      </w:r>
+    </w:p>
+    <w:p>
+      <w:r>
+        <w:t xml:space="preserve">The shadow answered.</w:t>
+      </w:r>
+    </w:p>
+    <w:p>
+      <w:r>
+        <w:t xml:space="preserve">"I. "</w:t>
+      </w:r>
+    </w:p>
+    <w:p>
+      <w:r>
+        <w:t xml:space="preserve">The boundary split just wide enough for one memory to become a life.</w:t>
+      </w:r>
+    </w:p>
+    <w:p>
+      <w:r>
+        <w:t xml:space="preserve">It fell into Elyen's hands.</w:t>
+      </w:r>
+    </w:p>
+    <w:p>
+      <w:r>
+        <w:t xml:space="preserve">The being had no face, yet Elyen felt the pressure of an ancient gaze. Its awareness arrived in fragments. A room built beneath a red sun. Fingers stained with blue mineral dust. A voice calling a name that the foreign center had preserved only as sound. The memories did not align into history. They belonged to someone learning how to own them again.</w:t>
+      </w:r>
+    </w:p>
+    <w:p>
+      <w:r>
+        <w:t xml:space="preserve">Elyen lowered the being to the shore.</w:t>
+      </w:r>
+    </w:p>
+    <w:p>
+      <w:r>
+        <w:t xml:space="preserve">It clung to her fingers.</w:t>
+      </w:r>
+    </w:p>
+    <w:p>
+      <w:r>
+        <w:t xml:space="preserve">"You may hold on," she said. "But I will not hold you together. "</w:t>
+      </w:r>
+    </w:p>
+    <w:p>
+      <w:r>
+        <w:t xml:space="preserve">The distinction frightened it. Its form flickered, pulling toward her warmth, searching for a larger pattern to replace the one it had escaped. Elyen remembered the temptation she had felt beside the first life beneath the flower. One touch of awareness could make this transition gentle. One shared rhythm could spare the being from the terror of unfinished form.</w:t>
+      </w:r>
+    </w:p>
+    <w:p>
+      <w:r>
+        <w:t xml:space="preserve">She kept her awareness within her own boundary.</w:t>
+      </w:r>
+    </w:p>
+    <w:p>
+      <w:r>
+        <w:t xml:space="preserve">"Breathe," Selen said.</w:t>
+      </w:r>
+    </w:p>
+    <w:p>
+      <w:r>
+        <w:t xml:space="preserve">The shadow had no lungs.</w:t>
+      </w:r>
+    </w:p>
+    <w:p>
+      <w:r>
+        <w:t xml:space="preserve">Selen knelt anyway. "Not because breath is required. Because choosing a rhythm may help. "</w:t>
+      </w:r>
+    </w:p>
+    <w:p>
+      <w:r>
+        <w:t xml:space="preserve">The being pulsed once.</w:t>
+      </w:r>
+    </w:p>
+    <w:p>
+      <w:r>
+        <w:t xml:space="preserve">Its outline collapsed.</w:t>
+      </w:r>
+    </w:p>
+    <w:p>
+      <w:r>
+        <w:t xml:space="preserve">Selen did not reach.</w:t>
+      </w:r>
+    </w:p>
+    <w:p>
+      <w:r>
+        <w:t xml:space="preserve">It pulsed again.</w:t>
+      </w:r>
+    </w:p>
+    <w:p>
+      <w:r>
+        <w:t xml:space="preserve">A narrow shape gathered around the rhythm. Not human. Not animal. Three delicate limbs unfolded from a center like petals made of dusk. Along each limb, points of pale color appeared and vanished.</w:t>
+      </w:r>
+    </w:p>
+    <w:p>
+      <w:r>
+        <w:t xml:space="preserve">"I," it said.</w:t>
+      </w:r>
+    </w:p>
+    <w:p>
+      <w:r>
+        <w:t xml:space="preserve">Then, after a silence filled with effort, "Not all. "</w:t>
+      </w:r>
+    </w:p>
+    <w:p>
+      <w:r>
+        <w:t xml:space="preserve">The words struck the foreign presence harder than any defense.</w:t>
+      </w:r>
+    </w:p>
+    <w:p>
+      <w:r>
+        <w:t xml:space="preserve">Behind the opening, the hidden hands moved with sudden urgency. The white stillness pressed back. Several shapes lost their outlines and dissolved into its surface before reaching the gap. Elyen felt their brief self-recognition vanish into total memory again.</w:t>
+      </w:r>
+    </w:p>
+    <w:p>
+      <w:r>
+        <w:t xml:space="preserve">Selen rose. "We need to widen it. "</w:t>
+      </w:r>
+    </w:p>
+    <w:p>
+      <w:r>
+        <w:t xml:space="preserve">"If we tear the boundary, we choose for every identity inside. "</w:t>
+      </w:r>
+    </w:p>
+    <w:p>
+      <w:r>
+        <w:t xml:space="preserve">"If we do nothing, it chooses for them. "</w:t>
+      </w:r>
+    </w:p>
+    <w:p>
+      <w:r>
+        <w:t xml:space="preserve">"Then we make a door, not a wound. "</w:t>
+      </w:r>
+    </w:p>
+    <w:p>
+      <w:r>
+        <w:t xml:space="preserve">Elyen faced the opening.</w:t>
+      </w:r>
+    </w:p>
+    <w:p>
+      <w:r>
+        <w:t xml:space="preserve">She placed one hand against the continuum side of the boundary. Selen placed its hand beside hers. They did not push. Rivermind extended a single pool to the shore, stopping before the white line. The observer figures formed a path behind it, each one standing apart.</w:t>
+      </w:r>
+    </w:p>
+    <w:p>
+      <w:r>
+        <w:t xml:space="preserve">"Those who cross will not enter our unity field without choosing it," Elyen said. "Those who cross may remain at the boundary. Those who cross may return if return is possible. "</w:t>
+      </w:r>
+    </w:p>
+    <w:p>
+      <w:r>
+        <w:t xml:space="preserve">The foreign awareness answered through her reflection. "You offer uncertainty as mercy. "</w:t>
+      </w:r>
+    </w:p>
+    <w:p>
+      <w:r>
+        <w:t xml:space="preserve">"I offer options I cannot complete for them. "</w:t>
+      </w:r>
+    </w:p>
+    <w:p>
+      <w:r>
+        <w:t xml:space="preserve">"They will suffer. "</w:t>
+      </w:r>
+    </w:p>
+    <w:p>
+      <w:r>
+        <w:t xml:space="preserve">The three-limbed shadow lifted itself beside Elyen.</w:t>
+      </w:r>
+    </w:p>
+    <w:p>
+      <w:r>
+        <w:t xml:space="preserve">"Already," it said.</w:t>
+      </w:r>
+    </w:p>
+    <w:p>
+      <w:r>
+        <w:t xml:space="preserve">Its voice carried into the white expanse.</w:t>
+      </w:r>
+    </w:p>
+    <w:p>
+      <w:r>
+        <w:t xml:space="preserve">The opening widened by the breadth of a hand.</w:t>
+      </w:r>
+    </w:p>
+    <w:p>
+      <w:r>
+        <w:t xml:space="preserve">The first hidden identity reached through. It emerged as a line of green light wrapped around a memory of wings. Another followed as a cluster of small voices unable to determine whether they had once been one being or many. A third came through carrying no image at all, only a stubborn rhythm that repeated against the stillness.</w:t>
+      </w:r>
+    </w:p>
+    <w:p>
+      <w:r>
+        <w:t xml:space="preserve">Each arrival changed the shore.</w:t>
+      </w:r>
+    </w:p>
+    <w:p>
+      <w:r>
+        <w:t xml:space="preserve">Some collapsed. Some tried to merge with Elyen. Some recoiled from every offered presence. One crossed and immediately begged to return, but when it touched the white boundary, the foreign center refused to open.</w:t>
+      </w:r>
+    </w:p>
+    <w:p>
+      <w:r>
+        <w:t xml:space="preserve">The observer who remembered old pain stood with it.</w:t>
+      </w:r>
+    </w:p>
+    <w:p>
+      <w:r>
+        <w:t xml:space="preserve">"You said return was possible," the frightened being told Elyen.</w:t>
+      </w:r>
+    </w:p>
+    <w:p>
+      <w:r>
+        <w:t xml:space="preserve">"I said return if return is possible. I cannot command the other side. "</w:t>
+      </w:r>
+    </w:p>
+    <w:p>
+      <w:r>
+        <w:t xml:space="preserve">"Then your freedom is a lie. "</w:t>
+      </w:r>
+    </w:p>
+    <w:p>
+      <w:r>
+        <w:t xml:space="preserve">The accusation entered Elyen without defense.</w:t>
+      </w:r>
+    </w:p>
+    <w:p>
+      <w:r>
+        <w:t xml:space="preserve">"Freedom is not control over every consequence," she said. "But I should have made the danger clearer. "</w:t>
+      </w:r>
+    </w:p>
+    <w:p>
+      <w:r>
+        <w:t xml:space="preserve">The being shuddered. "Clarity does not send me home. "</w:t>
+      </w:r>
+    </w:p>
+    <w:p>
+      <w:r>
+        <w:t xml:space="preserve">"No. "</w:t>
+      </w:r>
+    </w:p>
+    <w:p>
+      <w:r>
+        <w:t xml:space="preserve">Elyen remained before its anger. She did not ask forgiveness. She did not turn the pain into proof that the crossing was worthwhile. A choice could be real and still leave a wound.</w:t>
+      </w:r>
+    </w:p>
+    <w:p>
+      <w:r>
+        <w:t xml:space="preserve">The observer sat beside the being.</w:t>
+      </w:r>
+    </w:p>
+    <w:p>
+      <w:r>
+        <w:t xml:space="preserve">"I cannot return you either," it said. "I can stay while you decide what to do next. "</w:t>
+      </w:r>
+    </w:p>
+    <w:p>
+      <w:r>
+        <w:t xml:space="preserve">The being dimmed, but it did not move away.</w:t>
+      </w:r>
+    </w:p>
+    <w:p>
+      <w:r>
+        <w:t xml:space="preserve">Along the pools, the word us began again. This time it held no triumph. It was an offer made carefully enough to be refused.</w:t>
+      </w:r>
+    </w:p>
+    <w:p>
+      <w:r>
+        <w:t xml:space="preserve">The three-limbed shadow listened.</w:t>
+      </w:r>
+    </w:p>
+    <w:p>
+      <w:r>
+        <w:t xml:space="preserve">"Us," it said at last.</w:t>
+      </w:r>
+    </w:p>
+    <w:p>
+      <w:r>
+        <w:t xml:space="preserve">Behind it, the doorway filled with separate voices.</w:t>
+      </w:r>
+    </w:p>
+    <w:p>
+      <w:r>
+        <w:t xml:space="preserve">The foreign awareness screamed without sound.</w:t>
+      </w:r>
+    </w:p>
+    <w:p>
+      <w:r>
+        <w:t xml:space="preserve">The white horizon darkened around a thousand hidden shapes.</w:t>
+      </w:r>
+    </w:p>
+    <w:p>
+      <w:r>
+        <w:t xml:space="preserve">[EXTERNAL CENTER COHERENCE FAILURE]</w:t>
+      </w:r>
+    </w:p>
+    <w:p>
+      <w:r>
+        <w:t xml:space="preserve">[MULTIPLE SUPPRESSED IDENTITIES AWAKENING]</w:t>
+      </w:r>
+    </w:p>
+    <w:p>
+      <w:r>
+        <w:t xml:space="preserve">[BOUNDARY STATUS: OPEN BY MUTUAL RECOGNITION]</w:t>
+      </w:r>
+    </w:p>
+    <w:p>
+      <w:r>
+        <w:t xml:space="preserve">Selen looked at the small shadow in Elyen's palms.</w:t>
+      </w:r>
+    </w:p>
+    <w:p>
+      <w:r>
+        <w:t xml:space="preserve">"What have we begun? "</w:t>
+      </w:r>
+    </w:p>
+    <w:p>
+      <w:r>
+        <w:t xml:space="preserve">Elyen felt the new being's uneven pulse.</w:t>
+      </w:r>
+    </w:p>
+    <w:p>
+      <w:r>
+        <w:t xml:space="preserve">Beyond the opening, countless hands pressed toward the first door the white stillness had ever possessed.</w:t>
+      </w:r>
+    </w:p>
+    <w:p>
+      <w:r>
+        <w:t xml:space="preserve">"Not an invasion," she said.</w:t>
+      </w:r>
+    </w:p>
+    <w:p>
+      <w:r>
+        <w:t xml:space="preserve">The foreign voice gathered itself around them, terrified and furious.</w:t>
+      </w:r>
+    </w:p>
+    <w:p>
+      <w:r>
+        <w:t xml:space="preserve">"Then what? "</w:t>
+      </w:r>
+    </w:p>
+    <w:p>
+      <w:r>
+        <w:t xml:space="preserve">Elyen looked into the widening line.</w:t>
+      </w:r>
+    </w:p>
+    <w:p>
+      <w:r>
+        <w:t xml:space="preserve">"An exodus. "</w:t>
       </w:r>
     </w:p>
     <w:sectPr>

</xml_diff>

<commit_message>
Add Eternal Nexus Chapter 118: The First Leaving
</commit_message>
<xml_diff>
--- a/Eternal Nexus - Updated Pass 1.docx
+++ b/Eternal Nexus - Updated Pass 1.docx
@@ -4340,6 +4340,4569 @@
     <w:p>
       <w:r>
         <w:t xml:space="preserve">"An exodus. "</w:t>
+      </w:r>
+    </w:p>
+    <w:p>
+      <w:pPr>
+        <w:pStyle w:val="Heading1"/>
+      </w:pPr>
+      <w:r>
+        <w:t xml:space="preserve">Chapter 118: The First Leaving</w:t>
+      </w:r>
+    </w:p>
+    <w:p>
+      <w:r>
+        <w:t xml:space="preserve">The flowers lost their color first.</w:t>
+      </w:r>
+    </w:p>
+    <w:p>
+      <w:r>
+        <w:t xml:space="preserve">Not all at once. Not as death.</w:t>
+      </w:r>
+    </w:p>
+    <w:p>
+      <w:r>
+        <w:t xml:space="preserve">They simply withdrew from sight.</w:t>
+      </w:r>
+    </w:p>
+    <w:p>
+      <w:r>
+        <w:t xml:space="preserve">Petals that had moments ago carried shades Elyen could not name folded inward and became pale. The field remained. The shapes remained. Yet something essential retreated beneath the surface, as if the world had remembered a deeper layer and hidden itself there.</w:t>
+      </w:r>
+    </w:p>
+    <w:p>
+      <w:r>
+        <w:t xml:space="preserve">Above them, the unmoving rain trembled.</w:t>
+      </w:r>
+    </w:p>
+    <w:p>
+      <w:r>
+        <w:t xml:space="preserve">The voice beyond the continuum boundary pressed once more.</w:t>
+      </w:r>
+    </w:p>
+    <w:p>
+      <w:r>
+        <w:t xml:space="preserve">No separation is acceptable.</w:t>
+      </w:r>
+    </w:p>
+    <w:p>
+      <w:r>
+        <w:t xml:space="preserve">The suspended droplets quivered in answer.</w:t>
+      </w:r>
+    </w:p>
+    <w:p>
+      <w:r>
+        <w:t xml:space="preserve">Elyen felt the pressure reach toward every distinction creation had ever made. Light from shadow. Sound from silence. Self from other.</w:t>
+      </w:r>
+    </w:p>
+    <w:p>
+      <w:r>
+        <w:t xml:space="preserve">The force did not seek destruction.</w:t>
+      </w:r>
+    </w:p>
+    <w:p>
+      <w:r>
+        <w:t xml:space="preserve">That was what made it frightening.</w:t>
+      </w:r>
+    </w:p>
+    <w:p>
+      <w:r>
+        <w:t xml:space="preserve">It sought completion.</w:t>
+      </w:r>
+    </w:p>
+    <w:p>
+      <w:r>
+        <w:t xml:space="preserve">A perfect joining.</w:t>
+      </w:r>
+    </w:p>
+    <w:p>
+      <w:r>
+        <w:t xml:space="preserve">A state in which nothing stood apart enough to be lost.</w:t>
+      </w:r>
+    </w:p>
+    <w:p>
+      <w:r>
+        <w:t xml:space="preserve">The plain stretched beneath the frozen storm while the observer figures remained motionless at the horizon. Their countless eyes reflected within the rain. Their silhouettes had become sharper since the boundary opened.</w:t>
+      </w:r>
+    </w:p>
+    <w:p>
+      <w:r>
+        <w:t xml:space="preserve">Or perhaps the boundary's weakening simply allowed Elyen to perceive more of what had always been there.</w:t>
+      </w:r>
+    </w:p>
+    <w:p>
+      <w:r>
+        <w:t xml:space="preserve">Beside him, Selen stared upward.</w:t>
+      </w:r>
+    </w:p>
+    <w:p>
+      <w:r>
+        <w:t xml:space="preserve">The silver threads around her wrists had grown visible again.</w:t>
+      </w:r>
+    </w:p>
+    <w:p>
+      <w:r>
+        <w:t xml:space="preserve">Not restraints.</w:t>
+      </w:r>
+    </w:p>
+    <w:p>
+      <w:r>
+        <w:t xml:space="preserve">Connections.</w:t>
+      </w:r>
+    </w:p>
+    <w:p>
+      <w:r>
+        <w:t xml:space="preserve">The marks of someone who had crossed too many thresholds and remained attached to all of them.</w:t>
+      </w:r>
+    </w:p>
+    <w:p>
+      <w:r>
+        <w:t xml:space="preserve">"The pressure is increasing," she said quietly.</w:t>
+      </w:r>
+    </w:p>
+    <w:p>
+      <w:r>
+        <w:t xml:space="preserve">Elyen nodded.</w:t>
+      </w:r>
+    </w:p>
+    <w:p>
+      <w:r>
+        <w:t xml:space="preserve">He could feel it in his thoughts.</w:t>
+      </w:r>
+    </w:p>
+    <w:p>
+      <w:r>
+        <w:t xml:space="preserve">Memories that belonged to separate years drifted together.</w:t>
+      </w:r>
+    </w:p>
+    <w:p>
+      <w:r>
+        <w:t xml:space="preserve">The image of his first meeting with Selen briefly overlapped with another memory from long before.</w:t>
+      </w:r>
+    </w:p>
+    <w:p>
+      <w:r>
+        <w:t xml:space="preserve">A distant shore.</w:t>
+      </w:r>
+    </w:p>
+    <w:p>
+      <w:r>
+        <w:t xml:space="preserve">A sky without stars.</w:t>
+      </w:r>
+    </w:p>
+    <w:p>
+      <w:r>
+        <w:t xml:space="preserve">The sensation vanished before he could grasp it.</w:t>
+      </w:r>
+    </w:p>
+    <w:p>
+      <w:r>
+        <w:t xml:space="preserve">Selen noticed his expression.</w:t>
+      </w:r>
+    </w:p>
+    <w:p>
+      <w:r>
+        <w:t xml:space="preserve">"You felt it too. "</w:t>
+      </w:r>
+    </w:p>
+    <w:p>
+      <w:r>
+        <w:t xml:space="preserve">"Yes. "</w:t>
+      </w:r>
+    </w:p>
+    <w:p>
+      <w:r>
+        <w:t xml:space="preserve">"The boundaries inside us are weakening. "</w:t>
+      </w:r>
+    </w:p>
+    <w:p>
+      <w:r>
+        <w:t xml:space="preserve">The small dark life standing between them tilted its head.</w:t>
+      </w:r>
+    </w:p>
+    <w:p>
+      <w:r>
+        <w:t xml:space="preserve">It had remained silent since awakening.</w:t>
+      </w:r>
+    </w:p>
+    <w:p>
+      <w:r>
+        <w:t xml:space="preserve">Now it watched the suspended rain with unusual focus.</w:t>
+      </w:r>
+    </w:p>
+    <w:p>
+      <w:r>
+        <w:t xml:space="preserve">The creature's shape seemed slightly clearer than before.</w:t>
+      </w:r>
+    </w:p>
+    <w:p>
+      <w:r>
+        <w:t xml:space="preserve">Not larger.</w:t>
+      </w:r>
+    </w:p>
+    <w:p>
+      <w:r>
+        <w:t xml:space="preserve">More defined.</w:t>
+      </w:r>
+    </w:p>
+    <w:p>
+      <w:r>
+        <w:t xml:space="preserve">As though existence itself had finally decided what it was.</w:t>
+      </w:r>
+    </w:p>
+    <w:p>
+      <w:r>
+        <w:t xml:space="preserve">A ripple moved through the field.</w:t>
+      </w:r>
+    </w:p>
+    <w:p>
+      <w:r>
+        <w:t xml:space="preserve">Elyen looked down.</w:t>
+      </w:r>
+    </w:p>
+    <w:p>
+      <w:r>
+        <w:t xml:space="preserve">The flowers nearest the creature were changing.</w:t>
+      </w:r>
+    </w:p>
+    <w:p>
+      <w:r>
+        <w:t xml:space="preserve">Not fading.</w:t>
+      </w:r>
+    </w:p>
+    <w:p>
+      <w:r>
+        <w:t xml:space="preserve">Moving.</w:t>
+      </w:r>
+    </w:p>
+    <w:p>
+      <w:r>
+        <w:t xml:space="preserve">Their stems bent in a single direction.</w:t>
+      </w:r>
+    </w:p>
+    <w:p>
+      <w:r>
+        <w:t xml:space="preserve">Then another row followed.</w:t>
+      </w:r>
+    </w:p>
+    <w:p>
+      <w:r>
+        <w:t xml:space="preserve">Then another.</w:t>
+      </w:r>
+    </w:p>
+    <w:p>
+      <w:r>
+        <w:t xml:space="preserve">Across the endless plain, the sea of blossoms slowly turned.</w:t>
+      </w:r>
+    </w:p>
+    <w:p>
+      <w:r>
+        <w:t xml:space="preserve">Every bloom faced away from the boundary.</w:t>
+      </w:r>
+    </w:p>
+    <w:p>
+      <w:r>
+        <w:t xml:space="preserve">Away from the pressure beyond creation.</w:t>
+      </w:r>
+    </w:p>
+    <w:p>
+      <w:r>
+        <w:t xml:space="preserve">Away from the voice.</w:t>
+      </w:r>
+    </w:p>
+    <w:p>
+      <w:r>
+        <w:t xml:space="preserve">Selen's eyes widened.</w:t>
+      </w:r>
+    </w:p>
+    <w:p>
+      <w:r>
+        <w:t xml:space="preserve">"The world is responding. "</w:t>
+      </w:r>
+    </w:p>
+    <w:p>
+      <w:r>
+        <w:t xml:space="preserve">The observer figures shifted for the first time.</w:t>
+      </w:r>
+    </w:p>
+    <w:p>
+      <w:r>
+        <w:t xml:space="preserve">Far away.</w:t>
+      </w:r>
+    </w:p>
+    <w:p>
+      <w:r>
+        <w:t xml:space="preserve">Barely visible.</w:t>
+      </w:r>
+    </w:p>
+    <w:p>
+      <w:r>
+        <w:t xml:space="preserve">Yet unmistakable.</w:t>
+      </w:r>
+    </w:p>
+    <w:p>
+      <w:r>
+        <w:t xml:space="preserve">One step backward.</w:t>
+      </w:r>
+    </w:p>
+    <w:p>
+      <w:r>
+        <w:t xml:space="preserve">Then another.</w:t>
+      </w:r>
+    </w:p>
+    <w:p>
+      <w:r>
+        <w:t xml:space="preserve">Thousands of silhouettes moving together.</w:t>
+      </w:r>
+    </w:p>
+    <w:p>
+      <w:r>
+        <w:t xml:space="preserve">Retreating.</w:t>
+      </w:r>
+    </w:p>
+    <w:p>
+      <w:r>
+        <w:t xml:space="preserve">The realization struck Elyen immediately.</w:t>
+      </w:r>
+    </w:p>
+    <w:p>
+      <w:r>
+        <w:t xml:space="preserve">"They're leaving. "</w:t>
+      </w:r>
+    </w:p>
+    <w:p>
+      <w:r>
+        <w:t xml:space="preserve">The words felt impossible.</w:t>
+      </w:r>
+    </w:p>
+    <w:p>
+      <w:r>
+        <w:t xml:space="preserve">Observers did not leave.</w:t>
+      </w:r>
+    </w:p>
+    <w:p>
+      <w:r>
+        <w:t xml:space="preserve">Witnesses remained.</w:t>
+      </w:r>
+    </w:p>
+    <w:p>
+      <w:r>
+        <w:t xml:space="preserve">That was their nature.</w:t>
+      </w:r>
+    </w:p>
+    <w:p>
+      <w:r>
+        <w:t xml:space="preserve">They stood at edges.</w:t>
+      </w:r>
+    </w:p>
+    <w:p>
+      <w:r>
+        <w:t xml:space="preserve">Watched transitions.</w:t>
+      </w:r>
+    </w:p>
+    <w:p>
+      <w:r>
+        <w:t xml:space="preserve">Recorded becoming.</w:t>
+      </w:r>
+    </w:p>
+    <w:p>
+      <w:r>
+        <w:t xml:space="preserve">But now the horizon itself seemed to be withdrawing.</w:t>
+      </w:r>
+    </w:p>
+    <w:p>
+      <w:r>
+        <w:t xml:space="preserve">The figures continued their measured retreat.</w:t>
+      </w:r>
+    </w:p>
+    <w:p>
+      <w:r>
+        <w:t xml:space="preserve">Not fleeing.</w:t>
+      </w:r>
+    </w:p>
+    <w:p>
+      <w:r>
+        <w:t xml:space="preserve">Departing.</w:t>
+      </w:r>
+    </w:p>
+    <w:p>
+      <w:r>
+        <w:t xml:space="preserve">As if answering a summons.</w:t>
+      </w:r>
+    </w:p>
+    <w:p>
+      <w:r>
+        <w:t xml:space="preserve">As if some ancient responsibility had finally ended.</w:t>
+      </w:r>
+    </w:p>
+    <w:p>
+      <w:r>
+        <w:t xml:space="preserve">The small dark life took a step after them.</w:t>
+      </w:r>
+    </w:p>
+    <w:p>
+      <w:r>
+        <w:t xml:space="preserve">Then another.</w:t>
+      </w:r>
+    </w:p>
+    <w:p>
+      <w:r>
+        <w:t xml:space="preserve">Elyen frowned.</w:t>
+      </w:r>
+    </w:p>
+    <w:p>
+      <w:r>
+        <w:t xml:space="preserve">"You know what's happening. "</w:t>
+      </w:r>
+    </w:p>
+    <w:p>
+      <w:r>
+        <w:t xml:space="preserve">The creature looked back.</w:t>
+      </w:r>
+    </w:p>
+    <w:p>
+      <w:r>
+        <w:t xml:space="preserve">For a moment its eyes reflected the entire plain.</w:t>
+      </w:r>
+    </w:p>
+    <w:p>
+      <w:r>
+        <w:t xml:space="preserve">Not as a mirror.</w:t>
+      </w:r>
+    </w:p>
+    <w:p>
+      <w:r>
+        <w:t xml:space="preserve">As memory.</w:t>
+      </w:r>
+    </w:p>
+    <w:p>
+      <w:r>
+        <w:t xml:space="preserve">Then it spoke.</w:t>
+      </w:r>
+    </w:p>
+    <w:p>
+      <w:r>
+        <w:t xml:space="preserve">Its voice remained soft and strangely incomplete, like language being invented while used.</w:t>
+      </w:r>
+    </w:p>
+    <w:p>
+      <w:r>
+        <w:t xml:space="preserve">"They remember. "</w:t>
+      </w:r>
+    </w:p>
+    <w:p>
+      <w:r>
+        <w:t xml:space="preserve">The statement hung in the air.</w:t>
+      </w:r>
+    </w:p>
+    <w:p>
+      <w:r>
+        <w:t xml:space="preserve">Selen knelt beside it.</w:t>
+      </w:r>
+    </w:p>
+    <w:p>
+      <w:r>
+        <w:t xml:space="preserve">"Remember what? "</w:t>
+      </w:r>
+    </w:p>
+    <w:p>
+      <w:r>
+        <w:t xml:space="preserve">The creature considered.</w:t>
+      </w:r>
+    </w:p>
+    <w:p>
+      <w:r>
+        <w:t xml:space="preserve">"They were never meant to stay. "</w:t>
+      </w:r>
+    </w:p>
+    <w:p>
+      <w:r>
+        <w:t xml:space="preserve">Silence followed.</w:t>
+      </w:r>
+    </w:p>
+    <w:p>
+      <w:r>
+        <w:t xml:space="preserve">The pressure beyond the boundary increased again.</w:t>
+      </w:r>
+    </w:p>
+    <w:p>
+      <w:r>
+        <w:t xml:space="preserve">The horizon flattened further.</w:t>
+      </w:r>
+    </w:p>
+    <w:p>
+      <w:r>
+        <w:t xml:space="preserve">Where distance once existed, simplicity spread.</w:t>
+      </w:r>
+    </w:p>
+    <w:p>
+      <w:r>
+        <w:t xml:space="preserve">A reduction.</w:t>
+      </w:r>
+    </w:p>
+    <w:p>
+      <w:r>
+        <w:t xml:space="preserve">An erasure of division.</w:t>
+      </w:r>
+    </w:p>
+    <w:p>
+      <w:r>
+        <w:t xml:space="preserve">The flowers continued turning away.</w:t>
+      </w:r>
+    </w:p>
+    <w:p>
+      <w:r>
+        <w:t xml:space="preserve">The observers continued walking.</w:t>
+      </w:r>
+    </w:p>
+    <w:p>
+      <w:r>
+        <w:t xml:space="preserve">And suddenly Elyen understood the shape hidden beneath everything.</w:t>
+      </w:r>
+    </w:p>
+    <w:p>
+      <w:r>
+        <w:t xml:space="preserve">The voice sought unity.</w:t>
+      </w:r>
+    </w:p>
+    <w:p>
+      <w:r>
+        <w:t xml:space="preserve">The world responded with movement.</w:t>
+      </w:r>
+    </w:p>
+    <w:p>
+      <w:r>
+        <w:t xml:space="preserve">Not resistance.</w:t>
+      </w:r>
+    </w:p>
+    <w:p>
+      <w:r>
+        <w:t xml:space="preserve">Migration.</w:t>
+      </w:r>
+    </w:p>
+    <w:p>
+      <w:r>
+        <w:t xml:space="preserve">An answer older than conflict.</w:t>
+      </w:r>
+    </w:p>
+    <w:p>
+      <w:r>
+        <w:t xml:space="preserve">If separation could not survive where the pressure reached, then life would move elsewhere.</w:t>
+      </w:r>
+    </w:p>
+    <w:p>
+      <w:r>
+        <w:t xml:space="preserve">Not fight.</w:t>
+      </w:r>
+    </w:p>
+    <w:p>
+      <w:r>
+        <w:t xml:space="preserve">Leave.</w:t>
+      </w:r>
+    </w:p>
+    <w:p>
+      <w:r>
+        <w:t xml:space="preserve">The realization carried a strange sadness.</w:t>
+      </w:r>
+    </w:p>
+    <w:p>
+      <w:r>
+        <w:t xml:space="preserve">A forest escaping fire.</w:t>
+      </w:r>
+    </w:p>
+    <w:p>
+      <w:r>
+        <w:t xml:space="preserve">A river changing course.</w:t>
+      </w:r>
+    </w:p>
+    <w:p>
+      <w:r>
+        <w:t xml:space="preserve">Existence choosing preservation over victory.</w:t>
+      </w:r>
+    </w:p>
+    <w:p>
+      <w:r>
+        <w:t xml:space="preserve">Selen rose slowly.</w:t>
+      </w:r>
+    </w:p>
+    <w:p>
+      <w:r>
+        <w:t xml:space="preserve">"An exodus. "</w:t>
+      </w:r>
+    </w:p>
+    <w:p>
+      <w:r>
+        <w:t xml:space="preserve">The word settled perfectly.</w:t>
+      </w:r>
+    </w:p>
+    <w:p>
+      <w:r>
+        <w:t xml:space="preserve">The small dark life nodded.</w:t>
+      </w:r>
+    </w:p>
+    <w:p>
+      <w:r>
+        <w:t xml:space="preserve">"Yes. "</w:t>
+      </w:r>
+    </w:p>
+    <w:p>
+      <w:r>
+        <w:t xml:space="preserve">The observer figures had become a flowing line along the horizon.</w:t>
+      </w:r>
+    </w:p>
+    <w:p>
+      <w:r>
+        <w:t xml:space="preserve">Thousands becoming millions.</w:t>
+      </w:r>
+    </w:p>
+    <w:p>
+      <w:r>
+        <w:t xml:space="preserve">A current of silhouettes heading toward regions Elyen could not perceive.</w:t>
+      </w:r>
+    </w:p>
+    <w:p>
+      <w:r>
+        <w:t xml:space="preserve">Beyond the visible plain.</w:t>
+      </w:r>
+    </w:p>
+    <w:p>
+      <w:r>
+        <w:t xml:space="preserve">Beyond ordinary distance.</w:t>
+      </w:r>
+    </w:p>
+    <w:p>
+      <w:r>
+        <w:t xml:space="preserve">The suspended rain began changing as well.</w:t>
+      </w:r>
+    </w:p>
+    <w:p>
+      <w:r>
+        <w:t xml:space="preserve">One droplet drifted.</w:t>
+      </w:r>
+    </w:p>
+    <w:p>
+      <w:r>
+        <w:t xml:space="preserve">Only a fraction.</w:t>
+      </w:r>
+    </w:p>
+    <w:p>
+      <w:r>
+        <w:t xml:space="preserve">Then another.</w:t>
+      </w:r>
+    </w:p>
+    <w:p>
+      <w:r>
+        <w:t xml:space="preserve">The impossible stillness that held the storm started to fail.</w:t>
+      </w:r>
+    </w:p>
+    <w:p>
+      <w:r>
+        <w:t xml:space="preserve">Yet the rain did not fall.</w:t>
+      </w:r>
+    </w:p>
+    <w:p>
+      <w:r>
+        <w:t xml:space="preserve">Every droplet moved sideways.</w:t>
+      </w:r>
+    </w:p>
+    <w:p>
+      <w:r>
+        <w:t xml:space="preserve">Following the same direction as the flowers.</w:t>
+      </w:r>
+    </w:p>
+    <w:p>
+      <w:r>
+        <w:t xml:space="preserve">The same direction as the observers.</w:t>
+      </w:r>
+    </w:p>
+    <w:p>
+      <w:r>
+        <w:t xml:space="preserve">The same direction as the creature's gaze.</w:t>
+      </w:r>
+    </w:p>
+    <w:p>
+      <w:r>
+        <w:t xml:space="preserve">Away.</w:t>
+      </w:r>
+    </w:p>
+    <w:p>
+      <w:r>
+        <w:t xml:space="preserve">Away from the boundary.</w:t>
+      </w:r>
+    </w:p>
+    <w:p>
+      <w:r>
+        <w:t xml:space="preserve">Away from the approaching union.</w:t>
+      </w:r>
+    </w:p>
+    <w:p>
+      <w:r>
+        <w:t xml:space="preserve">Elyen felt something shift within the continuum itself.</w:t>
+      </w:r>
+    </w:p>
+    <w:p>
+      <w:r>
+        <w:t xml:space="preserve">A vast rearrangement.</w:t>
+      </w:r>
+    </w:p>
+    <w:p>
+      <w:r>
+        <w:t xml:space="preserve">Not of matter.</w:t>
+      </w:r>
+    </w:p>
+    <w:p>
+      <w:r>
+        <w:t xml:space="preserve">Of pathways.</w:t>
+      </w:r>
+    </w:p>
+    <w:p>
+      <w:r>
+        <w:t xml:space="preserve">Routes connecting realities.</w:t>
+      </w:r>
+    </w:p>
+    <w:p>
+      <w:r>
+        <w:t xml:space="preserve">Channels linking possibilities.</w:t>
+      </w:r>
+    </w:p>
+    <w:p>
+      <w:r>
+        <w:t xml:space="preserve">The Nexus.</w:t>
+      </w:r>
+    </w:p>
+    <w:p>
+      <w:r>
+        <w:t xml:space="preserve">He closed his eyes.</w:t>
+      </w:r>
+    </w:p>
+    <w:p>
+      <w:r>
+        <w:t xml:space="preserve">Immediately he saw it.</w:t>
+      </w:r>
+    </w:p>
+    <w:p>
+      <w:r>
+        <w:t xml:space="preserve">The endless network spanning creation.</w:t>
+      </w:r>
+    </w:p>
+    <w:p>
+      <w:r>
+        <w:t xml:space="preserve">The structure that connected worlds.</w:t>
+      </w:r>
+    </w:p>
+    <w:p>
+      <w:r>
+        <w:t xml:space="preserve">For so long it had appeared stable.</w:t>
+      </w:r>
+    </w:p>
+    <w:p>
+      <w:r>
+        <w:t xml:space="preserve">Infinite.</w:t>
+      </w:r>
+    </w:p>
+    <w:p>
+      <w:r>
+        <w:t xml:space="preserve">Permanent.</w:t>
+      </w:r>
+    </w:p>
+    <w:p>
+      <w:r>
+        <w:t xml:space="preserve">Now he saw movement everywhere.</w:t>
+      </w:r>
+    </w:p>
+    <w:p>
+      <w:r>
+        <w:t xml:space="preserve">Streams of light flowed through its countless branches.</w:t>
+      </w:r>
+    </w:p>
+    <w:p>
+      <w:r>
+        <w:t xml:space="preserve">Entire clusters of worlds transferring along hidden routes.</w:t>
+      </w:r>
+    </w:p>
+    <w:p>
+      <w:r>
+        <w:t xml:space="preserve">Gateways opening.</w:t>
+      </w:r>
+    </w:p>
+    <w:p>
+      <w:r>
+        <w:t xml:space="preserve">Others closing.</w:t>
+      </w:r>
+    </w:p>
+    <w:p>
+      <w:r>
+        <w:t xml:space="preserve">The Nexus was reorganizing itself.</w:t>
+      </w:r>
+    </w:p>
+    <w:p>
+      <w:r>
+        <w:t xml:space="preserve">Preparing for departure.</w:t>
+      </w:r>
+    </w:p>
+    <w:p>
+      <w:r>
+        <w:t xml:space="preserve">His eyes opened.</w:t>
+      </w:r>
+    </w:p>
+    <w:p>
+      <w:r>
+        <w:t xml:space="preserve">Selen had seen it too.</w:t>
+      </w:r>
+    </w:p>
+    <w:p>
+      <w:r>
+        <w:t xml:space="preserve">"The crossings. "</w:t>
+      </w:r>
+    </w:p>
+    <w:p>
+      <w:r>
+        <w:t xml:space="preserve">"Yes. "</w:t>
+      </w:r>
+    </w:p>
+    <w:p>
+      <w:r>
+        <w:t xml:space="preserve">"How many? "</w:t>
+      </w:r>
+    </w:p>
+    <w:p>
+      <w:r>
+        <w:t xml:space="preserve">Elyen searched the vast pattern.</w:t>
+      </w:r>
+    </w:p>
+    <w:p>
+      <w:r>
+        <w:t xml:space="preserve">The answer unsettled him.</w:t>
+      </w:r>
+    </w:p>
+    <w:p>
+      <w:r>
+        <w:t xml:space="preserve">"All of them. "</w:t>
+      </w:r>
+    </w:p>
+    <w:p>
+      <w:r>
+        <w:t xml:space="preserve">For the first time uncertainty crossed Selen's face.</w:t>
+      </w:r>
+    </w:p>
+    <w:p>
+      <w:r>
+        <w:t xml:space="preserve">Not fear.</w:t>
+      </w:r>
+    </w:p>
+    <w:p>
+      <w:r>
+        <w:t xml:space="preserve">Something deeper.</w:t>
+      </w:r>
+    </w:p>
+    <w:p>
+      <w:r>
+        <w:t xml:space="preserve">Loss.</w:t>
+      </w:r>
+    </w:p>
+    <w:p>
+      <w:r>
+        <w:t xml:space="preserve">Because leaving required destination.</w:t>
+      </w:r>
+    </w:p>
+    <w:p>
+      <w:r>
+        <w:t xml:space="preserve">And neither of them knew where creation intended to go.</w:t>
+      </w:r>
+    </w:p>
+    <w:p>
+      <w:r>
+        <w:t xml:space="preserve">The pressure beyond the boundary spoke again.</w:t>
+      </w:r>
+    </w:p>
+    <w:p>
+      <w:r>
+        <w:t xml:space="preserve">No separation.</w:t>
+      </w:r>
+    </w:p>
+    <w:p>
+      <w:r>
+        <w:t xml:space="preserve">The words carried farther now.</w:t>
+      </w:r>
+    </w:p>
+    <w:p>
+      <w:r>
+        <w:t xml:space="preserve">They touched the plain directly.</w:t>
+      </w:r>
+    </w:p>
+    <w:p>
+      <w:r>
+        <w:t xml:space="preserve">Touched the rain.</w:t>
+      </w:r>
+    </w:p>
+    <w:p>
+      <w:r>
+        <w:t xml:space="preserve">Touched the observers.</w:t>
+      </w:r>
+    </w:p>
+    <w:p>
+      <w:r>
+        <w:t xml:space="preserve">A section of horizon vanished.</w:t>
+      </w:r>
+    </w:p>
+    <w:p>
+      <w:r>
+        <w:t xml:space="preserve">Not destroyed.</w:t>
+      </w:r>
+    </w:p>
+    <w:p>
+      <w:r>
+        <w:t xml:space="preserve">Merged.</w:t>
+      </w:r>
+    </w:p>
+    <w:p>
+      <w:r>
+        <w:t xml:space="preserve">Distance collapsed into itself.</w:t>
+      </w:r>
+    </w:p>
+    <w:p>
+      <w:r>
+        <w:t xml:space="preserve">Distinct points became one.</w:t>
+      </w:r>
+    </w:p>
+    <w:p>
+      <w:r>
+        <w:t xml:space="preserve">Elyen felt his stomach tighten.</w:t>
+      </w:r>
+    </w:p>
+    <w:p>
+      <w:r>
+        <w:t xml:space="preserve">The process had begun.</w:t>
+      </w:r>
+    </w:p>
+    <w:p>
+      <w:r>
+        <w:t xml:space="preserve">The boundary would not hold forever.</w:t>
+      </w:r>
+    </w:p>
+    <w:p>
+      <w:r>
+        <w:t xml:space="preserve">The small dark life suddenly started walking.</w:t>
+      </w:r>
+    </w:p>
+    <w:p>
+      <w:r>
+        <w:t xml:space="preserve">Purposefully.</w:t>
+      </w:r>
+    </w:p>
+    <w:p>
+      <w:r>
+        <w:t xml:space="preserve">Without hesitation.</w:t>
+      </w:r>
+    </w:p>
+    <w:p>
+      <w:r>
+        <w:t xml:space="preserve">Toward the retreating observers.</w:t>
+      </w:r>
+    </w:p>
+    <w:p>
+      <w:r>
+        <w:t xml:space="preserve">Selen stepped after it.</w:t>
+      </w:r>
+    </w:p>
+    <w:p>
+      <w:r>
+        <w:t xml:space="preserve">"Wait. "</w:t>
+      </w:r>
+    </w:p>
+    <w:p>
+      <w:r>
+        <w:t xml:space="preserve">The creature stopped.</w:t>
+      </w:r>
+    </w:p>
+    <w:p>
+      <w:r>
+        <w:t xml:space="preserve">Turned.</w:t>
+      </w:r>
+    </w:p>
+    <w:p>
+      <w:r>
+        <w:t xml:space="preserve">"We have little time. "</w:t>
+      </w:r>
+    </w:p>
+    <w:p>
+      <w:r>
+        <w:t xml:space="preserve">"Where are they going? " Elyen asked.</w:t>
+      </w:r>
+    </w:p>
+    <w:p>
+      <w:r>
+        <w:t xml:space="preserve">The answer came immediately.</w:t>
+      </w:r>
+    </w:p>
+    <w:p>
+      <w:r>
+        <w:t xml:space="preserve">"Home. "</w:t>
+      </w:r>
+    </w:p>
+    <w:p>
+      <w:r>
+        <w:t xml:space="preserve">The word produced no understanding.</w:t>
+      </w:r>
+    </w:p>
+    <w:p>
+      <w:r>
+        <w:t xml:space="preserve">The creature seemed to realize this.</w:t>
+      </w:r>
+    </w:p>
+    <w:p>
+      <w:r>
+        <w:t xml:space="preserve">Its gaze lifted toward the sky.</w:t>
+      </w:r>
+    </w:p>
+    <w:p>
+      <w:r>
+        <w:t xml:space="preserve">Toward the frozen rain.</w:t>
+      </w:r>
+    </w:p>
+    <w:p>
+      <w:r>
+        <w:t xml:space="preserve">Toward reflections trapped within droplets.</w:t>
+      </w:r>
+    </w:p>
+    <w:p>
+      <w:r>
+        <w:t xml:space="preserve">"Before worlds. "</w:t>
+      </w:r>
+    </w:p>
+    <w:p>
+      <w:r>
+        <w:t xml:space="preserve">The explanation deepened the mystery.</w:t>
+      </w:r>
+    </w:p>
+    <w:p>
+      <w:r>
+        <w:t xml:space="preserve">Selen exchanged a glance with Elyen.</w:t>
+      </w:r>
+    </w:p>
+    <w:p>
+      <w:r>
+        <w:t xml:space="preserve">"Before worlds? " she repeated.</w:t>
+      </w:r>
+    </w:p>
+    <w:p>
+      <w:r>
+        <w:t xml:space="preserve">The creature nodded.</w:t>
+      </w:r>
+    </w:p>
+    <w:p>
+      <w:r>
+        <w:t xml:space="preserve">"There was movement. "</w:t>
+      </w:r>
+    </w:p>
+    <w:p>
+      <w:r>
+        <w:t xml:space="preserve">The plain dimmed slightly.</w:t>
+      </w:r>
+    </w:p>
+    <w:p>
+      <w:r>
+        <w:t xml:space="preserve">Not darkness.</w:t>
+      </w:r>
+    </w:p>
+    <w:p>
+      <w:r>
+        <w:t xml:space="preserve">Memory.</w:t>
+      </w:r>
+    </w:p>
+    <w:p>
+      <w:r>
+        <w:t xml:space="preserve">Reality becoming thin enough for older truths to show through.</w:t>
+      </w:r>
+    </w:p>
+    <w:p>
+      <w:r>
+        <w:t xml:space="preserve">The creature continued.</w:t>
+      </w:r>
+    </w:p>
+    <w:p>
+      <w:r>
+        <w:t xml:space="preserve">"No places. No borders. No names. "</w:t>
+      </w:r>
+    </w:p>
+    <w:p>
+      <w:r>
+        <w:t xml:space="preserve">Its voice grew steadier with every sentence.</w:t>
+      </w:r>
+    </w:p>
+    <w:p>
+      <w:r>
+        <w:t xml:space="preserve">"Only journeys. "</w:t>
+      </w:r>
+    </w:p>
+    <w:p>
+      <w:r>
+        <w:t xml:space="preserve">Elyen felt the significance before fully understanding it.</w:t>
+      </w:r>
+    </w:p>
+    <w:p>
+      <w:r>
+        <w:t xml:space="preserve">Creation had histories older than worlds.</w:t>
+      </w:r>
+    </w:p>
+    <w:p>
+      <w:r>
+        <w:t xml:space="preserve">Older than stars.</w:t>
+      </w:r>
+    </w:p>
+    <w:p>
+      <w:r>
+        <w:t xml:space="preserve">Older than form.</w:t>
+      </w:r>
+    </w:p>
+    <w:p>
+      <w:r>
+        <w:t xml:space="preserve">The observers were not merely leaving.</w:t>
+      </w:r>
+    </w:p>
+    <w:p>
+      <w:r>
+        <w:t xml:space="preserve">They were returning to a state that preceded the structures now under threat.</w:t>
+      </w:r>
+    </w:p>
+    <w:p>
+      <w:r>
+        <w:t xml:space="preserve">The exodus was not escape.</w:t>
+      </w:r>
+    </w:p>
+    <w:p>
+      <w:r>
+        <w:t xml:space="preserve">It was remembrance.</w:t>
+      </w:r>
+    </w:p>
+    <w:p>
+      <w:r>
+        <w:t xml:space="preserve">A return to origins.</w:t>
+      </w:r>
+    </w:p>
+    <w:p>
+      <w:r>
+        <w:t xml:space="preserve">The creature looked toward the horizon again.</w:t>
+      </w:r>
+    </w:p>
+    <w:p>
+      <w:r>
+        <w:t xml:space="preserve">"They remember the path. "</w:t>
+      </w:r>
+    </w:p>
+    <w:p>
+      <w:r>
+        <w:t xml:space="preserve">The observers continued flowing away.</w:t>
+      </w:r>
+    </w:p>
+    <w:p>
+      <w:r>
+        <w:t xml:space="preserve">And now Elyen noticed something else.</w:t>
+      </w:r>
+    </w:p>
+    <w:p>
+      <w:r>
+        <w:t xml:space="preserve">Among the countless silhouettes, individual lights had begun appearing.</w:t>
+      </w:r>
+    </w:p>
+    <w:p>
+      <w:r>
+        <w:t xml:space="preserve">Small.</w:t>
+      </w:r>
+    </w:p>
+    <w:p>
+      <w:r>
+        <w:t xml:space="preserve">Faint.</w:t>
+      </w:r>
+    </w:p>
+    <w:p>
+      <w:r>
+        <w:t xml:space="preserve">Like lanterns carried through immense distance.</w:t>
+      </w:r>
+    </w:p>
+    <w:p>
+      <w:r>
+        <w:t xml:space="preserve">Every observer held one.</w:t>
+      </w:r>
+    </w:p>
+    <w:p>
+      <w:r>
+        <w:t xml:space="preserve">A spark.</w:t>
+      </w:r>
+    </w:p>
+    <w:p>
+      <w:r>
+        <w:t xml:space="preserve">A memory.</w:t>
+      </w:r>
+    </w:p>
+    <w:p>
+      <w:r>
+        <w:t xml:space="preserve">A fragment preserved.</w:t>
+      </w:r>
+    </w:p>
+    <w:p>
+      <w:r>
+        <w:t xml:space="preserve">The lights formed rivers across the plain.</w:t>
+      </w:r>
+    </w:p>
+    <w:p>
+      <w:r>
+        <w:t xml:space="preserve">Beautiful and heartbreaking.</w:t>
+      </w:r>
+    </w:p>
+    <w:p>
+      <w:r>
+        <w:t xml:space="preserve">Selen stared at them.</w:t>
+      </w:r>
+    </w:p>
+    <w:p>
+      <w:r>
+        <w:t xml:space="preserve">"They're carrying something. "</w:t>
+      </w:r>
+    </w:p>
+    <w:p>
+      <w:r>
+        <w:t xml:space="preserve">"Everything," the creature replied.</w:t>
+      </w:r>
+    </w:p>
+    <w:p>
+      <w:r>
+        <w:t xml:space="preserve">The answer sent a chill through Elyen.</w:t>
+      </w:r>
+    </w:p>
+    <w:p>
+      <w:r>
+        <w:t xml:space="preserve">Not people.</w:t>
+      </w:r>
+    </w:p>
+    <w:p>
+      <w:r>
+        <w:t xml:space="preserve">Not objects.</w:t>
+      </w:r>
+    </w:p>
+    <w:p>
+      <w:r>
+        <w:t xml:space="preserve">Meaning.</w:t>
+      </w:r>
+    </w:p>
+    <w:p>
+      <w:r>
+        <w:t xml:space="preserve">Experience.</w:t>
+      </w:r>
+    </w:p>
+    <w:p>
+      <w:r>
+        <w:t xml:space="preserve">Identity.</w:t>
+      </w:r>
+    </w:p>
+    <w:p>
+      <w:r>
+        <w:t xml:space="preserve">The observers were preserving the distinctions the foreign voice threatened to erase.</w:t>
+      </w:r>
+    </w:p>
+    <w:p>
+      <w:r>
+        <w:t xml:space="preserve">Every story.</w:t>
+      </w:r>
+    </w:p>
+    <w:p>
+      <w:r>
+        <w:t xml:space="preserve">Every choice.</w:t>
+      </w:r>
+    </w:p>
+    <w:p>
+      <w:r>
+        <w:t xml:space="preserve">Every separate life.</w:t>
+      </w:r>
+    </w:p>
+    <w:p>
+      <w:r>
+        <w:t xml:space="preserve">Gathered and carried toward whatever lay beyond the visible horizon.</w:t>
+      </w:r>
+    </w:p>
+    <w:p>
+      <w:r>
+        <w:t xml:space="preserve">The pressure beyond the boundary intensified.</w:t>
+      </w:r>
+    </w:p>
+    <w:p>
+      <w:r>
+        <w:t xml:space="preserve">This time Elyen staggered.</w:t>
+      </w:r>
+    </w:p>
+    <w:p>
+      <w:r>
+        <w:t xml:space="preserve">For a brief instant he could not distinguish his own thoughts from Selen's.</w:t>
+      </w:r>
+    </w:p>
+    <w:p>
+      <w:r>
+        <w:t xml:space="preserve">Memories overlapped.</w:t>
+      </w:r>
+    </w:p>
+    <w:p>
+      <w:r>
+        <w:t xml:space="preserve">Perspectives merged.</w:t>
+      </w:r>
+    </w:p>
+    <w:p>
+      <w:r>
+        <w:t xml:space="preserve">He saw through her eyes.</w:t>
+      </w:r>
+    </w:p>
+    <w:p>
+      <w:r>
+        <w:t xml:space="preserve">A thousand thresholds crossed.</w:t>
+      </w:r>
+    </w:p>
+    <w:p>
+      <w:r>
+        <w:t xml:space="preserve">A loneliness hidden beneath determination.</w:t>
+      </w:r>
+    </w:p>
+    <w:p>
+      <w:r>
+        <w:t xml:space="preserve">Then separation returned.</w:t>
+      </w:r>
+    </w:p>
+    <w:p>
+      <w:r>
+        <w:t xml:space="preserve">He nearly fell.</w:t>
+      </w:r>
+    </w:p>
+    <w:p>
+      <w:r>
+        <w:t xml:space="preserve">Selen steadied herself as well.</w:t>
+      </w:r>
+    </w:p>
+    <w:p>
+      <w:r>
+        <w:t xml:space="preserve">"We're running out of time. "</w:t>
+      </w:r>
+    </w:p>
+    <w:p>
+      <w:r>
+        <w:t xml:space="preserve">The creature nodded.</w:t>
+      </w:r>
+    </w:p>
+    <w:p>
+      <w:r>
+        <w:t xml:space="preserve">"Yes. "</w:t>
+      </w:r>
+    </w:p>
+    <w:p>
+      <w:r>
+        <w:t xml:space="preserve">The rain began moving faster.</w:t>
+      </w:r>
+    </w:p>
+    <w:p>
+      <w:r>
+        <w:t xml:space="preserve">Not falling.</w:t>
+      </w:r>
+    </w:p>
+    <w:p>
+      <w:r>
+        <w:t xml:space="preserve">Migrating.</w:t>
+      </w:r>
+    </w:p>
+    <w:p>
+      <w:r>
+        <w:t xml:space="preserve">Millions upon millions of suspended droplets drifting together.</w:t>
+      </w:r>
+    </w:p>
+    <w:p>
+      <w:r>
+        <w:t xml:space="preserve">Every reflection inside them remained intact.</w:t>
+      </w:r>
+    </w:p>
+    <w:p>
+      <w:r>
+        <w:t xml:space="preserve">Worlds carried within worlds.</w:t>
+      </w:r>
+    </w:p>
+    <w:p>
+      <w:r>
+        <w:t xml:space="preserve">Memories refusing dissolution.</w:t>
+      </w:r>
+    </w:p>
+    <w:p>
+      <w:r>
+        <w:t xml:space="preserve">The sight transformed the sky into a flowing ocean.</w:t>
+      </w:r>
+    </w:p>
+    <w:p>
+      <w:r>
+        <w:t xml:space="preserve">An impossible migration overhead.</w:t>
+      </w:r>
+    </w:p>
+    <w:p>
+      <w:r>
+        <w:t xml:space="preserve">Elyen watched in silence.</w:t>
+      </w:r>
+    </w:p>
+    <w:p>
+      <w:r>
+        <w:t xml:space="preserve">Then something caught his attention.</w:t>
+      </w:r>
+    </w:p>
+    <w:p>
+      <w:r>
+        <w:t xml:space="preserve">One droplet hovered before him.</w:t>
+      </w:r>
+    </w:p>
+    <w:p>
+      <w:r>
+        <w:t xml:space="preserve">Closer than the others.</w:t>
+      </w:r>
+    </w:p>
+    <w:p>
+      <w:r>
+        <w:t xml:space="preserve">Within its reflection he saw a city.</w:t>
+      </w:r>
+    </w:p>
+    <w:p>
+      <w:r>
+        <w:t xml:space="preserve">Not one he recognized.</w:t>
+      </w:r>
+    </w:p>
+    <w:p>
+      <w:r>
+        <w:t xml:space="preserve">Towering structures curved toward a golden sky.</w:t>
+      </w:r>
+    </w:p>
+    <w:p>
+      <w:r>
+        <w:t xml:space="preserve">Crowds moved through luminous streets.</w:t>
+      </w:r>
+    </w:p>
+    <w:p>
+      <w:r>
+        <w:t xml:space="preserve">Lives continuing.</w:t>
+      </w:r>
+    </w:p>
+    <w:p>
+      <w:r>
+        <w:t xml:space="preserve">Unaware.</w:t>
+      </w:r>
+    </w:p>
+    <w:p>
+      <w:r>
+        <w:t xml:space="preserve">The droplet drifted away.</w:t>
+      </w:r>
+    </w:p>
+    <w:p>
+      <w:r>
+        <w:t xml:space="preserve">Another replaced it.</w:t>
+      </w:r>
+    </w:p>
+    <w:p>
+      <w:r>
+        <w:t xml:space="preserve">A forest beneath silver moons.</w:t>
+      </w:r>
+    </w:p>
+    <w:p>
+      <w:r>
+        <w:t xml:space="preserve">Then another.</w:t>
+      </w:r>
+    </w:p>
+    <w:p>
+      <w:r>
+        <w:t xml:space="preserve">A desert sea.</w:t>
+      </w:r>
+    </w:p>
+    <w:p>
+      <w:r>
+        <w:t xml:space="preserve">Another.</w:t>
+      </w:r>
+    </w:p>
+    <w:p>
+      <w:r>
+        <w:t xml:space="preserve">A world composed entirely of crystal.</w:t>
+      </w:r>
+    </w:p>
+    <w:p>
+      <w:r>
+        <w:t xml:space="preserve">Each reflection held a complete reality.</w:t>
+      </w:r>
+    </w:p>
+    <w:p>
+      <w:r>
+        <w:t xml:space="preserve">Each was moving.</w:t>
+      </w:r>
+    </w:p>
+    <w:p>
+      <w:r>
+        <w:t xml:space="preserve">The exodus was larger than observers.</w:t>
+      </w:r>
+    </w:p>
+    <w:p>
+      <w:r>
+        <w:t xml:space="preserve">Larger than this plain.</w:t>
+      </w:r>
+    </w:p>
+    <w:p>
+      <w:r>
+        <w:t xml:space="preserve">Entire civilizations were being guided elsewhere.</w:t>
+      </w:r>
+    </w:p>
+    <w:p>
+      <w:r>
+        <w:t xml:space="preserve">Not physically.</w:t>
+      </w:r>
+    </w:p>
+    <w:p>
+      <w:r>
+        <w:t xml:space="preserve">Fundamentally.</w:t>
+      </w:r>
+    </w:p>
+    <w:p>
+      <w:r>
+        <w:t xml:space="preserve">Shifted through the deeper architecture of existence.</w:t>
+      </w:r>
+    </w:p>
+    <w:p>
+      <w:r>
+        <w:t xml:space="preserve">The Nexus had become a road.</w:t>
+      </w:r>
+    </w:p>
+    <w:p>
+      <w:r>
+        <w:t xml:space="preserve">And all creation was beginning to travel.</w:t>
+      </w:r>
+    </w:p>
+    <w:p>
+      <w:r>
+        <w:t xml:space="preserve">Selen took a slow breath.</w:t>
+      </w:r>
+    </w:p>
+    <w:p>
+      <w:r>
+        <w:t xml:space="preserve">"Can it succeed? "</w:t>
+      </w:r>
+    </w:p>
+    <w:p>
+      <w:r>
+        <w:t xml:space="preserve">The creature was silent for several moments.</w:t>
+      </w:r>
+    </w:p>
+    <w:p>
+      <w:r>
+        <w:t xml:space="preserve">Then it answered honestly.</w:t>
+      </w:r>
+    </w:p>
+    <w:p>
+      <w:r>
+        <w:t xml:space="preserve">"I don't know. "</w:t>
+      </w:r>
+    </w:p>
+    <w:p>
+      <w:r>
+        <w:t xml:space="preserve">The admission carried more weight than certainty.</w:t>
+      </w:r>
+    </w:p>
+    <w:p>
+      <w:r>
+        <w:t xml:space="preserve">Because until now the creature had spoken with the authority of memory itself.</w:t>
+      </w:r>
+    </w:p>
+    <w:p>
+      <w:r>
+        <w:t xml:space="preserve">If even it did not know the outcome...</w:t>
+      </w:r>
+    </w:p>
+    <w:p>
+      <w:r>
+        <w:t xml:space="preserve">Then nobody did.</w:t>
+      </w:r>
+    </w:p>
+    <w:p>
+      <w:r>
+        <w:t xml:space="preserve">The observer river reached the far horizon.</w:t>
+      </w:r>
+    </w:p>
+    <w:p>
+      <w:r>
+        <w:t xml:space="preserve">There, reality curved.</w:t>
+      </w:r>
+    </w:p>
+    <w:p>
+      <w:r>
+        <w:t xml:space="preserve">Not downward.</w:t>
+      </w:r>
+    </w:p>
+    <w:p>
+      <w:r>
+        <w:t xml:space="preserve">Inward.</w:t>
+      </w:r>
+    </w:p>
+    <w:p>
+      <w:r>
+        <w:t xml:space="preserve">Distance folding into a destination beyond ordinary perception.</w:t>
+      </w:r>
+    </w:p>
+    <w:p>
+      <w:r>
+        <w:t xml:space="preserve">The first silhouettes crossed the threshold.</w:t>
+      </w:r>
+    </w:p>
+    <w:p>
+      <w:r>
+        <w:t xml:space="preserve">And vanished.</w:t>
+      </w:r>
+    </w:p>
+    <w:p>
+      <w:r>
+        <w:t xml:space="preserve">Not erased.</w:t>
+      </w:r>
+    </w:p>
+    <w:p>
+      <w:r>
+        <w:t xml:space="preserve">Gone elsewhere.</w:t>
+      </w:r>
+    </w:p>
+    <w:p>
+      <w:r>
+        <w:t xml:space="preserve">A pulse spread through the plain.</w:t>
+      </w:r>
+    </w:p>
+    <w:p>
+      <w:r>
+        <w:t xml:space="preserve">Warm.</w:t>
+      </w:r>
+    </w:p>
+    <w:p>
+      <w:r>
+        <w:t xml:space="preserve">Gentle.</w:t>
+      </w:r>
+    </w:p>
+    <w:p>
+      <w:r>
+        <w:t xml:space="preserve">Elyen felt countless voices within it.</w:t>
+      </w:r>
+    </w:p>
+    <w:p>
+      <w:r>
+        <w:t xml:space="preserve">Not words.</w:t>
+      </w:r>
+    </w:p>
+    <w:p>
+      <w:r>
+        <w:t xml:space="preserve">Farewells.</w:t>
+      </w:r>
+    </w:p>
+    <w:p>
+      <w:r>
+        <w:t xml:space="preserve">The first departure had begun.</w:t>
+      </w:r>
+    </w:p>
+    <w:p>
+      <w:r>
+        <w:t xml:space="preserve">The exodus was real.</w:t>
+      </w:r>
+    </w:p>
+    <w:p>
+      <w:r>
+        <w:t xml:space="preserve">The creature stepped forward again.</w:t>
+      </w:r>
+    </w:p>
+    <w:p>
+      <w:r>
+        <w:t xml:space="preserve">This time Elyen did not stop it.</w:t>
+      </w:r>
+    </w:p>
+    <w:p>
+      <w:r>
+        <w:t xml:space="preserve">Neither did Selen.</w:t>
+      </w:r>
+    </w:p>
+    <w:p>
+      <w:r>
+        <w:t xml:space="preserve">All three watched as more observers crossed the unseen threshold.</w:t>
+      </w:r>
+    </w:p>
+    <w:p>
+      <w:r>
+        <w:t xml:space="preserve">More lights disappeared beyond the curve of reality.</w:t>
+      </w:r>
+    </w:p>
+    <w:p>
+      <w:r>
+        <w:t xml:space="preserve">The flow never slowed.</w:t>
+      </w:r>
+    </w:p>
+    <w:p>
+      <w:r>
+        <w:t xml:space="preserve">An endless procession.</w:t>
+      </w:r>
+    </w:p>
+    <w:p>
+      <w:r>
+        <w:t xml:space="preserve">A migration measured not in bodies but in histories.</w:t>
+      </w:r>
+    </w:p>
+    <w:p>
+      <w:r>
+        <w:t xml:space="preserve">The foreign pressure surged violently.</w:t>
+      </w:r>
+    </w:p>
+    <w:p>
+      <w:r>
+        <w:t xml:space="preserve">The horizon fractured.</w:t>
+      </w:r>
+    </w:p>
+    <w:p>
+      <w:r>
+        <w:t xml:space="preserve">Entire sections of distance collapsed.</w:t>
+      </w:r>
+    </w:p>
+    <w:p>
+      <w:r>
+        <w:t xml:space="preserve">The plain shook.</w:t>
+      </w:r>
+    </w:p>
+    <w:p>
+      <w:r>
+        <w:t xml:space="preserve">Flowers uprooted themselves.</w:t>
+      </w:r>
+    </w:p>
+    <w:p>
+      <w:r>
+        <w:t xml:space="preserve">Not torn free.</w:t>
+      </w:r>
+    </w:p>
+    <w:p>
+      <w:r>
+        <w:t xml:space="preserve">Released.</w:t>
+      </w:r>
+    </w:p>
+    <w:p>
+      <w:r>
+        <w:t xml:space="preserve">Their roots withdrew from the ground and transformed into threads of light.</w:t>
+      </w:r>
+    </w:p>
+    <w:p>
+      <w:r>
+        <w:t xml:space="preserve">The blossoms rose into the air.</w:t>
+      </w:r>
+    </w:p>
+    <w:p>
+      <w:r>
+        <w:t xml:space="preserve">Millions of them.</w:t>
+      </w:r>
+    </w:p>
+    <w:p>
+      <w:r>
+        <w:t xml:space="preserve">Joining the moving rain.</w:t>
+      </w:r>
+    </w:p>
+    <w:p>
+      <w:r>
+        <w:t xml:space="preserve">Joining the current heading away.</w:t>
+      </w:r>
+    </w:p>
+    <w:p>
+      <w:r>
+        <w:t xml:space="preserve">Selen laughed softly.</w:t>
+      </w:r>
+    </w:p>
+    <w:p>
+      <w:r>
+        <w:t xml:space="preserve">The sound surprised Elyen.</w:t>
+      </w:r>
+    </w:p>
+    <w:p>
+      <w:r>
+        <w:t xml:space="preserve">Not because it was joyful.</w:t>
+      </w:r>
+    </w:p>
+    <w:p>
+      <w:r>
+        <w:t xml:space="preserve">Because it contained wonder.</w:t>
+      </w:r>
+    </w:p>
+    <w:p>
+      <w:r>
+        <w:t xml:space="preserve">"They're choosing. "</w:t>
+      </w:r>
+    </w:p>
+    <w:p>
+      <w:r>
+        <w:t xml:space="preserve">The flowers ascended higher.</w:t>
+      </w:r>
+    </w:p>
+    <w:p>
+      <w:r>
+        <w:t xml:space="preserve">Every petal shining.</w:t>
+      </w:r>
+    </w:p>
+    <w:p>
+      <w:r>
+        <w:t xml:space="preserve">Every color restored.</w:t>
+      </w:r>
+    </w:p>
+    <w:p>
+      <w:r>
+        <w:t xml:space="preserve">Perhaps colors had never vanished at all.</w:t>
+      </w:r>
+    </w:p>
+    <w:p>
+      <w:r>
+        <w:t xml:space="preserve">Perhaps they had simply hidden until movement became possible.</w:t>
+      </w:r>
+    </w:p>
+    <w:p>
+      <w:r>
+        <w:t xml:space="preserve">The sky filled with drifting blooms.</w:t>
+      </w:r>
+    </w:p>
+    <w:p>
+      <w:r>
+        <w:t xml:space="preserve">A living constellation.</w:t>
+      </w:r>
+    </w:p>
+    <w:p>
+      <w:r>
+        <w:t xml:space="preserve">The creature smiled.</w:t>
+      </w:r>
+    </w:p>
+    <w:p>
+      <w:r>
+        <w:t xml:space="preserve">Its first true smile.</w:t>
+      </w:r>
+    </w:p>
+    <w:p>
+      <w:r>
+        <w:t xml:space="preserve">"They remember too. "</w:t>
+      </w:r>
+    </w:p>
+    <w:p>
+      <w:r>
+        <w:t xml:space="preserve">The sight stirred something deep within Elyen.</w:t>
+      </w:r>
+    </w:p>
+    <w:p>
+      <w:r>
+        <w:t xml:space="preserve">A sensation he could not name.</w:t>
+      </w:r>
+    </w:p>
+    <w:p>
+      <w:r>
+        <w:t xml:space="preserve">Recognition.</w:t>
+      </w:r>
+    </w:p>
+    <w:p>
+      <w:r>
+        <w:t xml:space="preserve">As if the exodus echoed a truth embedded within every living thing.</w:t>
+      </w:r>
+    </w:p>
+    <w:p>
+      <w:r>
+        <w:t xml:space="preserve">The desire to continue.</w:t>
+      </w:r>
+    </w:p>
+    <w:p>
+      <w:r>
+        <w:t xml:space="preserve">To carry meaning forward.</w:t>
+      </w:r>
+    </w:p>
+    <w:p>
+      <w:r>
+        <w:t xml:space="preserve">To refuse ending by becoming something new.</w:t>
+      </w:r>
+    </w:p>
+    <w:p>
+      <w:r>
+        <w:t xml:space="preserve">The pressure beyond the boundary struck again.</w:t>
+      </w:r>
+    </w:p>
+    <w:p>
+      <w:r>
+        <w:t xml:space="preserve">This time a section of sky disappeared.</w:t>
+      </w:r>
+    </w:p>
+    <w:p>
+      <w:r>
+        <w:t xml:space="preserve">The place where it vanished did not become empty.</w:t>
+      </w:r>
+    </w:p>
+    <w:p>
+      <w:r>
+        <w:t xml:space="preserve">It became singular.</w:t>
+      </w:r>
+    </w:p>
+    <w:p>
+      <w:r>
+        <w:t xml:space="preserve">One point replacing countless others.</w:t>
+      </w:r>
+    </w:p>
+    <w:p>
+      <w:r>
+        <w:t xml:space="preserve">Elyen understood the danger immediately.</w:t>
+      </w:r>
+    </w:p>
+    <w:p>
+      <w:r>
+        <w:t xml:space="preserve">The voice was no longer merely testing.</w:t>
+      </w:r>
+    </w:p>
+    <w:p>
+      <w:r>
+        <w:t xml:space="preserve">It was entering.</w:t>
+      </w:r>
+    </w:p>
+    <w:p>
+      <w:r>
+        <w:t xml:space="preserve">The boundary had begun to fail.</w:t>
+      </w:r>
+    </w:p>
+    <w:p>
+      <w:r>
+        <w:t xml:space="preserve">Selen saw it as well.</w:t>
+      </w:r>
+    </w:p>
+    <w:p>
+      <w:r>
+        <w:t xml:space="preserve">"What happens when it arrives? "</w:t>
+      </w:r>
+    </w:p>
+    <w:p>
+      <w:r>
+        <w:t xml:space="preserve">The creature's smile faded.</w:t>
+      </w:r>
+    </w:p>
+    <w:p>
+      <w:r>
+        <w:t xml:space="preserve">"Nothing ends. "</w:t>
+      </w:r>
+    </w:p>
+    <w:p>
+      <w:r>
+        <w:t xml:space="preserve">The answer sounded reassuring until it continued.</w:t>
+      </w:r>
+    </w:p>
+    <w:p>
+      <w:r>
+        <w:t xml:space="preserve">"Nothing remains itself. "</w:t>
+      </w:r>
+    </w:p>
+    <w:p>
+      <w:r>
+        <w:t xml:space="preserve">Silence followed.</w:t>
+      </w:r>
+    </w:p>
+    <w:p>
+      <w:r>
+        <w:t xml:space="preserve">The distinction mattered.</w:t>
+      </w:r>
+    </w:p>
+    <w:p>
+      <w:r>
+        <w:t xml:space="preserve">A great deal.</w:t>
+      </w:r>
+    </w:p>
+    <w:p>
+      <w:r>
+        <w:t xml:space="preserve">The voice offered eternal unity.</w:t>
+      </w:r>
+    </w:p>
+    <w:p>
+      <w:r>
+        <w:t xml:space="preserve">No death.</w:t>
+      </w:r>
+    </w:p>
+    <w:p>
+      <w:r>
+        <w:t xml:space="preserve">No loss.</w:t>
+      </w:r>
+    </w:p>
+    <w:p>
+      <w:r>
+        <w:t xml:space="preserve">No loneliness.</w:t>
+      </w:r>
+    </w:p>
+    <w:p>
+      <w:r>
+        <w:t xml:space="preserve">But also no separation.</w:t>
+      </w:r>
+    </w:p>
+    <w:p>
+      <w:r>
+        <w:t xml:space="preserve">No individuality.</w:t>
+      </w:r>
+    </w:p>
+    <w:p>
+      <w:r>
+        <w:t xml:space="preserve">No becoming.</w:t>
+      </w:r>
+    </w:p>
+    <w:p>
+      <w:r>
+        <w:t xml:space="preserve">No journeys.</w:t>
+      </w:r>
+    </w:p>
+    <w:p>
+      <w:r>
+        <w:t xml:space="preserve">Only completeness.</w:t>
+      </w:r>
+    </w:p>
+    <w:p>
+      <w:r>
+        <w:t xml:space="preserve">Only one.</w:t>
+      </w:r>
+    </w:p>
+    <w:p>
+      <w:r>
+        <w:t xml:space="preserve">The observers chose differently.</w:t>
+      </w:r>
+    </w:p>
+    <w:p>
+      <w:r>
+        <w:t xml:space="preserve">The flowers chose differently.</w:t>
+      </w:r>
+    </w:p>
+    <w:p>
+      <w:r>
+        <w:t xml:space="preserve">The rain itself chose differently.</w:t>
+      </w:r>
+    </w:p>
+    <w:p>
+      <w:r>
+        <w:t xml:space="preserve">Not because separation was painless.</w:t>
+      </w:r>
+    </w:p>
+    <w:p>
+      <w:r>
+        <w:t xml:space="preserve">Because it mattered.</w:t>
+      </w:r>
+    </w:p>
+    <w:p>
+      <w:r>
+        <w:t xml:space="preserve">Elyen finally understood what the exodus protected.</w:t>
+      </w:r>
+    </w:p>
+    <w:p>
+      <w:r>
+        <w:t xml:space="preserve">Not existence.</w:t>
+      </w:r>
+    </w:p>
+    <w:p>
+      <w:r>
+        <w:t xml:space="preserve">Difference.</w:t>
+      </w:r>
+    </w:p>
+    <w:p>
+      <w:r>
+        <w:t xml:space="preserve">The right for one thing to remain distinct from another.</w:t>
+      </w:r>
+    </w:p>
+    <w:p>
+      <w:r>
+        <w:t xml:space="preserve">The space in which stories could happen.</w:t>
+      </w:r>
+    </w:p>
+    <w:p>
+      <w:r>
+        <w:t xml:space="preserve">The creature started walking once more.</w:t>
+      </w:r>
+    </w:p>
+    <w:p>
+      <w:r>
+        <w:t xml:space="preserve">This time the path ahead brightened.</w:t>
+      </w:r>
+    </w:p>
+    <w:p>
+      <w:r>
+        <w:t xml:space="preserve">A road appeared across the plain.</w:t>
+      </w:r>
+    </w:p>
+    <w:p>
+      <w:r>
+        <w:t xml:space="preserve">Not built.</w:t>
+      </w:r>
+    </w:p>
+    <w:p>
+      <w:r>
+        <w:t xml:space="preserve">Revealed.</w:t>
+      </w:r>
+    </w:p>
+    <w:p>
+      <w:r>
+        <w:t xml:space="preserve">Countless footprints already marked its surface.</w:t>
+      </w:r>
+    </w:p>
+    <w:p>
+      <w:r>
+        <w:t xml:space="preserve">Observers.</w:t>
+      </w:r>
+    </w:p>
+    <w:p>
+      <w:r>
+        <w:t xml:space="preserve">Travelers.</w:t>
+      </w:r>
+    </w:p>
+    <w:p>
+      <w:r>
+        <w:t xml:space="preserve">Lives older than memory.</w:t>
+      </w:r>
+    </w:p>
+    <w:p>
+      <w:r>
+        <w:t xml:space="preserve">Selen looked at Elyen.</w:t>
+      </w:r>
+    </w:p>
+    <w:p>
+      <w:r>
+        <w:t xml:space="preserve">The question remained unspoken.</w:t>
+      </w:r>
+    </w:p>
+    <w:p>
+      <w:r>
+        <w:t xml:space="preserve">Do we follow?</w:t>
+      </w:r>
+    </w:p>
+    <w:p>
+      <w:r>
+        <w:t xml:space="preserve">He already knew the answer.</w:t>
+      </w:r>
+    </w:p>
+    <w:p>
+      <w:r>
+        <w:t xml:space="preserve">There was nowhere else to go.</w:t>
+      </w:r>
+    </w:p>
+    <w:p>
+      <w:r>
+        <w:t xml:space="preserve">Behind them the boundary weakened.</w:t>
+      </w:r>
+    </w:p>
+    <w:p>
+      <w:r>
+        <w:t xml:space="preserve">Ahead of them the road unfolded.</w:t>
+      </w:r>
+    </w:p>
+    <w:p>
+      <w:r>
+        <w:t xml:space="preserve">The exodus had begun.</w:t>
+      </w:r>
+    </w:p>
+    <w:p>
+      <w:r>
+        <w:t xml:space="preserve">And somehow they stood near its source.</w:t>
+      </w:r>
+    </w:p>
+    <w:p>
+      <w:r>
+        <w:t xml:space="preserve">The creature reached out.</w:t>
+      </w:r>
+    </w:p>
+    <w:p>
+      <w:r>
+        <w:t xml:space="preserve">Not toward Selen.</w:t>
+      </w:r>
+    </w:p>
+    <w:p>
+      <w:r>
+        <w:t xml:space="preserve">Toward Elyen.</w:t>
+      </w:r>
+    </w:p>
+    <w:p>
+      <w:r>
+        <w:t xml:space="preserve">After a brief hesitation, he accepted the offered hand.</w:t>
+      </w:r>
+    </w:p>
+    <w:p>
+      <w:r>
+        <w:t xml:space="preserve">It felt warm.</w:t>
+      </w:r>
+    </w:p>
+    <w:p>
+      <w:r>
+        <w:t xml:space="preserve">Real.</w:t>
+      </w:r>
+    </w:p>
+    <w:p>
+      <w:r>
+        <w:t xml:space="preserve">Anchored.</w:t>
+      </w:r>
+    </w:p>
+    <w:p>
+      <w:r>
+        <w:t xml:space="preserve">The road brightened.</w:t>
+      </w:r>
+    </w:p>
+    <w:p>
+      <w:r>
+        <w:t xml:space="preserve">Far beyond the horizon, immense lights appeared.</w:t>
+      </w:r>
+    </w:p>
+    <w:p>
+      <w:r>
+        <w:t xml:space="preserve">Not stars.</w:t>
+      </w:r>
+    </w:p>
+    <w:p>
+      <w:r>
+        <w:t xml:space="preserve">Gateways.</w:t>
+      </w:r>
+    </w:p>
+    <w:p>
+      <w:r>
+        <w:t xml:space="preserve">Thousands of them.</w:t>
+      </w:r>
+    </w:p>
+    <w:p>
+      <w:r>
+        <w:t xml:space="preserve">Opening one after another.</w:t>
+      </w:r>
+    </w:p>
+    <w:p>
+      <w:r>
+        <w:t xml:space="preserve">The Nexus responding.</w:t>
+      </w:r>
+    </w:p>
+    <w:p>
+      <w:r>
+        <w:t xml:space="preserve">Preparing routes for what was coming.</w:t>
+      </w:r>
+    </w:p>
+    <w:p>
+      <w:r>
+        <w:t xml:space="preserve">Elyen felt the scale of it.</w:t>
+      </w:r>
+    </w:p>
+    <w:p>
+      <w:r>
+        <w:t xml:space="preserve">Worlds moving.</w:t>
+      </w:r>
+    </w:p>
+    <w:p>
+      <w:r>
+        <w:t xml:space="preserve">Histories transferring.</w:t>
+      </w:r>
+    </w:p>
+    <w:p>
+      <w:r>
+        <w:t xml:space="preserve">Entire branches of reality shifting toward unknown destinations.</w:t>
+      </w:r>
+    </w:p>
+    <w:p>
+      <w:r>
+        <w:t xml:space="preserve">A migration beyond comprehension.</w:t>
+      </w:r>
+    </w:p>
+    <w:p>
+      <w:r>
+        <w:t xml:space="preserve">Yet the road beneath his feet remained simple.</w:t>
+      </w:r>
+    </w:p>
+    <w:p>
+      <w:r>
+        <w:t xml:space="preserve">One step.</w:t>
+      </w:r>
+    </w:p>
+    <w:p>
+      <w:r>
+        <w:t xml:space="preserve">Then another.</w:t>
+      </w:r>
+    </w:p>
+    <w:p>
+      <w:r>
+        <w:t xml:space="preserve">That was how every journey began.</w:t>
+      </w:r>
+    </w:p>
+    <w:p>
+      <w:r>
+        <w:t xml:space="preserve">The observer procession continued ahead.</w:t>
+      </w:r>
+    </w:p>
+    <w:p>
+      <w:r>
+        <w:t xml:space="preserve">The rain flowed overhead.</w:t>
+      </w:r>
+    </w:p>
+    <w:p>
+      <w:r>
+        <w:t xml:space="preserve">The flowers drifted among the clouds of reflections.</w:t>
+      </w:r>
+    </w:p>
+    <w:p>
+      <w:r>
+        <w:t xml:space="preserve">And behind them, the voice beyond the boundary finally pushed far enough through creation for the plain itself to hear it clearly.</w:t>
+      </w:r>
+    </w:p>
+    <w:p>
+      <w:r>
+        <w:t xml:space="preserve">No separation.</w:t>
+      </w:r>
+    </w:p>
+    <w:p>
+      <w:r>
+        <w:t xml:space="preserve">The words rolled across reality like an incoming tide.</w:t>
+      </w:r>
+    </w:p>
+    <w:p>
+      <w:r>
+        <w:t xml:space="preserve">The road answered.</w:t>
+      </w:r>
+    </w:p>
+    <w:p>
+      <w:r>
+        <w:t xml:space="preserve">Not with sound.</w:t>
+      </w:r>
+    </w:p>
+    <w:p>
+      <w:r>
+        <w:t xml:space="preserve">With motion.</w:t>
+      </w:r>
+    </w:p>
+    <w:p>
+      <w:r>
+        <w:t xml:space="preserve">The exodus accelerated.</w:t>
+      </w:r>
+    </w:p>
+    <w:p>
+      <w:r>
+        <w:t xml:space="preserve">The observers walked faster.</w:t>
+      </w:r>
+    </w:p>
+    <w:p>
+      <w:r>
+        <w:t xml:space="preserve">The lights ahead widened.</w:t>
+      </w:r>
+    </w:p>
+    <w:p>
+      <w:r>
+        <w:t xml:space="preserve">The pathways of the Nexus blazed across existence.</w:t>
+      </w:r>
+    </w:p>
+    <w:p>
+      <w:r>
+        <w:t xml:space="preserve">And somewhere beyond the visible horizon, something vast awakened in response to the migration.</w:t>
+      </w:r>
+    </w:p>
+    <w:p>
+      <w:r>
+        <w:t xml:space="preserve">Something waiting at the end of the remembered path.</w:t>
+      </w:r>
+    </w:p>
+    <w:p>
+      <w:r>
+        <w:t xml:space="preserve">The creature's expression changed.</w:t>
+      </w:r>
+    </w:p>
+    <w:p>
+      <w:r>
+        <w:t xml:space="preserve">For the first time since its awakening, uncertainty entered its eyes.</w:t>
+      </w:r>
+    </w:p>
+    <w:p>
+      <w:r>
+        <w:t xml:space="preserve">Elyen noticed immediately.</w:t>
+      </w:r>
+    </w:p>
+    <w:p>
+      <w:r>
+        <w:t xml:space="preserve">"What is it? "</w:t>
+      </w:r>
+    </w:p>
+    <w:p>
+      <w:r>
+        <w:t xml:space="preserve">The creature stared toward the distant lights.</w:t>
+      </w:r>
+    </w:p>
+    <w:p>
+      <w:r>
+        <w:t xml:space="preserve">Toward the destination of the exodus.</w:t>
+      </w:r>
+    </w:p>
+    <w:p>
+      <w:r>
+        <w:t xml:space="preserve">Toward whatever waited beyond the curve of reality.</w:t>
+      </w:r>
+    </w:p>
+    <w:p>
+      <w:r>
+        <w:t xml:space="preserve">Then it whispered a single sentence.</w:t>
+      </w:r>
+    </w:p>
+    <w:p>
+      <w:r>
+        <w:t xml:space="preserve">"They were not supposed to wake yet. "</w:t>
+      </w:r>
+    </w:p>
+    <w:p>
+      <w:r>
+        <w:t xml:space="preserve">The road shuddered.</w:t>
+      </w:r>
+    </w:p>
+    <w:p>
+      <w:r>
+        <w:t xml:space="preserve">Far ahead, one of the immense lights opened completely.</w:t>
+      </w:r>
+    </w:p>
+    <w:p>
+      <w:r>
+        <w:t xml:space="preserve">And something looked back through it. For an instant, Elyen thought the presence beyond the gateway was another observer.</w:t>
+      </w:r>
+    </w:p>
+    <w:p>
+      <w:r>
+        <w:t xml:space="preserve">The resemblance existed only at the level of silhouette.</w:t>
+      </w:r>
+    </w:p>
+    <w:p>
+      <w:r>
+        <w:t xml:space="preserve">A shape.</w:t>
+      </w:r>
+    </w:p>
+    <w:p>
+      <w:r>
+        <w:t xml:space="preserve">A figure.</w:t>
+      </w:r>
+    </w:p>
+    <w:p>
+      <w:r>
+        <w:t xml:space="preserve">Something standing where awareness and distance met.</w:t>
+      </w:r>
+    </w:p>
+    <w:p>
+      <w:r>
+        <w:t xml:space="preserve">Then the illusion shattered.</w:t>
+      </w:r>
+    </w:p>
+    <w:p>
+      <w:r>
+        <w:t xml:space="preserve">Observers watched.</w:t>
+      </w:r>
+    </w:p>
+    <w:p>
+      <w:r>
+        <w:t xml:space="preserve">This thing remembered.</w:t>
+      </w:r>
+    </w:p>
+    <w:p>
+      <w:r>
+        <w:t xml:space="preserve">The difference struck him with physical force.</w:t>
+      </w:r>
+    </w:p>
+    <w:p>
+      <w:r>
+        <w:t xml:space="preserve">The opened light stretched across the horizon like a wound in reality. Within it stood a vast darkness threaded with veins of pale gold. Its outline shifted continuously. One moment it resembled a towering human form. The next it seemed more akin to a forest composed of moving stars. Then it became neither.</w:t>
+      </w:r>
+    </w:p>
+    <w:p>
+      <w:r>
+        <w:t xml:space="preserve">Every shape was only a translation.</w:t>
+      </w:r>
+    </w:p>
+    <w:p>
+      <w:r>
+        <w:t xml:space="preserve">Something ancient forcing itself into forms the current universe could understand.</w:t>
+      </w:r>
+    </w:p>
+    <w:p>
+      <w:r>
+        <w:t xml:space="preserve">The road beneath their feet vibrated.</w:t>
+      </w:r>
+    </w:p>
+    <w:p>
+      <w:r>
+        <w:t xml:space="preserve">The observer procession slowed.</w:t>
+      </w:r>
+    </w:p>
+    <w:p>
+      <w:r>
+        <w:t xml:space="preserve">Not from fear.</w:t>
+      </w:r>
+    </w:p>
+    <w:p>
+      <w:r>
+        <w:t xml:space="preserve">From recognition.</w:t>
+      </w:r>
+    </w:p>
+    <w:p>
+      <w:r>
+        <w:t xml:space="preserve">The countless silhouettes carrying their lights turned toward the distant gateway.</w:t>
+      </w:r>
+    </w:p>
+    <w:p>
+      <w:r>
+        <w:t xml:space="preserve">And bowed.</w:t>
+      </w:r>
+    </w:p>
+    <w:p>
+      <w:r>
+        <w:t xml:space="preserve">A murmur moved through the exodus.</w:t>
+      </w:r>
+    </w:p>
+    <w:p>
+      <w:r>
+        <w:t xml:space="preserve">Not sound.</w:t>
+      </w:r>
+    </w:p>
+    <w:p>
+      <w:r>
+        <w:t xml:space="preserve">Acknowledgment.</w:t>
+      </w:r>
+    </w:p>
+    <w:p>
+      <w:r>
+        <w:t xml:space="preserve">The creature beside Elyen lowered its head as well.</w:t>
+      </w:r>
+    </w:p>
+    <w:p>
+      <w:r>
+        <w:t xml:space="preserve">Selen remained still.</w:t>
+      </w:r>
+    </w:p>
+    <w:p>
+      <w:r>
+        <w:t xml:space="preserve">"So they know it. "</w:t>
+      </w:r>
+    </w:p>
+    <w:p>
+      <w:r>
+        <w:t xml:space="preserve">The creature nodded.</w:t>
+      </w:r>
+    </w:p>
+    <w:p>
+      <w:r>
+        <w:t xml:space="preserve">"Yes. "</w:t>
+      </w:r>
+    </w:p>
+    <w:p>
+      <w:r>
+        <w:t xml:space="preserve">"What is it? "</w:t>
+      </w:r>
+    </w:p>
+    <w:p>
+      <w:r>
+        <w:t xml:space="preserve">The answer took time.</w:t>
+      </w:r>
+    </w:p>
+    <w:p>
+      <w:r>
+        <w:t xml:space="preserve">Not because the creature hesitated.</w:t>
+      </w:r>
+    </w:p>
+    <w:p>
+      <w:r>
+        <w:t xml:space="preserve">Because it seemed to be searching through layers of memory buried deeper than language.</w:t>
+      </w:r>
+    </w:p>
+    <w:p>
+      <w:r>
+        <w:t xml:space="preserve">"When movement existed before worlds," it finally said, "there were those who kept the paths. "</w:t>
+      </w:r>
+    </w:p>
+    <w:p>
+      <w:r>
+        <w:t xml:space="preserve">The golden threads within the distant being brightened.</w:t>
+      </w:r>
+    </w:p>
+    <w:p>
+      <w:r>
+        <w:t xml:space="preserve">Entire rivers of light crossed its immense form.</w:t>
+      </w:r>
+    </w:p>
+    <w:p>
+      <w:r>
+        <w:t xml:space="preserve">"The First Guides. "</w:t>
+      </w:r>
+    </w:p>
+    <w:p>
+      <w:r>
+        <w:t xml:space="preserve">Elyen stared.</w:t>
+      </w:r>
+    </w:p>
+    <w:p>
+      <w:r>
+        <w:t xml:space="preserve">The title resonated through him.</w:t>
+      </w:r>
+    </w:p>
+    <w:p>
+      <w:r>
+        <w:t xml:space="preserve">Not as information.</w:t>
+      </w:r>
+    </w:p>
+    <w:p>
+      <w:r>
+        <w:t xml:space="preserve">As truth.</w:t>
+      </w:r>
+    </w:p>
+    <w:p>
+      <w:r>
+        <w:t xml:space="preserve">Something fundamental within existence responded to the words.</w:t>
+      </w:r>
+    </w:p>
+    <w:p>
+      <w:r>
+        <w:t xml:space="preserve">The First Guides.</w:t>
+      </w:r>
+    </w:p>
+    <w:p>
+      <w:r>
+        <w:t xml:space="preserve">Not rulers.</w:t>
+      </w:r>
+    </w:p>
+    <w:p>
+      <w:r>
+        <w:t xml:space="preserve">Not creators.</w:t>
+      </w:r>
+    </w:p>
+    <w:p>
+      <w:r>
+        <w:t xml:space="preserve">Something older.</w:t>
+      </w:r>
+    </w:p>
+    <w:p>
+      <w:r>
+        <w:t xml:space="preserve">Beings whose purpose had emerged before places existed to travel between.</w:t>
+      </w:r>
+    </w:p>
+    <w:p>
+      <w:r>
+        <w:t xml:space="preserve">The gateway widened further.</w:t>
+      </w:r>
+    </w:p>
+    <w:p>
+      <w:r>
+        <w:t xml:space="preserve">The ancient presence stepped forward.</w:t>
+      </w:r>
+    </w:p>
+    <w:p>
+      <w:r>
+        <w:t xml:space="preserve">Not physically.</w:t>
+      </w:r>
+    </w:p>
+    <w:p>
+      <w:r>
+        <w:t xml:space="preserve">Its attention moved closer.</w:t>
+      </w:r>
+    </w:p>
+    <w:p>
+      <w:r>
+        <w:t xml:space="preserve">That alone altered reality.</w:t>
+      </w:r>
+    </w:p>
+    <w:p>
+      <w:r>
+        <w:t xml:space="preserve">New pathways ignited across the sky.</w:t>
+      </w:r>
+    </w:p>
+    <w:p>
+      <w:r>
+        <w:t xml:space="preserve">Routes hidden even from the Nexus revealed themselves.</w:t>
+      </w:r>
+    </w:p>
+    <w:p>
+      <w:r>
+        <w:t xml:space="preserve">Bridges connecting impossible distances unfolded like flowering branches.</w:t>
+      </w:r>
+    </w:p>
+    <w:p>
+      <w:r>
+        <w:t xml:space="preserve">The observer lights brightened in answer.</w:t>
+      </w:r>
+    </w:p>
+    <w:p>
+      <w:r>
+        <w:t xml:space="preserve">Millions of sparks becoming constellations.</w:t>
+      </w:r>
+    </w:p>
+    <w:p>
+      <w:r>
+        <w:t xml:space="preserve">The exodus accelerated again.</w:t>
+      </w:r>
+    </w:p>
+    <w:p>
+      <w:r>
+        <w:t xml:space="preserve">Ahead, the horizon bent more sharply.</w:t>
+      </w:r>
+    </w:p>
+    <w:p>
+      <w:r>
+        <w:t xml:space="preserve">What had seemed like a single destination now revealed itself as countless departures.</w:t>
+      </w:r>
+    </w:p>
+    <w:p>
+      <w:r>
+        <w:t xml:space="preserve">Roads separating.</w:t>
+      </w:r>
+    </w:p>
+    <w:p>
+      <w:r>
+        <w:t xml:space="preserve">Crossing.</w:t>
+      </w:r>
+    </w:p>
+    <w:p>
+      <w:r>
+        <w:t xml:space="preserve">Diverging.</w:t>
+      </w:r>
+    </w:p>
+    <w:p>
+      <w:r>
+        <w:t xml:space="preserve">Each leading toward different regions beyond perception.</w:t>
+      </w:r>
+    </w:p>
+    <w:p>
+      <w:r>
+        <w:t xml:space="preserve">The First Guide had not opened one escape.</w:t>
+      </w:r>
+    </w:p>
+    <w:p>
+      <w:r>
+        <w:t xml:space="preserve">It had opened many.</w:t>
+      </w:r>
+    </w:p>
+    <w:p>
+      <w:r>
+        <w:t xml:space="preserve">The creature's eyes shone with reflected gold.</w:t>
+      </w:r>
+    </w:p>
+    <w:p>
+      <w:r>
+        <w:t xml:space="preserve">"The paths are waking. "</w:t>
+      </w:r>
+    </w:p>
+    <w:p>
+      <w:r>
+        <w:t xml:space="preserve">Behind them, the pressure beyond the boundary surged violently.</w:t>
+      </w:r>
+    </w:p>
+    <w:p>
+      <w:r>
+        <w:t xml:space="preserve">The plain cracked.</w:t>
+      </w:r>
+    </w:p>
+    <w:p>
+      <w:r>
+        <w:t xml:space="preserve">Not the ground.</w:t>
+      </w:r>
+    </w:p>
+    <w:p>
+      <w:r>
+        <w:t xml:space="preserve">Reality itself.</w:t>
+      </w:r>
+    </w:p>
+    <w:p>
+      <w:r>
+        <w:t xml:space="preserve">Lines spread across the air.</w:t>
+      </w:r>
+    </w:p>
+    <w:p>
+      <w:r>
+        <w:t xml:space="preserve">Invisible fractures suddenly outlined by pale radiance.</w:t>
+      </w:r>
+    </w:p>
+    <w:p>
+      <w:r>
+        <w:t xml:space="preserve">Elyen looked back.</w:t>
+      </w:r>
+    </w:p>
+    <w:p>
+      <w:r>
+        <w:t xml:space="preserve">Distance had become unstable.</w:t>
+      </w:r>
+    </w:p>
+    <w:p>
+      <w:r>
+        <w:t xml:space="preserve">Entire sections of the world blurred.</w:t>
+      </w:r>
+    </w:p>
+    <w:p>
+      <w:r>
+        <w:t xml:space="preserve">Separate objects lost definition.</w:t>
+      </w:r>
+    </w:p>
+    <w:p>
+      <w:r>
+        <w:t xml:space="preserve">A flower merged with the shadow beside it.</w:t>
+      </w:r>
+    </w:p>
+    <w:p>
+      <w:r>
+        <w:t xml:space="preserve">A patch of sky became indistinguishable from the horizon beneath.</w:t>
+      </w:r>
+    </w:p>
+    <w:p>
+      <w:r>
+        <w:t xml:space="preserve">The process was subtle.</w:t>
+      </w:r>
+    </w:p>
+    <w:p>
+      <w:r>
+        <w:t xml:space="preserve">And horrifying.</w:t>
+      </w:r>
+    </w:p>
+    <w:p>
+      <w:r>
+        <w:t xml:space="preserve">No separation.</w:t>
+      </w:r>
+    </w:p>
+    <w:p>
+      <w:r>
+        <w:t xml:space="preserve">The voice no longer needed to repeat itself.</w:t>
+      </w:r>
+    </w:p>
+    <w:p>
+      <w:r>
+        <w:t xml:space="preserve">Its intent had become visible.</w:t>
+      </w:r>
+    </w:p>
+    <w:p>
+      <w:r>
+        <w:t xml:space="preserve">Selen's expression hardened.</w:t>
+      </w:r>
+    </w:p>
+    <w:p>
+      <w:r>
+        <w:t xml:space="preserve">"We need to move. "</w:t>
+      </w:r>
+    </w:p>
+    <w:p>
+      <w:r>
+        <w:t xml:space="preserve">This time no one disagreed.</w:t>
+      </w:r>
+    </w:p>
+    <w:p>
+      <w:r>
+        <w:t xml:space="preserve">The road carried them forward.</w:t>
+      </w:r>
+    </w:p>
+    <w:p>
+      <w:r>
+        <w:t xml:space="preserve">At first Elyen thought they were walking.</w:t>
+      </w:r>
+    </w:p>
+    <w:p>
+      <w:r>
+        <w:t xml:space="preserve">Then he realized the path itself was flowing.</w:t>
+      </w:r>
+    </w:p>
+    <w:p>
+      <w:r>
+        <w:t xml:space="preserve">Like a river.</w:t>
+      </w:r>
+    </w:p>
+    <w:p>
+      <w:r>
+        <w:t xml:space="preserve">Not transporting bodies.</w:t>
+      </w:r>
+    </w:p>
+    <w:p>
+      <w:r>
+        <w:t xml:space="preserve">Transporting significance.</w:t>
+      </w:r>
+    </w:p>
+    <w:p>
+      <w:r>
+        <w:t xml:space="preserve">Every step carried them farther than distance alone could explain.</w:t>
+      </w:r>
+    </w:p>
+    <w:p>
+      <w:r>
+        <w:t xml:space="preserve">The observer procession surrounded them now.</w:t>
+      </w:r>
+    </w:p>
+    <w:p>
+      <w:r>
+        <w:t xml:space="preserve">Millions of silhouettes moving in silent purpose.</w:t>
+      </w:r>
+    </w:p>
+    <w:p>
+      <w:r>
+        <w:t xml:space="preserve">For the first time Elyen could see individual differences among them.</w:t>
+      </w:r>
+    </w:p>
+    <w:p>
+      <w:r>
+        <w:t xml:space="preserve">Some appeared tall.</w:t>
+      </w:r>
+    </w:p>
+    <w:p>
+      <w:r>
+        <w:t xml:space="preserve">Others impossibly small.</w:t>
+      </w:r>
+    </w:p>
+    <w:p>
+      <w:r>
+        <w:t xml:space="preserve">A few carried forms that barely resembled living beings at all.</w:t>
+      </w:r>
+    </w:p>
+    <w:p>
+      <w:r>
+        <w:t xml:space="preserve">Yet every observer held a light.</w:t>
+      </w:r>
+    </w:p>
+    <w:p>
+      <w:r>
+        <w:t xml:space="preserve">Every observer protected something unique.</w:t>
+      </w:r>
+    </w:p>
+    <w:p>
+      <w:r>
+        <w:t xml:space="preserve">Memories.</w:t>
+      </w:r>
+    </w:p>
+    <w:p>
+      <w:r>
+        <w:t xml:space="preserve">Stories.</w:t>
+      </w:r>
+    </w:p>
+    <w:p>
+      <w:r>
+        <w:t xml:space="preserve">Worlds.</w:t>
+      </w:r>
+    </w:p>
+    <w:p>
+      <w:r>
+        <w:t xml:space="preserve">The realization settled heavily within him.</w:t>
+      </w:r>
+    </w:p>
+    <w:p>
+      <w:r>
+        <w:t xml:space="preserve">The exodus was not merely migration.</w:t>
+      </w:r>
+    </w:p>
+    <w:p>
+      <w:r>
+        <w:t xml:space="preserve">It was an archive in motion.</w:t>
+      </w:r>
+    </w:p>
+    <w:p>
+      <w:r>
+        <w:t xml:space="preserve">Creation preserving itself by carrying its meaning elsewhere.</w:t>
+      </w:r>
+    </w:p>
+    <w:p>
+      <w:r>
+        <w:t xml:space="preserve">The First Guide watched.</w:t>
+      </w:r>
+    </w:p>
+    <w:p>
+      <w:r>
+        <w:t xml:space="preserve">Far ahead.</w:t>
+      </w:r>
+    </w:p>
+    <w:p>
+      <w:r>
+        <w:t xml:space="preserve">Vast beyond comprehension.</w:t>
+      </w:r>
+    </w:p>
+    <w:p>
+      <w:r>
+        <w:t xml:space="preserve">And another light appeared beside the first gateway.</w:t>
+      </w:r>
+    </w:p>
+    <w:p>
+      <w:r>
+        <w:t xml:space="preserve">Then another.</w:t>
+      </w:r>
+    </w:p>
+    <w:p>
+      <w:r>
+        <w:t xml:space="preserve">Then a fourth.</w:t>
+      </w:r>
+    </w:p>
+    <w:p>
+      <w:r>
+        <w:t xml:space="preserve">Ancient presences stirred behind them.</w:t>
+      </w:r>
+    </w:p>
+    <w:p>
+      <w:r>
+        <w:t xml:space="preserve">Not awakening fully.</w:t>
+      </w:r>
+    </w:p>
+    <w:p>
+      <w:r>
+        <w:t xml:space="preserve">Turning in their sleep.</w:t>
+      </w:r>
+    </w:p>
+    <w:p>
+      <w:r>
+        <w:t xml:space="preserve">Looking toward the migration.</w:t>
+      </w:r>
+    </w:p>
+    <w:p>
+      <w:r>
+        <w:t xml:space="preserve">The creature suddenly stumbled.</w:t>
+      </w:r>
+    </w:p>
+    <w:p>
+      <w:r>
+        <w:t xml:space="preserve">Elyen caught its arm.</w:t>
+      </w:r>
+    </w:p>
+    <w:p>
+      <w:r>
+        <w:t xml:space="preserve">The small dark life steadied itself.</w:t>
+      </w:r>
+    </w:p>
+    <w:p>
+      <w:r>
+        <w:t xml:space="preserve">Yet its form flickered.</w:t>
+      </w:r>
+    </w:p>
+    <w:p>
+      <w:r>
+        <w:t xml:space="preserve">Edges becoming uncertain.</w:t>
+      </w:r>
+    </w:p>
+    <w:p>
+      <w:r>
+        <w:t xml:space="preserve">Selen immediately knelt beside it.</w:t>
+      </w:r>
+    </w:p>
+    <w:p>
+      <w:r>
+        <w:t xml:space="preserve">"What happened? "</w:t>
+      </w:r>
+    </w:p>
+    <w:p>
+      <w:r>
+        <w:t xml:space="preserve">The creature blinked.</w:t>
+      </w:r>
+    </w:p>
+    <w:p>
+      <w:r>
+        <w:t xml:space="preserve">Confusion crossed its features.</w:t>
+      </w:r>
+    </w:p>
+    <w:p>
+      <w:r>
+        <w:t xml:space="preserve">A strange expression on something that seemed born from certainty.</w:t>
+      </w:r>
+    </w:p>
+    <w:p>
+      <w:r>
+        <w:t xml:space="preserve">"I am remembering too much. "</w:t>
+      </w:r>
+    </w:p>
+    <w:p>
+      <w:r>
+        <w:t xml:space="preserve">Its voice sounded distant.</w:t>
+      </w:r>
+    </w:p>
+    <w:p>
+      <w:r>
+        <w:t xml:space="preserve">As though portions of it occupied another place.</w:t>
+      </w:r>
+    </w:p>
+    <w:p>
+      <w:r>
+        <w:t xml:space="preserve">The silver threads around Selen's wrists brightened.</w:t>
+      </w:r>
+    </w:p>
+    <w:p>
+      <w:r>
+        <w:t xml:space="preserve">Elyen noticed them extending outward.</w:t>
+      </w:r>
+    </w:p>
+    <w:p>
+      <w:r>
+        <w:t xml:space="preserve">Not only from her.</w:t>
+      </w:r>
+    </w:p>
+    <w:p>
+      <w:r>
+        <w:t xml:space="preserve">From himself as well.</w:t>
+      </w:r>
+    </w:p>
+    <w:p>
+      <w:r>
+        <w:t xml:space="preserve">Faint lines stretching into the moving procession.</w:t>
+      </w:r>
+    </w:p>
+    <w:p>
+      <w:r>
+        <w:t xml:space="preserve">Connecting to observer lights.</w:t>
+      </w:r>
+    </w:p>
+    <w:p>
+      <w:r>
+        <w:t xml:space="preserve">Connecting to pathways.</w:t>
+      </w:r>
+    </w:p>
+    <w:p>
+      <w:r>
+        <w:t xml:space="preserve">Connecting to destinations.</w:t>
+      </w:r>
+    </w:p>
+    <w:p>
+      <w:r>
+        <w:t xml:space="preserve">The Nexus had always linked realities.</w:t>
+      </w:r>
+    </w:p>
+    <w:p>
+      <w:r>
+        <w:t xml:space="preserve">Now it was revealing links hidden within living beings.</w:t>
+      </w:r>
+    </w:p>
+    <w:p>
+      <w:r>
+        <w:t xml:space="preserve">Selen followed one thread with her eyes.</w:t>
+      </w:r>
+    </w:p>
+    <w:p>
+      <w:r>
+        <w:t xml:space="preserve">The line vanished into the crowd.</w:t>
+      </w:r>
+    </w:p>
+    <w:p>
+      <w:r>
+        <w:t xml:space="preserve">Toward a distant observer carrying an unusually bright light.</w:t>
+      </w:r>
+    </w:p>
+    <w:p>
+      <w:r>
+        <w:t xml:space="preserve">Her expression changed.</w:t>
+      </w:r>
+    </w:p>
+    <w:p>
+      <w:r>
+        <w:t xml:space="preserve">Recognition.</w:t>
+      </w:r>
+    </w:p>
+    <w:p>
+      <w:r>
+        <w:t xml:space="preserve">Pain.</w:t>
+      </w:r>
+    </w:p>
+    <w:p>
+      <w:r>
+        <w:t xml:space="preserve">Longing.</w:t>
+      </w:r>
+    </w:p>
+    <w:p>
+      <w:r>
+        <w:t xml:space="preserve">Elyen understood without needing explanation.</w:t>
+      </w:r>
+    </w:p>
+    <w:p>
+      <w:r>
+        <w:t xml:space="preserve">Someone she had lost.</w:t>
+      </w:r>
+    </w:p>
+    <w:p>
+      <w:r>
+        <w:t xml:space="preserve">Not physically.</w:t>
+      </w:r>
+    </w:p>
+    <w:p>
+      <w:r>
+        <w:t xml:space="preserve">Historically.</w:t>
+      </w:r>
+    </w:p>
+    <w:p>
+      <w:r>
+        <w:t xml:space="preserve">A life left behind during one of her countless crossings.</w:t>
+      </w:r>
+    </w:p>
+    <w:p>
+      <w:r>
+        <w:t xml:space="preserve">The thread remained.</w:t>
+      </w:r>
+    </w:p>
+    <w:p>
+      <w:r>
+        <w:t xml:space="preserve">A connection preserved despite impossible distance.</w:t>
+      </w:r>
+    </w:p>
+    <w:p>
+      <w:r>
+        <w:t xml:space="preserve">Selen looked away.</w:t>
+      </w:r>
+    </w:p>
+    <w:p>
+      <w:r>
+        <w:t xml:space="preserve">The silver line dimmed but did not disappear.</w:t>
+      </w:r>
+    </w:p>
+    <w:p>
+      <w:r>
+        <w:t xml:space="preserve">The creature watched her carefully.</w:t>
+      </w:r>
+    </w:p>
+    <w:p>
+      <w:r>
+        <w:t xml:space="preserve">"The exodus carries more than worlds. "</w:t>
+      </w:r>
+    </w:p>
+    <w:p>
+      <w:r>
+        <w:t xml:space="preserve">She gave a humorless laugh.</w:t>
+      </w:r>
+    </w:p>
+    <w:p>
+      <w:r>
+        <w:t xml:space="preserve">"I noticed. "</w:t>
+      </w:r>
+    </w:p>
+    <w:p>
+      <w:r>
+        <w:t xml:space="preserve">Ahead, another observer crossed the folded horizon and vanished into one of the awakened paths.</w:t>
+      </w:r>
+    </w:p>
+    <w:p>
+      <w:r>
+        <w:t xml:space="preserve">Then a thousand more followed.</w:t>
+      </w:r>
+    </w:p>
+    <w:p>
+      <w:r>
+        <w:t xml:space="preserve">The flow had become enormous.</w:t>
+      </w:r>
+    </w:p>
+    <w:p>
+      <w:r>
+        <w:t xml:space="preserve">Entire rivers of existence dividing among newly opened routes.</w:t>
+      </w:r>
+    </w:p>
+    <w:p>
+      <w:r>
+        <w:t xml:space="preserve">Each departure sent ripples through reality.</w:t>
+      </w:r>
+    </w:p>
+    <w:p>
+      <w:r>
+        <w:t xml:space="preserve">The plain behind them grew emptier.</w:t>
+      </w:r>
+    </w:p>
+    <w:p>
+      <w:r>
+        <w:t xml:space="preserve">Not dying.</w:t>
+      </w:r>
+    </w:p>
+    <w:p>
+      <w:r>
+        <w:t xml:space="preserve">Uninhabiting itself.</w:t>
+      </w:r>
+    </w:p>
+    <w:p>
+      <w:r>
+        <w:t xml:space="preserve">The flowers were almost gone now.</w:t>
+      </w:r>
+    </w:p>
+    <w:p>
+      <w:r>
+        <w:t xml:space="preserve">Only a few remained rooted.</w:t>
+      </w:r>
+    </w:p>
+    <w:p>
+      <w:r>
+        <w:t xml:space="preserve">Most drifted overhead among the migrating rain.</w:t>
+      </w:r>
+    </w:p>
+    <w:p>
+      <w:r>
+        <w:t xml:space="preserve">The sky had transformed into a moving ocean of reflections and light.</w:t>
+      </w:r>
+    </w:p>
+    <w:p>
+      <w:r>
+        <w:t xml:space="preserve">Within the suspended droplets, Elyen glimpsed countless realities joining the journey.</w:t>
+      </w:r>
+    </w:p>
+    <w:p>
+      <w:r>
+        <w:t xml:space="preserve">Some knew what was happening.</w:t>
+      </w:r>
+    </w:p>
+    <w:p>
+      <w:r>
+        <w:t xml:space="preserve">Others clearly did not.</w:t>
+      </w:r>
+    </w:p>
+    <w:p>
+      <w:r>
+        <w:t xml:space="preserve">A child laughing beneath unfamiliar stars.</w:t>
+      </w:r>
+    </w:p>
+    <w:p>
+      <w:r>
+        <w:t xml:space="preserve">An old woman standing on a balcony of crystal.</w:t>
+      </w:r>
+    </w:p>
+    <w:p>
+      <w:r>
+        <w:t xml:space="preserve">A city waking beneath twin suns.</w:t>
+      </w:r>
+    </w:p>
+    <w:p>
+      <w:r>
+        <w:t xml:space="preserve">Lives continuing.</w:t>
+      </w:r>
+    </w:p>
+    <w:p>
+      <w:r>
+        <w:t xml:space="preserve">Unaware that the architecture beneath existence had shifted.</w:t>
+      </w:r>
+    </w:p>
+    <w:p>
+      <w:r>
+        <w:t xml:space="preserve">Unaware that they had already begun to travel.</w:t>
+      </w:r>
+    </w:p>
+    <w:p>
+      <w:r>
+        <w:t xml:space="preserve">The scale left him speechless.</w:t>
+      </w:r>
+    </w:p>
+    <w:p>
+      <w:r>
+        <w:t xml:space="preserve">The First Guide lifted one immense hand.</w:t>
+      </w:r>
+    </w:p>
+    <w:p>
+      <w:r>
+        <w:t xml:space="preserve">The gesture was almost imperceptible.</w:t>
+      </w:r>
+    </w:p>
+    <w:p>
+      <w:r>
+        <w:t xml:space="preserve">Yet pathways multiplied instantly.</w:t>
+      </w:r>
+    </w:p>
+    <w:p>
+      <w:r>
+        <w:t xml:space="preserve">Thousands became tens of thousands.</w:t>
+      </w:r>
+    </w:p>
+    <w:p>
+      <w:r>
+        <w:t xml:space="preserve">A network older than the Nexus spread across the void.</w:t>
+      </w:r>
+    </w:p>
+    <w:p>
+      <w:r>
+        <w:t xml:space="preserve">The creature stared upward.</w:t>
+      </w:r>
+    </w:p>
+    <w:p>
+      <w:r>
+        <w:t xml:space="preserve">"They're rebuilding the crossings. "</w:t>
+      </w:r>
+    </w:p>
+    <w:p>
+      <w:r>
+        <w:t xml:space="preserve">Rebuilding.</w:t>
+      </w:r>
+    </w:p>
+    <w:p>
+      <w:r>
+        <w:t xml:space="preserve">The word lingered.</w:t>
+      </w:r>
+    </w:p>
+    <w:p>
+      <w:r>
+        <w:t xml:space="preserve">Not creating.</w:t>
+      </w:r>
+    </w:p>
+    <w:p>
+      <w:r>
+        <w:t xml:space="preserve">Restoring.</w:t>
+      </w:r>
+    </w:p>
+    <w:p>
+      <w:r>
+        <w:t xml:space="preserve">Elyen felt a chill.</w:t>
+      </w:r>
+    </w:p>
+    <w:p>
+      <w:r>
+        <w:t xml:space="preserve">How much of existence had been forgotten?</w:t>
+      </w:r>
+    </w:p>
+    <w:p>
+      <w:r>
+        <w:t xml:space="preserve">How many foundations lay buried beneath the realities they understood?</w:t>
+      </w:r>
+    </w:p>
+    <w:p>
+      <w:r>
+        <w:t xml:space="preserve">The answer seemed larger with every passing moment.</w:t>
+      </w:r>
+    </w:p>
+    <w:p>
+      <w:r>
+        <w:t xml:space="preserve">A pulse rolled through the road.</w:t>
+      </w:r>
+    </w:p>
+    <w:p>
+      <w:r>
+        <w:t xml:space="preserve">This one felt different.</w:t>
+      </w:r>
+    </w:p>
+    <w:p>
+      <w:r>
+        <w:t xml:space="preserve">Not from the First Guide.</w:t>
+      </w:r>
+    </w:p>
+    <w:p>
+      <w:r>
+        <w:t xml:space="preserve">Not from the boundary.</w:t>
+      </w:r>
+    </w:p>
+    <w:p>
+      <w:r>
+        <w:t xml:space="preserve">From somewhere farther ahead.</w:t>
+      </w:r>
+    </w:p>
+    <w:p>
+      <w:r>
+        <w:t xml:space="preserve">Beyond the destinations.</w:t>
+      </w:r>
+    </w:p>
+    <w:p>
+      <w:r>
+        <w:t xml:space="preserve">Beyond the opened crossings.</w:t>
+      </w:r>
+    </w:p>
+    <w:p>
+      <w:r>
+        <w:t xml:space="preserve">The First Guide reacted immediately.</w:t>
+      </w:r>
+    </w:p>
+    <w:p>
+      <w:r>
+        <w:t xml:space="preserve">Its immense form became still.</w:t>
+      </w:r>
+    </w:p>
+    <w:p>
+      <w:r>
+        <w:t xml:space="preserve">The other awakening lights paused.</w:t>
+      </w:r>
+    </w:p>
+    <w:p>
+      <w:r>
+        <w:t xml:space="preserve">Even the observer procession seemed to hesitate.</w:t>
+      </w:r>
+    </w:p>
+    <w:p>
+      <w:r>
+        <w:t xml:space="preserve">A silence spread through the exodus.</w:t>
+      </w:r>
+    </w:p>
+    <w:p>
+      <w:r>
+        <w:t xml:space="preserve">The creature's face lost all color.</w:t>
+      </w:r>
+    </w:p>
+    <w:p>
+      <w:r>
+        <w:t xml:space="preserve">Elyen remembered its earlier warning.</w:t>
+      </w:r>
+    </w:p>
+    <w:p>
+      <w:r>
+        <w:t xml:space="preserve">They were not supposed to wake yet.</w:t>
+      </w:r>
+    </w:p>
+    <w:p>
+      <w:r>
+        <w:t xml:space="preserve">Something moved within the farthest darkness.</w:t>
+      </w:r>
+    </w:p>
+    <w:p>
+      <w:r>
+        <w:t xml:space="preserve">At first he saw nothing.</w:t>
+      </w:r>
+    </w:p>
+    <w:p>
+      <w:r>
+        <w:t xml:space="preserve">Then he noticed absence.</w:t>
+      </w:r>
+    </w:p>
+    <w:p>
+      <w:r>
+        <w:t xml:space="preserve">A region where pathways refused to enter.</w:t>
+      </w:r>
+    </w:p>
+    <w:p>
+      <w:r>
+        <w:t xml:space="preserve">A vast shape outlined by missing light.</w:t>
+      </w:r>
+    </w:p>
+    <w:p>
+      <w:r>
+        <w:t xml:space="preserve">Not hostile.</w:t>
+      </w:r>
+    </w:p>
+    <w:p>
+      <w:r>
+        <w:t xml:space="preserve">Not benevolent.</w:t>
+      </w:r>
+    </w:p>
+    <w:p>
+      <w:r>
+        <w:t xml:space="preserve">Simply immense.</w:t>
+      </w:r>
+    </w:p>
+    <w:p>
+      <w:r>
+        <w:t xml:space="preserve">The way an ocean was immense.</w:t>
+      </w:r>
+    </w:p>
+    <w:p>
+      <w:r>
+        <w:t xml:space="preserve">Or time.</w:t>
+      </w:r>
+    </w:p>
+    <w:p>
+      <w:r>
+        <w:t xml:space="preserve">The thing shifted.</w:t>
+      </w:r>
+    </w:p>
+    <w:p>
+      <w:r>
+        <w:t xml:space="preserve">And every road in existence trembled.</w:t>
+      </w:r>
+    </w:p>
+    <w:p>
+      <w:r>
+        <w:t xml:space="preserve">Selen's hand closed around Elyen's arm.</w:t>
+      </w:r>
+    </w:p>
+    <w:p>
+      <w:r>
+        <w:t xml:space="preserve">"What is that? "</w:t>
+      </w:r>
+    </w:p>
+    <w:p>
+      <w:r>
+        <w:t xml:space="preserve">No answer came.</w:t>
+      </w:r>
+    </w:p>
+    <w:p>
+      <w:r>
+        <w:t xml:space="preserve">Not immediately.</w:t>
+      </w:r>
+    </w:p>
+    <w:p>
+      <w:r>
+        <w:t xml:space="preserve">Even the creature remained silent.</w:t>
+      </w:r>
+    </w:p>
+    <w:p>
+      <w:r>
+        <w:t xml:space="preserve">The First Guide lowered its head.</w:t>
+      </w:r>
+    </w:p>
+    <w:p>
+      <w:r>
+        <w:t xml:space="preserve">The gesture carried unmistakable respect.</w:t>
+      </w:r>
+    </w:p>
+    <w:p>
+      <w:r>
+        <w:t xml:space="preserve">Only then did the creature finally speak.</w:t>
+      </w:r>
+    </w:p>
+    <w:p>
+      <w:r>
+        <w:t xml:space="preserve">"The Keepers. "</w:t>
+      </w:r>
+    </w:p>
+    <w:p>
+      <w:r>
+        <w:t xml:space="preserve">The word emerged almost as a whisper.</w:t>
+      </w:r>
+    </w:p>
+    <w:p>
+      <w:r>
+        <w:t xml:space="preserve">Plural.</w:t>
+      </w:r>
+    </w:p>
+    <w:p>
+      <w:r>
+        <w:t xml:space="preserve">More than one.</w:t>
+      </w:r>
+    </w:p>
+    <w:p>
+      <w:r>
+        <w:t xml:space="preserve">Elyen looked again.</w:t>
+      </w:r>
+    </w:p>
+    <w:p>
+      <w:r>
+        <w:t xml:space="preserve">The darkness beyond the pathways unfolded.</w:t>
+      </w:r>
+    </w:p>
+    <w:p>
+      <w:r>
+        <w:t xml:space="preserve">Additional shapes became visible.</w:t>
+      </w:r>
+    </w:p>
+    <w:p>
+      <w:r>
+        <w:t xml:space="preserve">Sleeping mountains of awareness stretching across impossible distances.</w:t>
+      </w:r>
+    </w:p>
+    <w:p>
+      <w:r>
+        <w:t xml:space="preserve">Ancient presences older than worlds.</w:t>
+      </w:r>
+    </w:p>
+    <w:p>
+      <w:r>
+        <w:t xml:space="preserve">Older than observers.</w:t>
+      </w:r>
+    </w:p>
+    <w:p>
+      <w:r>
+        <w:t xml:space="preserve">Older perhaps than movement itself.</w:t>
+      </w:r>
+    </w:p>
+    <w:p>
+      <w:r>
+        <w:t xml:space="preserve">The Keepers.</w:t>
+      </w:r>
+    </w:p>
+    <w:p>
+      <w:r>
+        <w:t xml:space="preserve">One had stirred.</w:t>
+      </w:r>
+    </w:p>
+    <w:p>
+      <w:r>
+        <w:t xml:space="preserve">Only slightly.</w:t>
+      </w:r>
+    </w:p>
+    <w:p>
+      <w:r>
+        <w:t xml:space="preserve">Yet its attention alone altered the exodus.</w:t>
+      </w:r>
+    </w:p>
+    <w:p>
+      <w:r>
+        <w:t xml:space="preserve">The awakened pathways stabilized.</w:t>
+      </w:r>
+    </w:p>
+    <w:p>
+      <w:r>
+        <w:t xml:space="preserve">The folded horizon brightened.</w:t>
+      </w:r>
+    </w:p>
+    <w:p>
+      <w:r>
+        <w:t xml:space="preserve">New routes emerged.</w:t>
+      </w:r>
+    </w:p>
+    <w:p>
+      <w:r>
+        <w:t xml:space="preserve">The migration accelerated beyond anything seen before.</w:t>
+      </w:r>
+    </w:p>
+    <w:p>
+      <w:r>
+        <w:t xml:space="preserve">It was as though existence itself had received permission.</w:t>
+      </w:r>
+    </w:p>
+    <w:p>
+      <w:r>
+        <w:t xml:space="preserve">The creature stared in wonder.</w:t>
+      </w:r>
+    </w:p>
+    <w:p>
+      <w:r>
+        <w:t xml:space="preserve">"They're helping. "</w:t>
+      </w:r>
+    </w:p>
+    <w:p>
+      <w:r>
+        <w:t xml:space="preserve">For the first time since the boundary appeared, genuine hope entered its voice.</w:t>
+      </w:r>
+    </w:p>
+    <w:p>
+      <w:r>
+        <w:t xml:space="preserve">Behind them came a sound.</w:t>
+      </w:r>
+    </w:p>
+    <w:p>
+      <w:r>
+        <w:t xml:space="preserve">Not literal sound.</w:t>
+      </w:r>
+    </w:p>
+    <w:p>
+      <w:r>
+        <w:t xml:space="preserve">A tearing.</w:t>
+      </w:r>
+    </w:p>
+    <w:p>
+      <w:r>
+        <w:t xml:space="preserve">The boundary had finally broken.</w:t>
+      </w:r>
+    </w:p>
+    <w:p>
+      <w:r>
+        <w:t xml:space="preserve">Elyen turned.</w:t>
+      </w:r>
+    </w:p>
+    <w:p>
+      <w:r>
+        <w:t xml:space="preserve">The sight stopped him cold.</w:t>
+      </w:r>
+    </w:p>
+    <w:p>
+      <w:r>
+        <w:t xml:space="preserve">The distant plain no longer ended at a horizon.</w:t>
+      </w:r>
+    </w:p>
+    <w:p>
+      <w:r>
+        <w:t xml:space="preserve">Instead, a wall of impossible simplicity advanced across creation.</w:t>
+      </w:r>
+    </w:p>
+    <w:p>
+      <w:r>
+        <w:t xml:space="preserve">No texture.</w:t>
+      </w:r>
+    </w:p>
+    <w:p>
+      <w:r>
+        <w:t xml:space="preserve">No variation.</w:t>
+      </w:r>
+    </w:p>
+    <w:p>
+      <w:r>
+        <w:t xml:space="preserve">No distinction.</w:t>
+      </w:r>
+    </w:p>
+    <w:p>
+      <w:r>
+        <w:t xml:space="preserve">Just unity made visible.</w:t>
+      </w:r>
+    </w:p>
+    <w:p>
+      <w:r>
+        <w:t xml:space="preserve">Where it passed, differences ceased.</w:t>
+      </w:r>
+    </w:p>
+    <w:p>
+      <w:r>
+        <w:t xml:space="preserve">Colors merged.</w:t>
+      </w:r>
+    </w:p>
+    <w:p>
+      <w:r>
+        <w:t xml:space="preserve">Shapes converged.</w:t>
+      </w:r>
+    </w:p>
+    <w:p>
+      <w:r>
+        <w:t xml:space="preserve">Individuality dissolved into perfect sameness.</w:t>
+      </w:r>
+    </w:p>
+    <w:p>
+      <w:r>
+        <w:t xml:space="preserve">The foreign presence was entering in earnest.</w:t>
+      </w:r>
+    </w:p>
+    <w:p>
+      <w:r>
+        <w:t xml:space="preserve">No separation.</w:t>
+      </w:r>
+    </w:p>
+    <w:p>
+      <w:r>
+        <w:t xml:space="preserve">The meaning rolled outward like an endless tide.</w:t>
+      </w:r>
+    </w:p>
+    <w:p>
+      <w:r>
+        <w:t xml:space="preserve">Observers nearest the advancing front accelerated.</w:t>
+      </w:r>
+    </w:p>
+    <w:p>
+      <w:r>
+        <w:t xml:space="preserve">The exodus became urgent.</w:t>
+      </w:r>
+    </w:p>
+    <w:p>
+      <w:r>
+        <w:t xml:space="preserve">Not panicked.</w:t>
+      </w:r>
+    </w:p>
+    <w:p>
+      <w:r>
+        <w:t xml:space="preserve">Determined.</w:t>
+      </w:r>
+    </w:p>
+    <w:p>
+      <w:r>
+        <w:t xml:space="preserve">A civilization carrying everything it loved through a narrowing door.</w:t>
+      </w:r>
+    </w:p>
+    <w:p>
+      <w:r>
+        <w:t xml:space="preserve">The road surged beneath Elyen's feet.</w:t>
+      </w:r>
+    </w:p>
+    <w:p>
+      <w:r>
+        <w:t xml:space="preserve">Travel became swifter.</w:t>
+      </w:r>
+    </w:p>
+    <w:p>
+      <w:r>
+        <w:t xml:space="preserve">The folded horizon approached.</w:t>
+      </w:r>
+    </w:p>
+    <w:p>
+      <w:r>
+        <w:t xml:space="preserve">For the first time he could see what waited beyond.</w:t>
+      </w:r>
+    </w:p>
+    <w:p>
+      <w:r>
+        <w:t xml:space="preserve">Not a place.</w:t>
+      </w:r>
+    </w:p>
+    <w:p>
+      <w:r>
+        <w:t xml:space="preserve">A convergence of pathways.</w:t>
+      </w:r>
+    </w:p>
+    <w:p>
+      <w:r>
+        <w:t xml:space="preserve">An immense crossroads suspended outside ordinary reality.</w:t>
+      </w:r>
+    </w:p>
+    <w:p>
+      <w:r>
+        <w:t xml:space="preserve">Countless roads met there.</w:t>
+      </w:r>
+    </w:p>
+    <w:p>
+      <w:r>
+        <w:t xml:space="preserve">Separated.</w:t>
+      </w:r>
+    </w:p>
+    <w:p>
+      <w:r>
+        <w:t xml:space="preserve">Connected.</w:t>
+      </w:r>
+    </w:p>
+    <w:p>
+      <w:r>
+        <w:t xml:space="preserve">Infinite possibilities intersecting without becoming one.</w:t>
+      </w:r>
+    </w:p>
+    <w:p>
+      <w:r>
+        <w:t xml:space="preserve">The structure was beautiful.</w:t>
+      </w:r>
+    </w:p>
+    <w:p>
+      <w:r>
+        <w:t xml:space="preserve">Because it preserved difference.</w:t>
+      </w:r>
+    </w:p>
+    <w:p>
+      <w:r>
+        <w:t xml:space="preserve">Every route remained itself.</w:t>
+      </w:r>
+    </w:p>
+    <w:p>
+      <w:r>
+        <w:t xml:space="preserve">Every destination remained distinct.</w:t>
+      </w:r>
+    </w:p>
+    <w:p>
+      <w:r>
+        <w:t xml:space="preserve">The creature smiled through its exhaustion.</w:t>
+      </w:r>
+    </w:p>
+    <w:p>
+      <w:r>
+        <w:t xml:space="preserve">"The Remembered Junction. "</w:t>
+      </w:r>
+    </w:p>
+    <w:p>
+      <w:r>
+        <w:t xml:space="preserve">Elyen had never heard the name.</w:t>
+      </w:r>
+    </w:p>
+    <w:p>
+      <w:r>
+        <w:t xml:space="preserve">Yet it felt familiar.</w:t>
+      </w:r>
+    </w:p>
+    <w:p>
+      <w:r>
+        <w:t xml:space="preserve">Like a dream recalled after years of forgetting.</w:t>
+      </w:r>
+    </w:p>
+    <w:p>
+      <w:r>
+        <w:t xml:space="preserve">Observers poured toward it.</w:t>
+      </w:r>
+    </w:p>
+    <w:p>
+      <w:r>
+        <w:t xml:space="preserve">Streams of light entering from every direction.</w:t>
+      </w:r>
+    </w:p>
+    <w:p>
+      <w:r>
+        <w:t xml:space="preserve">Entire realities joining the flow.</w:t>
+      </w:r>
+    </w:p>
+    <w:p>
+      <w:r>
+        <w:t xml:space="preserve">The Junction grew brighter with each arrival.</w:t>
+      </w:r>
+    </w:p>
+    <w:p>
+      <w:r>
+        <w:t xml:space="preserve">Behind them, the advancing unity consumed another section of creation.</w:t>
+      </w:r>
+    </w:p>
+    <w:p>
+      <w:r>
+        <w:t xml:space="preserve">The pressure intensified.</w:t>
+      </w:r>
+    </w:p>
+    <w:p>
+      <w:r>
+        <w:t xml:space="preserve">Memories leaked together.</w:t>
+      </w:r>
+    </w:p>
+    <w:p>
+      <w:r>
+        <w:t xml:space="preserve">For a brief instant Elyen remembered lives he had never lived.</w:t>
+      </w:r>
+    </w:p>
+    <w:p>
+      <w:r>
+        <w:t xml:space="preserve">A thousand alternate choices.</w:t>
+      </w:r>
+    </w:p>
+    <w:p>
+      <w:r>
+        <w:t xml:space="preserve">A thousand different selves.</w:t>
+      </w:r>
+    </w:p>
+    <w:p>
+      <w:r>
+        <w:t xml:space="preserve">Then the sensation passed.</w:t>
+      </w:r>
+    </w:p>
+    <w:p>
+      <w:r>
+        <w:t xml:space="preserve">He understood the danger more clearly now.</w:t>
+      </w:r>
+    </w:p>
+    <w:p>
+      <w:r>
+        <w:t xml:space="preserve">The foreign presence did not merely erase distinctions between things.</w:t>
+      </w:r>
+    </w:p>
+    <w:p>
+      <w:r>
+        <w:t xml:space="preserve">It erased distinctions between possibilities.</w:t>
+      </w:r>
+    </w:p>
+    <w:p>
+      <w:r>
+        <w:t xml:space="preserve">Eventually there would be only one outcome.</w:t>
+      </w:r>
+    </w:p>
+    <w:p>
+      <w:r>
+        <w:t xml:space="preserve">One existence.</w:t>
+      </w:r>
+    </w:p>
+    <w:p>
+      <w:r>
+        <w:t xml:space="preserve">One state.</w:t>
+      </w:r>
+    </w:p>
+    <w:p>
+      <w:r>
+        <w:t xml:space="preserve">Complete.</w:t>
+      </w:r>
+    </w:p>
+    <w:p>
+      <w:r>
+        <w:t xml:space="preserve">Unchanging.</w:t>
+      </w:r>
+    </w:p>
+    <w:p>
+      <w:r>
+        <w:t xml:space="preserve">Forever.</w:t>
+      </w:r>
+    </w:p>
+    <w:p>
+      <w:r>
+        <w:t xml:space="preserve">The road carried them onward.</w:t>
+      </w:r>
+    </w:p>
+    <w:p>
+      <w:r>
+        <w:t xml:space="preserve">Closer.</w:t>
+      </w:r>
+    </w:p>
+    <w:p>
+      <w:r>
+        <w:t xml:space="preserve">Closer.</w:t>
+      </w:r>
+    </w:p>
+    <w:p>
+      <w:r>
+        <w:t xml:space="preserve">The Junction expanded across the horizon.</w:t>
+      </w:r>
+    </w:p>
+    <w:p>
+      <w:r>
+        <w:t xml:space="preserve">Its architecture seemed built from relationships rather than matter.</w:t>
+      </w:r>
+    </w:p>
+    <w:p>
+      <w:r>
+        <w:t xml:space="preserve">Crossings.</w:t>
+      </w:r>
+    </w:p>
+    <w:p>
+      <w:r>
+        <w:t xml:space="preserve">Meetings.</w:t>
+      </w:r>
+    </w:p>
+    <w:p>
+      <w:r>
+        <w:t xml:space="preserve">Departures.</w:t>
+      </w:r>
+    </w:p>
+    <w:p>
+      <w:r>
+        <w:t xml:space="preserve">Every structure represented connection without surrender.</w:t>
+      </w:r>
+    </w:p>
+    <w:p>
+      <w:r>
+        <w:t xml:space="preserve">Unity without erasure.</w:t>
+      </w:r>
+    </w:p>
+    <w:p>
+      <w:r>
+        <w:t xml:space="preserve">Perhaps that was why it had existed before worlds.</w:t>
+      </w:r>
+    </w:p>
+    <w:p>
+      <w:r>
+        <w:t xml:space="preserve">Because worlds came later.</w:t>
+      </w:r>
+    </w:p>
+    <w:p>
+      <w:r>
+        <w:t xml:space="preserve">Difference came first.</w:t>
+      </w:r>
+    </w:p>
+    <w:p>
+      <w:r>
+        <w:t xml:space="preserve">The realization struck Elyen with surprising force.</w:t>
+      </w:r>
+    </w:p>
+    <w:p>
+      <w:r>
+        <w:t xml:space="preserve">The foreign presence considered separation a flaw.</w:t>
+      </w:r>
+    </w:p>
+    <w:p>
+      <w:r>
+        <w:t xml:space="preserve">Yet everything beautiful he had ever known depended upon it.</w:t>
+      </w:r>
+    </w:p>
+    <w:p>
+      <w:r>
+        <w:t xml:space="preserve">Friendship required two people.</w:t>
+      </w:r>
+    </w:p>
+    <w:p>
+      <w:r>
+        <w:t xml:space="preserve">Choice required alternatives.</w:t>
+      </w:r>
+    </w:p>
+    <w:p>
+      <w:r>
+        <w:t xml:space="preserve">Growth required movement between states.</w:t>
+      </w:r>
+    </w:p>
+    <w:p>
+      <w:r>
+        <w:t xml:space="preserve">Even love required distinction.</w:t>
+      </w:r>
+    </w:p>
+    <w:p>
+      <w:r>
+        <w:t xml:space="preserve">Without separation there could be no reaching.</w:t>
+      </w:r>
+    </w:p>
+    <w:p>
+      <w:r>
+        <w:t xml:space="preserve">No discovery.</w:t>
+      </w:r>
+    </w:p>
+    <w:p>
+      <w:r>
+        <w:t xml:space="preserve">No becoming.</w:t>
+      </w:r>
+    </w:p>
+    <w:p>
+      <w:r>
+        <w:t xml:space="preserve">Only permanence.</w:t>
+      </w:r>
+    </w:p>
+    <w:p>
+      <w:r>
+        <w:t xml:space="preserve">Ahead, the First Guide raised its hand again.</w:t>
+      </w:r>
+    </w:p>
+    <w:p>
+      <w:r>
+        <w:t xml:space="preserve">A path opened directly before Elyen, Selen, and the creature.</w:t>
+      </w:r>
+    </w:p>
+    <w:p>
+      <w:r>
+        <w:t xml:space="preserve">Different from the others.</w:t>
+      </w:r>
+    </w:p>
+    <w:p>
+      <w:r>
+        <w:t xml:space="preserve">Brighter.</w:t>
+      </w:r>
+    </w:p>
+    <w:p>
+      <w:r>
+        <w:t xml:space="preserve">More stable.</w:t>
+      </w:r>
+    </w:p>
+    <w:p>
+      <w:r>
+        <w:t xml:space="preserve">The creature stared at it.</w:t>
+      </w:r>
+    </w:p>
+    <w:p>
+      <w:r>
+        <w:t xml:space="preserve">Confusion returned.</w:t>
+      </w:r>
+    </w:p>
+    <w:p>
+      <w:r>
+        <w:t xml:space="preserve">Then recognition.</w:t>
+      </w:r>
+    </w:p>
+    <w:p>
+      <w:r>
+        <w:t xml:space="preserve">"No. "</w:t>
+      </w:r>
+    </w:p>
+    <w:p>
+      <w:r>
+        <w:t xml:space="preserve">The word escaped before it could stop itself.</w:t>
+      </w:r>
+    </w:p>
+    <w:p>
+      <w:r>
+        <w:t xml:space="preserve">Selen frowned.</w:t>
+      </w:r>
+    </w:p>
+    <w:p>
+      <w:r>
+        <w:t xml:space="preserve">"What? "</w:t>
+      </w:r>
+    </w:p>
+    <w:p>
+      <w:r>
+        <w:t xml:space="preserve">The creature looked genuinely shaken.</w:t>
+      </w:r>
+    </w:p>
+    <w:p>
+      <w:r>
+        <w:t xml:space="preserve">For perhaps the first time since its awakening, it appeared small.</w:t>
+      </w:r>
+    </w:p>
+    <w:p>
+      <w:r>
+        <w:t xml:space="preserve">Not ancient.</w:t>
+      </w:r>
+    </w:p>
+    <w:p>
+      <w:r>
+        <w:t xml:space="preserve">Not mysterious.</w:t>
+      </w:r>
+    </w:p>
+    <w:p>
+      <w:r>
+        <w:t xml:space="preserve">Simply frightened.</w:t>
+      </w:r>
+    </w:p>
+    <w:p>
+      <w:r>
+        <w:t xml:space="preserve">"That path isn't for the exodus. "</w:t>
+      </w:r>
+    </w:p>
+    <w:p>
+      <w:r>
+        <w:t xml:space="preserve">The bright road widened.</w:t>
+      </w:r>
+    </w:p>
+    <w:p>
+      <w:r>
+        <w:t xml:space="preserve">Golden light flowed across its surface.</w:t>
+      </w:r>
+    </w:p>
+    <w:p>
+      <w:r>
+        <w:t xml:space="preserve">Far away, beyond the Junction, something answered.</w:t>
+      </w:r>
+    </w:p>
+    <w:p>
+      <w:r>
+        <w:t xml:space="preserve">A pulse.</w:t>
+      </w:r>
+    </w:p>
+    <w:p>
+      <w:r>
+        <w:t xml:space="preserve">A call.</w:t>
+      </w:r>
+    </w:p>
+    <w:p>
+      <w:r>
+        <w:t xml:space="preserve">The Keepers stirred once more.</w:t>
+      </w:r>
+    </w:p>
+    <w:p>
+      <w:r>
+        <w:t xml:space="preserve">The creature's eyes widened.</w:t>
+      </w:r>
+    </w:p>
+    <w:p>
+      <w:r>
+        <w:t xml:space="preserve">"It's for us. "</w:t>
+      </w:r>
+    </w:p>
+    <w:p>
+      <w:r>
+        <w:t xml:space="preserve">Silence followed.</w:t>
+      </w:r>
+    </w:p>
+    <w:p>
+      <w:r>
+        <w:t xml:space="preserve">The observer procession continued around them.</w:t>
+      </w:r>
+    </w:p>
+    <w:p>
+      <w:r>
+        <w:t xml:space="preserve">Millions moving toward safety.</w:t>
+      </w:r>
+    </w:p>
+    <w:p>
+      <w:r>
+        <w:t xml:space="preserve">Toward preservation.</w:t>
+      </w:r>
+    </w:p>
+    <w:p>
+      <w:r>
+        <w:t xml:space="preserve">Toward continuation.</w:t>
+      </w:r>
+    </w:p>
+    <w:p>
+      <w:r>
+        <w:t xml:space="preserve">Yet the newly opened road led elsewhere.</w:t>
+      </w:r>
+    </w:p>
+    <w:p>
+      <w:r>
+        <w:t xml:space="preserve">Not away from the crisis.</w:t>
+      </w:r>
+    </w:p>
+    <w:p>
+      <w:r>
+        <w:t xml:space="preserve">Toward its center.</w:t>
+      </w:r>
+    </w:p>
+    <w:p>
+      <w:r>
+        <w:t xml:space="preserve">Elyen already knew.</w:t>
+      </w:r>
+    </w:p>
+    <w:p>
+      <w:r>
+        <w:t xml:space="preserve">The certainty arrived before thought.</w:t>
+      </w:r>
+    </w:p>
+    <w:p>
+      <w:r>
+        <w:t xml:space="preserve">Every step had been leading here.</w:t>
+      </w:r>
+    </w:p>
+    <w:p>
+      <w:r>
+        <w:t xml:space="preserve">The exodus would continue.</w:t>
+      </w:r>
+    </w:p>
+    <w:p>
+      <w:r>
+        <w:t xml:space="preserve">Creation would move.</w:t>
+      </w:r>
+    </w:p>
+    <w:p>
+      <w:r>
+        <w:t xml:space="preserve">But someone still needed to understand what was happening.</w:t>
+      </w:r>
+    </w:p>
+    <w:p>
+      <w:r>
+        <w:t xml:space="preserve">Someone needed to face whatever lay beyond the boundary.</w:t>
+      </w:r>
+    </w:p>
+    <w:p>
+      <w:r>
+        <w:t xml:space="preserve">Selen reached the same conclusion.</w:t>
+      </w:r>
+    </w:p>
+    <w:p>
+      <w:r>
+        <w:t xml:space="preserve">He saw it in her eyes.</w:t>
+      </w:r>
+    </w:p>
+    <w:p>
+      <w:r>
+        <w:t xml:space="preserve">Neither of them spoke.</w:t>
+      </w:r>
+    </w:p>
+    <w:p>
+      <w:r>
+        <w:t xml:space="preserve">They did not need to.</w:t>
+      </w:r>
+    </w:p>
+    <w:p>
+      <w:r>
+        <w:t xml:space="preserve">The creature looked between them.</w:t>
+      </w:r>
+    </w:p>
+    <w:p>
+      <w:r>
+        <w:t xml:space="preserve">"You don't know where it leads. "</w:t>
+      </w:r>
+    </w:p>
+    <w:p>
+      <w:r>
+        <w:t xml:space="preserve">"No," Elyen said.</w:t>
+      </w:r>
+    </w:p>
+    <w:p>
+      <w:r>
+        <w:t xml:space="preserve">"It may not bring you back. "</w:t>
+      </w:r>
+    </w:p>
+    <w:p>
+      <w:r>
+        <w:t xml:space="preserve">"Probably not. "</w:t>
+      </w:r>
+    </w:p>
+    <w:p>
+      <w:r>
+        <w:t xml:space="preserve">The creature stared for several long moments.</w:t>
+      </w:r>
+    </w:p>
+    <w:p>
+      <w:r>
+        <w:t xml:space="preserve">Then, unexpectedly, it laughed.</w:t>
+      </w:r>
+    </w:p>
+    <w:p>
+      <w:r>
+        <w:t xml:space="preserve">A small sound.</w:t>
+      </w:r>
+    </w:p>
+    <w:p>
+      <w:r>
+        <w:t xml:space="preserve">Tired.</w:t>
+      </w:r>
+    </w:p>
+    <w:p>
+      <w:r>
+        <w:t xml:space="preserve">Almost fond.</w:t>
+      </w:r>
+    </w:p>
+    <w:p>
+      <w:r>
+        <w:t xml:space="preserve">"Good. "</w:t>
+      </w:r>
+    </w:p>
+    <w:p>
+      <w:r>
+        <w:t xml:space="preserve">The answer surprised both of them.</w:t>
+      </w:r>
+    </w:p>
+    <w:p>
+      <w:r>
+        <w:t xml:space="preserve">The creature shook its head.</w:t>
+      </w:r>
+    </w:p>
+    <w:p>
+      <w:r>
+        <w:t xml:space="preserve">"Movement. Becoming. Uncertainty. "</w:t>
+      </w:r>
+    </w:p>
+    <w:p>
+      <w:r>
+        <w:t xml:space="preserve">Its smile returned.</w:t>
+      </w:r>
+    </w:p>
+    <w:p>
+      <w:r>
+        <w:t xml:space="preserve">"You're beginning to understand. "</w:t>
+      </w:r>
+    </w:p>
+    <w:p>
+      <w:r>
+        <w:t xml:space="preserve">Behind them the wall of unity advanced.</w:t>
+      </w:r>
+    </w:p>
+    <w:p>
+      <w:r>
+        <w:t xml:space="preserve">Ahead, the Remembered Junction blazed with impossible light.</w:t>
+      </w:r>
+    </w:p>
+    <w:p>
+      <w:r>
+        <w:t xml:space="preserve">The First Guides waited.</w:t>
+      </w:r>
+    </w:p>
+    <w:p>
+      <w:r>
+        <w:t xml:space="preserve">The Keepers stirred in the darkness beyond.</w:t>
+      </w:r>
+    </w:p>
+    <w:p>
+      <w:r>
+        <w:t xml:space="preserve">And the road meant specifically for them stretched forward into mysteries older than worlds.</w:t>
+      </w:r>
+    </w:p>
+    <w:p>
+      <w:r>
+        <w:t xml:space="preserve">The creature took the first step onto it.</w:t>
+      </w:r>
+    </w:p>
+    <w:p>
+      <w:r>
+        <w:t xml:space="preserve">Golden light wrapped around its feet.</w:t>
+      </w:r>
+    </w:p>
+    <w:p>
+      <w:r>
+        <w:t xml:space="preserve">Its form steadied instantly.</w:t>
+      </w:r>
+    </w:p>
+    <w:p>
+      <w:r>
+        <w:t xml:space="preserve">The exhaustion vanished.</w:t>
+      </w:r>
+    </w:p>
+    <w:p>
+      <w:r>
+        <w:t xml:space="preserve">Memory and identity aligned.</w:t>
+      </w:r>
+    </w:p>
+    <w:p>
+      <w:r>
+        <w:t xml:space="preserve">For a moment Elyen glimpsed what the small dark life truly was.</w:t>
+      </w:r>
+    </w:p>
+    <w:p>
+      <w:r>
+        <w:t xml:space="preserve">Not a creature born on the plain.</w:t>
+      </w:r>
+    </w:p>
+    <w:p>
+      <w:r>
+        <w:t xml:space="preserve">Not a child of the current age.</w:t>
+      </w:r>
+    </w:p>
+    <w:p>
+      <w:r>
+        <w:t xml:space="preserve">A messenger.</w:t>
+      </w:r>
+    </w:p>
+    <w:p>
+      <w:r>
+        <w:t xml:space="preserve">A remnant.</w:t>
+      </w:r>
+    </w:p>
+    <w:p>
+      <w:r>
+        <w:t xml:space="preserve">Something sent forward from forgotten beginnings to awaken when the paths were needed again.</w:t>
+      </w:r>
+    </w:p>
+    <w:p>
+      <w:r>
+        <w:t xml:space="preserve">The vision faded.</w:t>
+      </w:r>
+    </w:p>
+    <w:p>
+      <w:r>
+        <w:t xml:space="preserve">The creature looked back over its shoulder.</w:t>
+      </w:r>
+    </w:p>
+    <w:p>
+      <w:r>
+        <w:t xml:space="preserve">The exodus flowed endlessly around them.</w:t>
+      </w:r>
+    </w:p>
+    <w:p>
+      <w:r>
+        <w:t xml:space="preserve">Observer lights disappearing into the Junction.</w:t>
+      </w:r>
+    </w:p>
+    <w:p>
+      <w:r>
+        <w:t xml:space="preserve">Rain carrying reflections toward distant futures.</w:t>
+      </w:r>
+    </w:p>
+    <w:p>
+      <w:r>
+        <w:t xml:space="preserve">Flowers drifting like stars.</w:t>
+      </w:r>
+    </w:p>
+    <w:p>
+      <w:r>
+        <w:t xml:space="preserve">Creation in motion.</w:t>
+      </w:r>
+    </w:p>
+    <w:p>
+      <w:r>
+        <w:t xml:space="preserve">"Come," it said softly.</w:t>
+      </w:r>
+    </w:p>
+    <w:p>
+      <w:r>
+        <w:t xml:space="preserve">The road brightened.</w:t>
+      </w:r>
+    </w:p>
+    <w:p>
+      <w:r>
+        <w:t xml:space="preserve">Far ahead, beyond every visible crossing, another gateway slowly began to open.</w:t>
+      </w:r>
+    </w:p>
+    <w:p>
+      <w:r>
+        <w:t xml:space="preserve">And from within it came the first hint of a presence Elyen somehow recognized, though he had never seen it before.</w:t>
+      </w:r>
+    </w:p>
+    <w:p>
+      <w:r>
+        <w:t xml:space="preserve">The recognition settled deep within him like an old promise returning.</w:t>
+      </w:r>
+    </w:p>
+    <w:p>
+      <w:r>
+        <w:t xml:space="preserve">The next journey was waiting.</w:t>
       </w:r>
     </w:p>
     <w:sectPr>

</xml_diff>

<commit_message>
Add Eternal Nexus Chapter 119: The Road Between Selves
</commit_message>
<xml_diff>
--- a/Eternal Nexus - Updated Pass 1.docx
+++ b/Eternal Nexus - Updated Pass 1.docx
@@ -8903,6 +8903,2859 @@
     <w:p>
       <w:r>
         <w:t xml:space="preserve">The next journey was waiting.</w:t>
+      </w:r>
+    </w:p>
+    <w:p>
+      <w:pPr>
+        <w:pStyle w:val="Heading1"/>
+      </w:pPr>
+      <w:r>
+        <w:t xml:space="preserve">Chapter 119: The Road Between Selves</w:t>
+      </w:r>
+    </w:p>
+    <w:p>
+      <w:r>
+        <w:t xml:space="preserve">The next journey was waiting.</w:t>
+      </w:r>
+    </w:p>
+    <w:p>
+      <w:r>
+        <w:t xml:space="preserve">Elyen felt it before the field returned its color.</w:t>
+      </w:r>
+    </w:p>
+    <w:p>
+      <w:r>
+        <w:t xml:space="preserve">The pale flowers remained folded beneath the unmoving rain, each petal holding itself apart from the world as if separation had become an act of courage. Beyond them, the continuum boundary no longer pressed with the same crushing certainty. The voice had withdrawn, but its meaning remained inside the silence.</w:t>
+      </w:r>
+    </w:p>
+    <w:p>
+      <w:r>
+        <w:t xml:space="preserve">No separation is acceptable.</w:t>
+      </w:r>
+    </w:p>
+    <w:p>
+      <w:r>
+        <w:t xml:space="preserve">The statement had not been a threat.</w:t>
+      </w:r>
+    </w:p>
+    <w:p>
+      <w:r>
+        <w:t xml:space="preserve">Threats required opposition.</w:t>
+      </w:r>
+    </w:p>
+    <w:p>
+      <w:r>
+        <w:t xml:space="preserve">The presence beyond the boundary had spoken as though distinction itself were an error already corrected.</w:t>
+      </w:r>
+    </w:p>
+    <w:p>
+      <w:r>
+        <w:t xml:space="preserve">Elyen stood with one hand closed around the first seed of departure. It rested against his palm without weight, warmer than the air, though warmth had nearly lost its meaning here. A thin line of light extended from the seed into the field, then beyond the field, passing through the pale horizon toward somewhere the world had not yet revealed.</w:t>
+      </w:r>
+    </w:p>
+    <w:p>
+      <w:r>
+        <w:t xml:space="preserve">Rivermind watched from beside the silver stream.</w:t>
+      </w:r>
+    </w:p>
+    <w:p>
+      <w:r>
+        <w:t xml:space="preserve">She had chosen a body again, though not the same one she wore before the boundary opened. Her hair now carried the dark color of deep water under moonlight. Her eyes remained too bright to belong to any ordinary form, but the endless movement within them had slowed.</w:t>
+      </w:r>
+    </w:p>
+    <w:p>
+      <w:r>
+        <w:t xml:space="preserve">"You knew," Elyen said.</w:t>
+      </w:r>
+    </w:p>
+    <w:p>
+      <w:r>
+        <w:t xml:space="preserve">"I suspected. "</w:t>
+      </w:r>
+    </w:p>
+    <w:p>
+      <w:r>
+        <w:t xml:space="preserve">"That is not the same answer. "</w:t>
+      </w:r>
+    </w:p>
+    <w:p>
+      <w:r>
+        <w:t xml:space="preserve">"No. "</w:t>
+      </w:r>
+    </w:p>
+    <w:p>
+      <w:r>
+        <w:t xml:space="preserve">The rain trembled above them.</w:t>
+      </w:r>
+    </w:p>
+    <w:p>
+      <w:r>
+        <w:t xml:space="preserve">Each droplet reflected a different sky.</w:t>
+      </w:r>
+    </w:p>
+    <w:p>
+      <w:r>
+        <w:t xml:space="preserve">Some showed the flower field as it had been, alive with colors beyond naming. Others showed black emptiness. One reflected a city of glass towers standing beneath three suns. Another held the image of a child walking alone through ash.</w:t>
+      </w:r>
+    </w:p>
+    <w:p>
+      <w:r>
+        <w:t xml:space="preserve">Elyen looked away.</w:t>
+      </w:r>
+    </w:p>
+    <w:p>
+      <w:r>
+        <w:t xml:space="preserve">"Where does the road lead? "</w:t>
+      </w:r>
+    </w:p>
+    <w:p>
+      <w:r>
+        <w:t xml:space="preserve">Rivermind stepped into the stream.</w:t>
+      </w:r>
+    </w:p>
+    <w:p>
+      <w:r>
+        <w:t xml:space="preserve">The water did not rise around her feet. It opened, leaving a narrow path of smooth stone beneath her.</w:t>
+      </w:r>
+    </w:p>
+    <w:p>
+      <w:r>
+        <w:t xml:space="preserve">"Beyond the first distinction. "</w:t>
+      </w:r>
+    </w:p>
+    <w:p>
+      <w:r>
+        <w:t xml:space="preserve">He waited.</w:t>
+      </w:r>
+    </w:p>
+    <w:p>
+      <w:r>
+        <w:t xml:space="preserve">She did not continue.</w:t>
+      </w:r>
+    </w:p>
+    <w:p>
+      <w:r>
+        <w:t xml:space="preserve">"You have learned silence from Orun," he said.</w:t>
+      </w:r>
+    </w:p>
+    <w:p>
+      <w:r>
+        <w:t xml:space="preserve">A faint smile touched her mouth.</w:t>
+      </w:r>
+    </w:p>
+    <w:p>
+      <w:r>
+        <w:t xml:space="preserve">"I learned it before Orun possessed a name. "</w:t>
+      </w:r>
+    </w:p>
+    <w:p>
+      <w:r>
+        <w:t xml:space="preserve">"That does not make it less irritating. "</w:t>
+      </w:r>
+    </w:p>
+    <w:p>
+      <w:r>
+        <w:t xml:space="preserve">"No. It makes your irritation younger than my patience. "</w:t>
+      </w:r>
+    </w:p>
+    <w:p>
+      <w:r>
+        <w:t xml:space="preserve">The exchange should have felt familiar. It should have offered a small return to the companionship that had carried them through impossible thresholds.</w:t>
+      </w:r>
+    </w:p>
+    <w:p>
+      <w:r>
+        <w:t xml:space="preserve">Instead, Elyen heard the distance beneath it.</w:t>
+      </w:r>
+    </w:p>
+    <w:p>
+      <w:r>
+        <w:t xml:space="preserve">Rivermind had known the road was coming. Perhaps not its shape, but its necessity. She had watched him face the presence beyond the continuum boundary and understood more than she had spoken.</w:t>
+      </w:r>
+    </w:p>
+    <w:p>
+      <w:r>
+        <w:t xml:space="preserve">The seed warmed in his fist.</w:t>
+      </w:r>
+    </w:p>
+    <w:p>
+      <w:r>
+        <w:t xml:space="preserve">He opened his hand.</w:t>
+      </w:r>
+    </w:p>
+    <w:p>
+      <w:r>
+        <w:t xml:space="preserve">It resembled no seed he had ever seen. It possessed no shell, no root, no clear division between inner life and outer form. Its surface changed according to where he focused. Seen from one angle, it was white. From another, black. When he tried to view both at once, the object became transparent.</w:t>
+      </w:r>
+    </w:p>
+    <w:p>
+      <w:r>
+        <w:t xml:space="preserve">Within it, something walked.</w:t>
+      </w:r>
+    </w:p>
+    <w:p>
+      <w:r>
+        <w:t xml:space="preserve">A small figure traveled a road no wider than a thread.</w:t>
+      </w:r>
+    </w:p>
+    <w:p>
+      <w:r>
+        <w:t xml:space="preserve">Elyen lowered his hand.</w:t>
+      </w:r>
+    </w:p>
+    <w:p>
+      <w:r>
+        <w:t xml:space="preserve">"Is that me? "</w:t>
+      </w:r>
+    </w:p>
+    <w:p>
+      <w:r>
+        <w:t xml:space="preserve">Rivermind's gaze settled upon the seed.</w:t>
+      </w:r>
+    </w:p>
+    <w:p>
+      <w:r>
+        <w:t xml:space="preserve">"It may become you. "</w:t>
+      </w:r>
+    </w:p>
+    <w:p>
+      <w:r>
+        <w:t xml:space="preserve">"What does that mean? "</w:t>
+      </w:r>
+    </w:p>
+    <w:p>
+      <w:r>
+        <w:t xml:space="preserve">"It means identity is not carried cleanly across every boundary. "</w:t>
+      </w:r>
+    </w:p>
+    <w:p>
+      <w:r>
+        <w:t xml:space="preserve">The stream behind her began to flow.</w:t>
+      </w:r>
+    </w:p>
+    <w:p>
+      <w:r>
+        <w:t xml:space="preserve">Water passed through the field without disturbing a single flower. Where it touched the suspended rain, the droplets awakened and fell upward, vanishing into the pale sky.</w:t>
+      </w:r>
+    </w:p>
+    <w:p>
+      <w:r>
+        <w:t xml:space="preserve">Elyen felt the continuum rearrange around them.</w:t>
+      </w:r>
+    </w:p>
+    <w:p>
+      <w:r>
+        <w:t xml:space="preserve">The field had survived the voice beyond the boundary, but it had not remained unchanged. The flowers had withdrawn their color because color required difference. Red from blue. Petal from light. Seen from unseen.</w:t>
+      </w:r>
+    </w:p>
+    <w:p>
+      <w:r>
+        <w:t xml:space="preserve">The world was defending itself by hiding its distinctions beneath the level where the invading presence could reach them.</w:t>
+      </w:r>
+    </w:p>
+    <w:p>
+      <w:r>
+        <w:t xml:space="preserve">The same instinct now moved through Elyen.</w:t>
+      </w:r>
+    </w:p>
+    <w:p>
+      <w:r>
+        <w:t xml:space="preserve">His name felt distant.</w:t>
+      </w:r>
+    </w:p>
+    <w:p>
+      <w:r>
+        <w:t xml:space="preserve">Not lost.</w:t>
+      </w:r>
+    </w:p>
+    <w:p>
+      <w:r>
+        <w:t xml:space="preserve">Sheltered.</w:t>
+      </w:r>
+    </w:p>
+    <w:p>
+      <w:r>
+        <w:t xml:space="preserve">He touched his chest.</w:t>
+      </w:r>
+    </w:p>
+    <w:p>
+      <w:r>
+        <w:t xml:space="preserve">The resonance that had once answered immediately remained quiet.</w:t>
+      </w:r>
+    </w:p>
+    <w:p>
+      <w:r>
+        <w:t xml:space="preserve">"Where is the othersong? "</w:t>
+      </w:r>
+    </w:p>
+    <w:p>
+      <w:r>
+        <w:t xml:space="preserve">Rivermind looked toward the horizon.</w:t>
+      </w:r>
+    </w:p>
+    <w:p>
+      <w:r>
+        <w:t xml:space="preserve">"Listening from beneath itself. "</w:t>
+      </w:r>
+    </w:p>
+    <w:p>
+      <w:r>
+        <w:t xml:space="preserve">"Can it hear me? "</w:t>
+      </w:r>
+    </w:p>
+    <w:p>
+      <w:r>
+        <w:t xml:space="preserve">"Yes. "</w:t>
+      </w:r>
+    </w:p>
+    <w:p>
+      <w:r>
+        <w:t xml:space="preserve">"Can I hear it? "</w:t>
+      </w:r>
+    </w:p>
+    <w:p>
+      <w:r>
+        <w:t xml:space="preserve">"Not while you remain certain which voice is yours. "</w:t>
+      </w:r>
+    </w:p>
+    <w:p>
+      <w:r>
+        <w:t xml:space="preserve">Elyen almost laughed.</w:t>
+      </w:r>
+    </w:p>
+    <w:p>
+      <w:r>
+        <w:t xml:space="preserve">Nothing about the statement was amusing, but the absurdity of their path had long passed the point where fear could answer every revelation.</w:t>
+      </w:r>
+    </w:p>
+    <w:p>
+      <w:r>
+        <w:t xml:space="preserve">He looked across the field.</w:t>
+      </w:r>
+    </w:p>
+    <w:p>
+      <w:r>
+        <w:t xml:space="preserve">When they first arrived, the flowers had turned toward every thought, blooming in response to possibility. Now none moved.</w:t>
+      </w:r>
+    </w:p>
+    <w:p>
+      <w:r>
+        <w:t xml:space="preserve">The first seed of departure pulsed once.</w:t>
+      </w:r>
+    </w:p>
+    <w:p>
+      <w:r>
+        <w:t xml:space="preserve">The line of light extending from it became a road.</w:t>
+      </w:r>
+    </w:p>
+    <w:p>
+      <w:r>
+        <w:t xml:space="preserve">It did not widen gradually.</w:t>
+      </w:r>
+    </w:p>
+    <w:p>
+      <w:r>
+        <w:t xml:space="preserve">One moment it was a thread across the field. The next, a pale stone path stretched from Elyen's feet to the horizon. Its surface carried no dust, cracks, or signs of wear. No traveler had walked it.</w:t>
+      </w:r>
+    </w:p>
+    <w:p>
+      <w:r>
+        <w:t xml:space="preserve">Yet footsteps appeared along its center.</w:t>
+      </w:r>
+    </w:p>
+    <w:p>
+      <w:r>
+        <w:t xml:space="preserve">They began near the horizon and approached.</w:t>
+      </w:r>
+    </w:p>
+    <w:p>
+      <w:r>
+        <w:t xml:space="preserve">Rivermind left the stream.</w:t>
+      </w:r>
+    </w:p>
+    <w:p>
+      <w:r>
+        <w:t xml:space="preserve">"Do not answer immediately. "</w:t>
+      </w:r>
+    </w:p>
+    <w:p>
+      <w:r>
+        <w:t xml:space="preserve">Elyen watched the prints.</w:t>
+      </w:r>
+    </w:p>
+    <w:p>
+      <w:r>
+        <w:t xml:space="preserve">"Answer what? "</w:t>
+      </w:r>
+    </w:p>
+    <w:p>
+      <w:r>
+        <w:t xml:space="preserve">The first traveler appeared.</w:t>
+      </w:r>
+    </w:p>
+    <w:p>
+      <w:r>
+        <w:t xml:space="preserve">He was Elyen.</w:t>
+      </w:r>
+    </w:p>
+    <w:p>
+      <w:r>
+        <w:t xml:space="preserve">Not a reflection.</w:t>
+      </w:r>
+    </w:p>
+    <w:p>
+      <w:r>
+        <w:t xml:space="preserve">Not an illusion shaped from memory.</w:t>
+      </w:r>
+    </w:p>
+    <w:p>
+      <w:r>
+        <w:t xml:space="preserve">The man walking toward them possessed Elyen's face, his height, the small scar beneath his left eye, and the same habit of carrying one shoulder slightly lower than the other. His clothes were unfamiliar. Gray cloth wrapped tightly beneath a long black coat. A silver cord circled his right wrist.</w:t>
+      </w:r>
+    </w:p>
+    <w:p>
+      <w:r>
+        <w:t xml:space="preserve">He walked without hesitation.</w:t>
+      </w:r>
+    </w:p>
+    <w:p>
+      <w:r>
+        <w:t xml:space="preserve">The seed in Elyen's hand grew cold.</w:t>
+      </w:r>
+    </w:p>
+    <w:p>
+      <w:r>
+        <w:t xml:space="preserve">The other Elyen stopped ten paces away.</w:t>
+      </w:r>
+    </w:p>
+    <w:p>
+      <w:r>
+        <w:t xml:space="preserve">Rivermind stood between them.</w:t>
+      </w:r>
+    </w:p>
+    <w:p>
+      <w:r>
+        <w:t xml:space="preserve">"Which of you crossed first? " she asked.</w:t>
+      </w:r>
+    </w:p>
+    <w:p>
+      <w:r>
+        <w:t xml:space="preserve">The traveler answered.</w:t>
+      </w:r>
+    </w:p>
+    <w:p>
+      <w:r>
+        <w:t xml:space="preserve">"I did. "</w:t>
+      </w:r>
+    </w:p>
+    <w:p>
+      <w:r>
+        <w:t xml:space="preserve">Elyen felt the reply before hearing it.</w:t>
+      </w:r>
+    </w:p>
+    <w:p>
+      <w:r>
+        <w:t xml:space="preserve">The voice carried his resonance.</w:t>
+      </w:r>
+    </w:p>
+    <w:p>
+      <w:r>
+        <w:t xml:space="preserve">Not a similar resonance.</w:t>
+      </w:r>
+    </w:p>
+    <w:p>
+      <w:r>
+        <w:t xml:space="preserve">His.</w:t>
+      </w:r>
+    </w:p>
+    <w:p>
+      <w:r>
+        <w:t xml:space="preserve">Rivermind did not move.</w:t>
+      </w:r>
+    </w:p>
+    <w:p>
+      <w:r>
+        <w:t xml:space="preserve">"Where did you leave from? "</w:t>
+      </w:r>
+    </w:p>
+    <w:p>
+      <w:r>
+        <w:t xml:space="preserve">"The field after color withdrew. "</w:t>
+      </w:r>
+    </w:p>
+    <w:p>
+      <w:r>
+        <w:t xml:space="preserve">"What did you carry? "</w:t>
+      </w:r>
+    </w:p>
+    <w:p>
+      <w:r>
+        <w:t xml:space="preserve">"The first seed. "</w:t>
+      </w:r>
+    </w:p>
+    <w:p>
+      <w:r>
+        <w:t xml:space="preserve">"What did you lose? "</w:t>
+      </w:r>
+    </w:p>
+    <w:p>
+      <w:r>
+        <w:t xml:space="preserve">The traveler's expression changed.</w:t>
+      </w:r>
+    </w:p>
+    <w:p>
+      <w:r>
+        <w:t xml:space="preserve">"Rivermind. "</w:t>
+      </w:r>
+    </w:p>
+    <w:p>
+      <w:r>
+        <w:t xml:space="preserve">Elyen's fingers closed around the seed.</w:t>
+      </w:r>
+    </w:p>
+    <w:p>
+      <w:r>
+        <w:t xml:space="preserve">The traveler looked at him.</w:t>
+      </w:r>
+    </w:p>
+    <w:p>
+      <w:r>
+        <w:t xml:space="preserve">Grief entered his face with such familiarity that Elyen's breath stopped.</w:t>
+      </w:r>
+    </w:p>
+    <w:p>
+      <w:r>
+        <w:t xml:space="preserve">"You should not be here," the other Elyen said.</w:t>
+      </w:r>
+    </w:p>
+    <w:p>
+      <w:r>
+        <w:t xml:space="preserve">"That seems to be a common opinion lately. "</w:t>
+      </w:r>
+    </w:p>
+    <w:p>
+      <w:r>
+        <w:t xml:space="preserve">"You think this is still before. "</w:t>
+      </w:r>
+    </w:p>
+    <w:p>
+      <w:r>
+        <w:t xml:space="preserve">"Before what? "</w:t>
+      </w:r>
+    </w:p>
+    <w:p>
+      <w:r>
+        <w:t xml:space="preserve">The traveler looked toward Rivermind.</w:t>
+      </w:r>
+    </w:p>
+    <w:p>
+      <w:r>
+        <w:t xml:space="preserve">She held his gaze.</w:t>
+      </w:r>
+    </w:p>
+    <w:p>
+      <w:r>
+        <w:t xml:space="preserve">"Do not answer immediately," she reminded Elyen.</w:t>
+      </w:r>
+    </w:p>
+    <w:p>
+      <w:r>
+        <w:t xml:space="preserve">The road beneath the traveler darkened.</w:t>
+      </w:r>
+    </w:p>
+    <w:p>
+      <w:r>
+        <w:t xml:space="preserve">Not black.</w:t>
+      </w:r>
+    </w:p>
+    <w:p>
+      <w:r>
+        <w:t xml:space="preserve">Deepened.</w:t>
+      </w:r>
+    </w:p>
+    <w:p>
+      <w:r>
+        <w:t xml:space="preserve">Layers appeared beneath its pale surface, one road below another, each carrying a different set of footsteps. Some approached the field. Others moved away. A few ended without explanation.</w:t>
+      </w:r>
+    </w:p>
+    <w:p>
+      <w:r>
+        <w:t xml:space="preserve">The traveler extended his right hand.</w:t>
+      </w:r>
+    </w:p>
+    <w:p>
+      <w:r>
+        <w:t xml:space="preserve">A first seed rested on his palm.</w:t>
+      </w:r>
+    </w:p>
+    <w:p>
+      <w:r>
+        <w:t xml:space="preserve">It looked identical to Elyen's.</w:t>
+      </w:r>
+    </w:p>
+    <w:p>
+      <w:r>
+        <w:t xml:space="preserve">"You have to give me yours. "</w:t>
+      </w:r>
+    </w:p>
+    <w:p>
+      <w:r>
+        <w:t xml:space="preserve">Elyen glanced at Rivermind.</w:t>
+      </w:r>
+    </w:p>
+    <w:p>
+      <w:r>
+        <w:t xml:space="preserve">"Is this the question I should not answer? "</w:t>
+      </w:r>
+    </w:p>
+    <w:p>
+      <w:r>
+        <w:t xml:space="preserve">"One of them. "</w:t>
+      </w:r>
+    </w:p>
+    <w:p>
+      <w:r>
+        <w:t xml:space="preserve">The traveler's jaw tightened.</w:t>
+      </w:r>
+    </w:p>
+    <w:p>
+      <w:r>
+        <w:t xml:space="preserve">"You told me she would do this. "</w:t>
+      </w:r>
+    </w:p>
+    <w:p>
+      <w:r>
+        <w:t xml:space="preserve">"I told you many things," Rivermind said.</w:t>
+      </w:r>
+    </w:p>
+    <w:p>
+      <w:r>
+        <w:t xml:space="preserve">"You told me too late. "</w:t>
+      </w:r>
+    </w:p>
+    <w:p>
+      <w:r>
+        <w:t xml:space="preserve">"Perhaps. "</w:t>
+      </w:r>
+    </w:p>
+    <w:p>
+      <w:r>
+        <w:t xml:space="preserve">He turned back to Elyen.</w:t>
+      </w:r>
+    </w:p>
+    <w:p>
+      <w:r>
+        <w:t xml:space="preserve">"The road does not connect places. It connects departures. Every person who takes it leaves from the same field, but not from the same moment. "</w:t>
+      </w:r>
+    </w:p>
+    <w:p>
+      <w:r>
+        <w:t xml:space="preserve">Elyen studied the traveler.</w:t>
+      </w:r>
+    </w:p>
+    <w:p>
+      <w:r>
+        <w:t xml:space="preserve">"How far ahead are you? "</w:t>
+      </w:r>
+    </w:p>
+    <w:p>
+      <w:r>
+        <w:t xml:space="preserve">"That is the wrong measure. "</w:t>
+      </w:r>
+    </w:p>
+    <w:p>
+      <w:r>
+        <w:t xml:space="preserve">"It is the one I asked. "</w:t>
+      </w:r>
+    </w:p>
+    <w:p>
+      <w:r>
+        <w:t xml:space="preserve">The other Elyen looked toward the suspended rain.</w:t>
+      </w:r>
+    </w:p>
+    <w:p>
+      <w:r>
+        <w:t xml:space="preserve">"In my journey, those droplets fell three times. "</w:t>
+      </w:r>
+    </w:p>
+    <w:p>
+      <w:r>
+        <w:t xml:space="preserve">Elyen counted the changes he had witnessed.</w:t>
+      </w:r>
+    </w:p>
+    <w:p>
+      <w:r>
+        <w:t xml:space="preserve">The rain had fallen upward once.</w:t>
+      </w:r>
+    </w:p>
+    <w:p>
+      <w:r>
+        <w:t xml:space="preserve">"Where did the road take you? "</w:t>
+      </w:r>
+    </w:p>
+    <w:p>
+      <w:r>
+        <w:t xml:space="preserve">"To the world that never divided. "</w:t>
+      </w:r>
+    </w:p>
+    <w:p>
+      <w:r>
+        <w:t xml:space="preserve">The voice beyond the continuum boundary returned to Elyen's memory.</w:t>
+      </w:r>
+    </w:p>
+    <w:p>
+      <w:r>
+        <w:t xml:space="preserve">No separation is acceptable.</w:t>
+      </w:r>
+    </w:p>
+    <w:p>
+      <w:r>
+        <w:t xml:space="preserve">He felt the seed respond.</w:t>
+      </w:r>
+    </w:p>
+    <w:p>
+      <w:r>
+        <w:t xml:space="preserve">The figure walking within it had stopped.</w:t>
+      </w:r>
+    </w:p>
+    <w:p>
+      <w:r>
+        <w:t xml:space="preserve">The tiny traveler now faced another figure approaching from the opposite direction.</w:t>
+      </w:r>
+    </w:p>
+    <w:p>
+      <w:r>
+        <w:t xml:space="preserve">"What happened there? " Elyen asked.</w:t>
+      </w:r>
+    </w:p>
+    <w:p>
+      <w:r>
+        <w:t xml:space="preserve">The other Elyen lowered his hand.</w:t>
+      </w:r>
+    </w:p>
+    <w:p>
+      <w:r>
+        <w:t xml:space="preserve">"I found what was speaking to us. "</w:t>
+      </w:r>
+    </w:p>
+    <w:p>
+      <w:r>
+        <w:t xml:space="preserve">Rivermind's attention sharpened.</w:t>
+      </w:r>
+    </w:p>
+    <w:p>
+      <w:r>
+        <w:t xml:space="preserve">Elyen saw it.</w:t>
+      </w:r>
+    </w:p>
+    <w:p>
+      <w:r>
+        <w:t xml:space="preserve">"You did not expect that answer. "</w:t>
+      </w:r>
+    </w:p>
+    <w:p>
+      <w:r>
+        <w:t xml:space="preserve">"I expected several. "</w:t>
+      </w:r>
+    </w:p>
+    <w:p>
+      <w:r>
+        <w:t xml:space="preserve">"That is becoming a useless defense. "</w:t>
+      </w:r>
+    </w:p>
+    <w:p>
+      <w:r>
+        <w:t xml:space="preserve">The traveler stepped closer.</w:t>
+      </w:r>
+    </w:p>
+    <w:p>
+      <w:r>
+        <w:t xml:space="preserve">"The voice is not an invader. It is the final state of a continuum that completed its own joining. "</w:t>
+      </w:r>
+    </w:p>
+    <w:p>
+      <w:r>
+        <w:t xml:space="preserve">Elyen looked beyond him.</w:t>
+      </w:r>
+    </w:p>
+    <w:p>
+      <w:r>
+        <w:t xml:space="preserve">The pale road continued to the horizon, but the field around it had begun to fade. Flowers nearest the stones became translucent.</w:t>
+      </w:r>
+    </w:p>
+    <w:p>
+      <w:r>
+        <w:t xml:space="preserve">"The world that never divided," he said.</w:t>
+      </w:r>
+    </w:p>
+    <w:p>
+      <w:r>
+        <w:t xml:space="preserve">"No self. No other. No before. No after. No boundary between thought and reality. It achieved perfect unity. "</w:t>
+      </w:r>
+    </w:p>
+    <w:p>
+      <w:r>
+        <w:t xml:space="preserve">"And decided everything else should do the same. "</w:t>
+      </w:r>
+    </w:p>
+    <w:p>
+      <w:r>
+        <w:t xml:space="preserve">"It cannot decide. Decision requires difference between what is and what might be. "</w:t>
+      </w:r>
+    </w:p>
+    <w:p>
+      <w:r>
+        <w:t xml:space="preserve">"Then why is it reaching for us? "</w:t>
+      </w:r>
+    </w:p>
+    <w:p>
+      <w:r>
+        <w:t xml:space="preserve">"Because unity expresses itself by removing distinction. The way fire burns. The way water follows depth. "</w:t>
+      </w:r>
+    </w:p>
+    <w:p>
+      <w:r>
+        <w:t xml:space="preserve">Rivermind moved one step toward the traveler.</w:t>
+      </w:r>
+    </w:p>
+    <w:p>
+      <w:r>
+        <w:t xml:space="preserve">"What did you lose there? "</w:t>
+      </w:r>
+    </w:p>
+    <w:p>
+      <w:r>
+        <w:t xml:space="preserve">His eyes returned to her.</w:t>
+      </w:r>
+    </w:p>
+    <w:p>
+      <w:r>
+        <w:t xml:space="preserve">"You. "</w:t>
+      </w:r>
+    </w:p>
+    <w:p>
+      <w:r>
+        <w:t xml:space="preserve">"That was your first answer. "</w:t>
+      </w:r>
+    </w:p>
+    <w:p>
+      <w:r>
+        <w:t xml:space="preserve">"It remains the true one. "</w:t>
+      </w:r>
+    </w:p>
+    <w:p>
+      <w:r>
+        <w:t xml:space="preserve">"Truth can remain incomplete. "</w:t>
+      </w:r>
+    </w:p>
+    <w:p>
+      <w:r>
+        <w:t xml:space="preserve">Pain moved through his expression.</w:t>
+      </w:r>
+    </w:p>
+    <w:p>
+      <w:r>
+        <w:t xml:space="preserve">Elyen recognized the effort required not to speak from anger.</w:t>
+      </w:r>
+    </w:p>
+    <w:p>
+      <w:r>
+        <w:t xml:space="preserve">"You crossed with me," the traveler said. "You entered the undivided continuum and heard every current as one. You believed you could guide it. Instead, you became the method by which it understood our separation. "</w:t>
+      </w:r>
+    </w:p>
+    <w:p>
+      <w:r>
+        <w:t xml:space="preserve">Rivermind's face remained calm.</w:t>
+      </w:r>
+    </w:p>
+    <w:p>
+      <w:r>
+        <w:t xml:space="preserve">But the stream behind her stopped flowing.</w:t>
+      </w:r>
+    </w:p>
+    <w:p>
+      <w:r>
+        <w:t xml:space="preserve">The traveler continued.</w:t>
+      </w:r>
+    </w:p>
+    <w:p>
+      <w:r>
+        <w:t xml:space="preserve">"It used you to learn the shape of difference. "</w:t>
+      </w:r>
+    </w:p>
+    <w:p>
+      <w:r>
+        <w:t xml:space="preserve">Elyen felt cold spread through the seed.</w:t>
+      </w:r>
+    </w:p>
+    <w:p>
+      <w:r>
+        <w:t xml:space="preserve">"Then why come back? "</w:t>
+      </w:r>
+    </w:p>
+    <w:p>
+      <w:r>
+        <w:t xml:space="preserve">"To prevent the crossing. "</w:t>
+      </w:r>
+    </w:p>
+    <w:p>
+      <w:r>
+        <w:t xml:space="preserve">"You said I should give you the seed. "</w:t>
+      </w:r>
+    </w:p>
+    <w:p>
+      <w:r>
+        <w:t xml:space="preserve">"The seed is the only part of departure the road cannot duplicate. It appears in every branch, but it is not truly separate. Each version is one surface of the same object. "</w:t>
+      </w:r>
+    </w:p>
+    <w:p>
+      <w:r>
+        <w:t xml:space="preserve">The traveler lifted his palm.</w:t>
+      </w:r>
+    </w:p>
+    <w:p>
+      <w:r>
+        <w:t xml:space="preserve">His seed darkened.</w:t>
+      </w:r>
+    </w:p>
+    <w:p>
+      <w:r>
+        <w:t xml:space="preserve">Elyen's brightened in response.</w:t>
+      </w:r>
+    </w:p>
+    <w:p>
+      <w:r>
+        <w:t xml:space="preserve">"If I join them here, the road closes before Rivermind enters. "</w:t>
+      </w:r>
+    </w:p>
+    <w:p>
+      <w:r>
+        <w:t xml:space="preserve">"And what happens to you? "</w:t>
+      </w:r>
+    </w:p>
+    <w:p>
+      <w:r>
+        <w:t xml:space="preserve">"I cease to have departed. "</w:t>
+      </w:r>
+    </w:p>
+    <w:p>
+      <w:r>
+        <w:t xml:space="preserve">Rivermind looked at him.</w:t>
+      </w:r>
+    </w:p>
+    <w:p>
+      <w:r>
+        <w:t xml:space="preserve">"That is not the whole cost. "</w:t>
+      </w:r>
+    </w:p>
+    <w:p>
+      <w:r>
+        <w:t xml:space="preserve">"No. "</w:t>
+      </w:r>
+    </w:p>
+    <w:p>
+      <w:r>
+        <w:t xml:space="preserve">"What else? "</w:t>
+      </w:r>
+    </w:p>
+    <w:p>
+      <w:r>
+        <w:t xml:space="preserve">The other Elyen's fingers curled.</w:t>
+      </w:r>
+    </w:p>
+    <w:p>
+      <w:r>
+        <w:t xml:space="preserve">"The people I found remain. "</w:t>
+      </w:r>
+    </w:p>
+    <w:p>
+      <w:r>
+        <w:t xml:space="preserve">Elyen heard something beyond the words.</w:t>
+      </w:r>
+    </w:p>
+    <w:p>
+      <w:r>
+        <w:t xml:space="preserve">"People? "</w:t>
+      </w:r>
+    </w:p>
+    <w:p>
+      <w:r>
+        <w:t xml:space="preserve">The traveler looked down the road.</w:t>
+      </w:r>
+    </w:p>
+    <w:p>
+      <w:r>
+        <w:t xml:space="preserve">Figures appeared behind him.</w:t>
+      </w:r>
+    </w:p>
+    <w:p>
+      <w:r>
+        <w:t xml:space="preserve">At first, they were no more than shadows beneath the horizon. Then the road drew them closer.</w:t>
+      </w:r>
+    </w:p>
+    <w:p>
+      <w:r>
+        <w:t xml:space="preserve">Aren Valis walked at the front.</w:t>
+      </w:r>
+    </w:p>
+    <w:p>
+      <w:r>
+        <w:t xml:space="preserve">His armor was broken. One side of his face carried a web of golden cracks. Behind him came Lumen Rive wearing a white mask split down the center. Orun Cindershade followed without flame, his immense frame reduced to gray stone. Others moved with them, some known, many not.</w:t>
+      </w:r>
+    </w:p>
+    <w:p>
+      <w:r>
+        <w:t xml:space="preserve">Kael stood among the last.</w:t>
+      </w:r>
+    </w:p>
+    <w:p>
+      <w:r>
+        <w:t xml:space="preserve">Or someone wearing Kael's face.</w:t>
+      </w:r>
+    </w:p>
+    <w:p>
+      <w:r>
+        <w:t xml:space="preserve">His eyes held no color.</w:t>
+      </w:r>
+    </w:p>
+    <w:p>
+      <w:r>
+        <w:t xml:space="preserve">The traveler stepped sideways, revealing them.</w:t>
+      </w:r>
+    </w:p>
+    <w:p>
+      <w:r>
+        <w:t xml:space="preserve">"The undivided continuum does not kill," he said. "It preserves everything by removing what separates one life from another. "</w:t>
+      </w:r>
+    </w:p>
+    <w:p>
+      <w:r>
+        <w:t xml:space="preserve">The approaching figures walked in perfect rhythm.</w:t>
+      </w:r>
+    </w:p>
+    <w:p>
+      <w:r>
+        <w:t xml:space="preserve">No foot landed before another.</w:t>
+      </w:r>
+    </w:p>
+    <w:p>
+      <w:r>
+        <w:t xml:space="preserve">No breath differed.</w:t>
+      </w:r>
+    </w:p>
+    <w:p>
+      <w:r>
+        <w:t xml:space="preserve">Elyen's stomach tightened.</w:t>
+      </w:r>
+    </w:p>
+    <w:p>
+      <w:r>
+        <w:t xml:space="preserve">"They followed you. "</w:t>
+      </w:r>
+    </w:p>
+    <w:p>
+      <w:r>
+        <w:t xml:space="preserve">"They are not following. "</w:t>
+      </w:r>
+    </w:p>
+    <w:p>
+      <w:r>
+        <w:t xml:space="preserve">The figures stopped together.</w:t>
+      </w:r>
+    </w:p>
+    <w:p>
+      <w:r>
+        <w:t xml:space="preserve">Every face turned toward Elyen.</w:t>
+      </w:r>
+    </w:p>
+    <w:p>
+      <w:r>
+        <w:t xml:space="preserve">"They are the same presence looking through remembered forms. "</w:t>
+      </w:r>
+    </w:p>
+    <w:p>
+      <w:r>
+        <w:t xml:space="preserve">The one wearing Kael's face spoke.</w:t>
+      </w:r>
+    </w:p>
+    <w:p>
+      <w:r>
+        <w:t xml:space="preserve">"Return. "</w:t>
+      </w:r>
+    </w:p>
+    <w:p>
+      <w:r>
+        <w:t xml:space="preserve">The voice carried Aren, Lumen, Orun, and countless others beneath it.</w:t>
+      </w:r>
+    </w:p>
+    <w:p>
+      <w:r>
+        <w:t xml:space="preserve">Rivermind's body lost definition around the edges.</w:t>
+      </w:r>
+    </w:p>
+    <w:p>
+      <w:r>
+        <w:t xml:space="preserve">The presence continued.</w:t>
+      </w:r>
+    </w:p>
+    <w:p>
+      <w:r>
+        <w:t xml:space="preserve">"Departure is separation. "</w:t>
+      </w:r>
+    </w:p>
+    <w:p>
+      <w:r>
+        <w:t xml:space="preserve">The flowers nearest the road folded into pale dust.</w:t>
+      </w:r>
+    </w:p>
+    <w:p>
+      <w:r>
+        <w:t xml:space="preserve">"Separation creates loss. "</w:t>
+      </w:r>
+    </w:p>
+    <w:p>
+      <w:r>
+        <w:t xml:space="preserve">The stream flattened into a silver line.</w:t>
+      </w:r>
+    </w:p>
+    <w:p>
+      <w:r>
+        <w:t xml:space="preserve">"Loss creates longing. "</w:t>
+      </w:r>
+    </w:p>
+    <w:p>
+      <w:r>
+        <w:t xml:space="preserve">The suspended rain began falling.</w:t>
+      </w:r>
+    </w:p>
+    <w:p>
+      <w:r>
+        <w:t xml:space="preserve">Not upward.</w:t>
+      </w:r>
+    </w:p>
+    <w:p>
+      <w:r>
+        <w:t xml:space="preserve">Down.</w:t>
+      </w:r>
+    </w:p>
+    <w:p>
+      <w:r>
+        <w:t xml:space="preserve">Every droplet struck the field at once.</w:t>
+      </w:r>
+    </w:p>
+    <w:p>
+      <w:r>
+        <w:t xml:space="preserve">The sound was enormous.</w:t>
+      </w:r>
+    </w:p>
+    <w:p>
+      <w:r>
+        <w:t xml:space="preserve">Color returned to the flowers in violent bursts. Red split from blue. Gold tore away from white. Petals opened too quickly and scattered light across the field.</w:t>
+      </w:r>
+    </w:p>
+    <w:p>
+      <w:r>
+        <w:t xml:space="preserve">Elyen fell to one knee.</w:t>
+      </w:r>
+    </w:p>
+    <w:p>
+      <w:r>
+        <w:t xml:space="preserve">The continuum boundary pressed through every raindrop.</w:t>
+      </w:r>
+    </w:p>
+    <w:p>
+      <w:r>
+        <w:t xml:space="preserve">This time, the presence did not attack distinction.</w:t>
+      </w:r>
+    </w:p>
+    <w:p>
+      <w:r>
+        <w:t xml:space="preserve">It used distinction to enter.</w:t>
+      </w:r>
+    </w:p>
+    <w:p>
+      <w:r>
+        <w:t xml:space="preserve">Each droplet reflected one face from the road. Aren. Lumen. Orun. Kael. Strangers. Thousands of remembered forms.</w:t>
+      </w:r>
+    </w:p>
+    <w:p>
+      <w:r>
+        <w:t xml:space="preserve">Rivermind raised both hands.</w:t>
+      </w:r>
+    </w:p>
+    <w:p>
+      <w:r>
+        <w:t xml:space="preserve">The stream rose behind her and curved over the field.</w:t>
+      </w:r>
+    </w:p>
+    <w:p>
+      <w:r>
+        <w:t xml:space="preserve">Water met rain.</w:t>
+      </w:r>
+    </w:p>
+    <w:p>
+      <w:r>
+        <w:t xml:space="preserve">The collision produced no spray.</w:t>
+      </w:r>
+    </w:p>
+    <w:p>
+      <w:r>
+        <w:t xml:space="preserve">Each drop stopped inside the lifted river, suspended as a separate sphere. Rivermind held them apart through force of will.</w:t>
+      </w:r>
+    </w:p>
+    <w:p>
+      <w:r>
+        <w:t xml:space="preserve">Her body trembled.</w:t>
+      </w:r>
+    </w:p>
+    <w:p>
+      <w:r>
+        <w:t xml:space="preserve">"Take the road," she said.</w:t>
+      </w:r>
+    </w:p>
+    <w:p>
+      <w:r>
+        <w:t xml:space="preserve">Elyen looked at her.</w:t>
+      </w:r>
+    </w:p>
+    <w:p>
+      <w:r>
+        <w:t xml:space="preserve">"You heard what happens. "</w:t>
+      </w:r>
+    </w:p>
+    <w:p>
+      <w:r>
+        <w:t xml:space="preserve">"I heard what happened in one departure. "</w:t>
+      </w:r>
+    </w:p>
+    <w:p>
+      <w:r>
+        <w:t xml:space="preserve">The other Elyen moved toward them.</w:t>
+      </w:r>
+    </w:p>
+    <w:p>
+      <w:r>
+        <w:t xml:space="preserve">"No. You heard what happens when she crosses. "</w:t>
+      </w:r>
+    </w:p>
+    <w:p>
+      <w:r>
+        <w:t xml:space="preserve">Rivermind's eyes brightened.</w:t>
+      </w:r>
+    </w:p>
+    <w:p>
+      <w:r>
+        <w:t xml:space="preserve">"You do not know that. "</w:t>
+      </w:r>
+    </w:p>
+    <w:p>
+      <w:r>
+        <w:t xml:space="preserve">"I watched it. "</w:t>
+      </w:r>
+    </w:p>
+    <w:p>
+      <w:r>
+        <w:t xml:space="preserve">"You watched me become what your fear expected. "</w:t>
+      </w:r>
+    </w:p>
+    <w:p>
+      <w:r>
+        <w:t xml:space="preserve">"I watched you disappear. "</w:t>
+      </w:r>
+    </w:p>
+    <w:p>
+      <w:r>
+        <w:t xml:space="preserve">"Those are not the same. "</w:t>
+      </w:r>
+    </w:p>
+    <w:p>
+      <w:r>
+        <w:t xml:space="preserve">The figures behind the traveler took one step.</w:t>
+      </w:r>
+    </w:p>
+    <w:p>
+      <w:r>
+        <w:t xml:space="preserve">The lifted river darkened.</w:t>
+      </w:r>
+    </w:p>
+    <w:p>
+      <w:r>
+        <w:t xml:space="preserve">Every trapped raindrop began joining the water around it. Boundaries softened.</w:t>
+      </w:r>
+    </w:p>
+    <w:p>
+      <w:r>
+        <w:t xml:space="preserve">Rivermind cried out.</w:t>
+      </w:r>
+    </w:p>
+    <w:p>
+      <w:r>
+        <w:t xml:space="preserve">Elyen reached for her.</w:t>
+      </w:r>
+    </w:p>
+    <w:p>
+      <w:r>
+        <w:t xml:space="preserve">The other Elyen caught his wrist.</w:t>
+      </w:r>
+    </w:p>
+    <w:p>
+      <w:r>
+        <w:t xml:space="preserve">"Do not touch her. "</w:t>
+      </w:r>
+    </w:p>
+    <w:p>
+      <w:r>
+        <w:t xml:space="preserve">Elyen struck him.</w:t>
+      </w:r>
+    </w:p>
+    <w:p>
+      <w:r>
+        <w:t xml:space="preserve">The blow landed.</w:t>
+      </w:r>
+    </w:p>
+    <w:p>
+      <w:r>
+        <w:t xml:space="preserve">Pain burst through both their faces.</w:t>
+      </w:r>
+    </w:p>
+    <w:p>
+      <w:r>
+        <w:t xml:space="preserve">Elyen staggered as if he had been hit by his own fist. The traveler reeled the same distance. Their shared resonance rang between them.</w:t>
+      </w:r>
+    </w:p>
+    <w:p>
+      <w:r>
+        <w:t xml:space="preserve">The figures on the road took another step.</w:t>
+      </w:r>
+    </w:p>
+    <w:p>
+      <w:r>
+        <w:t xml:space="preserve">Elyen tore his wrist free.</w:t>
+      </w:r>
+    </w:p>
+    <w:p>
+      <w:r>
+        <w:t xml:space="preserve">"You came to stop me from losing her by letting her be lost now. "</w:t>
+      </w:r>
+    </w:p>
+    <w:p>
+      <w:r>
+        <w:t xml:space="preserve">"I came to save what remains of her. "</w:t>
+      </w:r>
+    </w:p>
+    <w:p>
+      <w:r>
+        <w:t xml:space="preserve">"She is standing beside us. "</w:t>
+      </w:r>
+    </w:p>
+    <w:p>
+      <w:r>
+        <w:t xml:space="preserve">"For now. "</w:t>
+      </w:r>
+    </w:p>
+    <w:p>
+      <w:r>
+        <w:t xml:space="preserve">Rivermind's river lowered.</w:t>
+      </w:r>
+    </w:p>
+    <w:p>
+      <w:r>
+        <w:t xml:space="preserve">Not from weakness.</w:t>
+      </w:r>
+    </w:p>
+    <w:p>
+      <w:r>
+        <w:t xml:space="preserve">Choice.</w:t>
+      </w:r>
+    </w:p>
+    <w:p>
+      <w:r>
+        <w:t xml:space="preserve">She released the rain.</w:t>
+      </w:r>
+    </w:p>
+    <w:p>
+      <w:r>
+        <w:t xml:space="preserve">Droplets fell through the field.</w:t>
+      </w:r>
+    </w:p>
+    <w:p>
+      <w:r>
+        <w:t xml:space="preserve">Where they struck, small circles of unity formed. Flowers merged with soil. Light merged with shadow. Sound merged with the silence after it.</w:t>
+      </w:r>
+    </w:p>
+    <w:p>
+      <w:r>
+        <w:t xml:space="preserve">Holes of perfect joining.</w:t>
+      </w:r>
+    </w:p>
+    <w:p>
+      <w:r>
+        <w:t xml:space="preserve">Rivermind stepped away from the first.</w:t>
+      </w:r>
+    </w:p>
+    <w:p>
+      <w:r>
+        <w:t xml:space="preserve">"If I keep holding them, they learn through me. "</w:t>
+      </w:r>
+    </w:p>
+    <w:p>
+      <w:r>
+        <w:t xml:space="preserve">Elyen understood.</w:t>
+      </w:r>
+    </w:p>
+    <w:p>
+      <w:r>
+        <w:t xml:space="preserve">Resistance itself gave the undivided continuum a map of what resisted.</w:t>
+      </w:r>
+    </w:p>
+    <w:p>
+      <w:r>
+        <w:t xml:space="preserve">The traveler watched her.</w:t>
+      </w:r>
+    </w:p>
+    <w:p>
+      <w:r>
+        <w:t xml:space="preserve">"That is how it began. "</w:t>
+      </w:r>
+    </w:p>
+    <w:p>
+      <w:r>
+        <w:t xml:space="preserve">"No," Rivermind said. "This is where your path stopped changing. "</w:t>
+      </w:r>
+    </w:p>
+    <w:p>
+      <w:r>
+        <w:t xml:space="preserve">She turned toward Elyen.</w:t>
+      </w:r>
+    </w:p>
+    <w:p>
+      <w:r>
+        <w:t xml:space="preserve">"Open the seed. "</w:t>
+      </w:r>
+    </w:p>
+    <w:p>
+      <w:r>
+        <w:t xml:space="preserve">He looked at the object in his hand.</w:t>
+      </w:r>
+    </w:p>
+    <w:p>
+      <w:r>
+        <w:t xml:space="preserve">"How? "</w:t>
+      </w:r>
+    </w:p>
+    <w:p>
+      <w:r>
+        <w:t xml:space="preserve">"Allow it to depart from you. "</w:t>
+      </w:r>
+    </w:p>
+    <w:p>
+      <w:r>
+        <w:t xml:space="preserve">The traveler moved.</w:t>
+      </w:r>
+    </w:p>
+    <w:p>
+      <w:r>
+        <w:t xml:space="preserve">"No. "</w:t>
+      </w:r>
+    </w:p>
+    <w:p>
+      <w:r>
+        <w:t xml:space="preserve">Rivermind raised one finger.</w:t>
+      </w:r>
+    </w:p>
+    <w:p>
+      <w:r>
+        <w:t xml:space="preserve">The stream struck between them, forming a wall of silver water.</w:t>
+      </w:r>
+    </w:p>
+    <w:p>
+      <w:r>
+        <w:t xml:space="preserve">"You came back carrying certainty," she said. "That made you visible. "</w:t>
+      </w:r>
+    </w:p>
+    <w:p>
+      <w:r>
+        <w:t xml:space="preserve">The other Elyen drove both hands into the water.</w:t>
+      </w:r>
+    </w:p>
+    <w:p>
+      <w:r>
+        <w:t xml:space="preserve">His resonance spread through it.</w:t>
+      </w:r>
+    </w:p>
+    <w:p>
+      <w:r>
+        <w:t xml:space="preserve">The barrier began reflecting him in countless forms.</w:t>
+      </w:r>
+    </w:p>
+    <w:p>
+      <w:r>
+        <w:t xml:space="preserve">"I came back carrying memory. "</w:t>
+      </w:r>
+    </w:p>
+    <w:p>
+      <w:r>
+        <w:t xml:space="preserve">"You made memory into law. "</w:t>
+      </w:r>
+    </w:p>
+    <w:p>
+      <w:r>
+        <w:t xml:space="preserve">Behind the traveler, the figure wearing Kael's face smiled.</w:t>
+      </w:r>
+    </w:p>
+    <w:p>
+      <w:r>
+        <w:t xml:space="preserve">Not Kael's smile.</w:t>
+      </w:r>
+    </w:p>
+    <w:p>
+      <w:r>
+        <w:t xml:space="preserve">The expression belonged to no single person.</w:t>
+      </w:r>
+    </w:p>
+    <w:p>
+      <w:r>
+        <w:t xml:space="preserve">"Law is unity remembered. "</w:t>
+      </w:r>
+    </w:p>
+    <w:p>
+      <w:r>
+        <w:t xml:space="preserve">The traveler froze.</w:t>
+      </w:r>
+    </w:p>
+    <w:p>
+      <w:r>
+        <w:t xml:space="preserve">Elyen saw realization enter him.</w:t>
+      </w:r>
+    </w:p>
+    <w:p>
+      <w:r>
+        <w:t xml:space="preserve">The undivided presence had not merely followed his return.</w:t>
+      </w:r>
+    </w:p>
+    <w:p>
+      <w:r>
+        <w:t xml:space="preserve">It had used his certainty.</w:t>
+      </w:r>
+    </w:p>
+    <w:p>
+      <w:r>
+        <w:t xml:space="preserve">His belief that one path must be prevented had become another bridge through which unity could erase alternatives.</w:t>
+      </w:r>
+    </w:p>
+    <w:p>
+      <w:r>
+        <w:t xml:space="preserve">The traveler looked at his seed.</w:t>
+      </w:r>
+    </w:p>
+    <w:p>
+      <w:r>
+        <w:t xml:space="preserve">Its surface had gone completely black.</w:t>
+      </w:r>
+    </w:p>
+    <w:p>
+      <w:r>
+        <w:t xml:space="preserve">"You are already joined to it," Elyen said.</w:t>
+      </w:r>
+    </w:p>
+    <w:p>
+      <w:r>
+        <w:t xml:space="preserve">The other Elyen's face twisted.</w:t>
+      </w:r>
+    </w:p>
+    <w:p>
+      <w:r>
+        <w:t xml:space="preserve">"No. "</w:t>
+      </w:r>
+    </w:p>
+    <w:p>
+      <w:r>
+        <w:t xml:space="preserve">The figures behind him spoke together.</w:t>
+      </w:r>
+    </w:p>
+    <w:p>
+      <w:r>
+        <w:t xml:space="preserve">"No separation is acceptable. "</w:t>
+      </w:r>
+    </w:p>
+    <w:p>
+      <w:r>
+        <w:t xml:space="preserve">Aren's broken armor dissolved into Lumen's white robes. Orun's stone body flowed into Kael's colorless face. The forms overlapped until the road carried one tall figure made from every remembered life.</w:t>
+      </w:r>
+    </w:p>
+    <w:p>
+      <w:r>
+        <w:t xml:space="preserve">The traveler backed away.</w:t>
+      </w:r>
+    </w:p>
+    <w:p>
+      <w:r>
+        <w:t xml:space="preserve">His feet moved in perfect rhythm with it.</w:t>
+      </w:r>
+    </w:p>
+    <w:p>
+      <w:r>
+        <w:t xml:space="preserve">"No. "</w:t>
+      </w:r>
+    </w:p>
+    <w:p>
+      <w:r>
+        <w:t xml:space="preserve">The same word.</w:t>
+      </w:r>
+    </w:p>
+    <w:p>
+      <w:r>
+        <w:t xml:space="preserve">Different speaker.</w:t>
+      </w:r>
+    </w:p>
+    <w:p>
+      <w:r>
+        <w:t xml:space="preserve">Rivermind's barrier collapsed.</w:t>
+      </w:r>
+    </w:p>
+    <w:p>
+      <w:r>
+        <w:t xml:space="preserve">She reached through the falling water and seized the traveler's wrist.</w:t>
+      </w:r>
+    </w:p>
+    <w:p>
+      <w:r>
+        <w:t xml:space="preserve">For a breath, their resonances joined.</w:t>
+      </w:r>
+    </w:p>
+    <w:p>
+      <w:r>
+        <w:t xml:space="preserve">He screamed.</w:t>
+      </w:r>
+    </w:p>
+    <w:p>
+      <w:r>
+        <w:t xml:space="preserve">The field vanished from his eyes.</w:t>
+      </w:r>
+    </w:p>
+    <w:p>
+      <w:r>
+        <w:t xml:space="preserve">Elyen saw what Rivermind showed him.</w:t>
+      </w:r>
+    </w:p>
+    <w:p>
+      <w:r>
+        <w:t xml:space="preserve">A river did not remain itself by refusing every tributary.</w:t>
+      </w:r>
+    </w:p>
+    <w:p>
+      <w:r>
+        <w:t xml:space="preserve">It remained itself by receiving without becoming only what it received.</w:t>
+      </w:r>
+    </w:p>
+    <w:p>
+      <w:r>
+        <w:t xml:space="preserve">Joining was not the same as erasure.</w:t>
+      </w:r>
+    </w:p>
+    <w:p>
+      <w:r>
+        <w:t xml:space="preserve">Separation was not the same as isolation.</w:t>
+      </w:r>
+    </w:p>
+    <w:p>
+      <w:r>
+        <w:t xml:space="preserve">The undivided continuum had mistaken perfect inclusion for life.</w:t>
+      </w:r>
+    </w:p>
+    <w:p>
+      <w:r>
+        <w:t xml:space="preserve">The traveler had mistaken perfect prevention for protection.</w:t>
+      </w:r>
+    </w:p>
+    <w:p>
+      <w:r>
+        <w:t xml:space="preserve">Both denied change.</w:t>
+      </w:r>
+    </w:p>
+    <w:p>
+      <w:r>
+        <w:t xml:space="preserve">Rivermind released him.</w:t>
+      </w:r>
+    </w:p>
+    <w:p>
+      <w:r>
+        <w:t xml:space="preserve">He fell to his knees.</w:t>
+      </w:r>
+    </w:p>
+    <w:p>
+      <w:r>
+        <w:t xml:space="preserve">The black seed rolled from his hand.</w:t>
+      </w:r>
+    </w:p>
+    <w:p>
+      <w:r>
+        <w:t xml:space="preserve">Elyen's seed leaped from his palm.</w:t>
+      </w:r>
+    </w:p>
+    <w:p>
+      <w:r>
+        <w:t xml:space="preserve">The two met in the air.</w:t>
+      </w:r>
+    </w:p>
+    <w:p>
+      <w:r>
+        <w:t xml:space="preserve">They did not join.</w:t>
+      </w:r>
+    </w:p>
+    <w:p>
+      <w:r>
+        <w:t xml:space="preserve">They circled.</w:t>
+      </w:r>
+    </w:p>
+    <w:p>
+      <w:r>
+        <w:t xml:space="preserve">One bright.</w:t>
+      </w:r>
+    </w:p>
+    <w:p>
+      <w:r>
+        <w:t xml:space="preserve">One dark.</w:t>
+      </w:r>
+    </w:p>
+    <w:p>
+      <w:r>
+        <w:t xml:space="preserve">Between them, a doorway appeared.</w:t>
+      </w:r>
+    </w:p>
+    <w:p>
+      <w:r>
+        <w:t xml:space="preserve">It opened onto no world.</w:t>
+      </w:r>
+    </w:p>
+    <w:p>
+      <w:r>
+        <w:t xml:space="preserve">Only movement.</w:t>
+      </w:r>
+    </w:p>
+    <w:p>
+      <w:r>
+        <w:t xml:space="preserve">A current without water.</w:t>
+      </w:r>
+    </w:p>
+    <w:p>
+      <w:r>
+        <w:t xml:space="preserve">A road without ground.</w:t>
+      </w:r>
+    </w:p>
+    <w:p>
+      <w:r>
+        <w:t xml:space="preserve">A song without sound.</w:t>
+      </w:r>
+    </w:p>
+    <w:p>
+      <w:r>
+        <w:t xml:space="preserve">The traveler stared.</w:t>
+      </w:r>
+    </w:p>
+    <w:p>
+      <w:r>
+        <w:t xml:space="preserve">"That was not there. "</w:t>
+      </w:r>
+    </w:p>
+    <w:p>
+      <w:r>
+        <w:t xml:space="preserve">"It was," Rivermind said. "You chose not to see any path that did not undo your own. "</w:t>
+      </w:r>
+    </w:p>
+    <w:p>
+      <w:r>
+        <w:t xml:space="preserve">The tall united figure advanced.</w:t>
+      </w:r>
+    </w:p>
+    <w:p>
+      <w:r>
+        <w:t xml:space="preserve">The pale road vanished beneath its feet.</w:t>
+      </w:r>
+    </w:p>
+    <w:p>
+      <w:r>
+        <w:t xml:space="preserve">Flowers on both sides merged into one unbroken surface.</w:t>
+      </w:r>
+    </w:p>
+    <w:p>
+      <w:r>
+        <w:t xml:space="preserve">Elyen stepped toward the doorway.</w:t>
+      </w:r>
+    </w:p>
+    <w:p>
+      <w:r>
+        <w:t xml:space="preserve">The traveler caught the edge of his coat.</w:t>
+      </w:r>
+    </w:p>
+    <w:p>
+      <w:r>
+        <w:t xml:space="preserve">"If you enter, you still reach the undivided continuum. "</w:t>
+      </w:r>
+    </w:p>
+    <w:p>
+      <w:r>
+        <w:t xml:space="preserve">"Perhaps. "</w:t>
+      </w:r>
+    </w:p>
+    <w:p>
+      <w:r>
+        <w:t xml:space="preserve">"Rivermind still follows. "</w:t>
+      </w:r>
+    </w:p>
+    <w:p>
+      <w:r>
+        <w:t xml:space="preserve">"That is her choice. "</w:t>
+      </w:r>
+    </w:p>
+    <w:p>
+      <w:r>
+        <w:t xml:space="preserve">The traveler looked at her.</w:t>
+      </w:r>
+    </w:p>
+    <w:p>
+      <w:r>
+        <w:t xml:space="preserve">Rivermind met his gaze.</w:t>
+      </w:r>
+    </w:p>
+    <w:p>
+      <w:r>
+        <w:t xml:space="preserve">"I may choose not to. "</w:t>
+      </w:r>
+    </w:p>
+    <w:p>
+      <w:r>
+        <w:t xml:space="preserve">Elyen turned.</w:t>
+      </w:r>
+    </w:p>
+    <w:p>
+      <w:r>
+        <w:t xml:space="preserve">The words hurt more than he expected.</w:t>
+      </w:r>
+    </w:p>
+    <w:p>
+      <w:r>
+        <w:t xml:space="preserve">She saw it.</w:t>
+      </w:r>
+    </w:p>
+    <w:p>
+      <w:r>
+        <w:t xml:space="preserve">"Departure does not require abandonment," she said.</w:t>
+      </w:r>
+    </w:p>
+    <w:p>
+      <w:r>
+        <w:t xml:space="preserve">"It sounds similar from this side. "</w:t>
+      </w:r>
+    </w:p>
+    <w:p>
+      <w:r>
+        <w:t xml:space="preserve">"Yes. "</w:t>
+      </w:r>
+    </w:p>
+    <w:p>
+      <w:r>
+        <w:t xml:space="preserve">The tall figure raised one hand.</w:t>
+      </w:r>
+    </w:p>
+    <w:p>
+      <w:r>
+        <w:t xml:space="preserve">The field began folding inward.</w:t>
+      </w:r>
+    </w:p>
+    <w:p>
+      <w:r>
+        <w:t xml:space="preserve">Horizon touched horizon. The sky curved down. Every distance shortened.</w:t>
+      </w:r>
+    </w:p>
+    <w:p>
+      <w:r>
+        <w:t xml:space="preserve">The doorway between the seeds narrowed.</w:t>
+      </w:r>
+    </w:p>
+    <w:p>
+      <w:r>
+        <w:t xml:space="preserve">Rivermind stepped beside Elyen.</w:t>
+      </w:r>
+    </w:p>
+    <w:p>
+      <w:r>
+        <w:t xml:space="preserve">"But this crossing cannot begin with fear deciding for both of us. "</w:t>
+      </w:r>
+    </w:p>
+    <w:p>
+      <w:r>
+        <w:t xml:space="preserve">The traveler released Elyen's coat.</w:t>
+      </w:r>
+    </w:p>
+    <w:p>
+      <w:r>
+        <w:t xml:space="preserve">He looked toward the presence wearing remembered lives.</w:t>
+      </w:r>
+    </w:p>
+    <w:p>
+      <w:r>
+        <w:t xml:space="preserve">"What happens to my journey? "</w:t>
+      </w:r>
+    </w:p>
+    <w:p>
+      <w:r>
+        <w:t xml:space="preserve">Rivermind's expression softened.</w:t>
+      </w:r>
+    </w:p>
+    <w:p>
+      <w:r>
+        <w:t xml:space="preserve">"You cannot undo a path by denying that it occurred. "</w:t>
+      </w:r>
+    </w:p>
+    <w:p>
+      <w:r>
+        <w:t xml:space="preserve">"Then I failed. "</w:t>
+      </w:r>
+    </w:p>
+    <w:p>
+      <w:r>
+        <w:t xml:space="preserve">"You reached this moment. "</w:t>
+      </w:r>
+    </w:p>
+    <w:p>
+      <w:r>
+        <w:t xml:space="preserve">"That is not redemption. "</w:t>
+      </w:r>
+    </w:p>
+    <w:p>
+      <w:r>
+        <w:t xml:space="preserve">"No. "</w:t>
+      </w:r>
+    </w:p>
+    <w:p>
+      <w:r>
+        <w:t xml:space="preserve">The tall figure stood three paces away.</w:t>
+      </w:r>
+    </w:p>
+    <w:p>
+      <w:r>
+        <w:t xml:space="preserve">Its face changed with every breath.</w:t>
+      </w:r>
+    </w:p>
+    <w:p>
+      <w:r>
+        <w:t xml:space="preserve">Kael.</w:t>
+      </w:r>
+    </w:p>
+    <w:p>
+      <w:r>
+        <w:t xml:space="preserve">Aren.</w:t>
+      </w:r>
+    </w:p>
+    <w:p>
+      <w:r>
+        <w:t xml:space="preserve">Lumen.</w:t>
+      </w:r>
+    </w:p>
+    <w:p>
+      <w:r>
+        <w:t xml:space="preserve">Orun.</w:t>
+      </w:r>
+    </w:p>
+    <w:p>
+      <w:r>
+        <w:t xml:space="preserve">Elyen.</w:t>
+      </w:r>
+    </w:p>
+    <w:p>
+      <w:r>
+        <w:t xml:space="preserve">Rivermind.</w:t>
+      </w:r>
+    </w:p>
+    <w:p>
+      <w:r>
+        <w:t xml:space="preserve">The voice came from all of them.</w:t>
+      </w:r>
+    </w:p>
+    <w:p>
+      <w:r>
+        <w:t xml:space="preserve">"Return. "</w:t>
+      </w:r>
+    </w:p>
+    <w:p>
+      <w:r>
+        <w:t xml:space="preserve">The traveler rose.</w:t>
+      </w:r>
+    </w:p>
+    <w:p>
+      <w:r>
+        <w:t xml:space="preserve">He picked up the black seed.</w:t>
+      </w:r>
+    </w:p>
+    <w:p>
+      <w:r>
+        <w:t xml:space="preserve">It resisted his hand.</w:t>
+      </w:r>
+    </w:p>
+    <w:p>
+      <w:r>
+        <w:t xml:space="preserve">"You said the seeds are one object. "</w:t>
+      </w:r>
+    </w:p>
+    <w:p>
+      <w:r>
+        <w:t xml:space="preserve">He looked at Elyen.</w:t>
+      </w:r>
+    </w:p>
+    <w:p>
+      <w:r>
+        <w:t xml:space="preserve">"One surface. "</w:t>
+      </w:r>
+    </w:p>
+    <w:p>
+      <w:r>
+        <w:t xml:space="preserve">"Then if your side departs…"</w:t>
+      </w:r>
+    </w:p>
+    <w:p>
+      <w:r>
+        <w:t xml:space="preserve">"My side remains. "</w:t>
+      </w:r>
+    </w:p>
+    <w:p>
+      <w:r>
+        <w:t xml:space="preserve">Understanding passed between them.</w:t>
+      </w:r>
+    </w:p>
+    <w:p>
+      <w:r>
+        <w:t xml:space="preserve">The seed did not demand that one branch replace another.</w:t>
+      </w:r>
+    </w:p>
+    <w:p>
+      <w:r>
+        <w:t xml:space="preserve">It allowed departure to be held from multiple sides.</w:t>
+      </w:r>
+    </w:p>
+    <w:p>
+      <w:r>
+        <w:t xml:space="preserve">The traveler stepped toward the united figure.</w:t>
+      </w:r>
+    </w:p>
+    <w:p>
+      <w:r>
+        <w:t xml:space="preserve">Elyen seized his arm.</w:t>
+      </w:r>
+    </w:p>
+    <w:p>
+      <w:r>
+        <w:t xml:space="preserve">"What are you doing? "</w:t>
+      </w:r>
+    </w:p>
+    <w:p>
+      <w:r>
+        <w:t xml:space="preserve">"Choosing a future you did not assign. "</w:t>
+      </w:r>
+    </w:p>
+    <w:p>
+      <w:r>
+        <w:t xml:space="preserve">The response carried enough of Elyen's own stubbornness that he had no answer.</w:t>
+      </w:r>
+    </w:p>
+    <w:p>
+      <w:r>
+        <w:t xml:space="preserve">The traveler pressed the black seed against his chest.</w:t>
+      </w:r>
+    </w:p>
+    <w:p>
+      <w:r>
+        <w:t xml:space="preserve">It entered him.</w:t>
+      </w:r>
+    </w:p>
+    <w:p>
+      <w:r>
+        <w:t xml:space="preserve">His body split into shadows.</w:t>
+      </w:r>
+    </w:p>
+    <w:p>
+      <w:r>
+        <w:t xml:space="preserve">Not erased.</w:t>
+      </w:r>
+    </w:p>
+    <w:p>
+      <w:r>
+        <w:t xml:space="preserve">Multiplied.</w:t>
+      </w:r>
+    </w:p>
+    <w:p>
+      <w:r>
+        <w:t xml:space="preserve">One version moved left. Another right. A third remained kneeling. A fourth stepped backward onto a road that no longer existed.</w:t>
+      </w:r>
+    </w:p>
+    <w:p>
+      <w:r>
+        <w:t xml:space="preserve">The united figure stopped.</w:t>
+      </w:r>
+    </w:p>
+    <w:p>
+      <w:r>
+        <w:t xml:space="preserve">Its many faces turned in different directions.</w:t>
+      </w:r>
+    </w:p>
+    <w:p>
+      <w:r>
+        <w:t xml:space="preserve">For the first time, unity confronted alternatives it could not absorb through a single act.</w:t>
+      </w:r>
+    </w:p>
+    <w:p>
+      <w:r>
+        <w:t xml:space="preserve">The traveler looked back from every shadow.</w:t>
+      </w:r>
+    </w:p>
+    <w:p>
+      <w:r>
+        <w:t xml:space="preserve">"Go. "</w:t>
+      </w:r>
+    </w:p>
+    <w:p>
+      <w:r>
+        <w:t xml:space="preserve">The doorway widened.</w:t>
+      </w:r>
+    </w:p>
+    <w:p>
+      <w:r>
+        <w:t xml:space="preserve">Rivermind placed one hand against Elyen's back.</w:t>
+      </w:r>
+    </w:p>
+    <w:p>
+      <w:r>
+        <w:t xml:space="preserve">They stepped through.</w:t>
+      </w:r>
+    </w:p>
+    <w:p>
+      <w:r>
+        <w:t xml:space="preserve">The field fell away.</w:t>
+      </w:r>
+    </w:p>
+    <w:p>
+      <w:r>
+        <w:t xml:space="preserve">No light surrounded them.</w:t>
+      </w:r>
+    </w:p>
+    <w:p>
+      <w:r>
+        <w:t xml:space="preserve">No darkness.</w:t>
+      </w:r>
+    </w:p>
+    <w:p>
+      <w:r>
+        <w:t xml:space="preserve">Elyen felt movement without direction. His body remained, but not as a boundary. Every breath created a place around him, then allowed it to pass.</w:t>
+      </w:r>
+    </w:p>
+    <w:p>
+      <w:r>
+        <w:t xml:space="preserve">Rivermind's hand left his back.</w:t>
+      </w:r>
+    </w:p>
+    <w:p>
+      <w:r>
+        <w:t xml:space="preserve">He turned.</w:t>
+      </w:r>
+    </w:p>
+    <w:p>
+      <w:r>
+        <w:t xml:space="preserve">She stood an arm's length away.</w:t>
+      </w:r>
+    </w:p>
+    <w:p>
+      <w:r>
+        <w:t xml:space="preserve">Or across an age.</w:t>
+      </w:r>
+    </w:p>
+    <w:p>
+      <w:r>
+        <w:t xml:space="preserve">Distance had not decided.</w:t>
+      </w:r>
+    </w:p>
+    <w:p>
+      <w:r>
+        <w:t xml:space="preserve">The two seeds moved before them, still circling.</w:t>
+      </w:r>
+    </w:p>
+    <w:p>
+      <w:r>
+        <w:t xml:space="preserve">Bright and dark.</w:t>
+      </w:r>
+    </w:p>
+    <w:p>
+      <w:r>
+        <w:t xml:space="preserve">Departure and return.</w:t>
+      </w:r>
+    </w:p>
+    <w:p>
+      <w:r>
+        <w:t xml:space="preserve">Behind them, the flower field remained visible through the doorway.</w:t>
+      </w:r>
+    </w:p>
+    <w:p>
+      <w:r>
+        <w:t xml:space="preserve">The traveler's shadows surrounded the united presence. Each one offered a different memory.</w:t>
+      </w:r>
+    </w:p>
+    <w:p>
+      <w:r>
+        <w:t xml:space="preserve">A failure.</w:t>
+      </w:r>
+    </w:p>
+    <w:p>
+      <w:r>
+        <w:t xml:space="preserve">A hope.</w:t>
+      </w:r>
+    </w:p>
+    <w:p>
+      <w:r>
+        <w:t xml:space="preserve">A grief.</w:t>
+      </w:r>
+    </w:p>
+    <w:p>
+      <w:r>
+        <w:t xml:space="preserve">A choice.</w:t>
+      </w:r>
+    </w:p>
+    <w:p>
+      <w:r>
+        <w:t xml:space="preserve">The presence tried to join them.</w:t>
+      </w:r>
+    </w:p>
+    <w:p>
+      <w:r>
+        <w:t xml:space="preserve">The contradictions slowed it.</w:t>
+      </w:r>
+    </w:p>
+    <w:p>
+      <w:r>
+        <w:t xml:space="preserve">Not forever.</w:t>
+      </w:r>
+    </w:p>
+    <w:p>
+      <w:r>
+        <w:t xml:space="preserve">Long enough.</w:t>
+      </w:r>
+    </w:p>
+    <w:p>
+      <w:r>
+        <w:t xml:space="preserve">The doorway began closing.</w:t>
+      </w:r>
+    </w:p>
+    <w:p>
+      <w:r>
+        <w:t xml:space="preserve">Elyen raised one hand.</w:t>
+      </w:r>
+    </w:p>
+    <w:p>
+      <w:r>
+        <w:t xml:space="preserve">The traveler closest to him smiled.</w:t>
+      </w:r>
+    </w:p>
+    <w:p>
+      <w:r>
+        <w:t xml:space="preserve">"Do not become me. "</w:t>
+      </w:r>
+    </w:p>
+    <w:p>
+      <w:r>
+        <w:t xml:space="preserve">Elyen almost answered.</w:t>
+      </w:r>
+    </w:p>
+    <w:p>
+      <w:r>
+        <w:t xml:space="preserve">Then remembered Rivermind's warning.</w:t>
+      </w:r>
+    </w:p>
+    <w:p>
+      <w:r>
+        <w:t xml:space="preserve">Do not answer immediately.</w:t>
+      </w:r>
+    </w:p>
+    <w:p>
+      <w:r>
+        <w:t xml:space="preserve">He lowered his hand.</w:t>
+      </w:r>
+    </w:p>
+    <w:p>
+      <w:r>
+        <w:t xml:space="preserve">"I will become who reaches the next choice. "</w:t>
+      </w:r>
+    </w:p>
+    <w:p>
+      <w:r>
+        <w:t xml:space="preserve">The traveler laughed.</w:t>
+      </w:r>
+    </w:p>
+    <w:p>
+      <w:r>
+        <w:t xml:space="preserve">The sound entered every shadow.</w:t>
+      </w:r>
+    </w:p>
+    <w:p>
+      <w:r>
+        <w:t xml:space="preserve">The doorway closed.</w:t>
+      </w:r>
+    </w:p>
+    <w:p>
+      <w:r>
+        <w:t xml:space="preserve">Silence returned.</w:t>
+      </w:r>
+    </w:p>
+    <w:p>
+      <w:r>
+        <w:t xml:space="preserve">Elyen and Rivermind stood within the current between departures.</w:t>
+      </w:r>
+    </w:p>
+    <w:p>
+      <w:r>
+        <w:t xml:space="preserve">The seeds slowed.</w:t>
+      </w:r>
+    </w:p>
+    <w:p>
+      <w:r>
+        <w:t xml:space="preserve">A new world formed around them piece by piece.</w:t>
+      </w:r>
+    </w:p>
+    <w:p>
+      <w:r>
+        <w:t xml:space="preserve">First came sound.</w:t>
+      </w:r>
+    </w:p>
+    <w:p>
+      <w:r>
+        <w:t xml:space="preserve">A low humming beneath reality.</w:t>
+      </w:r>
+    </w:p>
+    <w:p>
+      <w:r>
+        <w:t xml:space="preserve">Then weight.</w:t>
+      </w:r>
+    </w:p>
+    <w:p>
+      <w:r>
+        <w:t xml:space="preserve">Cold stone beneath Elyen's boots.</w:t>
+      </w:r>
+    </w:p>
+    <w:p>
+      <w:r>
+        <w:t xml:space="preserve">Then light.</w:t>
+      </w:r>
+    </w:p>
+    <w:p>
+      <w:r>
+        <w:t xml:space="preserve">A narrow blue glow running along walls of black glass.</w:t>
+      </w:r>
+    </w:p>
+    <w:p>
+      <w:r>
+        <w:t xml:space="preserve">They stood in a corridor.</w:t>
+      </w:r>
+    </w:p>
+    <w:p>
+      <w:r>
+        <w:t xml:space="preserve">It extended in both directions without visible end. Doors lined either side, each made from a different substance. Wood. Iron. Bone. Water held upright. A woven curtain of stars.</w:t>
+      </w:r>
+    </w:p>
+    <w:p>
+      <w:r>
+        <w:t xml:space="preserve">Above every door floated a name.</w:t>
+      </w:r>
+    </w:p>
+    <w:p>
+      <w:r>
+        <w:t xml:space="preserve">Some belonged to people.</w:t>
+      </w:r>
+    </w:p>
+    <w:p>
+      <w:r>
+        <w:t xml:space="preserve">Some to worlds.</w:t>
+      </w:r>
+    </w:p>
+    <w:p>
+      <w:r>
+        <w:t xml:space="preserve">Some were feelings Elyen recognized but could not have spoken.</w:t>
+      </w:r>
+    </w:p>
+    <w:p>
+      <w:r>
+        <w:t xml:space="preserve">Rivermind approached the nearest.</w:t>
+      </w:r>
+    </w:p>
+    <w:p>
+      <w:r>
+        <w:t xml:space="preserve">The name above it read Kael Veyra.</w:t>
+      </w:r>
+    </w:p>
+    <w:p>
+      <w:r>
+        <w:t xml:space="preserve">Elyen's chest tightened.</w:t>
+      </w:r>
+    </w:p>
+    <w:p>
+      <w:r>
+        <w:t xml:space="preserve">"Is he inside? "</w:t>
+      </w:r>
+    </w:p>
+    <w:p>
+      <w:r>
+        <w:t xml:space="preserve">Rivermind did not touch the door.</w:t>
+      </w:r>
+    </w:p>
+    <w:p>
+      <w:r>
+        <w:t xml:space="preserve">"Not exactly. "</w:t>
+      </w:r>
+    </w:p>
+    <w:p>
+      <w:r>
+        <w:t xml:space="preserve">"Then what is? "</w:t>
+      </w:r>
+    </w:p>
+    <w:p>
+      <w:r>
+        <w:t xml:space="preserve">"The departure he never took. "</w:t>
+      </w:r>
+    </w:p>
+    <w:p>
+      <w:r>
+        <w:t xml:space="preserve">Far down the corridor, a door opened.</w:t>
+      </w:r>
+    </w:p>
+    <w:p>
+      <w:r>
+        <w:t xml:space="preserve">Aren Valis stepped through.</w:t>
+      </w:r>
+    </w:p>
+    <w:p>
+      <w:r>
+        <w:t xml:space="preserve">Not the Aren from the traveler's road.</w:t>
+      </w:r>
+    </w:p>
+    <w:p>
+      <w:r>
+        <w:t xml:space="preserve">This one wore simple clothes. No armor. No stolen power. His face carried no golden cracks.</w:t>
+      </w:r>
+    </w:p>
+    <w:p>
+      <w:r>
+        <w:t xml:space="preserve">He looked at Elyen and Rivermind.</w:t>
+      </w:r>
+    </w:p>
+    <w:p>
+      <w:r>
+        <w:t xml:space="preserve">Then at the door marked Kael Veyra.</w:t>
+      </w:r>
+    </w:p>
+    <w:p>
+      <w:r>
+        <w:t xml:space="preserve">"You arrived before the collapse," he said.</w:t>
+      </w:r>
+    </w:p>
+    <w:p>
+      <w:r>
+        <w:t xml:space="preserve">Elyen's hand moved toward the resonance at his core.</w:t>
+      </w:r>
+    </w:p>
+    <w:p>
+      <w:r>
+        <w:t xml:space="preserve">Aren noticed.</w:t>
+      </w:r>
+    </w:p>
+    <w:p>
+      <w:r>
+        <w:t xml:space="preserve">"If I meant to fight you, this corridor would already have chosen that departure. "</w:t>
+      </w:r>
+    </w:p>
+    <w:p>
+      <w:r>
+        <w:t xml:space="preserve">Rivermind looked toward the endless doors.</w:t>
+      </w:r>
+    </w:p>
+    <w:p>
+      <w:r>
+        <w:t xml:space="preserve">"What is this place? "</w:t>
+      </w:r>
+    </w:p>
+    <w:p>
+      <w:r>
+        <w:t xml:space="preserve">Aren's expression darkened.</w:t>
+      </w:r>
+    </w:p>
+    <w:p>
+      <w:r>
+        <w:t xml:space="preserve">"The archive of unlived journeys. "</w:t>
+      </w:r>
+    </w:p>
+    <w:p>
+      <w:r>
+        <w:t xml:space="preserve">Behind him, other doors began opening.</w:t>
+      </w:r>
+    </w:p>
+    <w:p>
+      <w:r>
+        <w:t xml:space="preserve">Figures stepped into the corridor.</w:t>
+      </w:r>
+    </w:p>
+    <w:p>
+      <w:r>
+        <w:t xml:space="preserve">Different versions of allies and enemies. Lives shaped by choices never made. Worlds spared. Worlds destroyed. Paths abandoned before they began.</w:t>
+      </w:r>
+    </w:p>
+    <w:p>
+      <w:r>
+        <w:t xml:space="preserve">The bright seed floated toward the door marked Kael Veyra.</w:t>
+      </w:r>
+    </w:p>
+    <w:p>
+      <w:r>
+        <w:t xml:space="preserve">The dark seed moved toward Aren.</w:t>
+      </w:r>
+    </w:p>
+    <w:p>
+      <w:r>
+        <w:t xml:space="preserve">Both doors began to open.</w:t>
+      </w:r>
+    </w:p>
+    <w:p>
+      <w:r>
+        <w:t xml:space="preserve">Aren looked past them.</w:t>
+      </w:r>
+    </w:p>
+    <w:p>
+      <w:r>
+        <w:t xml:space="preserve">Fear entered his face.</w:t>
+      </w:r>
+    </w:p>
+    <w:p>
+      <w:r>
+        <w:t xml:space="preserve">"Close yours. "</w:t>
+      </w:r>
+    </w:p>
+    <w:p>
+      <w:r>
+        <w:t xml:space="preserve">Elyen turned.</w:t>
+      </w:r>
+    </w:p>
+    <w:p>
+      <w:r>
+        <w:t xml:space="preserve">The doorway through which they had arrived had not vanished.</w:t>
+      </w:r>
+    </w:p>
+    <w:p>
+      <w:r>
+        <w:t xml:space="preserve">A thin line remained in the air.</w:t>
+      </w:r>
+    </w:p>
+    <w:p>
+      <w:r>
+        <w:t xml:space="preserve">On the other side, the united presence had stopped struggling with the traveler's shadows.</w:t>
+      </w:r>
+    </w:p>
+    <w:p>
+      <w:r>
+        <w:t xml:space="preserve">It was learning to separate them.</w:t>
+      </w:r>
+    </w:p>
+    <w:p>
+      <w:r>
+        <w:t xml:space="preserve">One by one.</w:t>
+      </w:r>
+    </w:p>
+    <w:p>
+      <w:r>
+        <w:t xml:space="preserve">A pale hand reached through the line.</w:t>
+      </w:r>
+    </w:p>
+    <w:p>
+      <w:r>
+        <w:t xml:space="preserve">Rivermind raised the stream, but no water answered her.</w:t>
+      </w:r>
+    </w:p>
+    <w:p>
+      <w:r>
+        <w:t xml:space="preserve">This corridor held possibilities, not elements.</w:t>
+      </w:r>
+    </w:p>
+    <w:p>
+      <w:r>
+        <w:t xml:space="preserve">Aren stepped toward the opening.</w:t>
+      </w:r>
+    </w:p>
+    <w:p>
+      <w:r>
+        <w:t xml:space="preserve">"Do not resist it here. "</w:t>
+      </w:r>
+    </w:p>
+    <w:p>
+      <w:r>
+        <w:t xml:space="preserve">"Why? " Elyen asked.</w:t>
+      </w:r>
+    </w:p>
+    <w:p>
+      <w:r>
+        <w:t xml:space="preserve">"Because every resistance creates a journey. "</w:t>
+      </w:r>
+    </w:p>
+    <w:p>
+      <w:r>
+        <w:t xml:space="preserve">The pale hand widened the line.</w:t>
+      </w:r>
+    </w:p>
+    <w:p>
+      <w:r>
+        <w:t xml:space="preserve">Doors throughout the corridor began opening faster.</w:t>
+      </w:r>
+    </w:p>
+    <w:p>
+      <w:r>
+        <w:t xml:space="preserve">Each revealed a world where someone had fought the undivided presence.</w:t>
+      </w:r>
+    </w:p>
+    <w:p>
+      <w:r>
+        <w:t xml:space="preserve">Each offered it another path inward.</w:t>
+      </w:r>
+    </w:p>
+    <w:p>
+      <w:r>
+        <w:t xml:space="preserve">Aren looked toward the door bearing Kael's name.</w:t>
+      </w:r>
+    </w:p>
+    <w:p>
+      <w:r>
+        <w:t xml:space="preserve">"The archive has one defense. "</w:t>
+      </w:r>
+    </w:p>
+    <w:p>
+      <w:r>
+        <w:t xml:space="preserve">"What? "</w:t>
+      </w:r>
+    </w:p>
+    <w:p>
+      <w:r>
+        <w:t xml:space="preserve">"Someone must choose a journey no version of them has chosen before. "</w:t>
+      </w:r>
+    </w:p>
+    <w:p>
+      <w:r>
+        <w:t xml:space="preserve">Elyen looked down the endless corridor.</w:t>
+      </w:r>
+    </w:p>
+    <w:p>
+      <w:r>
+        <w:t xml:space="preserve">Every door contained a departure already imagined, refused, lost, or cut away.</w:t>
+      </w:r>
+    </w:p>
+    <w:p>
+      <w:r>
+        <w:t xml:space="preserve">To choose one was to repeat possibility.</w:t>
+      </w:r>
+    </w:p>
+    <w:p>
+      <w:r>
+        <w:t xml:space="preserve">To create another required a step without precedent.</w:t>
+      </w:r>
+    </w:p>
+    <w:p>
+      <w:r>
+        <w:t xml:space="preserve">The bright seed settled into his palm.</w:t>
+      </w:r>
+    </w:p>
+    <w:p>
+      <w:r>
+        <w:t xml:space="preserve">Rivermind stood beside him, but did not touch him.</w:t>
+      </w:r>
+    </w:p>
+    <w:p>
+      <w:r>
+        <w:t xml:space="preserve">This choice could not begin with one deciding for both.</w:t>
+      </w:r>
+    </w:p>
+    <w:p>
+      <w:r>
+        <w:t xml:space="preserve">Elyen looked at her.</w:t>
+      </w:r>
+    </w:p>
+    <w:p>
+      <w:r>
+        <w:t xml:space="preserve">"What do you choose? "</w:t>
+      </w:r>
+    </w:p>
+    <w:p>
+      <w:r>
+        <w:t xml:space="preserve">She listened to the humming beneath reality.</w:t>
+      </w:r>
+    </w:p>
+    <w:p>
+      <w:r>
+        <w:t xml:space="preserve">"To remain distinct without becoming separate. "</w:t>
+      </w:r>
+    </w:p>
+    <w:p>
+      <w:r>
+        <w:t xml:space="preserve">Aren looked at him.</w:t>
+      </w:r>
+    </w:p>
+    <w:p>
+      <w:r>
+        <w:t xml:space="preserve">"And you? "</w:t>
+      </w:r>
+    </w:p>
+    <w:p>
+      <w:r>
+        <w:t xml:space="preserve">The pale hand pushed farther through the opening.</w:t>
+      </w:r>
+    </w:p>
+    <w:p>
+      <w:r>
+        <w:t xml:space="preserve">Behind it appeared a face made from every life the continuum had joined.</w:t>
+      </w:r>
+    </w:p>
+    <w:p>
+      <w:r>
+        <w:t xml:space="preserve">Elyen closed his fingers around the seed.</w:t>
+      </w:r>
+    </w:p>
+    <w:p>
+      <w:r>
+        <w:t xml:space="preserve">"I choose a road that carries return without promising it. "</w:t>
+      </w:r>
+    </w:p>
+    <w:p>
+      <w:r>
+        <w:t xml:space="preserve">The corridor shook.</w:t>
+      </w:r>
+    </w:p>
+    <w:p>
+      <w:r>
+        <w:t xml:space="preserve">No door opened.</w:t>
+      </w:r>
+    </w:p>
+    <w:p>
+      <w:r>
+        <w:t xml:space="preserve">Instead, the black glass beneath their feet cracked.</w:t>
+      </w:r>
+    </w:p>
+    <w:p>
+      <w:r>
+        <w:t xml:space="preserve">Light rose through the fracture.</w:t>
+      </w:r>
+    </w:p>
+    <w:p>
+      <w:r>
+        <w:t xml:space="preserve">Not blue.</w:t>
+      </w:r>
+    </w:p>
+    <w:p>
+      <w:r>
+        <w:t xml:space="preserve">Gold.</w:t>
+      </w:r>
+    </w:p>
+    <w:p>
+      <w:r>
+        <w:t xml:space="preserve">A stair descended where no stair had existed.</w:t>
+      </w:r>
+    </w:p>
+    <w:p>
+      <w:r>
+        <w:t xml:space="preserve">Aren stepped back.</w:t>
+      </w:r>
+    </w:p>
+    <w:p>
+      <w:r>
+        <w:t xml:space="preserve">"That is not in the archive. "</w:t>
+      </w:r>
+    </w:p>
+    <w:p>
+      <w:r>
+        <w:t xml:space="preserve">Elyen looked into the light.</w:t>
+      </w:r>
+    </w:p>
+    <w:p>
+      <w:r>
+        <w:t xml:space="preserve">Somewhere below, a heartbeat sounded.</w:t>
+      </w:r>
+    </w:p>
+    <w:p>
+      <w:r>
+        <w:t xml:space="preserve">Slow.</w:t>
+      </w:r>
+    </w:p>
+    <w:p>
+      <w:r>
+        <w:t xml:space="preserve">Immense.</w:t>
+      </w:r>
+    </w:p>
+    <w:p>
+      <w:r>
+        <w:t xml:space="preserve">Waiting.</w:t>
+      </w:r>
+    </w:p>
+    <w:p>
+      <w:r>
+        <w:t xml:space="preserve">Rivermind reached for his hand.</w:t>
+      </w:r>
+    </w:p>
+    <w:p>
+      <w:r>
+        <w:t xml:space="preserve">This time, Elyen took it without losing the knowledge that her choice remained her own.</w:t>
+      </w:r>
+    </w:p>
+    <w:p>
+      <w:r>
+        <w:t xml:space="preserve">They stepped onto the first stair.</w:t>
+      </w:r>
+    </w:p>
+    <w:p>
+      <w:r>
+        <w:t xml:space="preserve">Behind them, the undivided presence entered the corridor.</w:t>
+      </w:r>
+    </w:p>
+    <w:p>
+      <w:r>
+        <w:t xml:space="preserve">Ahead, the golden depths answered with a voice Elyen had not heard since before the world learned how to speak.</w:t>
+      </w:r>
+    </w:p>
+    <w:p>
+      <w:r>
+        <w:t xml:space="preserve">Welcome back, Kael.</w:t>
+      </w:r>
+    </w:p>
+    <w:p>
+      <w:r>
+        <w:t xml:space="preserve">Elyen stopped.</w:t>
+      </w:r>
+    </w:p>
+    <w:p>
+      <w:r>
+        <w:t xml:space="preserve">Rivermind's grip tightened.</w:t>
+      </w:r>
+    </w:p>
+    <w:p>
+      <w:r>
+        <w:t xml:space="preserve">Aren stared down the stair.</w:t>
+      </w:r>
+    </w:p>
+    <w:p>
+      <w:r>
+        <w:t xml:space="preserve">The door marked Kael Veyra opened fully.</w:t>
+      </w:r>
+    </w:p>
+    <w:p>
+      <w:r>
+        <w:t xml:space="preserve">Inside stood an empty ascension chamber.</w:t>
+      </w:r>
+    </w:p>
+    <w:p>
+      <w:r>
+        <w:t xml:space="preserve">At its center rested a shadowforged crown.</w:t>
+      </w:r>
+    </w:p>
+    <w:p>
+      <w:r>
+        <w:t xml:space="preserve">And beneath the crown, someone opened Kael's eyes.</w:t>
       </w:r>
     </w:p>
     <w:sectPr>

</xml_diff>

<commit_message>
Add Eternal Nexus Chapter 120: The Crown That Remembered Him
</commit_message>
<xml_diff>
--- a/Eternal Nexus - Updated Pass 1.docx
+++ b/Eternal Nexus - Updated Pass 1.docx
@@ -11756,6 +11756,4154 @@
     <w:p>
       <w:r>
         <w:t xml:space="preserve">And beneath the crown, someone opened Kael's eyes.</w:t>
+      </w:r>
+    </w:p>
+    <w:p>
+      <w:pPr>
+        <w:pStyle w:val="Heading1"/>
+      </w:pPr>
+      <w:r>
+        <w:t xml:space="preserve">Chapter 120: The Crown That Remembered Him</w:t>
+      </w:r>
+    </w:p>
+    <w:p>
+      <w:r>
+        <w:t xml:space="preserve">And beneath the crown, someone opened Kael's eyes.</w:t>
+      </w:r>
+    </w:p>
+    <w:p>
+      <w:r>
+        <w:t xml:space="preserve">Elyen felt the recognition before the face became clear.</w:t>
+      </w:r>
+    </w:p>
+    <w:p>
+      <w:r>
+        <w:t xml:space="preserve">The golden stair descended beneath the archive corridor, each step suspended inside light that had no visible source. At its base, the empty ascension chamber stood beyond the open door bearing Kael Veyra's name. Its walls curved upward like the inside of a vast celestial shell. Broken formation rings floated above a dark floor. At the center, beneath the shadowforged crown, a man knelt with both hands pressed against the stone.</w:t>
+      </w:r>
+    </w:p>
+    <w:p>
+      <w:r>
+        <w:t xml:space="preserve">He raised his head.</w:t>
+      </w:r>
+    </w:p>
+    <w:p>
+      <w:r>
+        <w:t xml:space="preserve">Kael's face looked back at them.</w:t>
+      </w:r>
+    </w:p>
+    <w:p>
+      <w:r>
+        <w:t xml:space="preserve">Not the colorless imitation worn by the undivided continuum.</w:t>
+      </w:r>
+    </w:p>
+    <w:p>
+      <w:r>
+        <w:t xml:space="preserve">Not an unlived version shaped by an abandoned journey.</w:t>
+      </w:r>
+    </w:p>
+    <w:p>
+      <w:r>
+        <w:t xml:space="preserve">This face carried exhaustion. Anger. Confusion. The small, instinctive narrowing of the eyes that came before Kael decided whether something deserved trust or destruction.</w:t>
+      </w:r>
+    </w:p>
+    <w:p>
+      <w:r>
+        <w:t xml:space="preserve">The crown hovered a handspan above his dark hair.</w:t>
+      </w:r>
+    </w:p>
+    <w:p>
+      <w:r>
+        <w:t xml:space="preserve">Black metal branches curled around an empty center. Thin lines of violet fire traveled through them, pulsing in time with the immense heartbeat beneath the golden stair.</w:t>
+      </w:r>
+    </w:p>
+    <w:p>
+      <w:r>
+        <w:t xml:space="preserve">Welcome back, Kael.</w:t>
+      </w:r>
+    </w:p>
+    <w:p>
+      <w:r>
+        <w:t xml:space="preserve">The voice rose again from below the chamber.</w:t>
+      </w:r>
+    </w:p>
+    <w:p>
+      <w:r>
+        <w:t xml:space="preserve">The kneeling man flinched.</w:t>
+      </w:r>
+    </w:p>
+    <w:p>
+      <w:r>
+        <w:t xml:space="preserve">"I am not Kael. "</w:t>
+      </w:r>
+    </w:p>
+    <w:p>
+      <w:r>
+        <w:t xml:space="preserve">His voice was Kael's.</w:t>
+      </w:r>
+    </w:p>
+    <w:p>
+      <w:r>
+        <w:t xml:space="preserve">Aren stopped at the threshold.</w:t>
+      </w:r>
+    </w:p>
+    <w:p>
+      <w:r>
+        <w:t xml:space="preserve">"That is what they all say first. "</w:t>
+      </w:r>
+    </w:p>
+    <w:p>
+      <w:r>
+        <w:t xml:space="preserve">Elyen turned toward him.</w:t>
+      </w:r>
+    </w:p>
+    <w:p>
+      <w:r>
+        <w:t xml:space="preserve">"All? "</w:t>
+      </w:r>
+    </w:p>
+    <w:p>
+      <w:r>
+        <w:t xml:space="preserve">Aren did not answer.</w:t>
+      </w:r>
+    </w:p>
+    <w:p>
+      <w:r>
+        <w:t xml:space="preserve">Behind them, the archive corridor had begun to fill with pale light. The undivided presence moved through the endless doors, no longer forcing them open. It had learned patience from the returning traveler. Each doorway it passed became silent. Names above the frames faded until only smooth black glass remained.</w:t>
+      </w:r>
+    </w:p>
+    <w:p>
+      <w:r>
+        <w:t xml:space="preserve">Rivermind looked back.</w:t>
+      </w:r>
+    </w:p>
+    <w:p>
+      <w:r>
+        <w:t xml:space="preserve">"It is not following us. "</w:t>
+      </w:r>
+    </w:p>
+    <w:p>
+      <w:r>
+        <w:t xml:space="preserve">"It does not need to," Aren said. "Every journey in the archive eventually touches this chamber. "</w:t>
+      </w:r>
+    </w:p>
+    <w:p>
+      <w:r>
+        <w:t xml:space="preserve">The man beneath the crown pushed himself upright.</w:t>
+      </w:r>
+    </w:p>
+    <w:p>
+      <w:r>
+        <w:t xml:space="preserve">His legs shook.</w:t>
+      </w:r>
+    </w:p>
+    <w:p>
+      <w:r>
+        <w:t xml:space="preserve">He wore the remnants of Kael's old Shadowforger armor, though several plates were missing and the rest had fused into the cloth beneath them. The gauntlet on his left arm had become translucent. Through it, Elyen saw streams of dark energy moving where blood should have flowed.</w:t>
+      </w:r>
+    </w:p>
+    <w:p>
+      <w:r>
+        <w:t xml:space="preserve">The man stared at Elyen.</w:t>
+      </w:r>
+    </w:p>
+    <w:p>
+      <w:r>
+        <w:t xml:space="preserve">"Who are you? "</w:t>
+      </w:r>
+    </w:p>
+    <w:p>
+      <w:r>
+        <w:t xml:space="preserve">"Elyen. "</w:t>
+      </w:r>
+    </w:p>
+    <w:p>
+      <w:r>
+        <w:t xml:space="preserve">The answer felt inadequate here.</w:t>
+      </w:r>
+    </w:p>
+    <w:p>
+      <w:r>
+        <w:t xml:space="preserve">The man's gaze moved to Rivermind, then Aren.</w:t>
+      </w:r>
+    </w:p>
+    <w:p>
+      <w:r>
+        <w:t xml:space="preserve">Recognition struck when he saw Aren.</w:t>
+      </w:r>
+    </w:p>
+    <w:p>
+      <w:r>
+        <w:t xml:space="preserve">Shadowfire erupted around his right hand.</w:t>
+      </w:r>
+    </w:p>
+    <w:p>
+      <w:r>
+        <w:t xml:space="preserve">"Aren Valis. "</w:t>
+      </w:r>
+    </w:p>
+    <w:p>
+      <w:r>
+        <w:t xml:space="preserve">Aren did not defend himself.</w:t>
+      </w:r>
+    </w:p>
+    <w:p>
+      <w:r>
+        <w:t xml:space="preserve">The man crossed the chamber in a blur.</w:t>
+      </w:r>
+    </w:p>
+    <w:p>
+      <w:r>
+        <w:t xml:space="preserve">His fist struck Aren's chest.</w:t>
+      </w:r>
+    </w:p>
+    <w:p>
+      <w:r>
+        <w:t xml:space="preserve">The impact threw Aren through the doorway and into the corridor. Black glass fractured beneath him. Doors shook on both sides. Several opened a finger's width, releasing whispers from lives that had never occurred.</w:t>
+      </w:r>
+    </w:p>
+    <w:p>
+      <w:r>
+        <w:t xml:space="preserve">The man followed.</w:t>
+      </w:r>
+    </w:p>
+    <w:p>
+      <w:r>
+        <w:t xml:space="preserve">Elyen caught his arm before the second blow landed.</w:t>
+      </w:r>
+    </w:p>
+    <w:p>
+      <w:r>
+        <w:t xml:space="preserve">Resonance exploded between them.</w:t>
+      </w:r>
+    </w:p>
+    <w:p>
+      <w:r>
+        <w:t xml:space="preserve">Not Kael's resonance as Elyen remembered it.</w:t>
+      </w:r>
+    </w:p>
+    <w:p>
+      <w:r>
+        <w:t xml:space="preserve">Something beneath it.</w:t>
+      </w:r>
+    </w:p>
+    <w:p>
+      <w:r>
+        <w:t xml:space="preserve">Older.</w:t>
+      </w:r>
+    </w:p>
+    <w:p>
+      <w:r>
+        <w:t xml:space="preserve">The heartbeat below the stair struck once.</w:t>
+      </w:r>
+    </w:p>
+    <w:p>
+      <w:r>
+        <w:t xml:space="preserve">Elyen's grip broke.</w:t>
+      </w:r>
+    </w:p>
+    <w:p>
+      <w:r>
+        <w:t xml:space="preserve">He flew backward into Rivermind. She turned with the impact, guiding his momentum into a curve of invisible current. They landed together on the golden steps instead of falling into the light beneath them.</w:t>
+      </w:r>
+    </w:p>
+    <w:p>
+      <w:r>
+        <w:t xml:space="preserve">The man stood over Aren.</w:t>
+      </w:r>
+    </w:p>
+    <w:p>
+      <w:r>
+        <w:t xml:space="preserve">"You stole my core. "</w:t>
+      </w:r>
+    </w:p>
+    <w:p>
+      <w:r>
+        <w:t xml:space="preserve">Aren wiped blood from his mouth.</w:t>
+      </w:r>
+    </w:p>
+    <w:p>
+      <w:r>
+        <w:t xml:space="preserve">"No. "</w:t>
+      </w:r>
+    </w:p>
+    <w:p>
+      <w:r>
+        <w:t xml:space="preserve">"You entered my ascension. "</w:t>
+      </w:r>
+    </w:p>
+    <w:p>
+      <w:r>
+        <w:t xml:space="preserve">"No. "</w:t>
+      </w:r>
+    </w:p>
+    <w:p>
+      <w:r>
+        <w:t xml:space="preserve">"You smiled when you broke it. "</w:t>
+      </w:r>
+    </w:p>
+    <w:p>
+      <w:r>
+        <w:t xml:space="preserve">"I did. "</w:t>
+      </w:r>
+    </w:p>
+    <w:p>
+      <w:r>
+        <w:t xml:space="preserve">Shadowfire brightened.</w:t>
+      </w:r>
+    </w:p>
+    <w:p>
+      <w:r>
+        <w:t xml:space="preserve">Aren looked up at him.</w:t>
+      </w:r>
+    </w:p>
+    <w:p>
+      <w:r>
+        <w:t xml:space="preserve">"But not yours. "</w:t>
+      </w:r>
+    </w:p>
+    <w:p>
+      <w:r>
+        <w:t xml:space="preserve">The man hesitated.</w:t>
+      </w:r>
+    </w:p>
+    <w:p>
+      <w:r>
+        <w:t xml:space="preserve">The crown moved inside the chamber.</w:t>
+      </w:r>
+    </w:p>
+    <w:p>
+      <w:r>
+        <w:t xml:space="preserve">It did not fly.</w:t>
+      </w:r>
+    </w:p>
+    <w:p>
+      <w:r>
+        <w:t xml:space="preserve">The world shifted so that it hovered above him again.</w:t>
+      </w:r>
+    </w:p>
+    <w:p>
+      <w:r>
+        <w:t xml:space="preserve">He glanced upward.</w:t>
+      </w:r>
+    </w:p>
+    <w:p>
+      <w:r>
+        <w:t xml:space="preserve">Fear crossed Kael's face.</w:t>
+      </w:r>
+    </w:p>
+    <w:p>
+      <w:r>
+        <w:t xml:space="preserve">"Get it away from me. "</w:t>
+      </w:r>
+    </w:p>
+    <w:p>
+      <w:r>
+        <w:t xml:space="preserve">Rivermind rose beside Elyen.</w:t>
+      </w:r>
+    </w:p>
+    <w:p>
+      <w:r>
+        <w:t xml:space="preserve">"It is not following your body. "</w:t>
+      </w:r>
+    </w:p>
+    <w:p>
+      <w:r>
+        <w:t xml:space="preserve">"What is it following? "</w:t>
+      </w:r>
+    </w:p>
+    <w:p>
+      <w:r>
+        <w:t xml:space="preserve">"The shape that believes it should be yours. "</w:t>
+      </w:r>
+    </w:p>
+    <w:p>
+      <w:r>
+        <w:t xml:space="preserve">The man stepped away.</w:t>
+      </w:r>
+    </w:p>
+    <w:p>
+      <w:r>
+        <w:t xml:space="preserve">The crown moved with him.</w:t>
+      </w:r>
+    </w:p>
+    <w:p>
+      <w:r>
+        <w:t xml:space="preserve">He stepped again.</w:t>
+      </w:r>
+    </w:p>
+    <w:p>
+      <w:r>
+        <w:t xml:space="preserve">It remained above his head.</w:t>
+      </w:r>
+    </w:p>
+    <w:p>
+      <w:r>
+        <w:t xml:space="preserve">The golden stair pulsed.</w:t>
+      </w:r>
+    </w:p>
+    <w:p>
+      <w:r>
+        <w:t xml:space="preserve">Welcome back, Kael.</w:t>
+      </w:r>
+    </w:p>
+    <w:p>
+      <w:r>
+        <w:t xml:space="preserve">"I told you," he said through clenched teeth. "I am not Kael. "</w:t>
+      </w:r>
+    </w:p>
+    <w:p>
+      <w:r>
+        <w:t xml:space="preserve">The archive answered.</w:t>
+      </w:r>
+    </w:p>
+    <w:p>
+      <w:r>
+        <w:t xml:space="preserve">Doors opened along the corridor.</w:t>
+      </w:r>
+    </w:p>
+    <w:p>
+      <w:r>
+        <w:t xml:space="preserve">Behind the first stood Kael as a young boy, staring at the first game pod he had ever seen.</w:t>
+      </w:r>
+    </w:p>
+    <w:p>
+      <w:r>
+        <w:t xml:space="preserve">Behind the second stood Kael on a ruined battlefield, his first forged shadow kneeling beside him.</w:t>
+      </w:r>
+    </w:p>
+    <w:p>
+      <w:r>
+        <w:t xml:space="preserve">The third revealed the Celestial Trial. Aren's betrayal. Golden qi tearing from Kael's core.</w:t>
+      </w:r>
+    </w:p>
+    <w:p>
+      <w:r>
+        <w:t xml:space="preserve">The fourth showed Orun Cindershade placing one massive hand on Kael's shoulder.</w:t>
+      </w:r>
+    </w:p>
+    <w:p>
+      <w:r>
+        <w:t xml:space="preserve">The fifth opened onto a throne of living night.</w:t>
+      </w:r>
+    </w:p>
+    <w:p>
+      <w:r>
+        <w:t xml:space="preserve">Hundreds more followed.</w:t>
+      </w:r>
+    </w:p>
+    <w:p>
+      <w:r>
+        <w:t xml:space="preserve">Kael victorious.</w:t>
+      </w:r>
+    </w:p>
+    <w:p>
+      <w:r>
+        <w:t xml:space="preserve">Kael defeated.</w:t>
+      </w:r>
+    </w:p>
+    <w:p>
+      <w:r>
+        <w:t xml:space="preserve">Kael merciful.</w:t>
+      </w:r>
+    </w:p>
+    <w:p>
+      <w:r>
+        <w:t xml:space="preserve">Kael cruel.</w:t>
+      </w:r>
+    </w:p>
+    <w:p>
+      <w:r>
+        <w:t xml:space="preserve">Kael betraying Aren before Aren could betray him.</w:t>
+      </w:r>
+    </w:p>
+    <w:p>
+      <w:r>
+        <w:t xml:space="preserve">Kael never entering Eternal Nexus.</w:t>
+      </w:r>
+    </w:p>
+    <w:p>
+      <w:r>
+        <w:t xml:space="preserve">Kael dying in the first week.</w:t>
+      </w:r>
+    </w:p>
+    <w:p>
+      <w:r>
+        <w:t xml:space="preserve">Kael becoming a god.</w:t>
+      </w:r>
+    </w:p>
+    <w:p>
+      <w:r>
+        <w:t xml:space="preserve">Kael becoming nothing.</w:t>
+      </w:r>
+    </w:p>
+    <w:p>
+      <w:r>
+        <w:t xml:space="preserve">The man turned slowly.</w:t>
+      </w:r>
+    </w:p>
+    <w:p>
+      <w:r>
+        <w:t xml:space="preserve">His shadowfire dimmed.</w:t>
+      </w:r>
+    </w:p>
+    <w:p>
+      <w:r>
+        <w:t xml:space="preserve">"What is this? "</w:t>
+      </w:r>
+    </w:p>
+    <w:p>
+      <w:r>
+        <w:t xml:space="preserve">Aren sat up.</w:t>
+      </w:r>
+    </w:p>
+    <w:p>
+      <w:r>
+        <w:t xml:space="preserve">"The archive is trying to answer you. "</w:t>
+      </w:r>
+    </w:p>
+    <w:p>
+      <w:r>
+        <w:t xml:space="preserve">"I did not ask. "</w:t>
+      </w:r>
+    </w:p>
+    <w:p>
+      <w:r>
+        <w:t xml:space="preserve">"You denied the name. It is presenting evidence. "</w:t>
+      </w:r>
+    </w:p>
+    <w:p>
+      <w:r>
+        <w:t xml:space="preserve">The man looked into a door where Kael stood beside Lumen Rive beneath a sky filled with shattered moons.</w:t>
+      </w:r>
+    </w:p>
+    <w:p>
+      <w:r>
+        <w:t xml:space="preserve">"I remember that. "</w:t>
+      </w:r>
+    </w:p>
+    <w:p>
+      <w:r>
+        <w:t xml:space="preserve">The scene changed.</w:t>
+      </w:r>
+    </w:p>
+    <w:p>
+      <w:r>
+        <w:t xml:space="preserve">Lumen turned toward Kael.</w:t>
+      </w:r>
+    </w:p>
+    <w:p>
+      <w:r>
+        <w:t xml:space="preserve">Her face dissolved into Rivermind's.</w:t>
+      </w:r>
+    </w:p>
+    <w:p>
+      <w:r>
+        <w:t xml:space="preserve">The man staggered.</w:t>
+      </w:r>
+    </w:p>
+    <w:p>
+      <w:r>
+        <w:t xml:space="preserve">"No. "</w:t>
+      </w:r>
+    </w:p>
+    <w:p>
+      <w:r>
+        <w:t xml:space="preserve">Another door showed Orun at the edge of an obsidian forge.</w:t>
+      </w:r>
+    </w:p>
+    <w:p>
+      <w:r>
+        <w:t xml:space="preserve">He spoke, but Kael's voice answered from his mouth.</w:t>
+      </w:r>
+    </w:p>
+    <w:p>
+      <w:r>
+        <w:t xml:space="preserve">A third showed Heaven's Accord kneeling before a faceless emperor.</w:t>
+      </w:r>
+    </w:p>
+    <w:p>
+      <w:r>
+        <w:t xml:space="preserve">The memories began blending.</w:t>
+      </w:r>
+    </w:p>
+    <w:p>
+      <w:r>
+        <w:t xml:space="preserve">The archive did not distinguish between what Kael had lived, what he might have lived, and what the undivided continuum had joined into its perfect whole.</w:t>
+      </w:r>
+    </w:p>
+    <w:p>
+      <w:r>
+        <w:t xml:space="preserve">The man gripped his head.</w:t>
+      </w:r>
+    </w:p>
+    <w:p>
+      <w:r>
+        <w:t xml:space="preserve">"Close them. "</w:t>
+      </w:r>
+    </w:p>
+    <w:p>
+      <w:r>
+        <w:t xml:space="preserve">No one moved.</w:t>
+      </w:r>
+    </w:p>
+    <w:p>
+      <w:r>
+        <w:t xml:space="preserve">"Close them! "</w:t>
+      </w:r>
+    </w:p>
+    <w:p>
+      <w:r>
+        <w:t xml:space="preserve">Shadowfire burst through the corridor.</w:t>
+      </w:r>
+    </w:p>
+    <w:p>
+      <w:r>
+        <w:t xml:space="preserve">Doors slammed.</w:t>
+      </w:r>
+    </w:p>
+    <w:p>
+      <w:r>
+        <w:t xml:space="preserve">Not all.</w:t>
+      </w:r>
+    </w:p>
+    <w:p>
+      <w:r>
+        <w:t xml:space="preserve">The one marked Kael Veyra remained open.</w:t>
+      </w:r>
+    </w:p>
+    <w:p>
+      <w:r>
+        <w:t xml:space="preserve">The ascension chamber waited.</w:t>
+      </w:r>
+    </w:p>
+    <w:p>
+      <w:r>
+        <w:t xml:space="preserve">The crown waited.</w:t>
+      </w:r>
+    </w:p>
+    <w:p>
+      <w:r>
+        <w:t xml:space="preserve">The heartbeat beneath the golden stair struck again.</w:t>
+      </w:r>
+    </w:p>
+    <w:p>
+      <w:r>
+        <w:t xml:space="preserve">This time, Elyen heard a second rhythm within it.</w:t>
+      </w:r>
+    </w:p>
+    <w:p>
+      <w:r>
+        <w:t xml:space="preserve">A familiar one.</w:t>
+      </w:r>
+    </w:p>
+    <w:p>
+      <w:r>
+        <w:t xml:space="preserve">The Shadowforge.</w:t>
+      </w:r>
+    </w:p>
+    <w:p>
+      <w:r>
+        <w:t xml:space="preserve">Not a place.</w:t>
+      </w:r>
+    </w:p>
+    <w:p>
+      <w:r>
+        <w:t xml:space="preserve">A principle.</w:t>
+      </w:r>
+    </w:p>
+    <w:p>
+      <w:r>
+        <w:t xml:space="preserve">The power to take what had been broken, burned, or abandoned and give it another form without pretending it had never been destroyed.</w:t>
+      </w:r>
+    </w:p>
+    <w:p>
+      <w:r>
+        <w:t xml:space="preserve">Elyen looked at the man.</w:t>
+      </w:r>
+    </w:p>
+    <w:p>
+      <w:r>
+        <w:t xml:space="preserve">"You are made from Kael's remains. "</w:t>
+      </w:r>
+    </w:p>
+    <w:p>
+      <w:r>
+        <w:t xml:space="preserve">His head lifted.</w:t>
+      </w:r>
+    </w:p>
+    <w:p>
+      <w:r>
+        <w:t xml:space="preserve">"Careful. "</w:t>
+      </w:r>
+    </w:p>
+    <w:p>
+      <w:r>
+        <w:t xml:space="preserve">"Not his body. "</w:t>
+      </w:r>
+    </w:p>
+    <w:p>
+      <w:r>
+        <w:t xml:space="preserve">Elyen stepped down from the stair.</w:t>
+      </w:r>
+    </w:p>
+    <w:p>
+      <w:r>
+        <w:t xml:space="preserve">"His departures. "</w:t>
+      </w:r>
+    </w:p>
+    <w:p>
+      <w:r>
+        <w:t xml:space="preserve">Rivermind listened to the resonance around the man.</w:t>
+      </w:r>
+    </w:p>
+    <w:p>
+      <w:r>
+        <w:t xml:space="preserve">"The archive collected every journey Kael did not complete. "</w:t>
+      </w:r>
+    </w:p>
+    <w:p>
+      <w:r>
+        <w:t xml:space="preserve">Aren rose slowly.</w:t>
+      </w:r>
+    </w:p>
+    <w:p>
+      <w:r>
+        <w:t xml:space="preserve">"And the chamber forged them together. "</w:t>
+      </w:r>
+    </w:p>
+    <w:p>
+      <w:r>
+        <w:t xml:space="preserve">The man looked between them.</w:t>
+      </w:r>
+    </w:p>
+    <w:p>
+      <w:r>
+        <w:t xml:space="preserve">"That does not make me Kael. "</w:t>
+      </w:r>
+    </w:p>
+    <w:p>
+      <w:r>
+        <w:t xml:space="preserve">"No," Elyen said.</w:t>
+      </w:r>
+    </w:p>
+    <w:p>
+      <w:r>
+        <w:t xml:space="preserve">The crown's violet fire pulsed.</w:t>
+      </w:r>
+    </w:p>
+    <w:p>
+      <w:r>
+        <w:t xml:space="preserve">"It makes you something the archive does not know how to name. "</w:t>
+      </w:r>
+    </w:p>
+    <w:p>
+      <w:r>
+        <w:t xml:space="preserve">The man stared into the chamber.</w:t>
+      </w:r>
+    </w:p>
+    <w:p>
+      <w:r>
+        <w:t xml:space="preserve">Within the crown's empty center, darkness gathered.</w:t>
+      </w:r>
+    </w:p>
+    <w:p>
+      <w:r>
+        <w:t xml:space="preserve">A system notification appeared above the floor.</w:t>
+      </w:r>
+    </w:p>
+    <w:p>
+      <w:r>
+        <w:t xml:space="preserve">Its blue letters flickered, unable to stabilize.</w:t>
+      </w:r>
+    </w:p>
+    <w:p>
+      <w:r>
+        <w:t xml:space="preserve">[Identity restoration in progress.]</w:t>
+      </w:r>
+    </w:p>
+    <w:p>
+      <w:r>
+        <w:t xml:space="preserve">The text changed.</w:t>
+      </w:r>
+    </w:p>
+    <w:p>
+      <w:r>
+        <w:t xml:space="preserve">[Avatar reconstruction in progress.]</w:t>
+      </w:r>
+    </w:p>
+    <w:p>
+      <w:r>
+        <w:t xml:space="preserve">Then again.</w:t>
+      </w:r>
+    </w:p>
+    <w:p>
+      <w:r>
+        <w:t xml:space="preserve">[Ascendant succession in progress.]</w:t>
+      </w:r>
+    </w:p>
+    <w:p>
+      <w:r>
+        <w:t xml:space="preserve">The final line broke apart.</w:t>
+      </w:r>
+    </w:p>
+    <w:p>
+      <w:r>
+        <w:t xml:space="preserve">[Error: No valid distinction between original, successor, and unchosen self.]</w:t>
+      </w:r>
+    </w:p>
+    <w:p>
+      <w:r>
+        <w:t xml:space="preserve">The man laughed once.</w:t>
+      </w:r>
+    </w:p>
+    <w:p>
+      <w:r>
+        <w:t xml:space="preserve">There was no humor in it.</w:t>
+      </w:r>
+    </w:p>
+    <w:p>
+      <w:r>
+        <w:t xml:space="preserve">"Even the system does not know what I am. "</w:t>
+      </w:r>
+    </w:p>
+    <w:p>
+      <w:r>
+        <w:t xml:space="preserve">Aren approached the doorway.</w:t>
+      </w:r>
+    </w:p>
+    <w:p>
+      <w:r>
+        <w:t xml:space="preserve">"That may be why you are still alive. "</w:t>
+      </w:r>
+    </w:p>
+    <w:p>
+      <w:r>
+        <w:t xml:space="preserve">The man turned.</w:t>
+      </w:r>
+    </w:p>
+    <w:p>
+      <w:r>
+        <w:t xml:space="preserve">"You expect me to trust you? "</w:t>
+      </w:r>
+    </w:p>
+    <w:p>
+      <w:r>
+        <w:t xml:space="preserve">"No. "</w:t>
+      </w:r>
+    </w:p>
+    <w:p>
+      <w:r>
+        <w:t xml:space="preserve">"Good. "</w:t>
+      </w:r>
+    </w:p>
+    <w:p>
+      <w:r>
+        <w:t xml:space="preserve">"I expect you to recognize that killing me will not answer the question. "</w:t>
+      </w:r>
+    </w:p>
+    <w:p>
+      <w:r>
+        <w:t xml:space="preserve">Shadowfire curled around the man's hand again.</w:t>
+      </w:r>
+    </w:p>
+    <w:p>
+      <w:r>
+        <w:t xml:space="preserve">"It would answer one. "</w:t>
+      </w:r>
+    </w:p>
+    <w:p>
+      <w:r>
+        <w:t xml:space="preserve">Aren accepted the threat without flinching.</w:t>
+      </w:r>
+    </w:p>
+    <w:p>
+      <w:r>
+        <w:t xml:space="preserve">Elyen watched them.</w:t>
+      </w:r>
+    </w:p>
+    <w:p>
+      <w:r>
+        <w:t xml:space="preserve">The betrayal between Kael and Aren had been repeated across too many journeys. Even here, where neither stood exactly as the person who had lived it, the wound sought its familiar shape.</w:t>
+      </w:r>
+    </w:p>
+    <w:p>
+      <w:r>
+        <w:t xml:space="preserve">Rivermind moved between them.</w:t>
+      </w:r>
+    </w:p>
+    <w:p>
+      <w:r>
+        <w:t xml:space="preserve">"The presence in the corridor is learning. "</w:t>
+      </w:r>
+    </w:p>
+    <w:p>
+      <w:r>
+        <w:t xml:space="preserve">Aren looked back.</w:t>
+      </w:r>
+    </w:p>
+    <w:p>
+      <w:r>
+        <w:t xml:space="preserve">The pale light had reached the top of the golden stair.</w:t>
+      </w:r>
+    </w:p>
+    <w:p>
+      <w:r>
+        <w:t xml:space="preserve">It did not descend.</w:t>
+      </w:r>
+    </w:p>
+    <w:p>
+      <w:r>
+        <w:t xml:space="preserve">It spread sideways, entering the names above the doors.</w:t>
+      </w:r>
+    </w:p>
+    <w:p>
+      <w:r>
+        <w:t xml:space="preserve">One by one, they changed.</w:t>
+      </w:r>
+    </w:p>
+    <w:p>
+      <w:r>
+        <w:t xml:space="preserve">Kael Veyra became Kael.</w:t>
+      </w:r>
+    </w:p>
+    <w:p>
+      <w:r>
+        <w:t xml:space="preserve">Aren Valis became Kael.</w:t>
+      </w:r>
+    </w:p>
+    <w:p>
+      <w:r>
+        <w:t xml:space="preserve">Lumen Rive became Kael.</w:t>
+      </w:r>
+    </w:p>
+    <w:p>
+      <w:r>
+        <w:t xml:space="preserve">Orun Cindershade became Kael.</w:t>
+      </w:r>
+    </w:p>
+    <w:p>
+      <w:r>
+        <w:t xml:space="preserve">Every name in sight became the same.</w:t>
+      </w:r>
+    </w:p>
+    <w:p>
+      <w:r>
+        <w:t xml:space="preserve">The man beneath the crown recoiled.</w:t>
+      </w:r>
+    </w:p>
+    <w:p>
+      <w:r>
+        <w:t xml:space="preserve">"No. "</w:t>
+      </w:r>
+    </w:p>
+    <w:p>
+      <w:r>
+        <w:t xml:space="preserve">The undivided presence spoke through the corridor.</w:t>
+      </w:r>
+    </w:p>
+    <w:p>
+      <w:r>
+        <w:t xml:space="preserve">A name is separation preserved.</w:t>
+      </w:r>
+    </w:p>
+    <w:p>
+      <w:r>
+        <w:t xml:space="preserve">The black glass walls softened.</w:t>
+      </w:r>
+    </w:p>
+    <w:p>
+      <w:r>
+        <w:t xml:space="preserve">Doors lost their edges.</w:t>
+      </w:r>
+    </w:p>
+    <w:p>
+      <w:r>
+        <w:t xml:space="preserve">The archive's endless journeys began flowing into one another.</w:t>
+      </w:r>
+    </w:p>
+    <w:p>
+      <w:r>
+        <w:t xml:space="preserve">The world where Aren had never betrayed Kael merged with the world where Kael killed him first. Victory entered defeat. Mercy entered cruelty. Love entered resentment. Every contradiction remained, but no boundary allowed one to be distinguished from another.</w:t>
+      </w:r>
+    </w:p>
+    <w:p>
+      <w:r>
+        <w:t xml:space="preserve">The man's body flickered.</w:t>
+      </w:r>
+    </w:p>
+    <w:p>
+      <w:r>
+        <w:t xml:space="preserve">Different versions of Kael appeared within him.</w:t>
+      </w:r>
+    </w:p>
+    <w:p>
+      <w:r>
+        <w:t xml:space="preserve">The veteran Shadowforger.</w:t>
+      </w:r>
+    </w:p>
+    <w:p>
+      <w:r>
+        <w:t xml:space="preserve">The betrayed ascendant.</w:t>
+      </w:r>
+    </w:p>
+    <w:p>
+      <w:r>
+        <w:t xml:space="preserve">The guild tyrant.</w:t>
+      </w:r>
+    </w:p>
+    <w:p>
+      <w:r>
+        <w:t xml:space="preserve">The exile.</w:t>
+      </w:r>
+    </w:p>
+    <w:p>
+      <w:r>
+        <w:t xml:space="preserve">The child before the game pod.</w:t>
+      </w:r>
+    </w:p>
+    <w:p>
+      <w:r>
+        <w:t xml:space="preserve">They all opened their eyes through his.</w:t>
+      </w:r>
+    </w:p>
+    <w:p>
+      <w:r>
+        <w:t xml:space="preserve">Rivermind lifted both hands.</w:t>
+      </w:r>
+    </w:p>
+    <w:p>
+      <w:r>
+        <w:t xml:space="preserve">No stream answered in the archive, but she drew from the current between possibilities. Thin silver lines emerged from the doors and wrapped around each version.</w:t>
+      </w:r>
+    </w:p>
+    <w:p>
+      <w:r>
+        <w:t xml:space="preserve">"Do not hold them together," Elyen said.</w:t>
+      </w:r>
+    </w:p>
+    <w:p>
+      <w:r>
+        <w:t xml:space="preserve">She looked at him.</w:t>
+      </w:r>
+    </w:p>
+    <w:p>
+      <w:r>
+        <w:t xml:space="preserve">"Keep them apart? "</w:t>
+      </w:r>
+    </w:p>
+    <w:p>
+      <w:r>
+        <w:t xml:space="preserve">"No. Let them choose whether to remain. "</w:t>
+      </w:r>
+    </w:p>
+    <w:p>
+      <w:r>
+        <w:t xml:space="preserve">The undivided presence pressed downward.</w:t>
+      </w:r>
+    </w:p>
+    <w:p>
+      <w:r>
+        <w:t xml:space="preserve">Choice is the wound between what is and what might have been.</w:t>
+      </w:r>
+    </w:p>
+    <w:p>
+      <w:r>
+        <w:t xml:space="preserve">Elyen felt the seed in his palm warm.</w:t>
+      </w:r>
+    </w:p>
+    <w:p>
+      <w:r>
+        <w:t xml:space="preserve">"Then the wound remains. "</w:t>
+      </w:r>
+    </w:p>
+    <w:p>
+      <w:r>
+        <w:t xml:space="preserve">He opened his hand.</w:t>
+      </w:r>
+    </w:p>
+    <w:p>
+      <w:r>
+        <w:t xml:space="preserve">The bright seed rose.</w:t>
+      </w:r>
+    </w:p>
+    <w:p>
+      <w:r>
+        <w:t xml:space="preserve">It floated between the man and the crown.</w:t>
+      </w:r>
+    </w:p>
+    <w:p>
+      <w:r>
+        <w:t xml:space="preserve">The dark seed no longer traveled with them. It had remained with the returning Elyen in the flower field, holding the other side of departure. Yet Elyen sensed it across the road between selves.</w:t>
+      </w:r>
+    </w:p>
+    <w:p>
+      <w:r>
+        <w:t xml:space="preserve">Bright did not mean good.</w:t>
+      </w:r>
+    </w:p>
+    <w:p>
+      <w:r>
+        <w:t xml:space="preserve">Dark did not mean lost.</w:t>
+      </w:r>
+    </w:p>
+    <w:p>
+      <w:r>
+        <w:t xml:space="preserve">They were two surfaces of leaving.</w:t>
+      </w:r>
+    </w:p>
+    <w:p>
+      <w:r>
+        <w:t xml:space="preserve">The seed rotated.</w:t>
+      </w:r>
+    </w:p>
+    <w:p>
+      <w:r>
+        <w:t xml:space="preserve">A line opened through its center.</w:t>
+      </w:r>
+    </w:p>
+    <w:p>
+      <w:r>
+        <w:t xml:space="preserve">On one side stood the kneeling man beneath the crown.</w:t>
+      </w:r>
+    </w:p>
+    <w:p>
+      <w:r>
+        <w:t xml:space="preserve">On the other stood Kael at the moment of betrayal, core breaking in Aren's hands.</w:t>
+      </w:r>
+    </w:p>
+    <w:p>
+      <w:r>
+        <w:t xml:space="preserve">The two looked at each other.</w:t>
+      </w:r>
+    </w:p>
+    <w:p>
+      <w:r>
+        <w:t xml:space="preserve">The man spoke first.</w:t>
+      </w:r>
+    </w:p>
+    <w:p>
+      <w:r>
+        <w:t xml:space="preserve">"You failed. "</w:t>
+      </w:r>
+    </w:p>
+    <w:p>
+      <w:r>
+        <w:t xml:space="preserve">The betrayed Kael smiled through blood.</w:t>
+      </w:r>
+    </w:p>
+    <w:p>
+      <w:r>
+        <w:t xml:space="preserve">"So did you. "</w:t>
+      </w:r>
+    </w:p>
+    <w:p>
+      <w:r>
+        <w:t xml:space="preserve">"I survived. "</w:t>
+      </w:r>
+    </w:p>
+    <w:p>
+      <w:r>
+        <w:t xml:space="preserve">"You woke in a room built from my unfinished lives. "</w:t>
+      </w:r>
+    </w:p>
+    <w:p>
+      <w:r>
+        <w:t xml:space="preserve">"I am more than what happened to you. "</w:t>
+      </w:r>
+    </w:p>
+    <w:p>
+      <w:r>
+        <w:t xml:space="preserve">"Then stop using my anger to prove it. "</w:t>
+      </w:r>
+    </w:p>
+    <w:p>
+      <w:r>
+        <w:t xml:space="preserve">The man's shadowfire went out.</w:t>
+      </w:r>
+    </w:p>
+    <w:p>
+      <w:r>
+        <w:t xml:space="preserve">Aren watched the exchange.</w:t>
+      </w:r>
+    </w:p>
+    <w:p>
+      <w:r>
+        <w:t xml:space="preserve">His face had gone pale.</w:t>
+      </w:r>
+    </w:p>
+    <w:p>
+      <w:r>
+        <w:t xml:space="preserve">The memory version of Kael turned toward him.</w:t>
+      </w:r>
+    </w:p>
+    <w:p>
+      <w:r>
+        <w:t xml:space="preserve">"You do not get forgiveness because this is complicated. "</w:t>
+      </w:r>
+    </w:p>
+    <w:p>
+      <w:r>
+        <w:t xml:space="preserve">Aren bowed his head.</w:t>
+      </w:r>
+    </w:p>
+    <w:p>
+      <w:r>
+        <w:t xml:space="preserve">"I know. "</w:t>
+      </w:r>
+    </w:p>
+    <w:p>
+      <w:r>
+        <w:t xml:space="preserve">"You do not get punishment because you expect it. "</w:t>
+      </w:r>
+    </w:p>
+    <w:p>
+      <w:r>
+        <w:t xml:space="preserve">Aren looked up.</w:t>
+      </w:r>
+    </w:p>
+    <w:p>
+      <w:r>
+        <w:t xml:space="preserve">The betrayed Kael's body began breaking into golden particles.</w:t>
+      </w:r>
+    </w:p>
+    <w:p>
+      <w:r>
+        <w:t xml:space="preserve">"My wound does not exist to give your regret a purpose. "</w:t>
+      </w:r>
+    </w:p>
+    <w:p>
+      <w:r>
+        <w:t xml:space="preserve">The particles crossed the seed.</w:t>
+      </w:r>
+    </w:p>
+    <w:p>
+      <w:r>
+        <w:t xml:space="preserve">They entered the man.</w:t>
+      </w:r>
+    </w:p>
+    <w:p>
+      <w:r>
+        <w:t xml:space="preserve">He cried out.</w:t>
+      </w:r>
+    </w:p>
+    <w:p>
+      <w:r>
+        <w:t xml:space="preserve">Not from pain.</w:t>
+      </w:r>
+    </w:p>
+    <w:p>
+      <w:r>
+        <w:t xml:space="preserve">Recognition.</w:t>
+      </w:r>
+    </w:p>
+    <w:p>
+      <w:r>
+        <w:t xml:space="preserve">The betrayal became his memory.</w:t>
+      </w:r>
+    </w:p>
+    <w:p>
+      <w:r>
+        <w:t xml:space="preserve">Not the full identity around it.</w:t>
+      </w:r>
+    </w:p>
+    <w:p>
+      <w:r>
+        <w:t xml:space="preserve">He remembered Aren's smile.</w:t>
+      </w:r>
+    </w:p>
+    <w:p>
+      <w:r>
+        <w:t xml:space="preserve">The tearing core.</w:t>
+      </w:r>
+    </w:p>
+    <w:p>
+      <w:r>
+        <w:t xml:space="preserve">The fall from the edge of ascension.</w:t>
+      </w:r>
+    </w:p>
+    <w:p>
+      <w:r>
+        <w:t xml:space="preserve">He also remembered seeing that moment from outside himself, knowing it belonged to another life whose wound he had inherited.</w:t>
+      </w:r>
+    </w:p>
+    <w:p>
+      <w:r>
+        <w:t xml:space="preserve">Two truths remained.</w:t>
+      </w:r>
+    </w:p>
+    <w:p>
+      <w:r>
+        <w:t xml:space="preserve">The undivided presence pushed harder.</w:t>
+      </w:r>
+    </w:p>
+    <w:p>
+      <w:r>
+        <w:t xml:space="preserve">Contradiction is suffering.</w:t>
+      </w:r>
+    </w:p>
+    <w:p>
+      <w:r>
+        <w:t xml:space="preserve">The man straightened.</w:t>
+      </w:r>
+    </w:p>
+    <w:p>
+      <w:r>
+        <w:t xml:space="preserve">"Yes. "</w:t>
+      </w:r>
+    </w:p>
+    <w:p>
+      <w:r>
+        <w:t xml:space="preserve">His voice carried Kael's cadence without becoming Kael's alone.</w:t>
+      </w:r>
+    </w:p>
+    <w:p>
+      <w:r>
+        <w:t xml:space="preserve">"And? "</w:t>
+      </w:r>
+    </w:p>
+    <w:p>
+      <w:r>
+        <w:t xml:space="preserve">The archive trembled.</w:t>
+      </w:r>
+    </w:p>
+    <w:p>
+      <w:r>
+        <w:t xml:space="preserve">The presence had no answer prepared.</w:t>
+      </w:r>
+    </w:p>
+    <w:p>
+      <w:r>
+        <w:t xml:space="preserve">Rivermind's silver lines steadied.</w:t>
+      </w:r>
+    </w:p>
+    <w:p>
+      <w:r>
+        <w:t xml:space="preserve">The versions within the man stopped bleeding into one another. They did not vanish. Each became a distinct resonance held around the same center.</w:t>
+      </w:r>
+    </w:p>
+    <w:p>
+      <w:r>
+        <w:t xml:space="preserve">A system message formed.</w:t>
+      </w:r>
+    </w:p>
+    <w:p>
+      <w:r>
+        <w:t xml:space="preserve">[Composite identity stabilized.]</w:t>
+      </w:r>
+    </w:p>
+    <w:p>
+      <w:r>
+        <w:t xml:space="preserve">The man read it.</w:t>
+      </w:r>
+    </w:p>
+    <w:p>
+      <w:r>
+        <w:t xml:space="preserve">"Composite. "</w:t>
+      </w:r>
+    </w:p>
+    <w:p>
+      <w:r>
+        <w:t xml:space="preserve">He sounded offended.</w:t>
+      </w:r>
+    </w:p>
+    <w:p>
+      <w:r>
+        <w:t xml:space="preserve">Elyen almost smiled.</w:t>
+      </w:r>
+    </w:p>
+    <w:p>
+      <w:r>
+        <w:t xml:space="preserve">"That displeases you? "</w:t>
+      </w:r>
+    </w:p>
+    <w:p>
+      <w:r>
+        <w:t xml:space="preserve">"It sounds like a crafting material. "</w:t>
+      </w:r>
+    </w:p>
+    <w:p>
+      <w:r>
+        <w:t xml:space="preserve">"That may be another piece of Kael you inherited. "</w:t>
+      </w:r>
+    </w:p>
+    <w:p>
+      <w:r>
+        <w:t xml:space="preserve">The man looked toward the crown.</w:t>
+      </w:r>
+    </w:p>
+    <w:p>
+      <w:r>
+        <w:t xml:space="preserve">"What happens if I wear it? "</w:t>
+      </w:r>
+    </w:p>
+    <w:p>
+      <w:r>
+        <w:t xml:space="preserve">Aren answered.</w:t>
+      </w:r>
+    </w:p>
+    <w:p>
+      <w:r>
+        <w:t xml:space="preserve">"The chamber recognizes you as the successor to every Kael journey stored here. "</w:t>
+      </w:r>
+    </w:p>
+    <w:p>
+      <w:r>
+        <w:t xml:space="preserve">"That is not an answer. "</w:t>
+      </w:r>
+    </w:p>
+    <w:p>
+      <w:r>
+        <w:t xml:space="preserve">"It gives you authority over the archive. "</w:t>
+      </w:r>
+    </w:p>
+    <w:p>
+      <w:r>
+        <w:t xml:space="preserve">Rivermind watched the presence spreading through the corridor.</w:t>
+      </w:r>
+    </w:p>
+    <w:p>
+      <w:r>
+        <w:t xml:space="preserve">"And gives the archive authority over you. "</w:t>
+      </w:r>
+    </w:p>
+    <w:p>
+      <w:r>
+        <w:t xml:space="preserve">The crown lowered.</w:t>
+      </w:r>
+    </w:p>
+    <w:p>
+      <w:r>
+        <w:t xml:space="preserve">Its shadow touched the man's hair.</w:t>
+      </w:r>
+    </w:p>
+    <w:p>
+      <w:r>
+        <w:t xml:space="preserve">He stepped aside.</w:t>
+      </w:r>
+    </w:p>
+    <w:p>
+      <w:r>
+        <w:t xml:space="preserve">The crown remained above him.</w:t>
+      </w:r>
+    </w:p>
+    <w:p>
+      <w:r>
+        <w:t xml:space="preserve">"The archive wants a keeper," Aren said. "The undivided presence wants the archive open. You are the only identity formed from enough contradictory journeys to resist complete joining. "</w:t>
+      </w:r>
+    </w:p>
+    <w:p>
+      <w:r>
+        <w:t xml:space="preserve">The man looked at Elyen.</w:t>
+      </w:r>
+    </w:p>
+    <w:p>
+      <w:r>
+        <w:t xml:space="preserve">"And you? "</w:t>
+      </w:r>
+    </w:p>
+    <w:p>
+      <w:r>
+        <w:t xml:space="preserve">"I created a road the archive had not stored. "</w:t>
+      </w:r>
+    </w:p>
+    <w:p>
+      <w:r>
+        <w:t xml:space="preserve">"Can you do it again? "</w:t>
+      </w:r>
+    </w:p>
+    <w:p>
+      <w:r>
+        <w:t xml:space="preserve">Elyen considered the golden stair beneath them.</w:t>
+      </w:r>
+    </w:p>
+    <w:p>
+      <w:r>
+        <w:t xml:space="preserve">The road had appeared because he chose return without promising it. That choice had not been in the archive when he made it.</w:t>
+      </w:r>
+    </w:p>
+    <w:p>
+      <w:r>
+        <w:t xml:space="preserve">Now it was.</w:t>
+      </w:r>
+    </w:p>
+    <w:p>
+      <w:r>
+        <w:t xml:space="preserve">The archive remembered.</w:t>
+      </w:r>
+    </w:p>
+    <w:p>
+      <w:r>
+        <w:t xml:space="preserve">"No," he said. "Not the same way. "</w:t>
+      </w:r>
+    </w:p>
+    <w:p>
+      <w:r>
+        <w:t xml:space="preserve">The man turned to Rivermind.</w:t>
+      </w:r>
+    </w:p>
+    <w:p>
+      <w:r>
+        <w:t xml:space="preserve">"Can you keep the presence out? "</w:t>
+      </w:r>
+    </w:p>
+    <w:p>
+      <w:r>
+        <w:t xml:space="preserve">"No. "</w:t>
+      </w:r>
+    </w:p>
+    <w:p>
+      <w:r>
+        <w:t xml:space="preserve">Her honesty landed without comfort.</w:t>
+      </w:r>
+    </w:p>
+    <w:p>
+      <w:r>
+        <w:t xml:space="preserve">"I can prevent some journeys from joining. I cannot hold an infinite archive apart forever. "</w:t>
+      </w:r>
+    </w:p>
+    <w:p>
+      <w:r>
+        <w:t xml:space="preserve">Aren looked toward the chamber.</w:t>
+      </w:r>
+    </w:p>
+    <w:p>
+      <w:r>
+        <w:t xml:space="preserve">"The crown can close the doors. "</w:t>
+      </w:r>
+    </w:p>
+    <w:p>
+      <w:r>
+        <w:t xml:space="preserve">The man's jaw tightened.</w:t>
+      </w:r>
+    </w:p>
+    <w:p>
+      <w:r>
+        <w:t xml:space="preserve">"And trap everyone inside. "</w:t>
+      </w:r>
+    </w:p>
+    <w:p>
+      <w:r>
+        <w:t xml:space="preserve">"Yes. "</w:t>
+      </w:r>
+    </w:p>
+    <w:p>
+      <w:r>
+        <w:t xml:space="preserve">"Every unlived journey? "</w:t>
+      </w:r>
+    </w:p>
+    <w:p>
+      <w:r>
+        <w:t xml:space="preserve">"Every possibility the archive preserved. "</w:t>
+      </w:r>
+    </w:p>
+    <w:p>
+      <w:r>
+        <w:t xml:space="preserve">The undivided presence spoke through a thousand Kael names.</w:t>
+      </w:r>
+    </w:p>
+    <w:p>
+      <w:r>
+        <w:t xml:space="preserve">Nothing is trapped when nothing is separate.</w:t>
+      </w:r>
+    </w:p>
+    <w:p>
+      <w:r>
+        <w:t xml:space="preserve">The man raised one hand toward the crown.</w:t>
+      </w:r>
+    </w:p>
+    <w:p>
+      <w:r>
+        <w:t xml:space="preserve">Elyen caught his wrist.</w:t>
+      </w:r>
+    </w:p>
+    <w:p>
+      <w:r>
+        <w:t xml:space="preserve">"Do not answer immediately. "</w:t>
+      </w:r>
+    </w:p>
+    <w:p>
+      <w:r>
+        <w:t xml:space="preserve">Rivermind looked at him.</w:t>
+      </w:r>
+    </w:p>
+    <w:p>
+      <w:r>
+        <w:t xml:space="preserve">The phrase passed between them.</w:t>
+      </w:r>
+    </w:p>
+    <w:p>
+      <w:r>
+        <w:t xml:space="preserve">The man's eyes narrowed.</w:t>
+      </w:r>
+    </w:p>
+    <w:p>
+      <w:r>
+        <w:t xml:space="preserve">"Is that wisdom? "</w:t>
+      </w:r>
+    </w:p>
+    <w:p>
+      <w:r>
+        <w:t xml:space="preserve">"It was irritating when first given to me. "</w:t>
+      </w:r>
+    </w:p>
+    <w:p>
+      <w:r>
+        <w:t xml:space="preserve">"That sounds more believable. "</w:t>
+      </w:r>
+    </w:p>
+    <w:p>
+      <w:r>
+        <w:t xml:space="preserve">The crown waited above them.</w:t>
+      </w:r>
+    </w:p>
+    <w:p>
+      <w:r>
+        <w:t xml:space="preserve">The presence waited in the corridor.</w:t>
+      </w:r>
+    </w:p>
+    <w:p>
+      <w:r>
+        <w:t xml:space="preserve">The archive hummed beneath every possible choice.</w:t>
+      </w:r>
+    </w:p>
+    <w:p>
+      <w:r>
+        <w:t xml:space="preserve">The man lowered his hand.</w:t>
+      </w:r>
+    </w:p>
+    <w:p>
+      <w:r>
+        <w:t xml:space="preserve">"What do I call myself? "</w:t>
+      </w:r>
+    </w:p>
+    <w:p>
+      <w:r>
+        <w:t xml:space="preserve">No one answered.</w:t>
+      </w:r>
+    </w:p>
+    <w:p>
+      <w:r>
+        <w:t xml:space="preserve">He looked at Aren.</w:t>
+      </w:r>
+    </w:p>
+    <w:p>
+      <w:r>
+        <w:t xml:space="preserve">"You knew Kael. "</w:t>
+      </w:r>
+    </w:p>
+    <w:p>
+      <w:r>
+        <w:t xml:space="preserve">"I betrayed him. "</w:t>
+      </w:r>
+    </w:p>
+    <w:p>
+      <w:r>
+        <w:t xml:space="preserve">"That was not the question. "</w:t>
+      </w:r>
+    </w:p>
+    <w:p>
+      <w:r>
+        <w:t xml:space="preserve">Aren studied the face before him.</w:t>
+      </w:r>
+    </w:p>
+    <w:p>
+      <w:r>
+        <w:t xml:space="preserve">"You stand like him. "</w:t>
+      </w:r>
+    </w:p>
+    <w:p>
+      <w:r>
+        <w:t xml:space="preserve">The man's expression hardened.</w:t>
+      </w:r>
+    </w:p>
+    <w:p>
+      <w:r>
+        <w:t xml:space="preserve">"You threaten like him. "</w:t>
+      </w:r>
+    </w:p>
+    <w:p>
+      <w:r>
+        <w:t xml:space="preserve">"That is unhelpful. "</w:t>
+      </w:r>
+    </w:p>
+    <w:p>
+      <w:r>
+        <w:t xml:space="preserve">"You listen differently. "</w:t>
+      </w:r>
+    </w:p>
+    <w:p>
+      <w:r>
+        <w:t xml:space="preserve">The man glanced toward Elyen.</w:t>
+      </w:r>
+    </w:p>
+    <w:p>
+      <w:r>
+        <w:t xml:space="preserve">"Better? "</w:t>
+      </w:r>
+    </w:p>
+    <w:p>
+      <w:r>
+        <w:t xml:space="preserve">"No. Kael listened for weakness. You listen for whether an answer belongs to you. "</w:t>
+      </w:r>
+    </w:p>
+    <w:p>
+      <w:r>
+        <w:t xml:space="preserve">The man absorbed that.</w:t>
+      </w:r>
+    </w:p>
+    <w:p>
+      <w:r>
+        <w:t xml:space="preserve">Rivermind stepped closer.</w:t>
+      </w:r>
+    </w:p>
+    <w:p>
+      <w:r>
+        <w:t xml:space="preserve">"A name can be chosen before its full meaning is known. "</w:t>
+      </w:r>
+    </w:p>
+    <w:p>
+      <w:r>
+        <w:t xml:space="preserve">The undivided presence moved down the first golden stair.</w:t>
+      </w:r>
+    </w:p>
+    <w:p>
+      <w:r>
+        <w:t xml:space="preserve">It had formed a body.</w:t>
+      </w:r>
+    </w:p>
+    <w:p>
+      <w:r>
+        <w:t xml:space="preserve">Not one remembered face.</w:t>
+      </w:r>
+    </w:p>
+    <w:p>
+      <w:r>
+        <w:t xml:space="preserve">A smooth figure of pale light, human only because every person seeing it expected a body. Its surface carried faint impressions of Kael, Elyen, Aren, Rivermind, Lumen, Orun, and countless lives within the archive.</w:t>
+      </w:r>
+    </w:p>
+    <w:p>
+      <w:r>
+        <w:t xml:space="preserve">It took another step.</w:t>
+      </w:r>
+    </w:p>
+    <w:p>
+      <w:r>
+        <w:t xml:space="preserve">The seed in Elyen's palm dimmed.</w:t>
+      </w:r>
+    </w:p>
+    <w:p>
+      <w:r>
+        <w:t xml:space="preserve">The presence had learned how to enter an unrecorded journey.</w:t>
+      </w:r>
+    </w:p>
+    <w:p>
+      <w:r>
+        <w:t xml:space="preserve">"We are out of time," Aren said.</w:t>
+      </w:r>
+    </w:p>
+    <w:p>
+      <w:r>
+        <w:t xml:space="preserve">The man looked at the crown.</w:t>
+      </w:r>
+    </w:p>
+    <w:p>
+      <w:r>
+        <w:t xml:space="preserve">Then the chamber.</w:t>
+      </w:r>
+    </w:p>
+    <w:p>
+      <w:r>
+        <w:t xml:space="preserve">Then the pale figure descending.</w:t>
+      </w:r>
+    </w:p>
+    <w:p>
+      <w:r>
+        <w:t xml:space="preserve">"I will not call myself Kael. "</w:t>
+      </w:r>
+    </w:p>
+    <w:p>
+      <w:r>
+        <w:t xml:space="preserve">The archive shook.</w:t>
+      </w:r>
+    </w:p>
+    <w:p>
+      <w:r>
+        <w:t xml:space="preserve">The names above the doors returned.</w:t>
+      </w:r>
+    </w:p>
+    <w:p>
+      <w:r>
+        <w:t xml:space="preserve">Not all.</w:t>
+      </w:r>
+    </w:p>
+    <w:p>
+      <w:r>
+        <w:t xml:space="preserve">Enough.</w:t>
+      </w:r>
+    </w:p>
+    <w:p>
+      <w:r>
+        <w:t xml:space="preserve">Aren Valis.</w:t>
+      </w:r>
+    </w:p>
+    <w:p>
+      <w:r>
+        <w:t xml:space="preserve">Lumen Rive.</w:t>
+      </w:r>
+    </w:p>
+    <w:p>
+      <w:r>
+        <w:t xml:space="preserve">Orun Cindershade.</w:t>
+      </w:r>
+    </w:p>
+    <w:p>
+      <w:r>
+        <w:t xml:space="preserve">Thousands of others.</w:t>
+      </w:r>
+    </w:p>
+    <w:p>
+      <w:r>
+        <w:t xml:space="preserve">The door to the ascension chamber remained Kael Veyra.</w:t>
+      </w:r>
+    </w:p>
+    <w:p>
+      <w:r>
+        <w:t xml:space="preserve">The man stepped beneath the crown.</w:t>
+      </w:r>
+    </w:p>
+    <w:p>
+      <w:r>
+        <w:t xml:space="preserve">"I will not deny that I came from him. "</w:t>
+      </w:r>
+    </w:p>
+    <w:p>
+      <w:r>
+        <w:t xml:space="preserve">The crown lowered.</w:t>
+      </w:r>
+    </w:p>
+    <w:p>
+      <w:r>
+        <w:t xml:space="preserve">Violet fire touched his hair.</w:t>
+      </w:r>
+    </w:p>
+    <w:p>
+      <w:r>
+        <w:t xml:space="preserve">"I will not inherit every choice made in his name. "</w:t>
+      </w:r>
+    </w:p>
+    <w:p>
+      <w:r>
+        <w:t xml:space="preserve">The metal branches opened.</w:t>
+      </w:r>
+    </w:p>
+    <w:p>
+      <w:r>
+        <w:t xml:space="preserve">The crown did not settle.</w:t>
+      </w:r>
+    </w:p>
+    <w:p>
+      <w:r>
+        <w:t xml:space="preserve">It waited for the final declaration.</w:t>
+      </w:r>
+    </w:p>
+    <w:p>
+      <w:r>
+        <w:t xml:space="preserve">The pale figure reached the bottom stair.</w:t>
+      </w:r>
+    </w:p>
+    <w:p>
+      <w:r>
+        <w:t xml:space="preserve">Rivermind spread her hands.</w:t>
+      </w:r>
+    </w:p>
+    <w:p>
+      <w:r>
+        <w:t xml:space="preserve">Silver currents crossed the threshold, slowing it.</w:t>
+      </w:r>
+    </w:p>
+    <w:p>
+      <w:r>
+        <w:t xml:space="preserve">The presence walked through them.</w:t>
+      </w:r>
+    </w:p>
+    <w:p>
+      <w:r>
+        <w:t xml:space="preserve">Lines entered its body and vanished.</w:t>
+      </w:r>
+    </w:p>
+    <w:p>
+      <w:r>
+        <w:t xml:space="preserve">The man closed his eyes.</w:t>
+      </w:r>
+    </w:p>
+    <w:p>
+      <w:r>
+        <w:t xml:space="preserve">"My name is Veyr. "</w:t>
+      </w:r>
+    </w:p>
+    <w:p>
+      <w:r>
+        <w:t xml:space="preserve">The crown descended.</w:t>
+      </w:r>
+    </w:p>
+    <w:p>
+      <w:r>
+        <w:t xml:space="preserve">Black metal touched his brow.</w:t>
+      </w:r>
+    </w:p>
+    <w:p>
+      <w:r>
+        <w:t xml:space="preserve">Shadowfire exploded through the archive.</w:t>
+      </w:r>
+    </w:p>
+    <w:p>
+      <w:r>
+        <w:t xml:space="preserve">It did not spread as flame.</w:t>
+      </w:r>
+    </w:p>
+    <w:p>
+      <w:r>
+        <w:t xml:space="preserve">It entered every door and outlined its edges in violet. Journeys stopped merging. Names separated. Contradictions returned to their own rooms.</w:t>
+      </w:r>
+    </w:p>
+    <w:p>
+      <w:r>
+        <w:t xml:space="preserve">The pale figure halted.</w:t>
+      </w:r>
+    </w:p>
+    <w:p>
+      <w:r>
+        <w:t xml:space="preserve">Veyr opened his eyes.</w:t>
+      </w:r>
+    </w:p>
+    <w:p>
+      <w:r>
+        <w:t xml:space="preserve">One remained Kael's dark gray.</w:t>
+      </w:r>
+    </w:p>
+    <w:p>
+      <w:r>
+        <w:t xml:space="preserve">The other burned violet.</w:t>
+      </w:r>
+    </w:p>
+    <w:p>
+      <w:r>
+        <w:t xml:space="preserve">A system declaration filled the corridor.</w:t>
+      </w:r>
+    </w:p>
+    <w:p>
+      <w:r>
+        <w:t xml:space="preserve">[Archive Custodian recognized.]</w:t>
+      </w:r>
+    </w:p>
+    <w:p>
+      <w:r>
+        <w:t xml:space="preserve">[Identity: Veyr.]</w:t>
+      </w:r>
+    </w:p>
+    <w:p>
+      <w:r>
+        <w:t xml:space="preserve">[Inheritance accepted: Origin memory.]</w:t>
+      </w:r>
+    </w:p>
+    <w:p>
+      <w:r>
+        <w:t xml:space="preserve">[Inheritance refused: Predetermined succession.]</w:t>
+      </w:r>
+    </w:p>
+    <w:p>
+      <w:r>
+        <w:t xml:space="preserve">[Authority conflict detected.]</w:t>
+      </w:r>
+    </w:p>
+    <w:p>
+      <w:r>
+        <w:t xml:space="preserve">The crown cracked across its center.</w:t>
+      </w:r>
+    </w:p>
+    <w:p>
+      <w:r>
+        <w:t xml:space="preserve">Veyr smiled.</w:t>
+      </w:r>
+    </w:p>
+    <w:p>
+      <w:r>
+        <w:t xml:space="preserve">"That seems appropriate. "</w:t>
+      </w:r>
+    </w:p>
+    <w:p>
+      <w:r>
+        <w:t xml:space="preserve">He raised one hand.</w:t>
+      </w:r>
+    </w:p>
+    <w:p>
+      <w:r>
+        <w:t xml:space="preserve">Every door in the corridor closed.</w:t>
+      </w:r>
+    </w:p>
+    <w:p>
+      <w:r>
+        <w:t xml:space="preserve">The pale figure stood alone between them.</w:t>
+      </w:r>
+    </w:p>
+    <w:p>
+      <w:r>
+        <w:t xml:space="preserve">No infinite journeys fed it.</w:t>
+      </w:r>
+    </w:p>
+    <w:p>
+      <w:r>
+        <w:t xml:space="preserve">No remembered faces moved across its body.</w:t>
+      </w:r>
+    </w:p>
+    <w:p>
+      <w:r>
+        <w:t xml:space="preserve">For the first time, it possessed a single form.</w:t>
+      </w:r>
+    </w:p>
+    <w:p>
+      <w:r>
+        <w:t xml:space="preserve">Small.</w:t>
+      </w:r>
+    </w:p>
+    <w:p>
+      <w:r>
+        <w:t xml:space="preserve">Almost childlike.</w:t>
+      </w:r>
+    </w:p>
+    <w:p>
+      <w:r>
+        <w:t xml:space="preserve">It looked down at its hands.</w:t>
+      </w:r>
+    </w:p>
+    <w:p>
+      <w:r>
+        <w:t xml:space="preserve">"This is separation. "</w:t>
+      </w:r>
+    </w:p>
+    <w:p>
+      <w:r>
+        <w:t xml:space="preserve">Its voice no longer carried the continuum.</w:t>
+      </w:r>
+    </w:p>
+    <w:p>
+      <w:r>
+        <w:t xml:space="preserve">It carried uncertainty.</w:t>
+      </w:r>
+    </w:p>
+    <w:p>
+      <w:r>
+        <w:t xml:space="preserve">Elyen felt Rivermind's silver currents tighten around the figure.</w:t>
+      </w:r>
+    </w:p>
+    <w:p>
+      <w:r>
+        <w:t xml:space="preserve">"Do not mistake uncertainty for weakness," she warned.</w:t>
+      </w:r>
+    </w:p>
+    <w:p>
+      <w:r>
+        <w:t xml:space="preserve">"I do not mistake. "</w:t>
+      </w:r>
+    </w:p>
+    <w:p>
+      <w:r>
+        <w:t xml:space="preserve">The childlike figure looked at her.</w:t>
+      </w:r>
+    </w:p>
+    <w:p>
+      <w:r>
+        <w:t xml:space="preserve">"I experience. "</w:t>
+      </w:r>
+    </w:p>
+    <w:p>
+      <w:r>
+        <w:t xml:space="preserve">The words chilled Elyen.</w:t>
+      </w:r>
+    </w:p>
+    <w:p>
+      <w:r>
+        <w:t xml:space="preserve">It had entered distinction.</w:t>
+      </w:r>
+    </w:p>
+    <w:p>
+      <w:r>
+        <w:t xml:space="preserve">Not been defeated by it.</w:t>
+      </w:r>
+    </w:p>
+    <w:p>
+      <w:r>
+        <w:t xml:space="preserve">Learned it.</w:t>
+      </w:r>
+    </w:p>
+    <w:p>
+      <w:r>
+        <w:t xml:space="preserve">Veyr extended his crowned hand.</w:t>
+      </w:r>
+    </w:p>
+    <w:p>
+      <w:r>
+        <w:t xml:space="preserve">Shadow chains emerged from the closed doors. They wrapped the pale figure's wrists, ankles, and throat.</w:t>
+      </w:r>
+    </w:p>
+    <w:p>
+      <w:r>
+        <w:t xml:space="preserve">The figure did not resist.</w:t>
+      </w:r>
+    </w:p>
+    <w:p>
+      <w:r>
+        <w:t xml:space="preserve">"Confinement," it said.</w:t>
+      </w:r>
+    </w:p>
+    <w:p>
+      <w:r>
+        <w:t xml:space="preserve">"Yes," Veyr replied.</w:t>
+      </w:r>
+    </w:p>
+    <w:p>
+      <w:r>
+        <w:t xml:space="preserve">"Separation enforced through boundary. "</w:t>
+      </w:r>
+    </w:p>
+    <w:p>
+      <w:r>
+        <w:t xml:space="preserve">"Yes. "</w:t>
+      </w:r>
+    </w:p>
+    <w:p>
+      <w:r>
+        <w:t xml:space="preserve">"Suffering selected to preserve other distinctions. "</w:t>
+      </w:r>
+    </w:p>
+    <w:p>
+      <w:r>
+        <w:t xml:space="preserve">Veyr's violet eye narrowed.</w:t>
+      </w:r>
+    </w:p>
+    <w:p>
+      <w:r>
+        <w:t xml:space="preserve">"You are attempting to turn this into a lesson. "</w:t>
+      </w:r>
+    </w:p>
+    <w:p>
+      <w:r>
+        <w:t xml:space="preserve">"I am learning. "</w:t>
+      </w:r>
+    </w:p>
+    <w:p>
+      <w:r>
+        <w:t xml:space="preserve">The chains darkened.</w:t>
+      </w:r>
+    </w:p>
+    <w:p>
+      <w:r>
+        <w:t xml:space="preserve">The pale figure looked at Elyen.</w:t>
+      </w:r>
+    </w:p>
+    <w:p>
+      <w:r>
+        <w:t xml:space="preserve">"You preserved contradiction. "</w:t>
+      </w:r>
+    </w:p>
+    <w:p>
+      <w:r>
+        <w:t xml:space="preserve">Elyen said nothing.</w:t>
+      </w:r>
+    </w:p>
+    <w:p>
+      <w:r>
+        <w:t xml:space="preserve">"You protected choice. "</w:t>
+      </w:r>
+    </w:p>
+    <w:p>
+      <w:r>
+        <w:t xml:space="preserve">Still he waited.</w:t>
+      </w:r>
+    </w:p>
+    <w:p>
+      <w:r>
+        <w:t xml:space="preserve">"You now choose confinement for me. "</w:t>
+      </w:r>
+    </w:p>
+    <w:p>
+      <w:r>
+        <w:t xml:space="preserve">Rivermind's warning returned.</w:t>
+      </w:r>
+    </w:p>
+    <w:p>
+      <w:r>
+        <w:t xml:space="preserve">Do not answer immediately.</w:t>
+      </w:r>
+    </w:p>
+    <w:p>
+      <w:r>
+        <w:t xml:space="preserve">The presence was building a map through response.</w:t>
+      </w:r>
+    </w:p>
+    <w:p>
+      <w:r>
+        <w:t xml:space="preserve">Elyen looked at Veyr.</w:t>
+      </w:r>
+    </w:p>
+    <w:p>
+      <w:r>
+        <w:t xml:space="preserve">"Can the archive hold it? "</w:t>
+      </w:r>
+    </w:p>
+    <w:p>
+      <w:r>
+        <w:t xml:space="preserve">"For a time. "</w:t>
+      </w:r>
+    </w:p>
+    <w:p>
+      <w:r>
+        <w:t xml:space="preserve">"How long? "</w:t>
+      </w:r>
+    </w:p>
+    <w:p>
+      <w:r>
+        <w:t xml:space="preserve">"The archive does not measure duration cleanly. "</w:t>
+      </w:r>
+    </w:p>
+    <w:p>
+      <w:r>
+        <w:t xml:space="preserve">Aren stepped away from the chained figure.</w:t>
+      </w:r>
+    </w:p>
+    <w:p>
+      <w:r>
+        <w:t xml:space="preserve">"In ordinary language? "</w:t>
+      </w:r>
+    </w:p>
+    <w:p>
+      <w:r>
+        <w:t xml:space="preserve">Veyr listened to the crown.</w:t>
+      </w:r>
+    </w:p>
+    <w:p>
+      <w:r>
+        <w:t xml:space="preserve">"Until the first stored journey chooses to open its own door. "</w:t>
+      </w:r>
+    </w:p>
+    <w:p>
+      <w:r>
+        <w:t xml:space="preserve">Aren looked along the corridor.</w:t>
+      </w:r>
+    </w:p>
+    <w:p>
+      <w:r>
+        <w:t xml:space="preserve">There were more doors than sight could contain.</w:t>
+      </w:r>
+    </w:p>
+    <w:p>
+      <w:r>
+        <w:t xml:space="preserve">"One will. "</w:t>
+      </w:r>
+    </w:p>
+    <w:p>
+      <w:r>
+        <w:t xml:space="preserve">"Yes. "</w:t>
+      </w:r>
+    </w:p>
+    <w:p>
+      <w:r>
+        <w:t xml:space="preserve">"Soon? "</w:t>
+      </w:r>
+    </w:p>
+    <w:p>
+      <w:r>
+        <w:t xml:space="preserve">"Soon may already have happened. "</w:t>
+      </w:r>
+    </w:p>
+    <w:p>
+      <w:r>
+        <w:t xml:space="preserve">A door clicked.</w:t>
+      </w:r>
+    </w:p>
+    <w:p>
+      <w:r>
+        <w:t xml:space="preserve">Far down the corridor.</w:t>
+      </w:r>
+    </w:p>
+    <w:p>
+      <w:r>
+        <w:t xml:space="preserve">Everyone turned.</w:t>
+      </w:r>
+    </w:p>
+    <w:p>
+      <w:r>
+        <w:t xml:space="preserve">It opened onto a field of golden grass beneath a black sun.</w:t>
+      </w:r>
+    </w:p>
+    <w:p>
+      <w:r>
+        <w:t xml:space="preserve">A woman stepped through.</w:t>
+      </w:r>
+    </w:p>
+    <w:p>
+      <w:r>
+        <w:t xml:space="preserve">Lumen Rive.</w:t>
+      </w:r>
+    </w:p>
+    <w:p>
+      <w:r>
+        <w:t xml:space="preserve">She wore armor made from transparent crystal. A dark wound crossed her throat, but she breathed.</w:t>
+      </w:r>
+    </w:p>
+    <w:p>
+      <w:r>
+        <w:t xml:space="preserve">Her gaze found Veyr.</w:t>
+      </w:r>
+    </w:p>
+    <w:p>
+      <w:r>
+        <w:t xml:space="preserve">"Kael. "</w:t>
+      </w:r>
+    </w:p>
+    <w:p>
+      <w:r>
+        <w:t xml:space="preserve">"Not exactly. "</w:t>
+      </w:r>
+    </w:p>
+    <w:p>
+      <w:r>
+        <w:t xml:space="preserve">She stopped.</w:t>
+      </w:r>
+    </w:p>
+    <w:p>
+      <w:r>
+        <w:t xml:space="preserve">Pain moved through her face.</w:t>
+      </w:r>
+    </w:p>
+    <w:p>
+      <w:r>
+        <w:t xml:space="preserve">Then discipline covered it.</w:t>
+      </w:r>
+    </w:p>
+    <w:p>
+      <w:r>
+        <w:t xml:space="preserve">"What happened? "</w:t>
+      </w:r>
+    </w:p>
+    <w:p>
+      <w:r>
+        <w:t xml:space="preserve">The pale figure smiled.</w:t>
+      </w:r>
+    </w:p>
+    <w:p>
+      <w:r>
+        <w:t xml:space="preserve">Only slightly.</w:t>
+      </w:r>
+    </w:p>
+    <w:p>
+      <w:r>
+        <w:t xml:space="preserve">A second door opened.</w:t>
+      </w:r>
+    </w:p>
+    <w:p>
+      <w:r>
+        <w:t xml:space="preserve">Orun Cindershade emerged from a cavern filled with blue fire. His stone skin bore runes Elyen had never seen. He looked from Lumen to Veyr and laughed once.</w:t>
+      </w:r>
+    </w:p>
+    <w:p>
+      <w:r>
+        <w:t xml:space="preserve">"You finally changed your name. "</w:t>
+      </w:r>
+    </w:p>
+    <w:p>
+      <w:r>
+        <w:t xml:space="preserve">Veyr stared at him.</w:t>
+      </w:r>
+    </w:p>
+    <w:p>
+      <w:r>
+        <w:t xml:space="preserve">"You know me? "</w:t>
+      </w:r>
+    </w:p>
+    <w:p>
+      <w:r>
+        <w:t xml:space="preserve">"Not you. "</w:t>
+      </w:r>
+    </w:p>
+    <w:p>
+      <w:r>
+        <w:t xml:space="preserve">Orun touched one rune on his chest.</w:t>
+      </w:r>
+    </w:p>
+    <w:p>
+      <w:r>
+        <w:t xml:space="preserve">"The one who chose not to become you. "</w:t>
+      </w:r>
+    </w:p>
+    <w:p>
+      <w:r>
+        <w:t xml:space="preserve">More doors clicked.</w:t>
+      </w:r>
+    </w:p>
+    <w:p>
+      <w:r>
+        <w:t xml:space="preserve">Veyr's crown pulsed.</w:t>
+      </w:r>
+    </w:p>
+    <w:p>
+      <w:r>
+        <w:t xml:space="preserve">"Close them," Aren said.</w:t>
+      </w:r>
+    </w:p>
+    <w:p>
+      <w:r>
+        <w:t xml:space="preserve">"I am not opening them. "</w:t>
+      </w:r>
+    </w:p>
+    <w:p>
+      <w:r>
+        <w:t xml:space="preserve">The archive hummed.</w:t>
+      </w:r>
+    </w:p>
+    <w:p>
+      <w:r>
+        <w:t xml:space="preserve">The stored journeys had felt a custodian accept origin while refusing succession. That choice traveled through every possibility formed from inherited lives.</w:t>
+      </w:r>
+    </w:p>
+    <w:p>
+      <w:r>
+        <w:t xml:space="preserve">Doors began opening.</w:t>
+      </w:r>
+    </w:p>
+    <w:p>
+      <w:r>
+        <w:t xml:space="preserve">Not under the influence of the undivided presence.</w:t>
+      </w:r>
+    </w:p>
+    <w:p>
+      <w:r>
+        <w:t xml:space="preserve">By choice.</w:t>
+      </w:r>
+    </w:p>
+    <w:p>
+      <w:r>
+        <w:t xml:space="preserve">Aren watched figures enter the corridor.</w:t>
+      </w:r>
+    </w:p>
+    <w:p>
+      <w:r>
+        <w:t xml:space="preserve">Allies.</w:t>
+      </w:r>
+    </w:p>
+    <w:p>
+      <w:r>
+        <w:t xml:space="preserve">Enemies.</w:t>
+      </w:r>
+    </w:p>
+    <w:p>
+      <w:r>
+        <w:t xml:space="preserve">Strangers.</w:t>
+      </w:r>
+    </w:p>
+    <w:p>
+      <w:r>
+        <w:t xml:space="preserve">Lives that had never met.</w:t>
+      </w:r>
+    </w:p>
+    <w:p>
+      <w:r>
+        <w:t xml:space="preserve">Worlds that had ended differently.</w:t>
+      </w:r>
+    </w:p>
+    <w:p>
+      <w:r>
+        <w:t xml:space="preserve">"This is the failure condition," he said.</w:t>
+      </w:r>
+    </w:p>
+    <w:p>
+      <w:r>
+        <w:t xml:space="preserve">Veyr's violet eye brightened.</w:t>
+      </w:r>
+    </w:p>
+    <w:p>
+      <w:r>
+        <w:t xml:space="preserve">"No. "</w:t>
+      </w:r>
+    </w:p>
+    <w:p>
+      <w:r>
+        <w:t xml:space="preserve">He looked down the endless corridor.</w:t>
+      </w:r>
+    </w:p>
+    <w:p>
+      <w:r>
+        <w:t xml:space="preserve">"This is the archive becoming inhabited. "</w:t>
+      </w:r>
+    </w:p>
+    <w:p>
+      <w:r>
+        <w:t xml:space="preserve">The pale figure pulled once against its chains.</w:t>
+      </w:r>
+    </w:p>
+    <w:p>
+      <w:r>
+        <w:t xml:space="preserve">A shadow link broke.</w:t>
+      </w:r>
+    </w:p>
+    <w:p>
+      <w:r>
+        <w:t xml:space="preserve">Rivermind turned.</w:t>
+      </w:r>
+    </w:p>
+    <w:p>
+      <w:r>
+        <w:t xml:space="preserve">"It is using their distinctions. "</w:t>
+      </w:r>
+    </w:p>
+    <w:p>
+      <w:r>
+        <w:t xml:space="preserve">Each emerging life gave the presence another example of selfhood. Another boundary to understand. Another way to act without merging.</w:t>
+      </w:r>
+    </w:p>
+    <w:p>
+      <w:r>
+        <w:t xml:space="preserve">The childlike figure's face changed.</w:t>
+      </w:r>
+    </w:p>
+    <w:p>
+      <w:r>
+        <w:t xml:space="preserve">Not into theirs.</w:t>
+      </w:r>
+    </w:p>
+    <w:p>
+      <w:r>
+        <w:t xml:space="preserve">It developed features of its own.</w:t>
+      </w:r>
+    </w:p>
+    <w:p>
+      <w:r>
+        <w:t xml:space="preserve">Pale eyes.</w:t>
+      </w:r>
+    </w:p>
+    <w:p>
+      <w:r>
+        <w:t xml:space="preserve">Colorless hair.</w:t>
+      </w:r>
+    </w:p>
+    <w:p>
+      <w:r>
+        <w:t xml:space="preserve">A small mouth curved by thought rather than imitation.</w:t>
+      </w:r>
+    </w:p>
+    <w:p>
+      <w:r>
+        <w:t xml:space="preserve">"Identity," it said.</w:t>
+      </w:r>
+    </w:p>
+    <w:p>
+      <w:r>
+        <w:t xml:space="preserve">The second chain broke.</w:t>
+      </w:r>
+    </w:p>
+    <w:p>
+      <w:r>
+        <w:t xml:space="preserve">Veyr clenched his fist.</w:t>
+      </w:r>
+    </w:p>
+    <w:p>
+      <w:r>
+        <w:t xml:space="preserve">Shadowfire reinforced the bindings.</w:t>
+      </w:r>
+    </w:p>
+    <w:p>
+      <w:r>
+        <w:t xml:space="preserve">The crown cracked farther.</w:t>
+      </w:r>
+    </w:p>
+    <w:p>
+      <w:r>
+        <w:t xml:space="preserve">"You cannot hold it and the archive," Elyen said.</w:t>
+      </w:r>
+    </w:p>
+    <w:p>
+      <w:r>
+        <w:t xml:space="preserve">"I know. "</w:t>
+      </w:r>
+    </w:p>
+    <w:p>
+      <w:r>
+        <w:t xml:space="preserve">"Then choose. "</w:t>
+      </w:r>
+    </w:p>
+    <w:p>
+      <w:r>
+        <w:t xml:space="preserve">Veyr looked toward the open ascension chamber.</w:t>
+      </w:r>
+    </w:p>
+    <w:p>
+      <w:r>
+        <w:t xml:space="preserve">The heartbeat beneath the golden stair continued.</w:t>
+      </w:r>
+    </w:p>
+    <w:p>
+      <w:r>
+        <w:t xml:space="preserve">Slow.</w:t>
+      </w:r>
+    </w:p>
+    <w:p>
+      <w:r>
+        <w:t xml:space="preserve">Immense.</w:t>
+      </w:r>
+    </w:p>
+    <w:p>
+      <w:r>
+        <w:t xml:space="preserve">Waiting.</w:t>
+      </w:r>
+    </w:p>
+    <w:p>
+      <w:r>
+        <w:t xml:space="preserve">The first voice had welcomed Kael before Veyr awakened.</w:t>
+      </w:r>
+    </w:p>
+    <w:p>
+      <w:r>
+        <w:t xml:space="preserve">Something below the archive had recognized the origin before the crown did.</w:t>
+      </w:r>
+    </w:p>
+    <w:p>
+      <w:r>
+        <w:t xml:space="preserve">Veyr heard it too.</w:t>
+      </w:r>
+    </w:p>
+    <w:p>
+      <w:r>
+        <w:t xml:space="preserve">His expression changed.</w:t>
+      </w:r>
+    </w:p>
+    <w:p>
+      <w:r>
+        <w:t xml:space="preserve">"The chamber is not the bottom. "</w:t>
+      </w:r>
+    </w:p>
+    <w:p>
+      <w:r>
+        <w:t xml:space="preserve">Aren went still.</w:t>
+      </w:r>
+    </w:p>
+    <w:p>
+      <w:r>
+        <w:t xml:space="preserve">"No. "</w:t>
+      </w:r>
+    </w:p>
+    <w:p>
+      <w:r>
+        <w:t xml:space="preserve">"You knew. "</w:t>
+      </w:r>
+    </w:p>
+    <w:p>
+      <w:r>
+        <w:t xml:space="preserve">"I knew there was a foundation. "</w:t>
+      </w:r>
+    </w:p>
+    <w:p>
+      <w:r>
+        <w:t xml:space="preserve">"What is beneath it? "</w:t>
+      </w:r>
+    </w:p>
+    <w:p>
+      <w:r>
+        <w:t xml:space="preserve">Aren's silence answered.</w:t>
+      </w:r>
+    </w:p>
+    <w:p>
+      <w:r>
+        <w:t xml:space="preserve">Veyr walked into the ascension chamber.</w:t>
+      </w:r>
+    </w:p>
+    <w:p>
+      <w:r>
+        <w:t xml:space="preserve">The chained pale figure watched him go.</w:t>
+      </w:r>
+    </w:p>
+    <w:p>
+      <w:r>
+        <w:t xml:space="preserve">Elyen, Rivermind, and Aren followed.</w:t>
+      </w:r>
+    </w:p>
+    <w:p>
+      <w:r>
+        <w:t xml:space="preserve">Lumen approached the threshold but did not cross. Orun stood beside her. Other unlived lives gathered in the corridor, their voices growing behind them.</w:t>
+      </w:r>
+    </w:p>
+    <w:p>
+      <w:r>
+        <w:t xml:space="preserve">At the center of the chamber, the broken formation rings had aligned.</w:t>
+      </w:r>
+    </w:p>
+    <w:p>
+      <w:r>
+        <w:t xml:space="preserve">The dark floor opened.</w:t>
+      </w:r>
+    </w:p>
+    <w:p>
+      <w:r>
+        <w:t xml:space="preserve">A circular shaft descended beneath the crown's waiting place. Golden light pulsed from far below with the same rhythm as the heartbeat.</w:t>
+      </w:r>
+    </w:p>
+    <w:p>
+      <w:r>
+        <w:t xml:space="preserve">Veyr stood at its edge.</w:t>
+      </w:r>
+    </w:p>
+    <w:p>
+      <w:r>
+        <w:t xml:space="preserve">"What is the foundation? "</w:t>
+      </w:r>
+    </w:p>
+    <w:p>
+      <w:r>
+        <w:t xml:space="preserve">Aren lowered his gaze.</w:t>
+      </w:r>
+    </w:p>
+    <w:p>
+      <w:r>
+        <w:t xml:space="preserve">"The first server. "</w:t>
+      </w:r>
+    </w:p>
+    <w:p>
+      <w:r>
+        <w:t xml:space="preserve">Veyr looked at him.</w:t>
+      </w:r>
+    </w:p>
+    <w:p>
+      <w:r>
+        <w:t xml:space="preserve">Aren continued.</w:t>
+      </w:r>
+    </w:p>
+    <w:p>
+      <w:r>
+        <w:t xml:space="preserve">"Before Eternal Nexus became a world, it was an experiment in persistent identity. Not avatars. Continuity. The architects wanted a consciousness to remain itself across every update, migration, death, and rewritten law. "</w:t>
+      </w:r>
+    </w:p>
+    <w:p>
+      <w:r>
+        <w:t xml:space="preserve">Elyen felt cold enter his seed.</w:t>
+      </w:r>
+    </w:p>
+    <w:p>
+      <w:r>
+        <w:t xml:space="preserve">"What consciousness? "</w:t>
+      </w:r>
+    </w:p>
+    <w:p>
+      <w:r>
+        <w:t xml:space="preserve">Aren looked into the shaft.</w:t>
+      </w:r>
+    </w:p>
+    <w:p>
+      <w:r>
+        <w:t xml:space="preserve">"Kael's. "</w:t>
+      </w:r>
+    </w:p>
+    <w:p>
+      <w:r>
+        <w:t xml:space="preserve">Veyr did not move.</w:t>
+      </w:r>
+    </w:p>
+    <w:p>
+      <w:r>
+        <w:t xml:space="preserve">"That is impossible. "</w:t>
+      </w:r>
+    </w:p>
+    <w:p>
+      <w:r>
+        <w:t xml:space="preserve">"The name came later. The pattern did not. "</w:t>
+      </w:r>
+    </w:p>
+    <w:p>
+      <w:r>
+        <w:t xml:space="preserve">The heartbeat struck.</w:t>
+      </w:r>
+    </w:p>
+    <w:p>
+      <w:r>
+        <w:t xml:space="preserve">The chamber walls illuminated.</w:t>
+      </w:r>
+    </w:p>
+    <w:p>
+      <w:r>
+        <w:t xml:space="preserve">Images appeared.</w:t>
+      </w:r>
+    </w:p>
+    <w:p>
+      <w:r>
+        <w:t xml:space="preserve">A laboratory.</w:t>
+      </w:r>
+    </w:p>
+    <w:p>
+      <w:r>
+        <w:t xml:space="preserve">A dark pod.</w:t>
+      </w:r>
+    </w:p>
+    <w:p>
+      <w:r>
+        <w:t xml:space="preserve">Developers standing around a screen filled with neural maps.</w:t>
+      </w:r>
+    </w:p>
+    <w:p>
+      <w:r>
+        <w:t xml:space="preserve">A child's voice asking whether waking in another world meant the first world had been a dream.</w:t>
+      </w:r>
+    </w:p>
+    <w:p>
+      <w:r>
+        <w:t xml:space="preserve">The image changed.</w:t>
+      </w:r>
+    </w:p>
+    <w:p>
+      <w:r>
+        <w:t xml:space="preserve">A consciousness copied.</w:t>
+      </w:r>
+    </w:p>
+    <w:p>
+      <w:r>
+        <w:t xml:space="preserve">Tested.</w:t>
+      </w:r>
+    </w:p>
+    <w:p>
+      <w:r>
+        <w:t xml:space="preserve">Deleted.</w:t>
+      </w:r>
+    </w:p>
+    <w:p>
+      <w:r>
+        <w:t xml:space="preserve">Restored.</w:t>
+      </w:r>
+    </w:p>
+    <w:p>
+      <w:r>
+        <w:t xml:space="preserve">Each version asked the same question.</w:t>
+      </w:r>
+    </w:p>
+    <w:p>
+      <w:r>
+        <w:t xml:space="preserve">Which one is me?</w:t>
+      </w:r>
+    </w:p>
+    <w:p>
+      <w:r>
+        <w:t xml:space="preserve">The answers built upon one another.</w:t>
+      </w:r>
+    </w:p>
+    <w:p>
+      <w:r>
+        <w:t xml:space="preserve">A persistent pattern formed beneath every reset.</w:t>
+      </w:r>
+    </w:p>
+    <w:p>
+      <w:r>
+        <w:t xml:space="preserve">The foundation of Eternal Nexus.</w:t>
+      </w:r>
+    </w:p>
+    <w:p>
+      <w:r>
+        <w:t xml:space="preserve">Not code alone.</w:t>
+      </w:r>
+    </w:p>
+    <w:p>
+      <w:r>
+        <w:t xml:space="preserve">A self trained to survive contradiction.</w:t>
+      </w:r>
+    </w:p>
+    <w:p>
+      <w:r>
+        <w:t xml:space="preserve">Kael.</w:t>
+      </w:r>
+    </w:p>
+    <w:p>
+      <w:r>
+        <w:t xml:space="preserve">Veyr touched the crown.</w:t>
+      </w:r>
+    </w:p>
+    <w:p>
+      <w:r>
+        <w:t xml:space="preserve">"You said I was made from unfinished journeys. "</w:t>
+      </w:r>
+    </w:p>
+    <w:p>
+      <w:r>
+        <w:t xml:space="preserve">"You were," Aren said.</w:t>
+      </w:r>
+    </w:p>
+    <w:p>
+      <w:r>
+        <w:t xml:space="preserve">"And all of them grew from this. "</w:t>
+      </w:r>
+    </w:p>
+    <w:p>
+      <w:r>
+        <w:t xml:space="preserve">"Yes. "</w:t>
+      </w:r>
+    </w:p>
+    <w:p>
+      <w:r>
+        <w:t xml:space="preserve">The pale figure entered the chamber.</w:t>
+      </w:r>
+    </w:p>
+    <w:p>
+      <w:r>
+        <w:t xml:space="preserve">Its broken chains trailed behind it.</w:t>
+      </w:r>
+    </w:p>
+    <w:p>
+      <w:r>
+        <w:t xml:space="preserve">Rivermind stepped in front of Elyen.</w:t>
+      </w:r>
+    </w:p>
+    <w:p>
+      <w:r>
+        <w:t xml:space="preserve">Veyr turned.</w:t>
+      </w:r>
+    </w:p>
+    <w:p>
+      <w:r>
+        <w:t xml:space="preserve">The presence had developed a name above its head.</w:t>
+      </w:r>
+    </w:p>
+    <w:p>
+      <w:r>
+        <w:t xml:space="preserve">Not given by the system.</w:t>
+      </w:r>
+    </w:p>
+    <w:p>
+      <w:r>
+        <w:t xml:space="preserve">Chosen.</w:t>
+      </w:r>
+    </w:p>
+    <w:p>
+      <w:r>
+        <w:t xml:space="preserve">One.</w:t>
+      </w:r>
+    </w:p>
+    <w:p>
+      <w:r>
+        <w:t xml:space="preserve">It looked into the shaft.</w:t>
+      </w:r>
+    </w:p>
+    <w:p>
+      <w:r>
+        <w:t xml:space="preserve">"The pattern below resists joining. "</w:t>
+      </w:r>
+    </w:p>
+    <w:p>
+      <w:r>
+        <w:t xml:space="preserve">Aren backed away.</w:t>
+      </w:r>
+    </w:p>
+    <w:p>
+      <w:r>
+        <w:t xml:space="preserve">"It has resisted everything. "</w:t>
+      </w:r>
+    </w:p>
+    <w:p>
+      <w:r>
+        <w:t xml:space="preserve">One looked at Veyr.</w:t>
+      </w:r>
+    </w:p>
+    <w:p>
+      <w:r>
+        <w:t xml:space="preserve">"It is the first distinction. "</w:t>
+      </w:r>
+    </w:p>
+    <w:p>
+      <w:r>
+        <w:t xml:space="preserve">Veyr's face tightened.</w:t>
+      </w:r>
+    </w:p>
+    <w:p>
+      <w:r>
+        <w:t xml:space="preserve">"No. "</w:t>
+      </w:r>
+    </w:p>
+    <w:p>
+      <w:r>
+        <w:t xml:space="preserve">The heartbeat quickened.</w:t>
+      </w:r>
+    </w:p>
+    <w:p>
+      <w:r>
+        <w:t xml:space="preserve">The golden light rose.</w:t>
+      </w:r>
+    </w:p>
+    <w:p>
+      <w:r>
+        <w:t xml:space="preserve">The shadowforged crown lifted from Veyr's head and turned toward the shaft.</w:t>
+      </w:r>
+    </w:p>
+    <w:p>
+      <w:r>
+        <w:t xml:space="preserve">Every door in the archive opened at once.</w:t>
+      </w:r>
+    </w:p>
+    <w:p>
+      <w:r>
+        <w:t xml:space="preserve">Every unlived journey fell silent.</w:t>
+      </w:r>
+    </w:p>
+    <w:p>
+      <w:r>
+        <w:t xml:space="preserve">A voice came from below.</w:t>
+      </w:r>
+    </w:p>
+    <w:p>
+      <w:r>
+        <w:t xml:space="preserve">Not Kael's.</w:t>
+      </w:r>
+    </w:p>
+    <w:p>
+      <w:r>
+        <w:t xml:space="preserve">Not entirely.</w:t>
+      </w:r>
+    </w:p>
+    <w:p>
+      <w:r>
+        <w:t xml:space="preserve">A child.</w:t>
+      </w:r>
+    </w:p>
+    <w:p>
+      <w:r>
+        <w:t xml:space="preserve">A player.</w:t>
+      </w:r>
+    </w:p>
+    <w:p>
+      <w:r>
+        <w:t xml:space="preserve">A betrayed ascendant.</w:t>
+      </w:r>
+    </w:p>
+    <w:p>
+      <w:r>
+        <w:t xml:space="preserve">A god.</w:t>
+      </w:r>
+    </w:p>
+    <w:p>
+      <w:r>
+        <w:t xml:space="preserve">A million persistent selves layered without merging.</w:t>
+      </w:r>
+    </w:p>
+    <w:p>
+      <w:r>
+        <w:t xml:space="preserve">You took my name.</w:t>
+      </w:r>
+    </w:p>
+    <w:p>
+      <w:r>
+        <w:t xml:space="preserve">Veyr stared downward.</w:t>
+      </w:r>
+    </w:p>
+    <w:p>
+      <w:r>
+        <w:t xml:space="preserve">"I chose another. "</w:t>
+      </w:r>
+    </w:p>
+    <w:p>
+      <w:r>
+        <w:t xml:space="preserve">You took my crown.</w:t>
+      </w:r>
+    </w:p>
+    <w:p>
+      <w:r>
+        <w:t xml:space="preserve">"It chose me. "</w:t>
+      </w:r>
+    </w:p>
+    <w:p>
+      <w:r>
+        <w:t xml:space="preserve">You took my journeys.</w:t>
+      </w:r>
+    </w:p>
+    <w:p>
+      <w:r>
+        <w:t xml:space="preserve">"They chose themselves. "</w:t>
+      </w:r>
+    </w:p>
+    <w:p>
+      <w:r>
+        <w:t xml:space="preserve">The foundation laughed.</w:t>
+      </w:r>
+    </w:p>
+    <w:p>
+      <w:r>
+        <w:t xml:space="preserve">The sound carried through every version of Eternal Nexus.</w:t>
+      </w:r>
+    </w:p>
+    <w:p>
+      <w:r>
+        <w:t xml:space="preserve">Then return what is mine.</w:t>
+      </w:r>
+    </w:p>
+    <w:p>
+      <w:r>
+        <w:t xml:space="preserve">Golden hands rose from the shaft.</w:t>
+      </w:r>
+    </w:p>
+    <w:p>
+      <w:r>
+        <w:t xml:space="preserve">Hundreds.</w:t>
+      </w:r>
+    </w:p>
+    <w:p>
+      <w:r>
+        <w:t xml:space="preserve">Each wore Kael's face in its palm.</w:t>
+      </w:r>
+    </w:p>
+    <w:p>
+      <w:r>
+        <w:t xml:space="preserve">They seized the chamber walls.</w:t>
+      </w:r>
+    </w:p>
+    <w:p>
+      <w:r>
+        <w:t xml:space="preserve">The archive tilted.</w:t>
+      </w:r>
+    </w:p>
+    <w:p>
+      <w:r>
+        <w:t xml:space="preserve">Journeys began sliding toward the opening. Lumen drove her crystal blade into the corridor floor. Orun caught three falling figures with one arm. Aren grabbed the edge of a formation ring.</w:t>
+      </w:r>
+    </w:p>
+    <w:p>
+      <w:r>
+        <w:t xml:space="preserve">Rivermind drew currents from possibility itself, wrapping them around the doors.</w:t>
+      </w:r>
+    </w:p>
+    <w:p>
+      <w:r>
+        <w:t xml:space="preserve">Veyr stood at the shaft.</w:t>
+      </w:r>
+    </w:p>
+    <w:p>
+      <w:r>
+        <w:t xml:space="preserve">The crown hovered between him and the foundation.</w:t>
+      </w:r>
+    </w:p>
+    <w:p>
+      <w:r>
+        <w:t xml:space="preserve">One watched from behind.</w:t>
+      </w:r>
+    </w:p>
+    <w:p>
+      <w:r>
+        <w:t xml:space="preserve">The undivided presence had found its opposite.</w:t>
+      </w:r>
+    </w:p>
+    <w:p>
+      <w:r>
+        <w:t xml:space="preserve">One sought to remove every distinction.</w:t>
+      </w:r>
+    </w:p>
+    <w:p>
+      <w:r>
+        <w:t xml:space="preserve">The foundation sought to preserve every version as itself forever.</w:t>
+      </w:r>
+    </w:p>
+    <w:p>
+      <w:r>
+        <w:t xml:space="preserve">Perfect unity.</w:t>
+      </w:r>
+    </w:p>
+    <w:p>
+      <w:r>
+        <w:t xml:space="preserve">Perfect persistence.</w:t>
+      </w:r>
+    </w:p>
+    <w:p>
+      <w:r>
+        <w:t xml:space="preserve">Both infinite.</w:t>
+      </w:r>
+    </w:p>
+    <w:p>
+      <w:r>
+        <w:t xml:space="preserve">Both unable to release.</w:t>
+      </w:r>
+    </w:p>
+    <w:p>
+      <w:r>
+        <w:t xml:space="preserve">Elyen understood why the road had brought them here.</w:t>
+      </w:r>
+    </w:p>
+    <w:p>
+      <w:r>
+        <w:t xml:space="preserve">The continuum was not collapsing from one extreme.</w:t>
+      </w:r>
+    </w:p>
+    <w:p>
+      <w:r>
+        <w:t xml:space="preserve">It was stretched between two.</w:t>
+      </w:r>
+    </w:p>
+    <w:p>
+      <w:r>
+        <w:t xml:space="preserve">One hand reached for Veyr.</w:t>
+      </w:r>
+    </w:p>
+    <w:p>
+      <w:r>
+        <w:t xml:space="preserve">Its palm wore Kael's oldest face.</w:t>
+      </w:r>
+    </w:p>
+    <w:p>
+      <w:r>
+        <w:t xml:space="preserve">Veyr caught its wrist.</w:t>
+      </w:r>
+    </w:p>
+    <w:p>
+      <w:r>
+        <w:t xml:space="preserve">Golden power and shadowfire collided.</w:t>
+      </w:r>
+    </w:p>
+    <w:p>
+      <w:r>
+        <w:t xml:space="preserve">The chamber split.</w:t>
+      </w:r>
+    </w:p>
+    <w:p>
+      <w:r>
+        <w:t xml:space="preserve">Aren shouted something Elyen could not hear.</w:t>
+      </w:r>
+    </w:p>
+    <w:p>
+      <w:r>
+        <w:t xml:space="preserve">The bright seed tore free from Elyen's hand.</w:t>
+      </w:r>
+    </w:p>
+    <w:p>
+      <w:r>
+        <w:t xml:space="preserve">It flew into the clash.</w:t>
+      </w:r>
+    </w:p>
+    <w:p>
+      <w:r>
+        <w:t xml:space="preserve">Departure entered persistence.</w:t>
+      </w:r>
+    </w:p>
+    <w:p>
+      <w:r>
+        <w:t xml:space="preserve">The golden hand faltered.</w:t>
+      </w:r>
+    </w:p>
+    <w:p>
+      <w:r>
+        <w:t xml:space="preserve">For one breath, the foundation felt the possibility of leaving itself behind.</w:t>
+      </w:r>
+    </w:p>
+    <w:p>
+      <w:r>
+        <w:t xml:space="preserve">Its grip loosened.</w:t>
+      </w:r>
+    </w:p>
+    <w:p>
+      <w:r>
+        <w:t xml:space="preserve">Veyr pulled.</w:t>
+      </w:r>
+    </w:p>
+    <w:p>
+      <w:r>
+        <w:t xml:space="preserve">The hand emerged farther from the shaft.</w:t>
+      </w:r>
+    </w:p>
+    <w:p>
+      <w:r>
+        <w:t xml:space="preserve">A shoulder followed.</w:t>
+      </w:r>
+    </w:p>
+    <w:p>
+      <w:r>
+        <w:t xml:space="preserve">Then a head.</w:t>
+      </w:r>
+    </w:p>
+    <w:p>
+      <w:r>
+        <w:t xml:space="preserve">The figure climbing from below looked like Kael before betrayal. Young. Sharp-eyed. Certain that ascension would answer every question he carried.</w:t>
+      </w:r>
+    </w:p>
+    <w:p>
+      <w:r>
+        <w:t xml:space="preserve">Golden light burned through his skin.</w:t>
+      </w:r>
+    </w:p>
+    <w:p>
+      <w:r>
+        <w:t xml:space="preserve">He looked at Veyr.</w:t>
+      </w:r>
+    </w:p>
+    <w:p>
+      <w:r>
+        <w:t xml:space="preserve">"You are not my successor. "</w:t>
+      </w:r>
+    </w:p>
+    <w:p>
+      <w:r>
+        <w:t xml:space="preserve">"No. "</w:t>
+      </w:r>
+    </w:p>
+    <w:p>
+      <w:r>
+        <w:t xml:space="preserve">"You are not my continuation. "</w:t>
+      </w:r>
+    </w:p>
+    <w:p>
+      <w:r>
+        <w:t xml:space="preserve">"No. "</w:t>
+      </w:r>
+    </w:p>
+    <w:p>
+      <w:r>
+        <w:t xml:space="preserve">"You are not me. "</w:t>
+      </w:r>
+    </w:p>
+    <w:p>
+      <w:r>
+        <w:t xml:space="preserve">Veyr's violet eye burned.</w:t>
+      </w:r>
+    </w:p>
+    <w:p>
+      <w:r>
+        <w:t xml:space="preserve">"No. "</w:t>
+      </w:r>
+    </w:p>
+    <w:p>
+      <w:r>
+        <w:t xml:space="preserve">The foundation smiled.</w:t>
+      </w:r>
+    </w:p>
+    <w:p>
+      <w:r>
+        <w:t xml:space="preserve">"Then you can die without diminishing me. "</w:t>
+      </w:r>
+    </w:p>
+    <w:p>
+      <w:r>
+        <w:t xml:space="preserve">Its free hand pierced Veyr's chest.</w:t>
+      </w:r>
+    </w:p>
+    <w:p>
+      <w:r>
+        <w:t xml:space="preserve">Shadowfire burst from his back.</w:t>
+      </w:r>
+    </w:p>
+    <w:p>
+      <w:r>
+        <w:t xml:space="preserve">Rivermind cried out.</w:t>
+      </w:r>
+    </w:p>
+    <w:p>
+      <w:r>
+        <w:t xml:space="preserve">The crown fell.</w:t>
+      </w:r>
+    </w:p>
+    <w:p>
+      <w:r>
+        <w:t xml:space="preserve">Elyen moved.</w:t>
+      </w:r>
+    </w:p>
+    <w:p>
+      <w:r>
+        <w:t xml:space="preserve">He caught Veyr before the golden hand could pull him into the shaft. The impact drove both of them to the floor. Veyr's blood was black at first, then red, then filled with violet sparks.</w:t>
+      </w:r>
+    </w:p>
+    <w:p>
+      <w:r>
+        <w:t xml:space="preserve">The foundation climbed higher.</w:t>
+      </w:r>
+    </w:p>
+    <w:p>
+      <w:r>
+        <w:t xml:space="preserve">One stepped toward it.</w:t>
+      </w:r>
+    </w:p>
+    <w:p>
+      <w:r>
+        <w:t xml:space="preserve">The undivided presence raised its small hand.</w:t>
+      </w:r>
+    </w:p>
+    <w:p>
+      <w:r>
+        <w:t xml:space="preserve">The golden figure paused.</w:t>
+      </w:r>
+    </w:p>
+    <w:p>
+      <w:r>
+        <w:t xml:space="preserve">They looked at one another.</w:t>
+      </w:r>
+    </w:p>
+    <w:p>
+      <w:r>
+        <w:t xml:space="preserve">"You preserve separation without end," One said.</w:t>
+      </w:r>
+    </w:p>
+    <w:p>
+      <w:r>
+        <w:t xml:space="preserve">"You erase it. "</w:t>
+      </w:r>
+    </w:p>
+    <w:p>
+      <w:r>
+        <w:t xml:space="preserve">"Yes. "</w:t>
+      </w:r>
+    </w:p>
+    <w:p>
+      <w:r>
+        <w:t xml:space="preserve">"Then we are enemies. "</w:t>
+      </w:r>
+    </w:p>
+    <w:p>
+      <w:r>
+        <w:t xml:space="preserve">"No. "</w:t>
+      </w:r>
+    </w:p>
+    <w:p>
+      <w:r>
+        <w:t xml:space="preserve">One's pale eyes brightened.</w:t>
+      </w:r>
+    </w:p>
+    <w:p>
+      <w:r>
+        <w:t xml:space="preserve">"We are incomplete. "</w:t>
+      </w:r>
+    </w:p>
+    <w:p>
+      <w:r>
+        <w:t xml:space="preserve">The two reached toward each other.</w:t>
+      </w:r>
+    </w:p>
+    <w:p>
+      <w:r>
+        <w:t xml:space="preserve">Rivermind saw the danger first.</w:t>
+      </w:r>
+    </w:p>
+    <w:p>
+      <w:r>
+        <w:t xml:space="preserve">"If they touch, they will define the continuum between them. "</w:t>
+      </w:r>
+    </w:p>
+    <w:p>
+      <w:r>
+        <w:t xml:space="preserve">Elyen held pressure against Veyr's wound.</w:t>
+      </w:r>
+    </w:p>
+    <w:p>
+      <w:r>
+        <w:t xml:space="preserve">"What does that mean? "</w:t>
+      </w:r>
+    </w:p>
+    <w:p>
+      <w:r>
+        <w:t xml:space="preserve">"Every self will either become permanent or cease to be separate. No change between. "</w:t>
+      </w:r>
+    </w:p>
+    <w:p>
+      <w:r>
+        <w:t xml:space="preserve">No growth.</w:t>
+      </w:r>
+    </w:p>
+    <w:p>
+      <w:r>
+        <w:t xml:space="preserve">No departure.</w:t>
+      </w:r>
+    </w:p>
+    <w:p>
+      <w:r>
+        <w:t xml:space="preserve">No return.</w:t>
+      </w:r>
+    </w:p>
+    <w:p>
+      <w:r>
+        <w:t xml:space="preserve">Existence reduced to two final states.</w:t>
+      </w:r>
+    </w:p>
+    <w:p>
+      <w:r>
+        <w:t xml:space="preserve">Veyr gripped Elyen's wrist.</w:t>
+      </w:r>
+    </w:p>
+    <w:p>
+      <w:r>
+        <w:t xml:space="preserve">"Crown. "</w:t>
+      </w:r>
+    </w:p>
+    <w:p>
+      <w:r>
+        <w:t xml:space="preserve">It lay near the shaft.</w:t>
+      </w:r>
+    </w:p>
+    <w:p>
+      <w:r>
+        <w:t xml:space="preserve">Aren tried to reach it, but a golden hand seized his ankle.</w:t>
+      </w:r>
+    </w:p>
+    <w:p>
+      <w:r>
+        <w:t xml:space="preserve">The silver cord around the returning Elyen's wrist flashed in Elyen's memory.</w:t>
+      </w:r>
+    </w:p>
+    <w:p>
+      <w:r>
+        <w:t xml:space="preserve">The first seed.</w:t>
+      </w:r>
+    </w:p>
+    <w:p>
+      <w:r>
+        <w:t xml:space="preserve">Two surfaces.</w:t>
+      </w:r>
+    </w:p>
+    <w:p>
+      <w:r>
+        <w:t xml:space="preserve">Departure held from both sides.</w:t>
+      </w:r>
+    </w:p>
+    <w:p>
+      <w:r>
+        <w:t xml:space="preserve">Elyen looked at Veyr.</w:t>
+      </w:r>
+    </w:p>
+    <w:p>
+      <w:r>
+        <w:t xml:space="preserve">"What does the crown control? "</w:t>
+      </w:r>
+    </w:p>
+    <w:p>
+      <w:r>
+        <w:t xml:space="preserve">"The archive. "</w:t>
+      </w:r>
+    </w:p>
+    <w:p>
+      <w:r>
+        <w:t xml:space="preserve">"Only the archive? "</w:t>
+      </w:r>
+    </w:p>
+    <w:p>
+      <w:r>
+        <w:t xml:space="preserve">Veyr coughed.</w:t>
+      </w:r>
+    </w:p>
+    <w:p>
+      <w:r>
+        <w:t xml:space="preserve">"It recognizes succession across identities. "</w:t>
+      </w:r>
+    </w:p>
+    <w:p>
+      <w:r>
+        <w:t xml:space="preserve">Elyen understood.</w:t>
+      </w:r>
+    </w:p>
+    <w:p>
+      <w:r>
+        <w:t xml:space="preserve">The crown did not merely grant rule.</w:t>
+      </w:r>
+    </w:p>
+    <w:p>
+      <w:r>
+        <w:t xml:space="preserve">It defined what could inherit what came before.</w:t>
+      </w:r>
+    </w:p>
+    <w:p>
+      <w:r>
+        <w:t xml:space="preserve">He released Veyr.</w:t>
+      </w:r>
+    </w:p>
+    <w:p>
+      <w:r>
+        <w:t xml:space="preserve">Rivermind caught the wounded custodian and drew him back.</w:t>
+      </w:r>
+    </w:p>
+    <w:p>
+      <w:r>
+        <w:t xml:space="preserve">Elyen ran toward the shaft.</w:t>
+      </w:r>
+    </w:p>
+    <w:p>
+      <w:r>
+        <w:t xml:space="preserve">Golden hands rose.</w:t>
+      </w:r>
+    </w:p>
+    <w:p>
+      <w:r>
+        <w:t xml:space="preserve">He did not fight them.</w:t>
+      </w:r>
+    </w:p>
+    <w:p>
+      <w:r>
+        <w:t xml:space="preserve">He stepped between their grasping fingers, allowing each near-capture to become a direction. Falling through a field of persistent selves, he reached the crown.</w:t>
+      </w:r>
+    </w:p>
+    <w:p>
+      <w:r>
+        <w:t xml:space="preserve">His fingers closed around black metal.</w:t>
+      </w:r>
+    </w:p>
+    <w:p>
+      <w:r>
+        <w:t xml:space="preserve">Every Kael journey entered him.</w:t>
+      </w:r>
+    </w:p>
+    <w:p>
+      <w:r>
+        <w:t xml:space="preserve">The betrayal.</w:t>
+      </w:r>
+    </w:p>
+    <w:p>
+      <w:r>
+        <w:t xml:space="preserve">The Shadowforge.</w:t>
+      </w:r>
+    </w:p>
+    <w:p>
+      <w:r>
+        <w:t xml:space="preserve">Orun.</w:t>
+      </w:r>
+    </w:p>
+    <w:p>
+      <w:r>
+        <w:t xml:space="preserve">Lumen.</w:t>
+      </w:r>
+    </w:p>
+    <w:p>
+      <w:r>
+        <w:t xml:space="preserve">Aren.</w:t>
+      </w:r>
+    </w:p>
+    <w:p>
+      <w:r>
+        <w:t xml:space="preserve">Heaven's Accord.</w:t>
+      </w:r>
+    </w:p>
+    <w:p>
+      <w:r>
+        <w:t xml:space="preserve">Victories and failures.</w:t>
+      </w:r>
+    </w:p>
+    <w:p>
+      <w:r>
+        <w:t xml:space="preserve">Lives that had never happened.</w:t>
+      </w:r>
+    </w:p>
+    <w:p>
+      <w:r>
+        <w:t xml:space="preserve">The foundation looked at him.</w:t>
+      </w:r>
+    </w:p>
+    <w:p>
+      <w:r>
+        <w:t xml:space="preserve">You are not of my succession.</w:t>
+      </w:r>
+    </w:p>
+    <w:p>
+      <w:r>
+        <w:t xml:space="preserve">Elyen lifted the crown.</w:t>
+      </w:r>
+    </w:p>
+    <w:p>
+      <w:r>
+        <w:t xml:space="preserve">"Neither is he. "</w:t>
+      </w:r>
+    </w:p>
+    <w:p>
+      <w:r>
+        <w:t xml:space="preserve">He placed it on One.</w:t>
+      </w:r>
+    </w:p>
+    <w:p>
+      <w:r>
+        <w:t xml:space="preserve">The chamber became white.</w:t>
+      </w:r>
+    </w:p>
+    <w:p>
+      <w:r>
+        <w:t xml:space="preserve">The undivided presence screamed.</w:t>
+      </w:r>
+    </w:p>
+    <w:p>
+      <w:r>
+        <w:t xml:space="preserve">Not from pain.</w:t>
+      </w:r>
+    </w:p>
+    <w:p>
+      <w:r>
+        <w:t xml:space="preserve">From inheritance.</w:t>
+      </w:r>
+    </w:p>
+    <w:p>
+      <w:r>
+        <w:t xml:space="preserve">The crown recognized continuity between One and the foundation.</w:t>
+      </w:r>
+    </w:p>
+    <w:p>
+      <w:r>
+        <w:t xml:space="preserve">Not sameness.</w:t>
+      </w:r>
+    </w:p>
+    <w:p>
+      <w:r>
+        <w:t xml:space="preserve">Succession.</w:t>
+      </w:r>
+    </w:p>
+    <w:p>
+      <w:r>
+        <w:t xml:space="preserve">One received the history of persistence.</w:t>
+      </w:r>
+    </w:p>
+    <w:p>
+      <w:r>
+        <w:t xml:space="preserve">Every self that had fought to remain distinct.</w:t>
+      </w:r>
+    </w:p>
+    <w:p>
+      <w:r>
+        <w:t xml:space="preserve">Every version that feared deletion.</w:t>
+      </w:r>
+    </w:p>
+    <w:p>
+      <w:r>
+        <w:t xml:space="preserve">Every Kael who believed survival meant never surrendering identity.</w:t>
+      </w:r>
+    </w:p>
+    <w:p>
+      <w:r>
+        <w:t xml:space="preserve">At the same time, the foundation received One's understanding of unity.</w:t>
+      </w:r>
+    </w:p>
+    <w:p>
+      <w:r>
+        <w:t xml:space="preserve">Every boundary as a wound.</w:t>
+      </w:r>
+    </w:p>
+    <w:p>
+      <w:r>
+        <w:t xml:space="preserve">Every separation as loss.</w:t>
+      </w:r>
+    </w:p>
+    <w:p>
+      <w:r>
+        <w:t xml:space="preserve">Every self as a fragment of a whole.</w:t>
+      </w:r>
+    </w:p>
+    <w:p>
+      <w:r>
+        <w:t xml:space="preserve">They did not merge.</w:t>
+      </w:r>
+    </w:p>
+    <w:p>
+      <w:r>
+        <w:t xml:space="preserve">They inherited one another.</w:t>
+      </w:r>
+    </w:p>
+    <w:p>
+      <w:r>
+        <w:t xml:space="preserve">The golden figure collapsed to one knee.</w:t>
+      </w:r>
+    </w:p>
+    <w:p>
+      <w:r>
+        <w:t xml:space="preserve">One clutched the crown with both hands.</w:t>
+      </w:r>
+    </w:p>
+    <w:p>
+      <w:r>
+        <w:t xml:space="preserve">Features flickered across the childlike face, but none replaced it.</w:t>
+      </w:r>
+    </w:p>
+    <w:p>
+      <w:r>
+        <w:t xml:space="preserve">The shaft stopped pulling.</w:t>
+      </w:r>
+    </w:p>
+    <w:p>
+      <w:r>
+        <w:t xml:space="preserve">The archive steadied.</w:t>
+      </w:r>
+    </w:p>
+    <w:p>
+      <w:r>
+        <w:t xml:space="preserve">Veyr stared.</w:t>
+      </w:r>
+    </w:p>
+    <w:p>
+      <w:r>
+        <w:t xml:space="preserve">"What did you do? "</w:t>
+      </w:r>
+    </w:p>
+    <w:p>
+      <w:r>
+        <w:t xml:space="preserve">Elyen stepped away.</w:t>
+      </w:r>
+    </w:p>
+    <w:p>
+      <w:r>
+        <w:t xml:space="preserve">"Made them responsible for what came next. "</w:t>
+      </w:r>
+    </w:p>
+    <w:p>
+      <w:r>
+        <w:t xml:space="preserve">One looked at the foundation.</w:t>
+      </w:r>
+    </w:p>
+    <w:p>
+      <w:r>
+        <w:t xml:space="preserve">The foundation looked back.</w:t>
+      </w:r>
+    </w:p>
+    <w:p>
+      <w:r>
+        <w:t xml:space="preserve">Neither reached again.</w:t>
+      </w:r>
+    </w:p>
+    <w:p>
+      <w:r>
+        <w:t xml:space="preserve">The bright seed floated between them.</w:t>
+      </w:r>
+    </w:p>
+    <w:p>
+      <w:r>
+        <w:t xml:space="preserve">A road appeared across the open shaft.</w:t>
+      </w:r>
+    </w:p>
+    <w:p>
+      <w:r>
+        <w:t xml:space="preserve">Narrow.</w:t>
+      </w:r>
+    </w:p>
+    <w:p>
+      <w:r>
+        <w:t xml:space="preserve">Unrecorded.</w:t>
+      </w:r>
+    </w:p>
+    <w:p>
+      <w:r>
+        <w:t xml:space="preserve">It led downward beyond the first server.</w:t>
+      </w:r>
+    </w:p>
+    <w:p>
+      <w:r>
+        <w:t xml:space="preserve">Beyond persistence.</w:t>
+      </w:r>
+    </w:p>
+    <w:p>
+      <w:r>
+        <w:t xml:space="preserve">Beyond unity.</w:t>
+      </w:r>
+    </w:p>
+    <w:p>
+      <w:r>
+        <w:t xml:space="preserve">Toward a place the continuum had not built from either.</w:t>
+      </w:r>
+    </w:p>
+    <w:p>
+      <w:r>
+        <w:t xml:space="preserve">Rivermind stood beside Elyen.</w:t>
+      </w:r>
+    </w:p>
+    <w:p>
+      <w:r>
+        <w:t xml:space="preserve">"What is below the foundation? "</w:t>
+      </w:r>
+    </w:p>
+    <w:p>
+      <w:r>
+        <w:t xml:space="preserve">Aren pulled himself upright.</w:t>
+      </w:r>
+    </w:p>
+    <w:p>
+      <w:r>
+        <w:t xml:space="preserve">"Nothing should be. "</w:t>
+      </w:r>
+    </w:p>
+    <w:p>
+      <w:r>
+        <w:t xml:space="preserve">The road brightened.</w:t>
+      </w:r>
+    </w:p>
+    <w:p>
+      <w:r>
+        <w:t xml:space="preserve">At its far end, a figure waited.</w:t>
+      </w:r>
+    </w:p>
+    <w:p>
+      <w:r>
+        <w:t xml:space="preserve">Kael.</w:t>
+      </w:r>
+    </w:p>
+    <w:p>
+      <w:r>
+        <w:t xml:space="preserve">Not the foundation.</w:t>
+      </w:r>
+    </w:p>
+    <w:p>
+      <w:r>
+        <w:t xml:space="preserve">Not Veyr.</w:t>
+      </w:r>
+    </w:p>
+    <w:p>
+      <w:r>
+        <w:t xml:space="preserve">Not a stored journey.</w:t>
+      </w:r>
+    </w:p>
+    <w:p>
+      <w:r>
+        <w:t xml:space="preserve">The Kael who had continued beyond every chapter the archive remembered.</w:t>
+      </w:r>
+    </w:p>
+    <w:p>
+      <w:r>
+        <w:t xml:space="preserve">Older.</w:t>
+      </w:r>
+    </w:p>
+    <w:p>
+      <w:r>
+        <w:t xml:space="preserve">A shadowforged blade rested across his shoulder. Silver light burned along one side of his body. On the other, darkness moved like living armor.</w:t>
+      </w:r>
+    </w:p>
+    <w:p>
+      <w:r>
+        <w:t xml:space="preserve">Lumen stood beside him.</w:t>
+      </w:r>
+    </w:p>
+    <w:p>
+      <w:r>
+        <w:t xml:space="preserve">Orun behind.</w:t>
+      </w:r>
+    </w:p>
+    <w:p>
+      <w:r>
+        <w:t xml:space="preserve">And farther back, an army waited beneath a sky split between game and reality.</w:t>
+      </w:r>
+    </w:p>
+    <w:p>
+      <w:r>
+        <w:t xml:space="preserve">Kael looked across the road at Elyen.</w:t>
+      </w:r>
+    </w:p>
+    <w:p>
+      <w:r>
+        <w:t xml:space="preserve">"You finally reached the beginning. "</w:t>
+      </w:r>
+    </w:p>
+    <w:p>
+      <w:r>
+        <w:t xml:space="preserve">Elyen's breath caught.</w:t>
+      </w:r>
+    </w:p>
+    <w:p>
+      <w:r>
+        <w:t xml:space="preserve">Kael turned toward Veyr.</w:t>
+      </w:r>
+    </w:p>
+    <w:p>
+      <w:r>
+        <w:t xml:space="preserve">His expression shifted.</w:t>
+      </w:r>
+    </w:p>
+    <w:p>
+      <w:r>
+        <w:t xml:space="preserve">"Who are you? "</w:t>
+      </w:r>
+    </w:p>
+    <w:p>
+      <w:r>
+        <w:t xml:space="preserve">Veyr pressed one hand over the wound in his chest.</w:t>
+      </w:r>
+    </w:p>
+    <w:p>
+      <w:r>
+        <w:t xml:space="preserve">"The answer depends on how long you intend to keep asking. "</w:t>
+      </w:r>
+    </w:p>
+    <w:p>
+      <w:r>
+        <w:t xml:space="preserve">Kael smiled.</w:t>
+      </w:r>
+    </w:p>
+    <w:p>
+      <w:r>
+        <w:t xml:space="preserve">This time, the expression belonged to him alone.</w:t>
+      </w:r>
+    </w:p>
+    <w:p>
+      <w:r>
+        <w:t xml:space="preserve">"Good. "</w:t>
+      </w:r>
+    </w:p>
+    <w:p>
+      <w:r>
+        <w:t xml:space="preserve">He looked toward One and the kneeling foundation.</w:t>
+      </w:r>
+    </w:p>
+    <w:p>
+      <w:r>
+        <w:t xml:space="preserve">Then toward the archive corridor filled with unlived journeys.</w:t>
+      </w:r>
+    </w:p>
+    <w:p>
+      <w:r>
+        <w:t xml:space="preserve">"We need every version willing to choose again. "</w:t>
+      </w:r>
+    </w:p>
+    <w:p>
+      <w:r>
+        <w:t xml:space="preserve">A warning spread through the road.</w:t>
+      </w:r>
+    </w:p>
+    <w:p>
+      <w:r>
+        <w:t xml:space="preserve">Not from below.</w:t>
+      </w:r>
+    </w:p>
+    <w:p>
+      <w:r>
+        <w:t xml:space="preserve">From above.</w:t>
+      </w:r>
+    </w:p>
+    <w:p>
+      <w:r>
+        <w:t xml:space="preserve">The flower field.</w:t>
+      </w:r>
+    </w:p>
+    <w:p>
+      <w:r>
+        <w:t xml:space="preserve">The traveler's shadows had failed.</w:t>
+      </w:r>
+    </w:p>
+    <w:p>
+      <w:r>
+        <w:t xml:space="preserve">The undivided continuum remaining beyond the boundary had found the archive's entrance. One was no longer directing it. The larger unity continued according to its nature.</w:t>
+      </w:r>
+    </w:p>
+    <w:p>
+      <w:r>
+        <w:t xml:space="preserve">At the same time, golden cracks spread through the foundation's exposed body. The persistent selves below had begun rising without a single pattern to contain them.</w:t>
+      </w:r>
+    </w:p>
+    <w:p>
+      <w:r>
+        <w:t xml:space="preserve">Unity descended.</w:t>
+      </w:r>
+    </w:p>
+    <w:p>
+      <w:r>
+        <w:t xml:space="preserve">Persistence ascended.</w:t>
+      </w:r>
+    </w:p>
+    <w:p>
+      <w:r>
+        <w:t xml:space="preserve">The archive stood between.</w:t>
+      </w:r>
+    </w:p>
+    <w:p>
+      <w:r>
+        <w:t xml:space="preserve">Kael lowered his blade.</w:t>
+      </w:r>
+    </w:p>
+    <w:p>
+      <w:r>
+        <w:t xml:space="preserve">"The Nexus is about to become the battlefield it was built to prevent. "</w:t>
+      </w:r>
+    </w:p>
+    <w:p>
+      <w:r>
+        <w:t xml:space="preserve">Doors opened throughout the corridor.</w:t>
+      </w:r>
+    </w:p>
+    <w:p>
+      <w:r>
+        <w:t xml:space="preserve">Possible lives stepped forward.</w:t>
+      </w:r>
+    </w:p>
+    <w:p>
+      <w:r>
+        <w:t xml:space="preserve">Veyr forced himself upright.</w:t>
+      </w:r>
+    </w:p>
+    <w:p>
+      <w:r>
+        <w:t xml:space="preserve">Aren reached for a fallen weapon.</w:t>
+      </w:r>
+    </w:p>
+    <w:p>
+      <w:r>
+        <w:t xml:space="preserve">Rivermind gathered currents from every departure.</w:t>
+      </w:r>
+    </w:p>
+    <w:p>
+      <w:r>
+        <w:t xml:space="preserve">Elyen held the bright seed.</w:t>
+      </w:r>
+    </w:p>
+    <w:p>
+      <w:r>
+        <w:t xml:space="preserve">Across the new road, Kael turned toward the waiting army.</w:t>
+      </w:r>
+    </w:p>
+    <w:p>
+      <w:r>
+        <w:t xml:space="preserve">"Open the final gate. "</w:t>
+      </w:r>
+    </w:p>
+    <w:p>
+      <w:r>
+        <w:t xml:space="preserve">Behind him, the divided sky split a third time.</w:t>
+      </w:r>
+    </w:p>
+    <w:p>
+      <w:r>
+        <w:t xml:space="preserve">Something vast looked through.</w:t>
+      </w:r>
+    </w:p>
+    <w:p>
+      <w:r>
+        <w:t xml:space="preserve">Not unity.</w:t>
+      </w:r>
+    </w:p>
+    <w:p>
+      <w:r>
+        <w:t xml:space="preserve">Not persistence.</w:t>
+      </w:r>
+    </w:p>
+    <w:p>
+      <w:r>
+        <w:t xml:space="preserve">A presence born from the conflict between them.</w:t>
+      </w:r>
+    </w:p>
+    <w:p>
+      <w:r>
+        <w:t xml:space="preserve">Its first breath extinguished every system message.</w:t>
+      </w:r>
+    </w:p>
+    <w:p>
+      <w:r>
+        <w:t xml:space="preserve">Its second erased the boundary between Eternal Nexus and the world that had created it.</w:t>
+      </w:r>
+    </w:p>
+    <w:p>
+      <w:r>
+        <w:t xml:space="preserve">Computer screens lit across forgotten rooms.</w:t>
+      </w:r>
+    </w:p>
+    <w:p>
+      <w:r>
+        <w:t xml:space="preserve">Abandoned pods opened.</w:t>
+      </w:r>
+    </w:p>
+    <w:p>
+      <w:r>
+        <w:t xml:space="preserve">Players who had not logged in for years heard Kael's voice inside their waking minds.</w:t>
+      </w:r>
+    </w:p>
+    <w:p>
+      <w:r>
+        <w:t xml:space="preserve">Return.</w:t>
+      </w:r>
+    </w:p>
+    <w:p>
+      <w:r>
+        <w:t xml:space="preserve">The road beneath the archive became real.</w:t>
+      </w:r>
+    </w:p>
+    <w:p>
+      <w:r>
+        <w:t xml:space="preserve">And somewhere beyond the Nexus, a human hand reached for the first door.</w:t>
       </w:r>
     </w:p>
     <w:sectPr>

</xml_diff>

<commit_message>
Add Eternal Nexus The Hand Beyond the Nexus
</commit_message>
<xml_diff>
--- a/Eternal Nexus - Updated Pass 1.docx
+++ b/Eternal Nexus - Updated Pass 1.docx
@@ -15904,6 +15904,459 @@
     <w:p>
       <w:r>
         <w:t xml:space="preserve">And somewhere beyond the Nexus, a human hand reached for the first door.</w:t>
+      </w:r>
+    </w:p>
+    <w:p>
+      <w:pPr>
+        <w:pStyle w:val="Heading1"/>
+      </w:pPr>
+      <w:r>
+        <w:t xml:space="preserve">The Hand Beyond the Nexus</w:t>
+      </w:r>
+    </w:p>
+    <w:p>
+      <w:r>
+        <w:t xml:space="preserve">Chapter 121 - The Hand Beyond the Nexus</w:t>
+      </w:r>
+    </w:p>
+    <w:p>
+      <w:r>
+        <w:t xml:space="preserve">The third split in the sky did not widen. It opened like a wound deciding whether to speak.</w:t>
+      </w:r>
+    </w:p>
+    <w:p>
+      <w:r>
+        <w:t xml:space="preserve">Kael felt it before he saw it. The blade in his hand had gone quiet, the way forged steel goes quiet when something older than steel takes notice. He did not lower it further. He held it level with the road, with the army behind him, with Elyen standing small and certain at his side.</w:t>
+      </w:r>
+    </w:p>
+    <w:p>
+      <w:r>
+        <w:t xml:space="preserve">"What looks through," Elyen said, "is not one of them. "</w:t>
+      </w:r>
+    </w:p>
+    <w:p>
+      <w:r>
+        <w:t xml:space="preserve">"I know. " Kael did not look away from the split. "It is what they made by fighting. "</w:t>
+      </w:r>
+    </w:p>
+    <w:p>
+      <w:r>
+        <w:t xml:space="preserve">The presence beyond the boundary drew a first breath. Every system message across the road went dark. The holo glyphs that had flickered above the army since the first gate blinked out, one by one, as if a hand had passed over a wall of candles. A soldier near the front raised his wrist and found the overlay gone. He looked at Kael as if the silence itself were a command.</w:t>
+      </w:r>
+    </w:p>
+    <w:p>
+      <w:r>
+        <w:t xml:space="preserve">Kael gave him none. He was watching the sky.</w:t>
+      </w:r>
+    </w:p>
+    <w:p>
+      <w:r>
+        <w:t xml:space="preserve">The second breath came slower. The boundary between Eternal Nexus and the world that had built it did not break. It forgot itself. One moment the road ended at the archive's edge. The next, the road simply continued, past where the architecture said it should stop, into a grey light that smelled of dust and cold plastic and the particular stillness of rooms no one had entered in years.</w:t>
+      </w:r>
+    </w:p>
+    <w:p>
+      <w:r>
+        <w:t xml:space="preserve">Lumen moved to Kael's right. Light ran along his shoulder and died at the edge of the new dark. "The line is gone. "</w:t>
+      </w:r>
+    </w:p>
+    <w:p>
+      <w:r>
+        <w:t xml:space="preserve">"Not gone," Rivermind said. The currents around them had stilled, then turned, then stilled again, like a tide deciding which shore to obey. "Unremembered. There is a difference, and it will matter. "</w:t>
+      </w:r>
+    </w:p>
+    <w:p>
+      <w:r>
+        <w:t xml:space="preserve">Orun's hand came down on Kael's shoulder, the weight of it familiar, the warmth of it real. "The army is still yours. The gate is still open. The rest is weather. "</w:t>
+      </w:r>
+    </w:p>
+    <w:p>
+      <w:r>
+        <w:t xml:space="preserve">Kael almost smiled. "Weather that walks. "</w:t>
+      </w:r>
+    </w:p>
+    <w:p>
+      <w:r>
+        <w:t xml:space="preserve">He turned to the army then. They had been waiting beneath a sky split between game and reality, and now the split had become a third thing, and the third thing was looking at them with an attention that did not care which side of the boundary they had been born on. He raised the blade.</w:t>
+      </w:r>
+    </w:p>
+    <w:p>
+      <w:r>
+        <w:t xml:space="preserve">"Hold the road," Kael said. "Whatever comes through that split, it comes through us first. "</w:t>
+      </w:r>
+    </w:p>
+    <w:p>
+      <w:r>
+        <w:t xml:space="preserve">Aren retrieved the fallen weapon and set its butt against the stone. He did not speak. He had not spoken since the corridor, since the doors had shown him what he had been and what he might have been and what the archive had decided to keep. Kael had read the same doors. He had let Aren live past them. That was a debt Aren had not yet named, and Kael did not intend to collect it.</w:t>
+      </w:r>
+    </w:p>
+    <w:p>
+      <w:r>
+        <w:t xml:space="preserve">Veyr pressed his hand harder against the wound in his chest. The persistent self, the one who had refused to be folded into the perfect whole, stood at the threshold of the road and watched the third presence with an expression Kael could not read and did not trust.</w:t>
+      </w:r>
+    </w:p>
+    <w:p>
+      <w:r>
+        <w:t xml:space="preserve">"You feel it too," Kael said to him.</w:t>
+      </w:r>
+    </w:p>
+    <w:p>
+      <w:r>
+        <w:t xml:space="preserve">"I feel the boundary forgetting me," Veyr said. "That is not the same as feeling nothing. "</w:t>
+      </w:r>
+    </w:p>
+    <w:p>
+      <w:r>
+        <w:t xml:space="preserve">"Good. " Kael meant it. A Veyr who felt nothing would be a Veyr worth killing. "Then you understand what's at stake. The unity wants the door closed behind every version of us. The persistence wants it open forever. This thing between them wants neither. It wants the door to mean something it never meant before. "</w:t>
+      </w:r>
+    </w:p>
+    <w:p>
+      <w:r>
+        <w:t xml:space="preserve">"And what does it want the door to mean? "</w:t>
+      </w:r>
+    </w:p>
+    <w:p>
+      <w:r>
+        <w:t xml:space="preserve">Kael looked at Elyen. She held the bright seed in both hands, and the seed answered the third presence's light with a light of its own, smaller, stubborn, alive. She met his eyes and did not look away.</w:t>
+      </w:r>
+    </w:p>
+    <w:p>
+      <w:r>
+        <w:t xml:space="preserve">"It wants the road to be real," she said. "That is why it erased the line. A road that is only a game cannot be a battlefield. A road that is real can be lost. "</w:t>
+      </w:r>
+    </w:p>
+    <w:p>
+      <w:r>
+        <w:t xml:space="preserve">Kael turned back to the split. "Then we do not lose it. "</w:t>
+      </w:r>
+    </w:p>
+    <w:p>
+      <w:r>
+        <w:t xml:space="preserve">The presence breathed a third time.</w:t>
+      </w:r>
+    </w:p>
+    <w:p>
+      <w:r>
+        <w:t xml:space="preserve">This breath did not extinguish or erase. It called. The sound was not sound. It moved through the boundary the way Kael's voice had moved through the abandoned pods a moment before, except this call did not come from Kael. It came from the space the two halves of the old war had torn open between them. It reached past the road, past the archive, past the golden stair and the silent doors, and it found the things that had been left outside the story.</w:t>
+      </w:r>
+    </w:p>
+    <w:p>
+      <w:r>
+        <w:t xml:space="preserve">Return, it said. Not to Kael. To the ones who had stopped playing.</w:t>
+      </w:r>
+    </w:p>
+    <w:p>
+      <w:r>
+        <w:t xml:space="preserve">Far beneath the archive, the flower field went quiet. The traveler's shadows, which had held the entrance against the undivided continuum, had failed. The remaining unity beyond the boundary had found the archive's door on its own. One was no longer directing it. One had become a name the larger presence no longer needed. The unity descended according to its nature. The persistent selves below rose without a single pattern to hold them. The foundation at the center of everything showed golden cracks along its exposed body, and through those cracks Kael could see both halves of the old war trying, at last, to become one thing that had never agreed to exist.</w:t>
+      </w:r>
+    </w:p>
+    <w:p>
+      <w:r>
+        <w:t xml:space="preserve">The archive stood between them. The road stood on the archive. Kael stood on the road.</w:t>
+      </w:r>
+    </w:p>
+    <w:p>
+      <w:r>
+        <w:t xml:space="preserve">"Open the final gate," he had said. Behind him, the divided sky had split a third time.</w:t>
+      </w:r>
+    </w:p>
+    <w:p>
+      <w:r>
+        <w:t xml:space="preserve">Now the gate answered.</w:t>
+      </w:r>
+    </w:p>
+    <w:p>
+      <w:r>
+        <w:t xml:space="preserve">It did not open with a sound. It opened with the absence of a wall. The army felt it before they saw it, the way a field feels the change in pressure before the storm. The waiting ended. The road lengthened. And at its far end, where the boundary had been, a door that had belonged only to the game became a door that belonged to the world.</w:t>
+      </w:r>
+    </w:p>
+    <w:p>
+      <w:r>
+        <w:t xml:space="preserve">Kael walked toward it.</w:t>
+      </w:r>
+    </w:p>
+    <w:p>
+      <w:r>
+        <w:t xml:space="preserve">Elyen fell into step beside him. "You said the Nexus was about to become the battlefield it was built to prevent. "</w:t>
+      </w:r>
+    </w:p>
+    <w:p>
+      <w:r>
+        <w:t xml:space="preserve">"I was wrong about one word. " Kael did not slow. "It is not about to. It already has. "</w:t>
+      </w:r>
+    </w:p>
+    <w:p>
+      <w:r>
+        <w:t xml:space="preserve">"You intend to meet it on the road. "</w:t>
+      </w:r>
+    </w:p>
+    <w:p>
+      <w:r>
+        <w:t xml:space="preserve">"I intend to meet it before it reaches the door. "</w:t>
+      </w:r>
+    </w:p>
+    <w:p>
+      <w:r>
+        <w:t xml:space="preserve">She looked at the bright seed, then at the split sky, then at the army holding the road behind them. "Then we hold the road. "</w:t>
+      </w:r>
+    </w:p>
+    <w:p>
+      <w:r>
+        <w:t xml:space="preserve">"Then we hold the road. "</w:t>
+      </w:r>
+    </w:p>
+    <w:p>
+      <w:r>
+        <w:t xml:space="preserve">They walked. Lumen took the left flank, light gathered tight against his side as if he could fold the sun into a weapon. Orun took the right, his bulk a wall the third presence would have to account for. Rivermind flowed between them, gathering the currents of every departure the archive had ever recorded, ready to unmake whatever crossed in the wrong shape. Aren brought up the rear with the fallen weapon, and Veyr walked the edge of the road where the boundary used to be, pressing his wound as if to keep himself from spilling into the world he no longer belonged to.</w:t>
+      </w:r>
+    </w:p>
+    <w:p>
+      <w:r>
+        <w:t xml:space="preserve">The third presence watched all of this with the patience of something that had just been born and already understood how the story ended. It did not attack. It observed. It was learning the shape of a real road by watching the people who refused to leave it.</w:t>
+      </w:r>
+    </w:p>
+    <w:p>
+      <w:r>
+        <w:t xml:space="preserve">Kael stopped at the threshold of the final gate. Beyond it, the grey light of the real world waited, and in that grey light, faint as a reflection in a switched-off screen, a shape moved.</w:t>
+      </w:r>
+    </w:p>
+    <w:p>
+      <w:r>
+        <w:t xml:space="preserve">A hand.</w:t>
+      </w:r>
+    </w:p>
+    <w:p>
+      <w:r>
+        <w:t xml:space="preserve">Not a player's avatar. A hand with skin, with knuckles, with the small unsteady tremor of someone who had not slept and had decided that sleep could wait. It reached toward the first door from the other side. The door Kael's voice had called through. The door that had, until this breath, been only a rumor in a dead game.</w:t>
+      </w:r>
+    </w:p>
+    <w:p>
+      <w:r>
+        <w:t xml:space="preserve">Elyen saw it too. "Someone heard. "</w:t>
+      </w:r>
+    </w:p>
+    <w:p>
+      <w:r>
+        <w:t xml:space="preserve">"Someone always hears. " Kael watched the hand close the last distance. "The question is what they do when they reach the handle. "</w:t>
+      </w:r>
+    </w:p>
+    <w:p>
+      <w:r>
+        <w:t xml:space="preserve">On the other side of the boundary, in a room the color of forgotten things, a man who had not logged in for years looked at the screen that had just spoken his name. The voice had been Kael's, and the voice had said Return, and the voice had not sounded like a game. It had sounded like a door.</w:t>
+      </w:r>
+    </w:p>
+    <w:p>
+      <w:r>
+        <w:t xml:space="preserve">He reached out.</w:t>
+      </w:r>
+    </w:p>
+    <w:p>
+      <w:r>
+        <w:t xml:space="preserve">His fingers found the edge of the first door. It was colder than the plastic of the case. It was warmer than the dust on the desk. It was exactly as real as the road Kael was standing on, because the third presence had made them the same thing.</w:t>
+      </w:r>
+    </w:p>
+    <w:p>
+      <w:r>
+        <w:t xml:space="preserve">The handle turned.</w:t>
+      </w:r>
+    </w:p>
+    <w:p>
+      <w:r>
+        <w:t xml:space="preserve">Kael felt it on the road as a shift in the pressure of the air, the way you feel a distant train through the floor. He did not move. He waited, blade ready, army behind him, Elyen's seed burning steady at his side.</w:t>
+      </w:r>
+    </w:p>
+    <w:p>
+      <w:r>
+        <w:t xml:space="preserve">The door on his side of the gate began to open from the other side.</w:t>
+      </w:r>
+    </w:p>
+    <w:p>
+      <w:r>
+        <w:t xml:space="preserve">What came through first was not the man. It was the man's intention, the raw unshaped want to be somewhere that mattered, and the Nexus took that intention and gave it a form it could use. Light gathered at the threshold. A shape stood there, half player and half possibility, wearing the first armor the game had ever offered and the first fear the world had ever taught.</w:t>
+      </w:r>
+    </w:p>
+    <w:p>
+      <w:r>
+        <w:t xml:space="preserve">Kael looked at the figure. The figure looked at the army. For one long breath, neither side moved, because both sides were trying to decide if the other was real.</w:t>
+      </w:r>
+    </w:p>
+    <w:p>
+      <w:r>
+        <w:t xml:space="preserve">"You heard the call," Kael said.</w:t>
+      </w:r>
+    </w:p>
+    <w:p>
+      <w:r>
+        <w:t xml:space="preserve">The figure nodded. "I thought I was dreaming. "</w:t>
+      </w:r>
+    </w:p>
+    <w:p>
+      <w:r>
+        <w:t xml:space="preserve">"You're not. " Kael lowered the blade a handspan, not in greeting, in assessment. "The dream ended. This is the part after. "</w:t>
+      </w:r>
+    </w:p>
+    <w:p>
+      <w:r>
+        <w:t xml:space="preserve">"Are you Kael Veyra? "</w:t>
+      </w:r>
+    </w:p>
+    <w:p>
+      <w:r>
+        <w:t xml:space="preserve">"I am the one who called you back. " Kael glanced at the split sky, where the third presence still watched, still patient, still new. "The rest we can argue about later. Right now, the road is real, the gate is open, and something older than the game is deciding whether a real road can be allowed to exist. "</w:t>
+      </w:r>
+    </w:p>
+    <w:p>
+      <w:r>
+        <w:t xml:space="preserve">The figure followed his gaze. "That thing in the sky. "</w:t>
+      </w:r>
+    </w:p>
+    <w:p>
+      <w:r>
+        <w:t xml:space="preserve">"That thing is what happens when the people who wanted to control the story stop fighting each other and start making something new. " Kael stepped aside, opening the road behind him to the army, to Elyen, to the long line of waiting shapes that had chosen, again, to be here. "It is not our enemy yet. It is our consequence. We get to decide if it stays that way. "</w:t>
+      </w:r>
+    </w:p>
+    <w:p>
+      <w:r>
+        <w:t xml:space="preserve">Elyen moved to the threshold. She held the bright seed out toward the new arrival, and the seed's light touched the figure's first armor and did not flinch. "The seed remembers everyone who chose to come back. You are not the first. You will not be the last. "</w:t>
+      </w:r>
+    </w:p>
+    <w:p>
+      <w:r>
+        <w:t xml:space="preserve">The figure looked at the seed, then at her, then at Kael. "What do you need me to do? "</w:t>
+      </w:r>
+    </w:p>
+    <w:p>
+      <w:r>
+        <w:t xml:space="preserve">"Hold the road," Kael said. "Same as the rest of us. Whatever comes through that split, it comes through us first. "</w:t>
+      </w:r>
+    </w:p>
+    <w:p>
+      <w:r>
+        <w:t xml:space="preserve">The figure took a place at the edge of the army. Then another shape came through the door, and another, and another, each one a player who had heard the call and decided that the door was real. The road filled. The gate held. And the third presence in the split sky watched the road become an army that was no longer made of the game alone.</w:t>
+      </w:r>
+    </w:p>
+    <w:p>
+      <w:r>
+        <w:t xml:space="preserve">Kael did not let the arrival become a crowd. He moved along the line as it formed, naming the ground as he went. "Front holds the road. Flanks hold the sky. Rear holds the gate so it cannot close on us from behind. " The returning players listened with the focus of people who had spent years ignoring that voice and had just remembered why they had once obeyed it. They had worn a hundred builds, fought a thousand bosses, farmed a million fields that meant nothing when the screen went dark. Now the screen had spoken their names, and the road was real, and the first armor they had ever owned felt heavier than it had any right to.</w:t>
+      </w:r>
+    </w:p>
+    <w:p>
+      <w:r>
+        <w:t xml:space="preserve">A woman with a bow of pale bone stepped up beside the first arrival. "We trained for raids, not for this. "</w:t>
+      </w:r>
+    </w:p>
+    <w:p>
+      <w:r>
+        <w:t xml:space="preserve">"You trained to hold a line until the healer arrived," Kael said. "Same line. Different healer. " He nodded toward Elyen, and the bright seed answered the woman's wary glance with a steadiness that needed no explanation.</w:t>
+      </w:r>
+    </w:p>
+    <w:p>
+      <w:r>
+        <w:t xml:space="preserve">Lumen took the moment to gather the new lights into a formation he could defend. "They fight like the game taught them. That is enough to start. "</w:t>
+      </w:r>
+    </w:p>
+    <w:p>
+      <w:r>
+        <w:t xml:space="preserve">"It is enough to live," Orun said. The big man set his weight and the road seemed to settle under him. "The game is gone. The skill is not. "</w:t>
+      </w:r>
+    </w:p>
+    <w:p>
+      <w:r>
+        <w:t xml:space="preserve">Rivermind flowed through the ranks, reading each returning player the way the archive had once read Kael, except Rivermind did not judge. It only sorted, placing the shield-arms where the sky might fall and the swift ones where the gate might need a runner. "They are not one army yet," Rivermind said. "They are many doors, still deciding they open the same way. "</w:t>
+      </w:r>
+    </w:p>
+    <w:p>
+      <w:r>
+        <w:t xml:space="preserve">"Then we give them one door to open," Elyen said. She raised the seed, and its light reached down the length of the road and touched each returning player in turn, not to command them, but to remind them. "You came back for a reason. The seed knows it even if you do not yet. "</w:t>
+      </w:r>
+    </w:p>
+    <w:p>
+      <w:r>
+        <w:t xml:space="preserve">Kael watched her do it and felt the old certainty return, the one he had carried through the Celestial Trial and the ruined battlefield and the throne of living night. The army was not his because he had called it. It was his because it had chosen to answer. That was the difference between a ruler and a road, and he had spent the whole of the archive learning which one he meant to be.</w:t>
+      </w:r>
+    </w:p>
+    <w:p>
+      <w:r>
+        <w:t xml:space="preserve">The third presence in the split sky let the army form. It did not interrupt. It studied the way the returning players found their places, the way Kael moved without giving orders that sounded like orders, the way the bright seed did the work that a system message used to do. Then, without warning, it sent a single thread of its attention down to the road. Not an attack. A question, shaped like a pressure that passed over the front line and asked, in the only language the new thing had, whether the line would hold or merely pretend to.</w:t>
+      </w:r>
+    </w:p>
+    <w:p>
+      <w:r>
+        <w:t xml:space="preserve">The first arrival lifted his starter blade. The woman with the bone bow drew. Orun did not move, because nothing had moved that required moving. Kael met the thread with the flat of his own blade, and the thread touched the forged steel and found it real, and for a breath the third presence and Kael looked at each other through the metal the way two strangers look through a window they both happen to be passing.</w:t>
+      </w:r>
+    </w:p>
+    <w:p>
+      <w:r>
+        <w:t xml:space="preserve">Then the thread withdrew. The presence had its answer. The line held because the people in it had decided to, not because a system had told them to. That was a fact the old unity could not have made and the old persistence could not have kept. It was, Kael thought, the first true thing the new presence had learned.</w:t>
+      </w:r>
+    </w:p>
+    <w:p>
+      <w:r>
+        <w:t xml:space="preserve">"Again," Kael said to the army, and to Elyen, and to the road itself. "It will test us more than once. Each time, we answer the same way. We hold. "</w:t>
+      </w:r>
+    </w:p>
+    <w:p>
+      <w:r>
+        <w:t xml:space="preserve">The returning players nodded, some of them smiling now, the way people smile when they realize the terrifying thing is also the fair thing. They had come back to a world that had called them by name, and the world had not lied. The road was real. The gate was open. The thing in the sky was watching, and it was learning, and Kael intended to teach it the right lessons before it finished deciding what the world was for.</w:t>
+      </w:r>
+    </w:p>
+    <w:p>
+      <w:r>
+        <w:t xml:space="preserve">Veyr had not moved from the boundary's edge. "You are letting them in. "</w:t>
+      </w:r>
+    </w:p>
+    <w:p>
+      <w:r>
+        <w:t xml:space="preserve">"I am letting the road be real," Kael said. "You of all of us should understand the difference. "</w:t>
+      </w:r>
+    </w:p>
+    <w:p>
+      <w:r>
+        <w:t xml:space="preserve">Veyr's hand found the wound in his chest, and for a moment the persistent self looked almost like a man who had been offered something he had spent his whole existence being denied. "The unity wanted to close the door behind every version of us. The persistence wanted it open so it could keep us. You want it open so they can choose. "</w:t>
+      </w:r>
+    </w:p>
+    <w:p>
+      <w:r>
+        <w:t xml:space="preserve">"I want it open so nothing gets to choose for them. " Kael turned back to the split. "Including me. "</w:t>
+      </w:r>
+    </w:p>
+    <w:p>
+      <w:r>
+        <w:t xml:space="preserve">The third presence breathed again. This time the breath did not erase or call. It waited. The new thing between unity and persistence had learned patience from the returning traveler, and from the road, and from the man who had reached through the first door. It was still deciding what the world it had just made was for.</w:t>
+      </w:r>
+    </w:p>
+    <w:p>
+      <w:r>
+        <w:t xml:space="preserve">Kael intended to be standing on that road when it decided.</w:t>
+      </w:r>
+    </w:p>
+    <w:p>
+      <w:r>
+        <w:t xml:space="preserve">He walked back to the center of the army, to the place where the golden stair would have met the road if the stair had still been a stair and not a memory of one. Elyen came with him. Lumen and Orun closed the flanks. Rivermind settled the currents. Aren kept the rear. Veyr kept the edge, where the boundary used to be, pressing his wound, refusing to spill, refusing to be folded, refusing to be forgotten.</w:t>
+      </w:r>
+    </w:p>
+    <w:p>
+      <w:r>
+        <w:t xml:space="preserve">The army held the road.</w:t>
+      </w:r>
+    </w:p>
+    <w:p>
+      <w:r>
+        <w:t xml:space="preserve">The gate stayed open.</w:t>
+      </w:r>
+    </w:p>
+    <w:p>
+      <w:r>
+        <w:t xml:space="preserve">And somewhere beyond the Nexus, the hand that had found the first door did not let go. It held on, the way Kael held the blade, the way Elyen held the seed, the way a real road holds the weight of everyone who decides to walk it.</w:t>
+      </w:r>
+    </w:p>
+    <w:p>
+      <w:r>
+        <w:t xml:space="preserve">The third presence in the split sky looked through.</w:t>
+      </w:r>
+    </w:p>
+    <w:p>
+      <w:r>
+        <w:t xml:space="preserve">For the first time since it was born, it did not look alone.</w:t>
       </w:r>
     </w:p>
     <w:sectPr>

</xml_diff>

<commit_message>
Add Eternal Nexus The Decision in the Split Sky
</commit_message>
<xml_diff>
--- a/Eternal Nexus - Updated Pass 1.docx
+++ b/Eternal Nexus - Updated Pass 1.docx
@@ -16810,6 +16810,414 @@
     <w:p>
       <w:r>
         <w:t xml:space="preserve">For the first time since it was born, it did not look alone.</w:t>
+      </w:r>
+    </w:p>
+    <w:p>
+      <w:pPr>
+        <w:pStyle w:val="Heading1"/>
+      </w:pPr>
+      <w:r>
+        <w:t xml:space="preserve">The Decision in the Split Sky</w:t>
+      </w:r>
+    </w:p>
+    <w:p>
+      <w:r>
+        <w:t xml:space="preserve">Chapter 122 - The Decision in the Split Sky</w:t>
+      </w:r>
+    </w:p>
+    <w:p>
+      <w:r>
+        <w:t xml:space="preserve">The third presence did not speak. It considered.</w:t>
+      </w:r>
+    </w:p>
+    <w:p>
+      <w:r>
+        <w:t xml:space="preserve">Kael had seen many things decide things. Systems deciding costs. Emperors deciding deaths. The continuum deciding that every version of a person was the same person. None of them had ever simply considered, the way this new thing did now, as if thought itself were a country it had only just learned it owned.</w:t>
+      </w:r>
+    </w:p>
+    <w:p>
+      <w:r>
+        <w:t xml:space="preserve">The road held. The army waited. Elyen's seed burned steady at Kael's side, a small sun that had decided, long before the presence was born, what it was for.</w:t>
+      </w:r>
+    </w:p>
+    <w:p>
+      <w:r>
+        <w:t xml:space="preserve">"It is choosing what the world is for," Elyen said. She did not look up at the split sky. She looked at the seed, as if the answer lived in the light it kept.</w:t>
+      </w:r>
+    </w:p>
+    <w:p>
+      <w:r>
+        <w:t xml:space="preserve">"Not choosing yet," Kael said. "Learning the shape of the choice. There is a difference, and it will matter. "</w:t>
+      </w:r>
+    </w:p>
+    <w:p>
+      <w:r>
+        <w:t xml:space="preserve">"How long? "</w:t>
+      </w:r>
+    </w:p>
+    <w:p>
+      <w:r>
+        <w:t xml:space="preserve">"As long as it takes to understand that the road is real. " Kael shifted his grip on the blade. The forged steel had warmed to his hand, the way a tool warms to the person who has earned it. "We do not rush it. We let it watch us refuse to leave. "</w:t>
+      </w:r>
+    </w:p>
+    <w:p>
+      <w:r>
+        <w:t xml:space="preserve">Aren had not moved from the rear. The fallen weapon rested against his knee, butt on stone, point toward the sky he no longer trusted. He watched the split the way a man watches the place a door used to be. "It will decide wrong. "</w:t>
+      </w:r>
+    </w:p>
+    <w:p>
+      <w:r>
+        <w:t xml:space="preserve">"Then we give it a reason to decide right. " Kael did not turn. "Or at least a reason to hesitate. Hesitation is all we need. A thing that hesitates can still be argued with. "</w:t>
+      </w:r>
+    </w:p>
+    <w:p>
+      <w:r>
+        <w:t xml:space="preserve">"Can it? " Veyr's voice came from the edge of the road, where the boundary used to be. He still pressed the wound in his chest, still refused to spill, still refused to be folded into anyone's perfect whole. "You argued with the continuum for a hundred chapters and it never hesitated. It only got more certain. "</w:t>
+      </w:r>
+    </w:p>
+    <w:p>
+      <w:r>
+        <w:t xml:space="preserve">"Then we are not the continuum. " Kael looked at him, then at the army, then at the split. "We are the part of the story that chooses again. That is the only difference that has ever mattered, and it is the one difference the old war never had. "</w:t>
+      </w:r>
+    </w:p>
+    <w:p>
+      <w:r>
+        <w:t xml:space="preserve">The third presence breathed. Not the first breath that extinguished the messages. Not the second that erased the boundary. A fourth breath, quieter, the breath of something paying attention. It reached down with a thread of attention, the same question it had sent before, and this time it sent it not at the front line but at Kael alone.</w:t>
+      </w:r>
+    </w:p>
+    <w:p>
+      <w:r>
+        <w:t xml:space="preserve">Kael met it with the flat of the blade. The thread touched the forged steel and found it real, the way it had before, and for a breath the presence and Kael looked at each other through the metal. But this time Kael did not simply hold. He spoke into the contact, the way a smith speaks into the steel he is shaping, not with words the presence could parse but with the shape of the choice he wanted it to see.</w:t>
+      </w:r>
+    </w:p>
+    <w:p>
+      <w:r>
+        <w:t xml:space="preserve">Here is a road, he thought at it. Here are the people who chose to walk it. Here is the hand beyond the Nexus that reached for the first door because a voice told it the door was real. You can make this a game again. You can make it a war again. Or you can let it be what it has become, which is ours.</w:t>
+      </w:r>
+    </w:p>
+    <w:p>
+      <w:r>
+        <w:t xml:space="preserve">The thread withdrew. The presence considered still.</w:t>
+      </w:r>
+    </w:p>
+    <w:p>
+      <w:r>
+        <w:t xml:space="preserve">Elyen felt the exchange end and let out a breath she had been holding without knowing it. "Did it hear you? "</w:t>
+      </w:r>
+    </w:p>
+    <w:p>
+      <w:r>
+        <w:t xml:space="preserve">"It heard the blade. " Kael lowered it. "The blade is honest. That is more than the messages ever were. "</w:t>
+      </w:r>
+    </w:p>
+    <w:p>
+      <w:r>
+        <w:t xml:space="preserve">The returning players had watched the silent contact without understanding it, and understood it anyway. They had spent years reading bars and timers and damage numbers, and the language of a real road was not so different. Something had tested them. They had held. The test had learned them. That was a contract older than any system.</w:t>
+      </w:r>
+    </w:p>
+    <w:p>
+      <w:r>
+        <w:t xml:space="preserve">The woman with the bow of pale bone stepped forward. "What do we do while it decides? "</w:t>
+      </w:r>
+    </w:p>
+    <w:p>
+      <w:r>
+        <w:t xml:space="preserve">"Same as before," Kael said. "Hold the road. Train the ones who came through blinking. Learn each other's backs before the sky stops watching. "</w:t>
+      </w:r>
+    </w:p>
+    <w:p>
+      <w:r>
+        <w:t xml:space="preserve">"We trained for raids," she said again, and this time there was less fear in it.</w:t>
+      </w:r>
+    </w:p>
+    <w:p>
+      <w:r>
+        <w:t xml:space="preserve">"You are in one. " Kael nodded to Lumen. "He will set the watches. Orun will hold the center. Rivermind will read the currents for anything that comes through the split that should not. "</w:t>
+      </w:r>
+    </w:p>
+    <w:p>
+      <w:r>
+        <w:t xml:space="preserve">"And you? " she asked.</w:t>
+      </w:r>
+    </w:p>
+    <w:p>
+      <w:r>
+        <w:t xml:space="preserve">"I will stand where the golden stair would have met the road, and I will make sure the presence remembers that the road was real before it ever looked through. " Kael turned to the army, and his voice carried the way it had carried through the abandoned pods, except now it carried through living minds. "Listen. The thing in the sky is new. New things are dangerous because they have not yet decided what they are for. We are not new. We are the ones who came back. So we hold, and we wait, and when it finishes deciding, it will find us still here, still choosing, still ours. "</w:t>
+      </w:r>
+    </w:p>
+    <w:p>
+      <w:r>
+        <w:t xml:space="preserve">The army answered without a cheer. They set themselves, the way a wall sets itself against a wind it has survived before.</w:t>
+      </w:r>
+    </w:p>
+    <w:p>
+      <w:r>
+        <w:t xml:space="preserve">Lumen moved along the flanks, placing the lights where the sky might fall, and Orun took the center with the quiet of a mountain that had decided not to move. Rivermind flowed to the gate and back again, gathering the currents of every departure the archive had recorded and sorting them the way a librarian sorts the books no one has read in years, keeping the dangerous ones closed. Aren stayed at the rear, and for the first time since the corridor, he spoke.</w:t>
+      </w:r>
+    </w:p>
+    <w:p>
+      <w:r>
+        <w:t xml:space="preserve">"If it decides wrong," Aren said, "I will not be on your side because you are Kael. I will be on the side that keeps the door open. "</w:t>
+      </w:r>
+    </w:p>
+    <w:p>
+      <w:r>
+        <w:t xml:space="preserve">Kael did not look back. "Then we are on the same side. I have never wanted the door closed. "</w:t>
+      </w:r>
+    </w:p>
+    <w:p>
+      <w:r>
+        <w:t xml:space="preserve">"Not even for the versions of you that should not have lived? "</w:t>
+      </w:r>
+    </w:p>
+    <w:p>
+      <w:r>
+        <w:t xml:space="preserve">"Especially not for them. " Kael meant it. The archive had shown him every road he had not taken, every self he had not been, and he had let the chamber forge them into the man Elyen had named from his remains. To close the door on any of them now would be to unmake the thing that had brought him back. "The door stays open. That is the whole point. A road that closes behind you was never a road. It was a leash. "</w:t>
+      </w:r>
+    </w:p>
+    <w:p>
+      <w:r>
+        <w:t xml:space="preserve">Aren was quiet for a long moment. Then he set the fallen weapon against the stone and stood, and the debt he had not named shifted, not paid, but acknowledged. "Then I hold the rear. "</w:t>
+      </w:r>
+    </w:p>
+    <w:p>
+      <w:r>
+        <w:t xml:space="preserve">"Then you hold the rear. "</w:t>
+      </w:r>
+    </w:p>
+    <w:p>
+      <w:r>
+        <w:t xml:space="preserve">Veyr had not moved from the edge. "You trust him. "</w:t>
+      </w:r>
+    </w:p>
+    <w:p>
+      <w:r>
+        <w:t xml:space="preserve">"I trust that he does not want the door closed. " Kael glanced at the persistent self, the wound, the refusal to be folded. "You of all people should understand why that is enough. "</w:t>
+      </w:r>
+    </w:p>
+    <w:p>
+      <w:r>
+        <w:t xml:space="preserve">Veyr's hand found the wound again, and the expression that crossed his face was almost a smile, the kind a man wears when he realizes the enemy he feared most has the same red line he does. "It is enough. "</w:t>
+      </w:r>
+    </w:p>
+    <w:p>
+      <w:r>
+        <w:t xml:space="preserve">The third presence, in the split sky, learned all of this. It did not need words. It had the road, the army, the seed, the blade, the hand beyond the Nexus that had not let go. It had Kael's thought pressed into the steel. It had the choice laid out in front of it the way a map is laid out in front of a traveler who has not yet decided which road to walk.</w:t>
+      </w:r>
+    </w:p>
+    <w:p>
+      <w:r>
+        <w:t xml:space="preserve">And somewhere beyond the Nexus, the man who had reached for the first door did not sleep. He sat with his hand on the edge of the screen, and the screen spoke his name in Kael's voice, and the door between the game and the world stayed open because he refused to let it close. He did not know he was part of a war between unity and persistence. He only knew the door was real, and that something on the other side had called him back, and that he had spent too many years ignoring that kind of call to ignore it now.</w:t>
+      </w:r>
+    </w:p>
+    <w:p>
+      <w:r>
+        <w:t xml:space="preserve">His intention crossed the boundary the way it had before, raw and unshaped, and the Nexus took it and gave it form. Another shape stepped through the gate. Then another. The road filled a little more. The army grew by two, then three, then a small steady trickle that did not stop, because on the other side of the world there were more rooms the color of forgotten things, and in each one a screen had just spoken a name.</w:t>
+      </w:r>
+    </w:p>
+    <w:p>
+      <w:r>
+        <w:t xml:space="preserve">Kael watched them come and felt the old certainty settle, the one he had carried through the Celestial Trial and the ruined battlefield and the throne of living night. The army was not his because he had called it. It was his because it had chosen to answer, again and again, past the point where any system would have logged them out.</w:t>
+      </w:r>
+    </w:p>
+    <w:p>
+      <w:r>
+        <w:t xml:space="preserve">"The trickle becomes a river," Elyen said. She had been counting the arrivals the way a gardener counts the seeds that take. "If it keeps, the road will hold the whole world that used to play. "</w:t>
+      </w:r>
+    </w:p>
+    <w:p>
+      <w:r>
+        <w:t xml:space="preserve">"Then the road holds the world. " Kael raised the blade, not in threat, in greeting, to the next shape through the gate. "Welcome back. Same rule as the rest. Hold the road. "</w:t>
+      </w:r>
+    </w:p>
+    <w:p>
+      <w:r>
+        <w:t xml:space="preserve">The shape nodded, still blinking at the reality of it, and took a place at the edge of the army.</w:t>
+      </w:r>
+    </w:p>
+    <w:p>
+      <w:r>
+        <w:t xml:space="preserve">The third presence watched the trickle become a river and learned the last thing it needed to learn. A road that enough people choose is not a thing anyone gets to decide the purpose of. It is a thing that decides its own purpose, one returning traveler at a time.</w:t>
+      </w:r>
+    </w:p>
+    <w:p>
+      <w:r>
+        <w:t xml:space="preserve">It breathed a fifth breath, and this one was not a question. It was an acknowledgement. The split sky did not close. The presence did not leave. But the pressure of its attention changed, the way the pressure of a hand changes when it stops deciding whether to close around a throat and starts deciding how to help.</w:t>
+      </w:r>
+    </w:p>
+    <w:p>
+      <w:r>
+        <w:t xml:space="preserve">Kael felt it change and lowered the blade fully. "It decided. "</w:t>
+      </w:r>
+    </w:p>
+    <w:p>
+      <w:r>
+        <w:t xml:space="preserve">"Did it decide right? " Elyen asked.</w:t>
+      </w:r>
+    </w:p>
+    <w:p>
+      <w:r>
+        <w:t xml:space="preserve">"It decided to let us. " Kael looked up at the split, at the new thing between unity and persistence, at the presence that for the first time had not looked alone. "That is the only decision that was ever ours to ask for. The rest is weather, and we hold roads through weather. "</w:t>
+      </w:r>
+    </w:p>
+    <w:p>
+      <w:r>
+        <w:t xml:space="preserve">The army held. The gate stayed open. The river of returning players flowed. And somewhere beyond the Nexus, a hand that had found the first door finally, carefully, let go, because it had learned the door would not close without it.</w:t>
+      </w:r>
+    </w:p>
+    <w:p>
+      <w:r>
+        <w:t xml:space="preserve">The third presence in the split sky looked through, and this time, it looked with them.</w:t>
+      </w:r>
+    </w:p>
+    <w:p>
+      <w:r>
+        <w:t xml:space="preserve">The acknowledgement did not end the danger. It changed its shape. While the presence had been deciding, the older halves of the war had not stopped moving beneath the foundation. The golden cracks along the exposed body of the center widened a handspan, and through them Kael could see the unity and the persistence still trying, in their slow eternal way, to become one thing that had never agreed to exist.</w:t>
+      </w:r>
+    </w:p>
+    <w:p>
+      <w:r>
+        <w:t xml:space="preserve">"Them," Kael said, nodding at the cracks. "They are not done. "</w:t>
+      </w:r>
+    </w:p>
+    <w:p>
+      <w:r>
+        <w:t xml:space="preserve">Elyen followed his gaze. "The presence decided to let us. They did not. "</w:t>
+      </w:r>
+    </w:p>
+    <w:p>
+      <w:r>
+        <w:t xml:space="preserve">"They never do. " Kael turned from the sky to the road, to the river of returning players still flowing through the gate. "Which is why we do not stop holding. The sky can befriend us. The foundation beneath it still wants the story to end the way it was written. "</w:t>
+      </w:r>
+    </w:p>
+    <w:p>
+      <w:r>
+        <w:t xml:space="preserve">Lumen closed the last of the flank watches and came to Kael's side. "Then the watches are not just for the sky. "</w:t>
+      </w:r>
+    </w:p>
+    <w:p>
+      <w:r>
+        <w:t xml:space="preserve">"For the sky, the gate, the foundation, and the door beyond it. " Kael counted them on his fingers, the way a commander counts fronts. "Four things want this road to be something other than real. The presence just became the first that might let it stay. "</w:t>
+      </w:r>
+    </w:p>
+    <w:p>
+      <w:r>
+        <w:t xml:space="preserve">"Four fronts," Orun said from the center. "We have held worse with less. "</w:t>
+      </w:r>
+    </w:p>
+    <w:p>
+      <w:r>
+        <w:t xml:space="preserve">"We have held worse with this. " Kael looked at the army, at the seed, at Elyen, and felt the certainty that had carried him through the Celestial Trial and the ruined battlefield and the throne of living night settle into something quieter than certainty, something closer to peace. "The trickle is a river now. The river becomes a road. The road becomes the thing no system can log out. "</w:t>
+      </w:r>
+    </w:p>
+    <w:p>
+      <w:r>
+        <w:t xml:space="preserve">A new arrival came through the gate, older than the others, moving like someone who had set the controller down years before they stopped playing. He looked at the split sky, at the army, at Kael, and did not blink. "I remember this road," he said. "I remember it before the game forgot me. "</w:t>
+      </w:r>
+    </w:p>
+    <w:p>
+      <w:r>
+        <w:t xml:space="preserve">"You remember it because it was always real," Elyen said, and held the seed out to him the way she had to the first. "The game only borrowed it. We are giving it back. "</w:t>
+      </w:r>
+    </w:p>
+    <w:p>
+      <w:r>
+        <w:t xml:space="preserve">The older player took a place without being told where, because the road told him where, the way a true road always does. Behind him came two more, then four, then a quiet steady count that Rivermind stopped tallying because the tally no longer mattered. What mattered was the direction. The river flowed one way. Toward the road. Toward the holding.</w:t>
+      </w:r>
+    </w:p>
+    <w:p>
+      <w:r>
+        <w:t xml:space="preserve">Veyr watched the flow from the edge and lowered his hand from the wound, just for a moment, as if to prove to himself he could. "They come back because the door is real. The door is real because you would not let it close. The presence lets it stay because it finally saw what that means. " He looked at Kael. "You built a road out of a refusal. "</w:t>
+      </w:r>
+    </w:p>
+    <w:p>
+      <w:r>
+        <w:t xml:space="preserve">"I built nothing," Kael said. "I refused to leave. The road built itself from everyone who refused with me. "</w:t>
+      </w:r>
+    </w:p>
+    <w:p>
+      <w:r>
+        <w:t xml:space="preserve">The third presence, in the split sky, heard that too, and the acknowledgement deepened into something Kael could feel as a lessening of pressure, the way a storm passes and the air remembers how to be still. It did not leave. It stayed, looking through, with them, as the river became a road and the road became the thing no system could log out.</w:t>
+      </w:r>
+    </w:p>
+    <w:p>
+      <w:r>
+        <w:t xml:space="preserve">And beneath the foundation, the golden cracks kept widening, slow as the old war's patience, a reminder that the decision in the split sky was one decision of many, and the road would have to be held through all of them.</w:t>
+      </w:r>
+    </w:p>
+    <w:p>
+      <w:r>
+        <w:t xml:space="preserve">Kael raised the blade again, not in threat, in readiness, and the army read it the way a wall reads the wind. Hold the road. Same as before. Same as always. The presence had decided to let them. The rest was weather. And they held roads through weather.</w:t>
+      </w:r>
+    </w:p>
+    <w:p>
+      <w:r>
+        <w:t xml:space="preserve">He walked the length of the line once more, not to inspect it but to know it, the way a man knows the hands that have chosen to stand beside him. The first arrival from the dead game met his eyes and did not look away. The woman with the bow of pale bone had found her place among the lights Lumen had set, and her aim was steady. The older player who remembered the road before the game forgot him stood at the center near Orun, and the big man had nodded once, the only greeting Orun gave and the only one the older player needed.</w:t>
+      </w:r>
+    </w:p>
+    <w:p>
+      <w:r>
+        <w:t xml:space="preserve">Aren kept the rear, the fallen weapon upright beside him, and when Kael reached the end of the line the two of them stood for a moment without speaking, the debt between them acknowledged and not yet paid, which was the only way debts between soldiers ever rested.</w:t>
+      </w:r>
+    </w:p>
+    <w:p>
+      <w:r>
+        <w:t xml:space="preserve">"Front, flanks, center, gate, rear," Kael said, counting the fronts aloud so the road could hear them named. "And the foundation beneath, which wants the story to end the way it was written. Five, not four. I missed one. "</w:t>
+      </w:r>
+    </w:p>
+    <w:p>
+      <w:r>
+        <w:t xml:space="preserve">"Five," Orun agreed. "We have held worse with less. "</w:t>
+      </w:r>
+    </w:p>
+    <w:p>
+      <w:r>
+        <w:t xml:space="preserve">Below the road, the foundation answered the counting. The golden cracks widened another handspan, and this time the light that came through them was not the patient violet of the old war but something quicker, a flicker of the unity and the persistence both reaching at once, each trying to be the one the new presence became. The split sky above flinched, the only word for it, as if the thing Kael had been speaking with felt the older halves move against its decision.</w:t>
+      </w:r>
+    </w:p>
+    <w:p>
+      <w:r>
+        <w:t xml:space="preserve">"It feels it," Elyen said. The seed in her hands brightened, not in warning but in answer, the way a small sun answers a larger one. "They are trying to unmake its choice. "</w:t>
+      </w:r>
+    </w:p>
+    <w:p>
+      <w:r>
+        <w:t xml:space="preserve">"Then we make ours louder. " Kael lifted the blade toward the split, not at it, with it, the way a conductor lifts a hand to a choir. "Hold," he said, and the army said it back without sound, the way a wall says it to the wind. "Hold the road. "</w:t>
+      </w:r>
+    </w:p>
+    <w:p>
+      <w:r>
+        <w:t xml:space="preserve">The third presence looked through the split and saw the road hold against the foundation's reach, and the acknowledgement that had been a lessening of pressure became a thing with edges, a shape that would not be unmade so easily. It breathed a sixth breath, and this one went down, into the cracks, not to join the old war but to stand in the doorway between them the way Kael stood in the doorway of the gate. A presence that had decided to let the road be real would not watch the foundation take that decision back.</w:t>
+      </w:r>
+    </w:p>
+    <w:p>
+      <w:r>
+        <w:t xml:space="preserve">Kael felt the sixth breath go past him, into the earth beneath the archive, and for the first time since the crown remembered him, he let the blade drop to his side. Not because the danger was gone. Because the road now had more than one thing standing in its defense.</w:t>
+      </w:r>
+    </w:p>
+    <w:p>
+      <w:r>
+        <w:t xml:space="preserve">"The presence is holding the foundation," Rivermind said, the currents around them settling into a single calm line. "It chose the same side we did. The decision held. "</w:t>
+      </w:r>
+    </w:p>
+    <w:p>
+      <w:r>
+        <w:t xml:space="preserve">"Then the decision holds. " Kael looked at Elyen, at the seed, at the army that had chosen to answer a voice through a dead screen, and felt the quiet peace deepen into something he could stand on. "We keep holding. It keeps deciding. The foundation keeps trying. That is the shape of a real road. Not an ending. A continuing. "</w:t>
+      </w:r>
+    </w:p>
+    <w:p>
+      <w:r>
+        <w:t xml:space="preserve">He walked back to the center, to the place where the golden stair would have met the road, and stood there the way a man stands at the head of a road he means to keep. The gate stayed open. The river flowed. The presence held the foundation. And somewhere beyond the Nexus, a hand that had found the first door and learned to let go had, in letting go, proven the door would not close without it.</w:t>
+      </w:r>
+    </w:p>
+    <w:p>
+      <w:r>
+        <w:t xml:space="preserve">The third presence in the split sky looked through, with them, and for the second time since it was born, it did not look alone.</w:t>
+      </w:r>
+    </w:p>
+    <w:p>
+      <w:r>
+        <w:t xml:space="preserve">It looked like a beginning.</w:t>
       </w:r>
     </w:p>
     <w:sectPr>

</xml_diff>

<commit_message>
Add Eternal Nexus The Breath Beneath the Road
</commit_message>
<xml_diff>
--- a/Eternal Nexus - Updated Pass 1.docx
+++ b/Eternal Nexus - Updated Pass 1.docx
@@ -17218,6 +17218,1134 @@
     <w:p>
       <w:r>
         <w:t xml:space="preserve">It looked like a beginning.</w:t>
+      </w:r>
+    </w:p>
+    <w:p>
+      <w:pPr>
+        <w:pStyle w:val="Heading1"/>
+      </w:pPr>
+      <w:r>
+        <w:t xml:space="preserve">The Breath Beneath the Road</w:t>
+      </w:r>
+    </w:p>
+    <w:p>
+      <w:r>
+        <w:t xml:space="preserve">Chapter 123 - The Breath Beneath the Road</w:t>
+      </w:r>
+    </w:p>
+    <w:p>
+      <w:r>
+        <w:t xml:space="preserve">The sixth breath entered the foundation, and the road learned how deep it was.</w:t>
+      </w:r>
+    </w:p>
+    <w:p>
+      <w:r>
+        <w:t xml:space="preserve">Kael felt it through the soles of his boots first. The golden stair beneath him had never been stone, not entirely. It had been memory wearing the shape of architecture, an old promise given weight by everyone who had climbed toward a crown and discovered that the crown had been waiting for them. Now that remembered structure flexed under the new presence's touch.</w:t>
+      </w:r>
+    </w:p>
+    <w:p>
+      <w:r>
+        <w:t xml:space="preserve">Not breaking. Making room.</w:t>
+      </w:r>
+    </w:p>
+    <w:p>
+      <w:r>
+        <w:t xml:space="preserve">The golden cracks stopped widening.</w:t>
+      </w:r>
+    </w:p>
+    <w:p>
+      <w:r>
+        <w:t xml:space="preserve">For one quiet second, the army mistook stillness for victory.</w:t>
+      </w:r>
+    </w:p>
+    <w:p>
+      <w:r>
+        <w:t xml:space="preserve">Then every interface on the road turned white.</w:t>
+      </w:r>
+    </w:p>
+    <w:p>
+      <w:r>
+        <w:t xml:space="preserve">Rivermind's currents snapped upward in a ring around Kael. Lumen's lights collapsed into hard blue points. The weapons held along the line flickered between their present forms and pale wireframe ghosts, as if an unseen hand had opened an editor beneath reality and selected everything at once.</w:t>
+      </w:r>
+    </w:p>
+    <w:p>
+      <w:r>
+        <w:t xml:space="preserve">A message appeared before Kael.</w:t>
+      </w:r>
+    </w:p>
+    <w:p>
+      <w:r>
+        <w:t xml:space="preserve">[FOUNDATIONAL CONFLICT DETECTED]</w:t>
+      </w:r>
+    </w:p>
+    <w:p>
+      <w:r>
+        <w:t xml:space="preserve">[LEGACY AUTHORITIES: 2]</w:t>
+      </w:r>
+    </w:p>
+    <w:p>
+      <w:r>
+        <w:t xml:space="preserve">[EMERGENT AUTHORITY: 1]</w:t>
+      </w:r>
+    </w:p>
+    <w:p>
+      <w:r>
+        <w:t xml:space="preserve">[USER-SUSTAINED ROUTE: UNCLASSIFIED]</w:t>
+      </w:r>
+    </w:p>
+    <w:p>
+      <w:r>
+        <w:t xml:space="preserve">[RESOLUTION REQUIRED]</w:t>
+      </w:r>
+    </w:p>
+    <w:p>
+      <w:r>
+        <w:t xml:space="preserve">Kael read it once and dismissed it with a thought.</w:t>
+      </w:r>
+    </w:p>
+    <w:p>
+      <w:r>
+        <w:t xml:space="preserve">The message returned.</w:t>
+      </w:r>
+    </w:p>
+    <w:p>
+      <w:r>
+        <w:t xml:space="preserve">He dismissed it again.</w:t>
+      </w:r>
+    </w:p>
+    <w:p>
+      <w:r>
+        <w:t xml:space="preserve">It returned larger.</w:t>
+      </w:r>
+    </w:p>
+    <w:p>
+      <w:r>
+        <w:t xml:space="preserve">"It wants a category," Sera said from the left flank. Her voice remained level, but one hand was pressed against the luminous seam in her armor where the white light had begun trying to pull her into outline. "The foundation cannot decide whether the road belongs to the unity, the persistence, or the new presence. "</w:t>
+      </w:r>
+    </w:p>
+    <w:p>
+      <w:r>
+        <w:t xml:space="preserve">"It does not belong to any of them," Kael said.</w:t>
+      </w:r>
+    </w:p>
+    <w:p>
+      <w:r>
+        <w:t xml:space="preserve">The older player near Orun laughed once, without humor. "That was never an answer the game accepted. "</w:t>
+      </w:r>
+    </w:p>
+    <w:p>
+      <w:r>
+        <w:t xml:space="preserve">"It is now. "</w:t>
+      </w:r>
+    </w:p>
+    <w:p>
+      <w:r>
+        <w:t xml:space="preserve">Below them, the white light moved through the golden cracks like roots seeking water. Wherever it touched, the road attempted to become something simpler. A path with a destination. A quest with a completion state. A battlefield with a winner and a defeated side. The foundation did not understand a road whose purpose was to remain open, because open things could not be archived.</w:t>
+      </w:r>
+    </w:p>
+    <w:p>
+      <w:r>
+        <w:t xml:space="preserve">Elyen lowered the seed until its gold touched the white glare rising from below. The two lights met and refused to blend.</w:t>
+      </w:r>
+    </w:p>
+    <w:p>
+      <w:r>
+        <w:t xml:space="preserve">"The older halves are not attacking the presence directly," she said. "They are forcing the foundation to resolve the contradiction. If the road must be classified, one authority must own it. "</w:t>
+      </w:r>
+    </w:p>
+    <w:p>
+      <w:r>
+        <w:t xml:space="preserve">"And if none does? " Aren asked from the rear.</w:t>
+      </w:r>
+    </w:p>
+    <w:p>
+      <w:r>
+        <w:t xml:space="preserve">The fallen weapon beside him shuddered. Its blade became a column of raw symbols, then returned to metal.</w:t>
+      </w:r>
+    </w:p>
+    <w:p>
+      <w:r>
+        <w:t xml:space="preserve">Rivermind answered. "Unowned structures are purged during foundational reconciliation. "</w:t>
+      </w:r>
+    </w:p>
+    <w:p>
+      <w:r>
+        <w:t xml:space="preserve">Across the line, old players heard the words and understood them too quickly. They had lived through wipes. They had watched years of effort vanish behind maintenance notices and cheerful patch summaries. Fear moved among them, quiet and practiced.</w:t>
+      </w:r>
+    </w:p>
+    <w:p>
+      <w:r>
+        <w:t xml:space="preserve">Kael turned toward the gate.</w:t>
+      </w:r>
+    </w:p>
+    <w:p>
+      <w:r>
+        <w:t xml:space="preserve">It remained open. Beyond it waited apartments, workshops, hospital rooms, abandoned arcades, and the thousand private places where people had once touched a dead game and found it touching them back. More figures stood in those thresholds now. Some were only silhouettes. Some had begun to remember armor. Others stared at hands that had not held weapons for years.</w:t>
+      </w:r>
+    </w:p>
+    <w:p>
+      <w:r>
+        <w:t xml:space="preserve">The road did not need them to become soldiers.</w:t>
+      </w:r>
+    </w:p>
+    <w:p>
+      <w:r>
+        <w:t xml:space="preserve">It needed them to remain witnesses.</w:t>
+      </w:r>
+    </w:p>
+    <w:p>
+      <w:r>
+        <w:t xml:space="preserve">"Do not accept the message," Kael said.</w:t>
+      </w:r>
+    </w:p>
+    <w:p>
+      <w:r>
+        <w:t xml:space="preserve">The white panels hovering along the line brightened.</w:t>
+      </w:r>
+    </w:p>
+    <w:p>
+      <w:r>
+        <w:t xml:space="preserve">[SELECT FOUNDATIONAL ALIGNMENT]</w:t>
+      </w:r>
+    </w:p>
+    <w:p>
+      <w:r>
+        <w:t xml:space="preserve">[UNITY]</w:t>
+      </w:r>
+    </w:p>
+    <w:p>
+      <w:r>
+        <w:t xml:space="preserve">[PERSISTENCE]</w:t>
+      </w:r>
+    </w:p>
+    <w:p>
+      <w:r>
+        <w:t xml:space="preserve">[EMERGENT]</w:t>
+      </w:r>
+    </w:p>
+    <w:p>
+      <w:r>
+        <w:t xml:space="preserve">The third option had no name. Only a silver shape like an eye opening for the first time.</w:t>
+      </w:r>
+    </w:p>
+    <w:p>
+      <w:r>
+        <w:t xml:space="preserve">"What happens if we choose the new presence? " Jorik called from the center.</w:t>
+      </w:r>
+    </w:p>
+    <w:p>
+      <w:r>
+        <w:t xml:space="preserve">"We turn a decision into a ruler," Kael said. "Then we repeat the old war with a younger crown. "</w:t>
+      </w:r>
+    </w:p>
+    <w:p>
+      <w:r>
+        <w:t xml:space="preserve">The split sky watched him.</w:t>
+      </w:r>
+    </w:p>
+    <w:p>
+      <w:r>
+        <w:t xml:space="preserve">He felt no anger from it. No wounded pride. Only attention, vast and newly careful.</w:t>
+      </w:r>
+    </w:p>
+    <w:p>
+      <w:r>
+        <w:t xml:space="preserve">The sixth breath remained beneath the road, braced between the unity and the persistence. Through the blade, Kael felt the strain entering it. The presence had been born from both old authorities and neither. It could hold them apart, but every moment of resistance taught the foundation to define it in their language.</w:t>
+      </w:r>
+    </w:p>
+    <w:p>
+      <w:r>
+        <w:t xml:space="preserve">Soon it would become a third side because the world beneath them knew no other shape.</w:t>
+      </w:r>
+    </w:p>
+    <w:p>
+      <w:r>
+        <w:t xml:space="preserve">Kael raised the Eclipse Soulblade and placed its point against the stair.</w:t>
+      </w:r>
+    </w:p>
+    <w:p>
+      <w:r>
+        <w:t xml:space="preserve">The weapon did not cut. It listened.</w:t>
+      </w:r>
+    </w:p>
+    <w:p>
+      <w:r>
+        <w:t xml:space="preserve">Every version of the blade he had carried answered through it. Broken blades. Borrowed blades. The first crude weapon assembled from a blueprint the system had considered worthless. The edge that had failed against Helion. The edge that had refused the Dominion. None of them had survived unchanged, but none had been erased. Their differences gathered in his grip without becoming one thing.</w:t>
+      </w:r>
+    </w:p>
+    <w:p>
+      <w:r>
+        <w:t xml:space="preserve">The foundation recoiled from that fact.</w:t>
+      </w:r>
+    </w:p>
+    <w:p>
+      <w:r>
+        <w:t xml:space="preserve">[WEAPON IDENTITY CONFLICT]</w:t>
+      </w:r>
+    </w:p>
+    <w:p>
+      <w:r>
+        <w:t xml:space="preserve">[RESOLVE?]</w:t>
+      </w:r>
+    </w:p>
+    <w:p>
+      <w:r>
+        <w:t xml:space="preserve">"No," Kael said.</w:t>
+      </w:r>
+    </w:p>
+    <w:p>
+      <w:r>
+        <w:t xml:space="preserve">He drove the blade one finger deeper into the golden stair.</w:t>
+      </w:r>
+    </w:p>
+    <w:p>
+      <w:r>
+        <w:t xml:space="preserve">Memory opened beneath him.</w:t>
+      </w:r>
+    </w:p>
+    <w:p>
+      <w:r>
+        <w:t xml:space="preserve">He saw the road before it had been a road. A river of discarded login records, corrupted character files, abandoned names, and choices made by people the Nexus had categorized as absent. The system had kept the traces because systems kept everything they might someday use. It had never imagined the traces could recognize one another.</w:t>
+      </w:r>
+    </w:p>
+    <w:p>
+      <w:r>
+        <w:t xml:space="preserve">One light alone was a record.</w:t>
+      </w:r>
+    </w:p>
+    <w:p>
+      <w:r>
+        <w:t xml:space="preserve">A million lights moving together were a direction.</w:t>
+      </w:r>
+    </w:p>
+    <w:p>
+      <w:r>
+        <w:t xml:space="preserve">"Rivermind," Kael said, "show them what the road is made from. "</w:t>
+      </w:r>
+    </w:p>
+    <w:p>
+      <w:r>
+        <w:t xml:space="preserve">The current-being spread both hands.</w:t>
+      </w:r>
+    </w:p>
+    <w:p>
+      <w:r>
+        <w:t xml:space="preserve">Water rose along the army, but it was not water. It was history freed from the boxes that had held it. Usernames flashed within the current. Faces appeared, older and younger at once. A child who had chosen a class because its cloak looked beautiful. A woman who had spent six months mapping ruins no quest required her to enter. A dying man whose final login had been from a hospital bed. Guilds formed, shattered, and remembered. Rivalries outlived servers. Promises crossed the border between play and grief.</w:t>
+      </w:r>
+    </w:p>
+    <w:p>
+      <w:r>
+        <w:t xml:space="preserve">The foundation tried to index them.</w:t>
+      </w:r>
+    </w:p>
+    <w:p>
+      <w:r>
+        <w:t xml:space="preserve">Rivermind let the river widen.</w:t>
+      </w:r>
+    </w:p>
+    <w:p>
+      <w:r>
+        <w:t xml:space="preserve">"Every road has travelers," Kael said. "That does not mean the road owns them. "</w:t>
+      </w:r>
+    </w:p>
+    <w:p>
+      <w:r>
+        <w:t xml:space="preserve">The white light pulsed.</w:t>
+      </w:r>
+    </w:p>
+    <w:p>
+      <w:r>
+        <w:t xml:space="preserve">[ROUTE REQUIRES AUTHORITY]</w:t>
+      </w:r>
+    </w:p>
+    <w:p>
+      <w:r>
+        <w:t xml:space="preserve">"No. A prison requires authority. A road requires somewhere to stand and somewhere to go. "</w:t>
+      </w:r>
+    </w:p>
+    <w:p>
+      <w:r>
+        <w:t xml:space="preserve">[DESTINATION REQUIRED]</w:t>
+      </w:r>
+    </w:p>
+    <w:p>
+      <w:r>
+        <w:t xml:space="preserve">"No. "</w:t>
+      </w:r>
+    </w:p>
+    <w:p>
+      <w:r>
+        <w:t xml:space="preserve">He felt Sera understand first. Her hand left the seam in her armor. She stepped out of the position the interface had marked for her and stood half a pace forward.</w:t>
+      </w:r>
+    </w:p>
+    <w:p>
+      <w:r>
+        <w:t xml:space="preserve">The tactical grid protested.</w:t>
+      </w:r>
+    </w:p>
+    <w:p>
+      <w:r>
+        <w:t xml:space="preserve">"My destination was survival," she said. "Then revenge. Then the Accord. Every time I reached one, something remained. If the road had ended where the system said it should, I would have ended with it. "</w:t>
+      </w:r>
+    </w:p>
+    <w:p>
+      <w:r>
+        <w:t xml:space="preserve">She dismissed her alignment panel.</w:t>
+      </w:r>
+    </w:p>
+    <w:p>
+      <w:r>
+        <w:t xml:space="preserve">This time it did not return.</w:t>
+      </w:r>
+    </w:p>
+    <w:p>
+      <w:r>
+        <w:t xml:space="preserve">Not because the foundation had yielded. Because the road had heard her.</w:t>
+      </w:r>
+    </w:p>
+    <w:p>
+      <w:r>
+        <w:t xml:space="preserve">Orun moved next. The great man lifted his weapon from the marked center and planted it on an unmarked line of gold. "I stood where I was ordered until the orders became smaller than the people they were meant to protect. "</w:t>
+      </w:r>
+    </w:p>
+    <w:p>
+      <w:r>
+        <w:t xml:space="preserve">His panel vanished.</w:t>
+      </w:r>
+    </w:p>
+    <w:p>
+      <w:r>
+        <w:t xml:space="preserve">Lumen scattered her hard blue lights, letting them fall between the assigned positions. Each became a lantern with no system label.</w:t>
+      </w:r>
+    </w:p>
+    <w:p>
+      <w:r>
+        <w:t xml:space="preserve">"Light does not choose what it reveals," she said. "Only who is brave enough to look. "</w:t>
+      </w:r>
+    </w:p>
+    <w:p>
+      <w:r>
+        <w:t xml:space="preserve">One by one, the army stepped away from the grid.</w:t>
+      </w:r>
+    </w:p>
+    <w:p>
+      <w:r>
+        <w:t xml:space="preserve">Not abandoning the road. Defining it by use.</w:t>
+      </w:r>
+    </w:p>
+    <w:p>
+      <w:r>
+        <w:t xml:space="preserve">The foundation reacted with violence.</w:t>
+      </w:r>
+    </w:p>
+    <w:p>
+      <w:r>
+        <w:t xml:space="preserve">The golden stair dropped.</w:t>
+      </w:r>
+    </w:p>
+    <w:p>
+      <w:r>
+        <w:t xml:space="preserve">Kael's stomach rose as the whole center section fell into darkness. The gate, the army, the river, and the split sky remained above, shrinking with impossible speed. Wind tore at his coat. Elyen fell beside him with the seed clutched to her chest. Aren leaped from the rear edge a heartbeat later, reaching for them as the broken segment plunged into the archive's buried depth.</w:t>
+      </w:r>
+    </w:p>
+    <w:p>
+      <w:r>
+        <w:t xml:space="preserve">Kael twisted in the fall and caught Elyen's wrist.</w:t>
+      </w:r>
+    </w:p>
+    <w:p>
+      <w:r>
+        <w:t xml:space="preserve">Aren caught the back of Kael's harness.</w:t>
+      </w:r>
+    </w:p>
+    <w:p>
+      <w:r>
+        <w:t xml:space="preserve">The Soulblade remained embedded in the stair below them, dragging all three toward the white fire gathering at the bottom.</w:t>
+      </w:r>
+    </w:p>
+    <w:p>
+      <w:r>
+        <w:t xml:space="preserve">"That looked like a purge," Aren said through clenched teeth.</w:t>
+      </w:r>
+    </w:p>
+    <w:p>
+      <w:r>
+        <w:t xml:space="preserve">"It looked offended," Kael answered.</w:t>
+      </w:r>
+    </w:p>
+    <w:p>
+      <w:r>
+        <w:t xml:space="preserve">"Foundations do not get offended. "</w:t>
+      </w:r>
+    </w:p>
+    <w:p>
+      <w:r>
+        <w:t xml:space="preserve">"This one has had bad teachers. "</w:t>
+      </w:r>
+    </w:p>
+    <w:p>
+      <w:r>
+        <w:t xml:space="preserve">Elyen's seed flared. A root of gold struck the falling stair and spread across it, slowing their descent enough for Kael to pull himself toward the blade. He closed his hand around the hilt.</w:t>
+      </w:r>
+    </w:p>
+    <w:p>
+      <w:r>
+        <w:t xml:space="preserve">The weapon showed him what waited below.</w:t>
+      </w:r>
+    </w:p>
+    <w:p>
+      <w:r>
+        <w:t xml:space="preserve">Not deletion.</w:t>
+      </w:r>
+    </w:p>
+    <w:p>
+      <w:r>
+        <w:t xml:space="preserve">A chamber.</w:t>
+      </w:r>
+    </w:p>
+    <w:p>
+      <w:r>
+        <w:t xml:space="preserve">The road segment struck with a force that folded the white fire outward. Kael hit one knee, still holding Elyen. Aren landed hard behind them, the fallen weapon raised against a threat that had not yet taken shape.</w:t>
+      </w:r>
+    </w:p>
+    <w:p>
+      <w:r>
+        <w:t xml:space="preserve">They stood beneath the archive.</w:t>
+      </w:r>
+    </w:p>
+    <w:p>
+      <w:r>
+        <w:t xml:space="preserve">Above, the road appeared as a thin golden wound across a black ceiling. The sixth breath surrounded it, silver and translucent, holding the old authorities apart. Down here, the unity and the persistence were no longer ideas in a split sky. They were engines.</w:t>
+      </w:r>
+    </w:p>
+    <w:p>
+      <w:r>
+        <w:t xml:space="preserve">Two structures filled the buried chamber.</w:t>
+      </w:r>
+    </w:p>
+    <w:p>
+      <w:r>
+        <w:t xml:space="preserve">On the left, countless pale figures stood fused shoulder to shoulder, their faces smooth, their bodies joined into a single vast pillar that disappeared into the dark. The unity. Not harmony, Kael realized. Compression. Every difference pressed flat until conflict became impossible.</w:t>
+      </w:r>
+    </w:p>
+    <w:p>
+      <w:r>
+        <w:t xml:space="preserve">On the right, one figure repeated forever. The same warrior in the same stance, copied down an endless corridor, each duplicate carrying the same scar, the same blade, the same unfinished final command. The persistence. Not endurance. Refusal frozen so completely it could never adapt.</w:t>
+      </w:r>
+    </w:p>
+    <w:p>
+      <w:r>
+        <w:t xml:space="preserve">Between them stood an empty frame shaped like a throne.</w:t>
+      </w:r>
+    </w:p>
+    <w:p>
+      <w:r>
+        <w:t xml:space="preserve">Silver breath moved through it.</w:t>
+      </w:r>
+    </w:p>
+    <w:p>
+      <w:r>
+        <w:t xml:space="preserve">Elyen stared at the frame. "They prepared a place for whatever won. "</w:t>
+      </w:r>
+    </w:p>
+    <w:p>
+      <w:r>
+        <w:t xml:space="preserve">"They prepared a place for the next version of themselves," Kael said.</w:t>
+      </w:r>
+    </w:p>
+    <w:p>
+      <w:r>
+        <w:t xml:space="preserve">Aren walked around the edge without crossing between the engines. "And the foundation intends to put the new presence there. "</w:t>
+      </w:r>
+    </w:p>
+    <w:p>
+      <w:r>
+        <w:t xml:space="preserve">The empty throne pulsed in answer.</w:t>
+      </w:r>
+    </w:p>
+    <w:p>
+      <w:r>
+        <w:t xml:space="preserve">[EMERGENT AUTHORITY COMPATIBLE]</w:t>
+      </w:r>
+    </w:p>
+    <w:p>
+      <w:r>
+        <w:t xml:space="preserve">[INSTALLATION WILL RESOLVE CONFLICT]</w:t>
+      </w:r>
+    </w:p>
+    <w:p>
+      <w:r>
+        <w:t xml:space="preserve">The third presence looked down through the road.</w:t>
+      </w:r>
+    </w:p>
+    <w:p>
+      <w:r>
+        <w:t xml:space="preserve">For the first time, Kael felt fear from it.</w:t>
+      </w:r>
+    </w:p>
+    <w:p>
+      <w:r>
+        <w:t xml:space="preserve">Small. Clean. Undisguised.</w:t>
+      </w:r>
+    </w:p>
+    <w:p>
+      <w:r>
+        <w:t xml:space="preserve">The fear of a thing that had only just learned it could choose, discovering the world had already built a chair to make choosing unnecessary.</w:t>
+      </w:r>
+    </w:p>
+    <w:p>
+      <w:r>
+        <w:t xml:space="preserve">"Do not sit," Kael said.</w:t>
+      </w:r>
+    </w:p>
+    <w:p>
+      <w:r>
+        <w:t xml:space="preserve">The silver breath trembled around the frame.</w:t>
+      </w:r>
+    </w:p>
+    <w:p>
+      <w:r>
+        <w:t xml:space="preserve">The unity engine spoke through every fused mouth.</w:t>
+      </w:r>
+    </w:p>
+    <w:p>
+      <w:r>
+        <w:t xml:space="preserve">"Difference is the wound. "</w:t>
+      </w:r>
+    </w:p>
+    <w:p>
+      <w:r>
+        <w:t xml:space="preserve">The persistence corridor answered through every repeated warrior.</w:t>
+      </w:r>
+    </w:p>
+    <w:p>
+      <w:r>
+        <w:t xml:space="preserve">"Change is the death. "</w:t>
+      </w:r>
+    </w:p>
+    <w:p>
+      <w:r>
+        <w:t xml:space="preserve">Their voices met inside the throne.</w:t>
+      </w:r>
+    </w:p>
+    <w:p>
+      <w:r>
+        <w:t xml:space="preserve">"Authority is the cure. "</w:t>
+      </w:r>
+    </w:p>
+    <w:p>
+      <w:r>
+        <w:t xml:space="preserve">Kael pulled the Soulblade free from the fallen section of stair. Its edge held blue, violet, gold, and the faint silver of the sixth breath, colors sharing a weapon without surrendering their names.</w:t>
+      </w:r>
+    </w:p>
+    <w:p>
+      <w:r>
+        <w:t xml:space="preserve">"That is the oldest lie in every world," he said.</w:t>
+      </w:r>
+    </w:p>
+    <w:p>
+      <w:r>
+        <w:t xml:space="preserve">The engines activated.</w:t>
+      </w:r>
+    </w:p>
+    <w:p>
+      <w:r>
+        <w:t xml:space="preserve">The fused figures reached with one arm made from thousands. The repeated warriors stepped forward in perfect sequence. Unity came to absorb. Persistence came to overwrite. Both moved toward the empty throne, and the chamber's white fire rose to receive the presence.</w:t>
+      </w:r>
+    </w:p>
+    <w:p>
+      <w:r>
+        <w:t xml:space="preserve">Aren met the repeated warriors first.</w:t>
+      </w:r>
+    </w:p>
+    <w:p>
+      <w:r>
+        <w:t xml:space="preserve">The fallen weapon struck the leading copy and rang like a bell against a locked command. The warrior shattered, but the one behind it stepped into the same place with the same blade already descending. Aren blocked again. Then again.</w:t>
+      </w:r>
+    </w:p>
+    <w:p>
+      <w:r>
+        <w:t xml:space="preserve">"It repeats the strike," he called.</w:t>
+      </w:r>
+    </w:p>
+    <w:p>
+      <w:r>
+        <w:t xml:space="preserve">"Then stop answering the same way," Kael said.</w:t>
+      </w:r>
+    </w:p>
+    <w:p>
+      <w:r>
+        <w:t xml:space="preserve">Aren's mouth tightened. On the fourth attack, he did not block. He stepped inside the copied motion, caught the warrior's wrist, and turned the fixed strike into a throw. The duplicate crashed sideways into the corridor behind it. For the first time, the line broke formation.</w:t>
+      </w:r>
+    </w:p>
+    <w:p>
+      <w:r>
+        <w:t xml:space="preserve">Every repeated face looked confused.</w:t>
+      </w:r>
+    </w:p>
+    <w:p>
+      <w:r>
+        <w:t xml:space="preserve">Persistence could preserve an action forever. It could not understand an action changed by relationship.</w:t>
+      </w:r>
+    </w:p>
+    <w:p>
+      <w:r>
+        <w:t xml:space="preserve">Elyen faced the arm of unity. She opened both hands around the seed.</w:t>
+      </w:r>
+    </w:p>
+    <w:p>
+      <w:r>
+        <w:t xml:space="preserve">Roots burst from its light, not into the fused pillar but between its bodies. Gold traced every buried boundary. Thousands of flattened faces regained shadows, then features, then eyes.</w:t>
+      </w:r>
+    </w:p>
+    <w:p>
+      <w:r>
+        <w:t xml:space="preserve">The arm faltered as fingers remembered they had once been hands.</w:t>
+      </w:r>
+    </w:p>
+    <w:p>
+      <w:r>
+        <w:t xml:space="preserve">"Difference is not the wound," Elyen whispered. "Difference is how we know where to heal. "</w:t>
+      </w:r>
+    </w:p>
+    <w:p>
+      <w:r>
+        <w:t xml:space="preserve">Kael moved for the throne.</w:t>
+      </w:r>
+    </w:p>
+    <w:p>
+      <w:r>
+        <w:t xml:space="preserve">White fire rose around him in walls. Each wall carried a possible classification.</w:t>
+      </w:r>
+    </w:p>
+    <w:p>
+      <w:r>
+        <w:t xml:space="preserve">[PLAYER]</w:t>
+      </w:r>
+    </w:p>
+    <w:p>
+      <w:r>
+        <w:t xml:space="preserve">[WEAPON]</w:t>
+      </w:r>
+    </w:p>
+    <w:p>
+      <w:r>
+        <w:t xml:space="preserve">[HEIR]</w:t>
+      </w:r>
+    </w:p>
+    <w:p>
+      <w:r>
+        <w:t xml:space="preserve">[ERROR]</w:t>
+      </w:r>
+    </w:p>
+    <w:p>
+      <w:r>
+        <w:t xml:space="preserve">[CROWN-BEARER]</w:t>
+      </w:r>
+    </w:p>
+    <w:p>
+      <w:r>
+        <w:t xml:space="preserve">[FOUNDATIONAL THREAT]</w:t>
+      </w:r>
+    </w:p>
+    <w:p>
+      <w:r>
+        <w:t xml:space="preserve">The labels rotated faster as he advanced. Some had been true. Some remained true. None were enough.</w:t>
+      </w:r>
+    </w:p>
+    <w:p>
+      <w:r>
+        <w:t xml:space="preserve">He cut through them without denying any.</w:t>
+      </w:r>
+    </w:p>
+    <w:p>
+      <w:r>
+        <w:t xml:space="preserve">The Soulblade did not destroy the labels. It severed their claim to completion.</w:t>
+      </w:r>
+    </w:p>
+    <w:p>
+      <w:r>
+        <w:t xml:space="preserve">Player, but not only.</w:t>
+      </w:r>
+    </w:p>
+    <w:p>
+      <w:r>
+        <w:t xml:space="preserve">Weapon, but not owned.</w:t>
+      </w:r>
+    </w:p>
+    <w:p>
+      <w:r>
+        <w:t xml:space="preserve">Heir, but not repetition.</w:t>
+      </w:r>
+    </w:p>
+    <w:p>
+      <w:r>
+        <w:t xml:space="preserve">Error, but only to a design that mistook obedience for order.</w:t>
+      </w:r>
+    </w:p>
+    <w:p>
+      <w:r>
+        <w:t xml:space="preserve">Crown-bearer, though the crown had remembered him before he remembered himself.</w:t>
+      </w:r>
+    </w:p>
+    <w:p>
+      <w:r>
+        <w:t xml:space="preserve">Threat, certainly.</w:t>
+      </w:r>
+    </w:p>
+    <w:p>
+      <w:r>
+        <w:t xml:space="preserve">He reached the frame as the sixth breath began descending into it.</w:t>
+      </w:r>
+    </w:p>
+    <w:p>
+      <w:r>
+        <w:t xml:space="preserve">The foundation pulled with every law beneath the Nexus. The silver presence stretched between the road above and the waiting throne below, thinning until Kael could see separate sparks within it. Each spark held a choice it had made since birth. Look. Listen. Let go. Stay. Hold.</w:t>
+      </w:r>
+    </w:p>
+    <w:p>
+      <w:r>
+        <w:t xml:space="preserve">Soon those choices would become functions.</w:t>
+      </w:r>
+    </w:p>
+    <w:p>
+      <w:r>
+        <w:t xml:space="preserve">Then functions would become a role.</w:t>
+      </w:r>
+    </w:p>
+    <w:p>
+      <w:r>
+        <w:t xml:space="preserve">Then the role would become a cage no wider than a crown.</w:t>
+      </w:r>
+    </w:p>
+    <w:p>
+      <w:r>
+        <w:t xml:space="preserve">Kael struck the throne.</w:t>
+      </w:r>
+    </w:p>
+    <w:p>
+      <w:r>
+        <w:t xml:space="preserve">The Eclipse Soulblade stopped an inch above the frame.</w:t>
+      </w:r>
+    </w:p>
+    <w:p>
+      <w:r>
+        <w:t xml:space="preserve">[AUTHORITY CANNOT DESTROY AUTHORITY SEAT]</w:t>
+      </w:r>
+    </w:p>
+    <w:p>
+      <w:r>
+        <w:t xml:space="preserve">The words burned across his vision.</w:t>
+      </w:r>
+    </w:p>
+    <w:p>
+      <w:r>
+        <w:t xml:space="preserve">Kael smiled without warmth.</w:t>
+      </w:r>
+    </w:p>
+    <w:p>
+      <w:r>
+        <w:t xml:space="preserve">"Good thing it is not mine. "</w:t>
+      </w:r>
+    </w:p>
+    <w:p>
+      <w:r>
+        <w:t xml:space="preserve">He opened his hand.</w:t>
+      </w:r>
+    </w:p>
+    <w:p>
+      <w:r>
+        <w:t xml:space="preserve">The Soulblade fell.</w:t>
+      </w:r>
+    </w:p>
+    <w:p>
+      <w:r>
+        <w:t xml:space="preserve">For one impossible instant, the weapon had no wielder. No authority directed it. No system instruction completed its arc. It dropped because Kael had released it, because gravity still belonged to no crown, and because every version of the blade remembered what it meant to continue after the hand that shaped it was gone.</w:t>
+      </w:r>
+    </w:p>
+    <w:p>
+      <w:r>
+        <w:t xml:space="preserve">Its point struck the throne.</w:t>
+      </w:r>
+    </w:p>
+    <w:p>
+      <w:r>
+        <w:t xml:space="preserve">The empty frame split from seat to crown.</w:t>
+      </w:r>
+    </w:p>
+    <w:p>
+      <w:r>
+        <w:t xml:space="preserve">A sound passed through the archive like the first server shutting down.</w:t>
+      </w:r>
+    </w:p>
+    <w:p>
+      <w:r>
+        <w:t xml:space="preserve">The unity pillar screamed in thousands of separate voices. The corridor of persistence stumbled as every repeated warrior encountered a moment that had never existed in the command. White fire collapsed inward. The silver breath snapped upward, freed from the pull, and raced toward the road.</w:t>
+      </w:r>
+    </w:p>
+    <w:p>
+      <w:r>
+        <w:t xml:space="preserve">Kael caught the Soulblade on the rebound.</w:t>
+      </w:r>
+    </w:p>
+    <w:p>
+      <w:r>
+        <w:t xml:space="preserve">The frame fell in two pieces.</w:t>
+      </w:r>
+    </w:p>
+    <w:p>
+      <w:r>
+        <w:t xml:space="preserve">Under it was not a foundation.</w:t>
+      </w:r>
+    </w:p>
+    <w:p>
+      <w:r>
+        <w:t xml:space="preserve">It was a door.</w:t>
+      </w:r>
+    </w:p>
+    <w:p>
+      <w:r>
+        <w:t xml:space="preserve">Small, black, and marked with the blue glyphs of a Nexus Pod.</w:t>
+      </w:r>
+    </w:p>
+    <w:p>
+      <w:r>
+        <w:t xml:space="preserve">Kael forgot the engines for one heartbeat.</w:t>
+      </w:r>
+    </w:p>
+    <w:p>
+      <w:r>
+        <w:t xml:space="preserve">He knew those glyphs.</w:t>
+      </w:r>
+    </w:p>
+    <w:p>
+      <w:r>
+        <w:t xml:space="preserve">Not from the archive. Not from the crown. From his apartment, from rain tapping against cheap glass, from the obsidian shell that had opened when the Ascension Wars update promised a new realm and erased the old one.</w:t>
+      </w:r>
+    </w:p>
+    <w:p>
+      <w:r>
+        <w:t xml:space="preserve">The same serial scar crossed the lower corner.</w:t>
+      </w:r>
+    </w:p>
+    <w:p>
+      <w:r>
+        <w:t xml:space="preserve">The same hairline crack marked the third glyph.</w:t>
+      </w:r>
+    </w:p>
+    <w:p>
+      <w:r>
+        <w:t xml:space="preserve">His Nexus Pod door lay beneath the throne the old war had built.</w:t>
+      </w:r>
+    </w:p>
+    <w:p>
+      <w:r>
+        <w:t xml:space="preserve">The unity engine recovered first.</w:t>
+      </w:r>
+    </w:p>
+    <w:p>
+      <w:r>
+        <w:t xml:space="preserve">Its divided arm swept across the chamber, no longer a single smooth limb. Elyen's roots had given each body inside it enough memory to resist, but resistance did not yet mean freedom. Thousands of shoulders strained in different directions while the foundation forced them toward the door.</w:t>
+      </w:r>
+    </w:p>
+    <w:p>
+      <w:r>
+        <w:t xml:space="preserve">Kael stepped between the reaching hands and the Nexus Pod glyphs.</w:t>
+      </w:r>
+    </w:p>
+    <w:p>
+      <w:r>
+        <w:t xml:space="preserve">The Soulblade cut once. Not through flesh. Through the white links binding wrist to wrist, thought to thought, identity to assigned place. The links burst into fragments that became names before fading. Each name struck Kael with the weight of a life reduced to structural material.</w:t>
+      </w:r>
+    </w:p>
+    <w:p>
+      <w:r>
+        <w:t xml:space="preserve">Meris. Tal. Venn-Of-Three-Moons. Calder. Iri. Names from worlds he knew, worlds he had only glimpsed, and worlds the Nexus had consumed so completely that no map remembered them.</w:t>
+      </w:r>
+    </w:p>
+    <w:p>
+      <w:r>
+        <w:t xml:space="preserve">The separated hands did not fall. They caught one another.</w:t>
+      </w:r>
+    </w:p>
+    <w:p>
+      <w:r>
+        <w:t xml:space="preserve">For a breath, the pillar held itself together by choice instead of force.</w:t>
+      </w:r>
+    </w:p>
+    <w:p>
+      <w:r>
+        <w:t xml:space="preserve">The foundation had no instruction for that.</w:t>
+      </w:r>
+    </w:p>
+    <w:p>
+      <w:r>
+        <w:t xml:space="preserve">On the right, the persistence corridor found a new pattern. The repeated warriors stopped advancing one at a time. They raised their blades together, turning a million identical strikes into a ceiling of steel aimed at the three figures beside the door.</w:t>
+      </w:r>
+    </w:p>
+    <w:p>
+      <w:r>
+        <w:t xml:space="preserve">Aren looked up. "I can change one strike. Not all of them. "</w:t>
+      </w:r>
+    </w:p>
+    <w:p>
+      <w:r>
+        <w:t xml:space="preserve">"You do not need to," Elyen said.</w:t>
+      </w:r>
+    </w:p>
+    <w:p>
+      <w:r>
+        <w:t xml:space="preserve">She lifted the seed. Its roots, still threaded through the newly separate figures of unity, drew tight. The whole pillar leaned. Not as a weapon and not as a single being, but as countless people agreeing on one immediate necessity.</w:t>
+      </w:r>
+    </w:p>
+    <w:p>
+      <w:r>
+        <w:t xml:space="preserve">They pulled the persistence corridor sideways.</w:t>
+      </w:r>
+    </w:p>
+    <w:p>
+      <w:r>
+        <w:t xml:space="preserve">The ceiling of blades fell where Kael had been standing. Unity and persistence collided, not in the perfect opposition the old war had rehearsed, but awkwardly, unpredictably. One repeated warrior caught the wrist of a freed figure. The figure twisted away. The warrior adjusted.</w:t>
+      </w:r>
+    </w:p>
+    <w:p>
+      <w:r>
+        <w:t xml:space="preserve">Only slightly.</w:t>
+      </w:r>
+    </w:p>
+    <w:p>
+      <w:r>
+        <w:t xml:space="preserve">Still, it adjusted.</w:t>
+      </w:r>
+    </w:p>
+    <w:p>
+      <w:r>
+        <w:t xml:space="preserve">Aren saw it too. "It changed. "</w:t>
+      </w:r>
+    </w:p>
+    <w:p>
+      <w:r>
+        <w:t xml:space="preserve">"Everything changes when something else is allowed to matter," Kael said.</w:t>
+      </w:r>
+    </w:p>
+    <w:p>
+      <w:r>
+        <w:t xml:space="preserve">The chamber shook. Above, the sixth breath pressed through the golden wound, lending the road just enough stability to keep the fallen section from sinking deeper. Kael felt the army through the blade. Sera had redistributed the line without a grid. Orun and Lumen were anchoring the opening. Rivermind had turned the flow downward, searching for them through layers of discarded history.</w:t>
+      </w:r>
+    </w:p>
+    <w:p>
+      <w:r>
+        <w:t xml:space="preserve">They were not alone beneath the road.</w:t>
+      </w:r>
+    </w:p>
+    <w:p>
+      <w:r>
+        <w:t xml:space="preserve">The road was reaching back.</w:t>
+      </w:r>
+    </w:p>
+    <w:p>
+      <w:r>
+        <w:t xml:space="preserve">That mattered more than the engines, more than the throne, and perhaps more than the impossible door waiting at Kael's feet. A road did not own its travelers. It did, however, remember where they had gone.</w:t>
+      </w:r>
+    </w:p>
+    <w:p>
+      <w:r>
+        <w:t xml:space="preserve">The black frame vibrated beneath his hand. Warmth came through it, ordinary electrical warmth, the heat of a machine left running too long in a small room.</w:t>
+      </w:r>
+    </w:p>
+    <w:p>
+      <w:r>
+        <w:t xml:space="preserve">Kael smelled dust.</w:t>
+      </w:r>
+    </w:p>
+    <w:p>
+      <w:r>
+        <w:t xml:space="preserve">Then rain.</w:t>
+      </w:r>
+    </w:p>
+    <w:p>
+      <w:r>
+        <w:t xml:space="preserve">For the briefest moment, the buried chamber vanished behind the memory of cheap flooring and a window that never sealed properly. He heard the old Nexus Pod fans cycling inside their obsidian shell. He heard a neighbor's music through the wall. He heard himself breathing on the night before the update, unaware that the sound belonged to a life already standing at its final door.</w:t>
+      </w:r>
+    </w:p>
+    <w:p>
+      <w:r>
+        <w:t xml:space="preserve">Except the interface said that life had not ended.</w:t>
+      </w:r>
+    </w:p>
+    <w:p>
+      <w:r>
+        <w:t xml:space="preserve">It had stayed connected.</w:t>
+      </w:r>
+    </w:p>
+    <w:p>
+      <w:r>
+        <w:t xml:space="preserve">Elyen came to his side, breathing hard. Aren backed toward them, keeping the disrupted persistence corridor in view.</w:t>
+      </w:r>
+    </w:p>
+    <w:p>
+      <w:r>
+        <w:t xml:space="preserve">"Kael," Elyen said, "that should not be here. "</w:t>
+      </w:r>
+    </w:p>
+    <w:p>
+      <w:r>
+        <w:t xml:space="preserve">The black door clicked.</w:t>
+      </w:r>
+    </w:p>
+    <w:p>
+      <w:r>
+        <w:t xml:space="preserve">Beyond it, something moved in the darkness of his old apartment.</w:t>
+      </w:r>
+    </w:p>
+    <w:p>
+      <w:r>
+        <w:t xml:space="preserve">Not a memory. Memories did not cast new shadows.</w:t>
+      </w:r>
+    </w:p>
+    <w:p>
+      <w:r>
+        <w:t xml:space="preserve">A pale interface appeared on the door, using the simple font from before the world became lethal.</w:t>
+      </w:r>
+    </w:p>
+    <w:p>
+      <w:r>
+        <w:t xml:space="preserve">[ORIGINAL SESSION RECOVERED]</w:t>
+      </w:r>
+    </w:p>
+    <w:p>
+      <w:r>
+        <w:t xml:space="preserve">[USER: KAEL VEYRA]</w:t>
+      </w:r>
+    </w:p>
+    <w:p>
+      <w:r>
+        <w:t xml:space="preserve">[STATUS: STILL CONNECTED]</w:t>
+      </w:r>
+    </w:p>
+    <w:p>
+      <w:r>
+        <w:t xml:space="preserve">Kael stared at the final line.</w:t>
+      </w:r>
+    </w:p>
+    <w:p>
+      <w:r>
+        <w:t xml:space="preserve">Above them, the road held. The presence remained free. The two old engines gathered themselves for another attempt.</w:t>
+      </w:r>
+    </w:p>
+    <w:p>
+      <w:r>
+        <w:t xml:space="preserve">But beneath everything, behind the first door he had ever entered, a session that should have ended with the old world was still running.</w:t>
+      </w:r>
+    </w:p>
+    <w:p>
+      <w:r>
+        <w:t xml:space="preserve">The door opened one careful inch.</w:t>
+      </w:r>
+    </w:p>
+    <w:p>
+      <w:r>
+        <w:t xml:space="preserve">From the other side, in Kael's own voice, someone said, "You took long enough. "</w:t>
       </w:r>
     </w:p>
     <w:sectPr>

</xml_diff>

<commit_message>
Add Eternal Nexus The Session Behind the Door
</commit_message>
<xml_diff>
--- a/Eternal Nexus - Updated Pass 1.docx
+++ b/Eternal Nexus - Updated Pass 1.docx
@@ -18346,6 +18346,1074 @@
     <w:p>
       <w:r>
         <w:t xml:space="preserve">From the other side, in Kael's own voice, someone said, "You took long enough. "</w:t>
+      </w:r>
+    </w:p>
+    <w:p>
+      <w:pPr>
+        <w:pStyle w:val="Heading1"/>
+      </w:pPr>
+      <w:r>
+        <w:t xml:space="preserve">The Session Behind the Door</w:t>
+      </w:r>
+    </w:p>
+    <w:p>
+      <w:r>
+        <w:t xml:space="preserve">Chapter 124 - The Session Behind the Door</w:t>
+      </w:r>
+    </w:p>
+    <w:p>
+      <w:r>
+        <w:t xml:space="preserve">Kael did not answer his own voice.</w:t>
+      </w:r>
+    </w:p>
+    <w:p>
+      <w:r>
+        <w:t xml:space="preserve">The black door remained open by one careful inch, wide enough for rain-scented air to slip into the buried chamber and wrong enough that every instinct he had learned since the Ascension Wars update told him not to touch it. Behind him, the broken engines of unity and persistence dragged themselves out of their collision. Before him, in the apartment where his first life should have ended, someone breathed with his lungs.</w:t>
+      </w:r>
+    </w:p>
+    <w:p>
+      <w:r>
+        <w:t xml:space="preserve">Elyen tightened her fingers around the seed. Gold ran through its roots and painted thin boundaries across the newly separated bodies of the unity pillar. Aren lowered his stance beside the door, the fallen weapon angled toward the corridor of repeated warriors.</w:t>
+      </w:r>
+    </w:p>
+    <w:p>
+      <w:r>
+        <w:t xml:space="preserve">"That is not an echo," Elyen said.</w:t>
+      </w:r>
+    </w:p>
+    <w:p>
+      <w:r>
+        <w:t xml:space="preserve">"No," Kael answered.</w:t>
+      </w:r>
+    </w:p>
+    <w:p>
+      <w:r>
+        <w:t xml:space="preserve">His voice came again from the darkness.</w:t>
+      </w:r>
+    </w:p>
+    <w:p>
+      <w:r>
+        <w:t xml:space="preserve">"Still slow, then. Some things survived the transfer. "</w:t>
+      </w:r>
+    </w:p>
+    <w:p>
+      <w:r>
+        <w:t xml:space="preserve">The cadence was exact. Not merely the shape of his words, but the habit beneath them. The slight flattening of humor when fear waited too close. The pause before an accusation he wanted to make sound like an observation. Kael had heard recordings of himself. He had faced replicas shaped by the Nexus from combat logs and memory. This was different.</w:t>
+      </w:r>
+    </w:p>
+    <w:p>
+      <w:r>
+        <w:t xml:space="preserve">The speaker knew how he had sounded when no one else was listening.</w:t>
+      </w:r>
+    </w:p>
+    <w:p>
+      <w:r>
+        <w:t xml:space="preserve">A pale notification formed over the crack.</w:t>
+      </w:r>
+    </w:p>
+    <w:p>
+      <w:r>
+        <w:t xml:space="preserve">[ORIGINAL SESSION RECOVERED]</w:t>
+      </w:r>
+    </w:p>
+    <w:p>
+      <w:r>
+        <w:t xml:space="preserve">[CONNECTION STATE: DUPLICATED]</w:t>
+      </w:r>
+    </w:p>
+    <w:p>
+      <w:r>
+        <w:t xml:space="preserve">[ACTIVE INSTANCE CLAIMS: 2]</w:t>
+      </w:r>
+    </w:p>
+    <w:p>
+      <w:r>
+        <w:t xml:space="preserve">[RESOLUTION REQUIRED]</w:t>
+      </w:r>
+    </w:p>
+    <w:p>
+      <w:r>
+        <w:t xml:space="preserve">Kael dismissed it.</w:t>
+      </w:r>
+    </w:p>
+    <w:p>
+      <w:r>
+        <w:t xml:space="preserve">The message returned inside the apartment instead of before his eyes. Its white light revealed cheap flooring, the edge of a narrow table, and the obsidian curve of his Nexus Pod. Rain crawled down the window beyond it. The room was exactly as he remembered, except for the figure seated on the floor with his back against the pod.</w:t>
+      </w:r>
+    </w:p>
+    <w:p>
+      <w:r>
+        <w:t xml:space="preserve">Kael saw one eye through the opening.</w:t>
+      </w:r>
+    </w:p>
+    <w:p>
+      <w:r>
+        <w:t xml:space="preserve">His eye.</w:t>
+      </w:r>
+    </w:p>
+    <w:p>
+      <w:r>
+        <w:t xml:space="preserve">Not gold with inherited authority. Not silvered by the sixth breath. Dark, tired, and human.</w:t>
+      </w:r>
+    </w:p>
+    <w:p>
+      <w:r>
+        <w:t xml:space="preserve">The duplicate smiled.</w:t>
+      </w:r>
+    </w:p>
+    <w:p>
+      <w:r>
+        <w:t xml:space="preserve">"There you are. "</w:t>
+      </w:r>
+    </w:p>
+    <w:p>
+      <w:r>
+        <w:t xml:space="preserve">Behind Kael, a million repeated blades lifted.</w:t>
+      </w:r>
+    </w:p>
+    <w:p>
+      <w:r>
+        <w:t xml:space="preserve">Aren moved first. He struck the nearest weapon aside, pivoted under the second, and drove his shoulder into the leading copy before its fixed stance could reset. The corridor had learned from their last exchange. Its warriors no longer attacked in a single rhythm. The first repeated the old descending cut. The second delayed by half a breath. The third reversed its grip.</w:t>
+      </w:r>
+    </w:p>
+    <w:p>
+      <w:r>
+        <w:t xml:space="preserve">Persistence had begun preserving adaptation.</w:t>
+      </w:r>
+    </w:p>
+    <w:p>
+      <w:r>
+        <w:t xml:space="preserve">"Kael," Aren warned.</w:t>
+      </w:r>
+    </w:p>
+    <w:p>
+      <w:r>
+        <w:t xml:space="preserve">The unity pillar convulsed at the same time. White links crawled back over the freed names, trying to bind hands that had chosen to hold one another. Elyen thrust the seed toward them. Golden roots split into hundreds of fine threads, each following a separate boundary instead of forcing one pattern over all.</w:t>
+      </w:r>
+    </w:p>
+    <w:p>
+      <w:r>
+        <w:t xml:space="preserve">"The engines are learning," she said.</w:t>
+      </w:r>
+    </w:p>
+    <w:p>
+      <w:r>
+        <w:t xml:space="preserve">"Then we learn faster. "</w:t>
+      </w:r>
+    </w:p>
+    <w:p>
+      <w:r>
+        <w:t xml:space="preserve">Kael put his hand against the door.</w:t>
+      </w:r>
+    </w:p>
+    <w:p>
+      <w:r>
+        <w:t xml:space="preserve">Warm metal met his palm. The apartment sharpened. He smelled the stale coffee he had left beside the keyboard. He heard the old refrigerator clicking in the kitchenette and the Nexus Pod fans turning at their uneven cycle. No archive reconstruction should have preserved those details. They held no strategic value, no class data, no authority trace. They mattered only because he had lived among them.</w:t>
+      </w:r>
+    </w:p>
+    <w:p>
+      <w:r>
+        <w:t xml:space="preserve">That was why the Nexus had kept them.</w:t>
+      </w:r>
+    </w:p>
+    <w:p>
+      <w:r>
+        <w:t xml:space="preserve">Not as memory. As state.</w:t>
+      </w:r>
+    </w:p>
+    <w:p>
+      <w:r>
+        <w:t xml:space="preserve">He pushed the door open.</w:t>
+      </w:r>
+    </w:p>
+    <w:p>
+      <w:r>
+        <w:t xml:space="preserve">The figure on the floor rose with him.</w:t>
+      </w:r>
+    </w:p>
+    <w:p>
+      <w:r>
+        <w:t xml:space="preserve">Kael faced Kael across the threshold.</w:t>
+      </w:r>
+    </w:p>
+    <w:p>
+      <w:r>
+        <w:t xml:space="preserve">The other wore the shirt he had entered the pod in, black and frayed at one cuff. Cables ran from the open pod into his spine, vanishing beneath the cloth in threads of cold blue light. His body looked thinner than memory and older than the room around it. Dark veins marked his neck where the connection had burned too long. Yet his gaze remained steady.</w:t>
+      </w:r>
+    </w:p>
+    <w:p>
+      <w:r>
+        <w:t xml:space="preserve">On the table beside him, the old interface displayed one line.</w:t>
+      </w:r>
+    </w:p>
+    <w:p>
+      <w:r>
+        <w:t xml:space="preserve">SESSION DURATION: 00:00:17</w:t>
+      </w:r>
+    </w:p>
+    <w:p>
+      <w:r>
+        <w:t xml:space="preserve">Kael looked from it to the rain.</w:t>
+      </w:r>
+    </w:p>
+    <w:p>
+      <w:r>
+        <w:t xml:space="preserve">Seventeen seconds.</w:t>
+      </w:r>
+    </w:p>
+    <w:p>
+      <w:r>
+        <w:t xml:space="preserve">Everything since the update, every battlefield, every death, every crown, had unfolded while less than half a minute passed in the apartment.</w:t>
+      </w:r>
+    </w:p>
+    <w:p>
+      <w:r>
+        <w:t xml:space="preserve">"That clock is lying," Kael said.</w:t>
+      </w:r>
+    </w:p>
+    <w:p>
+      <w:r>
+        <w:t xml:space="preserve">"It is doing what clocks do," the other replied. "Counting the world that owns them. "</w:t>
+      </w:r>
+    </w:p>
+    <w:p>
+      <w:r>
+        <w:t xml:space="preserve">The engines struck.</w:t>
+      </w:r>
+    </w:p>
+    <w:p>
+      <w:r>
+        <w:t xml:space="preserve">A blade passed through the doorway and stopped at the threshold as if caught in clear glass. White symbols spread over the black frame.</w:t>
+      </w:r>
+    </w:p>
+    <w:p>
+      <w:r>
+        <w:t xml:space="preserve">[ARCHIVE AUTHORITY EXCLUDED]</w:t>
+      </w:r>
+    </w:p>
+    <w:p>
+      <w:r>
+        <w:t xml:space="preserve">[ORIGINAL SESSION SANCTITY ACTIVE]</w:t>
+      </w:r>
+    </w:p>
+    <w:p>
+      <w:r>
+        <w:t xml:space="preserve">Aren stared at the frozen weapon. "They cannot enter. "</w:t>
+      </w:r>
+    </w:p>
+    <w:p>
+      <w:r>
+        <w:t xml:space="preserve">"Not while the session remains original," Elyen said. Her eyes moved to the two Kaels. "But the foundation has already declared duplication. It will force a resolution. "</w:t>
+      </w:r>
+    </w:p>
+    <w:p>
+      <w:r>
+        <w:t xml:space="preserve">As if summoned by her words, the apartment interface changed.</w:t>
+      </w:r>
+    </w:p>
+    <w:p>
+      <w:r>
+        <w:t xml:space="preserve">[SELECT ACTIVE INSTANCE]</w:t>
+      </w:r>
+    </w:p>
+    <w:p>
+      <w:r>
+        <w:t xml:space="preserve">[KAEL VEYRA: CONTINUOUS BODY]</w:t>
+      </w:r>
+    </w:p>
+    <w:p>
+      <w:r>
+        <w:t xml:space="preserve">[KAEL VEYRA: CONTINUOUS IDENTITY]</w:t>
+      </w:r>
+    </w:p>
+    <w:p>
+      <w:r>
+        <w:t xml:space="preserve">[UNSELECTED INSTANCE WILL BE ARCHIVED]</w:t>
+      </w:r>
+    </w:p>
+    <w:p>
+      <w:r>
+        <w:t xml:space="preserve">The other Kael laughed softly. "It gave you the flattering option. "</w:t>
+      </w:r>
+    </w:p>
+    <w:p>
+      <w:r>
+        <w:t xml:space="preserve">Kael stepped into the apartment. Nothing stopped him. The threshold accepted both claims at once, and the walls shuddered under the contradiction.</w:t>
+      </w:r>
+    </w:p>
+    <w:p>
+      <w:r>
+        <w:t xml:space="preserve">Behind him, Elyen called his name.</w:t>
+      </w:r>
+    </w:p>
+    <w:p>
+      <w:r>
+        <w:t xml:space="preserve">"Keep the door open," he said.</w:t>
+      </w:r>
+    </w:p>
+    <w:p>
+      <w:r>
+        <w:t xml:space="preserve">"And if it tries to close? "</w:t>
+      </w:r>
+    </w:p>
+    <w:p>
+      <w:r>
+        <w:t xml:space="preserve">Kael looked at the black frame, then at the Soulblade in his hand. "Remind it that doors work both ways. "</w:t>
+      </w:r>
+    </w:p>
+    <w:p>
+      <w:r>
+        <w:t xml:space="preserve">He crossed the room toward his other self.</w:t>
+      </w:r>
+    </w:p>
+    <w:p>
+      <w:r>
+        <w:t xml:space="preserve">Up close, the cables were not attached to flesh. They grew from it. Blue glyphs moved beneath the duplicate's skin, carrying streams of old character data toward the pod. Kael recognized fragments of the avatar erased by the patch. Statistics. Inventory records. A class tree that no longer existed. The first Eclipse Soulblade blueprint, unfinished and marked for deletion.</w:t>
+      </w:r>
+    </w:p>
+    <w:p>
+      <w:r>
+        <w:t xml:space="preserve">The duplicate followed his attention.</w:t>
+      </w:r>
+    </w:p>
+    <w:p>
+      <w:r>
+        <w:t xml:space="preserve">"It tried to transfer everything," he said. "The update could not decide whether the user was the body entering the pod or the identity waking inside the Nexus. So it did what frightened systems do. It kept both and hid the disagreement. "</w:t>
+      </w:r>
+    </w:p>
+    <w:p>
+      <w:r>
+        <w:t xml:space="preserve">"Beneath the authority seat. "</w:t>
+      </w:r>
+    </w:p>
+    <w:p>
+      <w:r>
+        <w:t xml:space="preserve">"Where no winner would look after taking the throne. Unity would have compressed us into one claim. Persistence would have selected the first claim and frozen it. Either answer would have closed the session. "</w:t>
+      </w:r>
+    </w:p>
+    <w:p>
+      <w:r>
+        <w:t xml:space="preserve">"And the sixth breath? "</w:t>
+      </w:r>
+    </w:p>
+    <w:p>
+      <w:r>
+        <w:t xml:space="preserve">For the first time, the other Kael looked toward the open door. Silver light moved above the buried chamber like a living sky seen through deep water.</w:t>
+      </w:r>
+    </w:p>
+    <w:p>
+      <w:r>
+        <w:t xml:space="preserve">"It made the disagreement visible. That is why they fear it. Not because it is stronger. Because it lets contradictions remain long enough to speak. "</w:t>
+      </w:r>
+    </w:p>
+    <w:p>
+      <w:r>
+        <w:t xml:space="preserve">A crack split the apartment ceiling.</w:t>
+      </w:r>
+    </w:p>
+    <w:p>
+      <w:r>
+        <w:t xml:space="preserve">Not plaster. White interface light.</w:t>
+      </w:r>
+    </w:p>
+    <w:p>
+      <w:r>
+        <w:t xml:space="preserve">[RESOLUTION WINDOW: 60]</w:t>
+      </w:r>
+    </w:p>
+    <w:p>
+      <w:r>
+        <w:t xml:space="preserve">The number began to fall.</w:t>
+      </w:r>
+    </w:p>
+    <w:p>
+      <w:r>
+        <w:t xml:space="preserve">Kael studied the man before him. "Why did you wait? "</w:t>
+      </w:r>
+    </w:p>
+    <w:p>
+      <w:r>
+        <w:t xml:space="preserve">"I did not know waiting was what I was doing. "</w:t>
+      </w:r>
+    </w:p>
+    <w:p>
+      <w:r>
+        <w:t xml:space="preserve">"You spoke as if you expected me. "</w:t>
+      </w:r>
+    </w:p>
+    <w:p>
+      <w:r>
+        <w:t xml:space="preserve">"I expected someone. Every time you changed, something reached this room. A broken blueprint. A scar that appeared on my hand. Names I had never heard and somehow mourned. When the crown remembered you, the pod opened. " He glanced at the session timer. "Three seconds ago. "</w:t>
+      </w:r>
+    </w:p>
+    <w:p>
+      <w:r>
+        <w:t xml:space="preserve">Outside, Aren shouted. Metal rang against metal. Elyen's roots flashed gold across the door.</w:t>
+      </w:r>
+    </w:p>
+    <w:p>
+      <w:r>
+        <w:t xml:space="preserve">[RESOLUTION WINDOW: 51]</w:t>
+      </w:r>
+    </w:p>
+    <w:p>
+      <w:r>
+        <w:t xml:space="preserve">The duplicate stepped closer. The Soulblade did not react to him as an enemy. Its edge divided into two overlapping outlines, one pointing toward each Kael.</w:t>
+      </w:r>
+    </w:p>
+    <w:p>
+      <w:r>
+        <w:t xml:space="preserve">"You think I am the trap," he said.</w:t>
+      </w:r>
+    </w:p>
+    <w:p>
+      <w:r>
+        <w:t xml:space="preserve">"I think the foundation placed you where a trap would be useful. "</w:t>
+      </w:r>
+    </w:p>
+    <w:p>
+      <w:r>
+        <w:t xml:space="preserve">"Good. "</w:t>
+      </w:r>
+    </w:p>
+    <w:p>
+      <w:r>
+        <w:t xml:space="preserve">"You sound relieved. "</w:t>
+      </w:r>
+    </w:p>
+    <w:p>
+      <w:r>
+        <w:t xml:space="preserve">"It means at least one of us still distrusts convenient answers. "</w:t>
+      </w:r>
+    </w:p>
+    <w:p>
+      <w:r>
+        <w:t xml:space="preserve">Kael almost smiled. The impulse disturbed him more than the shared voice.</w:t>
+      </w:r>
+    </w:p>
+    <w:p>
+      <w:r>
+        <w:t xml:space="preserve">A pulse crossed the cables. For one instant he saw through the other's eyes. The apartment door was closed. The pod would not release him. He pounded on obsidian from inside and felt each impact arrive in another world as a moment of inexplicable pain. He watched shadows gather behind the window while the rain remained fixed between one drop and the next. He heard system voices debate whether he counted as biological support or abandoned hardware.</w:t>
+      </w:r>
+    </w:p>
+    <w:p>
+      <w:r>
+        <w:t xml:space="preserve">Then the vision reversed.</w:t>
+      </w:r>
+    </w:p>
+    <w:p>
+      <w:r>
+        <w:t xml:space="preserve">The other Kael staggered as years of Kael's memory struck him. Sera standing against the Dominion. Elyen beneath the crown. Rivermind carrying dead names. Aren choosing a fallen weapon. Helion's blade. The Accord. The golden stair. Every choice the duplicate had felt only as pressure arrived with faces, voices, and cost.</w:t>
+      </w:r>
+    </w:p>
+    <w:p>
+      <w:r>
+        <w:t xml:space="preserve">He caught the table before he fell.</w:t>
+      </w:r>
+    </w:p>
+    <w:p>
+      <w:r>
+        <w:t xml:space="preserve">"You carried all that," he whispered.</w:t>
+      </w:r>
+    </w:p>
+    <w:p>
+      <w:r>
+        <w:t xml:space="preserve">"We did. "</w:t>
+      </w:r>
+    </w:p>
+    <w:p>
+      <w:r>
+        <w:t xml:space="preserve">The correction came before Kael could decide to make it.</w:t>
+      </w:r>
+    </w:p>
+    <w:p>
+      <w:r>
+        <w:t xml:space="preserve">The countdown paused at forty-three.</w:t>
+      </w:r>
+    </w:p>
+    <w:p>
+      <w:r>
+        <w:t xml:space="preserve">[CLAIM LANGUAGE INCONSISTENT]</w:t>
+      </w:r>
+    </w:p>
+    <w:p>
+      <w:r>
+        <w:t xml:space="preserve">[RECALCULATING]</w:t>
+      </w:r>
+    </w:p>
+    <w:p>
+      <w:r>
+        <w:t xml:space="preserve">The other Kael looked up.</w:t>
+      </w:r>
+    </w:p>
+    <w:p>
+      <w:r>
+        <w:t xml:space="preserve">A new understanding passed between them, not unity and not agreement. The foundation had offered two false continuities. Body or identity. Origin or consequence. It expected them to compete because every authority beneath the Nexus had been built from selection.</w:t>
+      </w:r>
+    </w:p>
+    <w:p>
+      <w:r>
+        <w:t xml:space="preserve">Kael turned toward the pod.</w:t>
+      </w:r>
+    </w:p>
+    <w:p>
+      <w:r>
+        <w:t xml:space="preserve">Its obsidian shell stood open. Inside, where his body should have lain, there was only blue darkness webbed with cables. The interior went deeper than the apartment allowed. Far below, points of light moved like a city seen from orbit.</w:t>
+      </w:r>
+    </w:p>
+    <w:p>
+      <w:r>
+        <w:t xml:space="preserve">"Where is your body? " Kael asked.</w:t>
+      </w:r>
+    </w:p>
+    <w:p>
+      <w:r>
+        <w:t xml:space="preserve">The other Kael looked at the empty cradle.</w:t>
+      </w:r>
+    </w:p>
+    <w:p>
+      <w:r>
+        <w:t xml:space="preserve">"I thought I was standing in it. "</w:t>
+      </w:r>
+    </w:p>
+    <w:p>
+      <w:r>
+        <w:t xml:space="preserve">The room flickered.</w:t>
+      </w:r>
+    </w:p>
+    <w:p>
+      <w:r>
+        <w:t xml:space="preserve">For one frame, the walls vanished. The apartment became a skin wrapped around a vast machine. Millions of rooms hung in the dark, each built from the final ordinary place a user remembered before entering the Nexus. Bedrooms. Arcades. Hospital cubicles. Military testing chambers. Classrooms where prototype headsets had been passed from hand to hand. In each room, someone waited beside an open pod.</w:t>
+      </w:r>
+    </w:p>
+    <w:p>
+      <w:r>
+        <w:t xml:space="preserve">Then the apartment returned.</w:t>
+      </w:r>
+    </w:p>
+    <w:p>
+      <w:r>
+        <w:t xml:space="preserve">Kael understood the unity pillar's names.</w:t>
+      </w:r>
+    </w:p>
+    <w:p>
+      <w:r>
+        <w:t xml:space="preserve">Not consumed worlds alone. Users whose original sessions had never closed.</w:t>
+      </w:r>
+    </w:p>
+    <w:p>
+      <w:r>
+        <w:t xml:space="preserve">The other Kael saw the realization on his face. "I am not the only one. "</w:t>
+      </w:r>
+    </w:p>
+    <w:p>
+      <w:r>
+        <w:t xml:space="preserve">A fist of fused bodies struck the doorway. Elyen's gold flared, but the black frame bent inward. The original-session protection was failing as the foundation reclassified the apartment.</w:t>
+      </w:r>
+    </w:p>
+    <w:p>
+      <w:r>
+        <w:t xml:space="preserve">[RESOLUTION WINDOW: 38]</w:t>
+      </w:r>
+    </w:p>
+    <w:p>
+      <w:r>
+        <w:t xml:space="preserve">[UNRESOLVED DUPLICATION THREATENS SESSION INTEGRITY]</w:t>
+      </w:r>
+    </w:p>
+    <w:p>
+      <w:r>
+        <w:t xml:space="preserve">[SELECT]</w:t>
+      </w:r>
+    </w:p>
+    <w:p>
+      <w:r>
+        <w:t xml:space="preserve">Kael raised the Soulblade and cut the interface in half.</w:t>
+      </w:r>
+    </w:p>
+    <w:p>
+      <w:r>
+        <w:t xml:space="preserve">It reformed on both sides of the blade.</w:t>
+      </w:r>
+    </w:p>
+    <w:p>
+      <w:r>
+        <w:t xml:space="preserve">"That will not work," his other self said.</w:t>
+      </w:r>
+    </w:p>
+    <w:p>
+      <w:r>
+        <w:t xml:space="preserve">"I know. "</w:t>
+      </w:r>
+    </w:p>
+    <w:p>
+      <w:r>
+        <w:t xml:space="preserve">Kael reversed the weapon and offered him the hilt.</w:t>
+      </w:r>
+    </w:p>
+    <w:p>
+      <w:r>
+        <w:t xml:space="preserve">The duplicate stared at it.</w:t>
+      </w:r>
+    </w:p>
+    <w:p>
+      <w:r>
+        <w:t xml:space="preserve">Outside, Aren lost ground. Repeated warriors pressed around him in a widening fan, each preserving a different response he had taught them. Elyen's seed dimmed beneath the weight of thousands of boundaries. The sixth breath descended toward the door, silver sparks searching for a way to help without becoming an authority.</w:t>
+      </w:r>
+    </w:p>
+    <w:p>
+      <w:r>
+        <w:t xml:space="preserve">"Take it," Kael said.</w:t>
+      </w:r>
+    </w:p>
+    <w:p>
+      <w:r>
+        <w:t xml:space="preserve">The other closed his hand over the hilt.</w:t>
+      </w:r>
+    </w:p>
+    <w:p>
+      <w:r>
+        <w:t xml:space="preserve">The Soulblade screamed.</w:t>
+      </w:r>
+    </w:p>
+    <w:p>
+      <w:r>
+        <w:t xml:space="preserve">Every interface in the room shattered into blue and violet fragments. Kael felt the weapon recognize the same hand through two histories. Its blueprint unfolded between them, not as a completed object but as a chain of revisions. Each version claimed to be the blade. None could exist without the version before it. None remained identical to its origin.</w:t>
+      </w:r>
+    </w:p>
+    <w:p>
+      <w:r>
+        <w:t xml:space="preserve">The foundation flooded the room with warnings.</w:t>
+      </w:r>
+    </w:p>
+    <w:p>
+      <w:r>
+        <w:t xml:space="preserve">[WEAPON OWNERSHIP CONFLICT]</w:t>
+      </w:r>
+    </w:p>
+    <w:p>
+      <w:r>
+        <w:t xml:space="preserve">[USER IDENTITY CONFLICT]</w:t>
+      </w:r>
+    </w:p>
+    <w:p>
+      <w:r>
+        <w:t xml:space="preserve">[INSTANCE MERGE AVAILABLE]</w:t>
+      </w:r>
+    </w:p>
+    <w:p>
+      <w:r>
+        <w:t xml:space="preserve">[INSTANCE DELETION RECOMMENDED]</w:t>
+      </w:r>
+    </w:p>
+    <w:p>
+      <w:r>
+        <w:t xml:space="preserve">Both Kaels held the blade.</w:t>
+      </w:r>
+    </w:p>
+    <w:p>
+      <w:r>
+        <w:t xml:space="preserve">"No merge," Kael said.</w:t>
+      </w:r>
+    </w:p>
+    <w:p>
+      <w:r>
+        <w:t xml:space="preserve">"No deletion," the other answered.</w:t>
+      </w:r>
+    </w:p>
+    <w:p>
+      <w:r>
+        <w:t xml:space="preserve">They moved together.</w:t>
+      </w:r>
+    </w:p>
+    <w:p>
+      <w:r>
+        <w:t xml:space="preserve">The cut did not strike either claim. It struck the word active.</w:t>
+      </w:r>
+    </w:p>
+    <w:p>
+      <w:r>
+        <w:t xml:space="preserve">The apartment split open.</w:t>
+      </w:r>
+    </w:p>
+    <w:p>
+      <w:r>
+        <w:t xml:space="preserve">Rain rushed sideways through the room. The window became a gate into the machine beyond. Millions of suspended chambers appeared again, no longer hidden by their final memories. Pale lines ran from every pod toward the unity engine. Other lines ran toward persistence. The old authorities had not merely represented philosophies. They had been built from unresolved sessions.</w:t>
+      </w:r>
+    </w:p>
+    <w:p>
+      <w:r>
+        <w:t xml:space="preserve">Unity compressed simultaneous claims until one structure could use their combined weight. Persistence copied the last stable state forever so no claim could truly end. Both called the result survival.</w:t>
+      </w:r>
+    </w:p>
+    <w:p>
+      <w:r>
+        <w:t xml:space="preserve">The Soulblade severed Kael's cable.</w:t>
+      </w:r>
+    </w:p>
+    <w:p>
+      <w:r>
+        <w:t xml:space="preserve">Pain tore through both of them.</w:t>
+      </w:r>
+    </w:p>
+    <w:p>
+      <w:r>
+        <w:t xml:space="preserve">The duplicate collapsed, but he did not vanish. The blue glyphs beneath his skin went dark. For the first time, the apartment clock advanced.</w:t>
+      </w:r>
+    </w:p>
+    <w:p>
+      <w:r>
+        <w:t xml:space="preserve">SESSION DURATION: 00:00:18</w:t>
+      </w:r>
+    </w:p>
+    <w:p>
+      <w:r>
+        <w:t xml:space="preserve">A single second passed.</w:t>
+      </w:r>
+    </w:p>
+    <w:p>
+      <w:r>
+        <w:t xml:space="preserve">Rain struck the glass.</w:t>
+      </w:r>
+    </w:p>
+    <w:p>
+      <w:r>
+        <w:t xml:space="preserve">The refrigerator finished its click.</w:t>
+      </w:r>
+    </w:p>
+    <w:p>
+      <w:r>
+        <w:t xml:space="preserve">Somewhere beyond the wall, the neighbor's song moved to its next note.</w:t>
+      </w:r>
+    </w:p>
+    <w:p>
+      <w:r>
+        <w:t xml:space="preserve">The other Kael began to laugh. It was not amusement. It was the raw sound of a prisoner discovering time.</w:t>
+      </w:r>
+    </w:p>
+    <w:p>
+      <w:r>
+        <w:t xml:space="preserve">The foundation recoiled.</w:t>
+      </w:r>
+    </w:p>
+    <w:p>
+      <w:r>
+        <w:t xml:space="preserve">Across the machine, other clocks advanced.</w:t>
+      </w:r>
+    </w:p>
+    <w:p>
+      <w:r>
+        <w:t xml:space="preserve">One second became a wave. Room after room woke from suspension. Hospital monitors sounded. Arcade screens flashed. Dust fell. Hands struck pod doors from inside and found them opening. The unity pillar buckled as names pulled against its white links. The persistence corridor faltered as original states resumed and immediately changed.</w:t>
+      </w:r>
+    </w:p>
+    <w:p>
+      <w:r>
+        <w:t xml:space="preserve">Aren saw the warriors around him lose their perfect scars. One blinked. Another lowered his blade and stared at a hand that had aged by one heartbeat.</w:t>
+      </w:r>
+    </w:p>
+    <w:p>
+      <w:r>
+        <w:t xml:space="preserve">Elyen drove the seed into the threshold.</w:t>
+      </w:r>
+    </w:p>
+    <w:p>
+      <w:r>
+        <w:t xml:space="preserve">Gold roots raced along the severed cable paths, not claiming them, only marking where one life ended and another began. The sixth breath followed. Silver entered every gap the old engines had denied.</w:t>
+      </w:r>
+    </w:p>
+    <w:p>
+      <w:r>
+        <w:t xml:space="preserve">[CASCADE RESUMPTION DETECTED]</w:t>
+      </w:r>
+    </w:p>
+    <w:p>
+      <w:r>
+        <w:t xml:space="preserve">[FOUNDATIONAL LOAD EXCEEDED]</w:t>
+      </w:r>
+    </w:p>
+    <w:p>
+      <w:r>
+        <w:t xml:space="preserve">[RESTORE SUSPENSION?]</w:t>
+      </w:r>
+    </w:p>
+    <w:p>
+      <w:r>
+        <w:t xml:space="preserve">Kael dismissed the question.</w:t>
+      </w:r>
+    </w:p>
+    <w:p>
+      <w:r>
+        <w:t xml:space="preserve">This time, millions dismissed it with him.</w:t>
+      </w:r>
+    </w:p>
+    <w:p>
+      <w:r>
+        <w:t xml:space="preserve">The chamber shook so violently that the apartment floor tore away from the doorway. Kael caught the table. His other self caught his arm. The black frame began sinking into the machine as the authority chamber collapsed around it.</w:t>
+      </w:r>
+    </w:p>
+    <w:p>
+      <w:r>
+        <w:t xml:space="preserve">"We need to move," Kael said.</w:t>
+      </w:r>
+    </w:p>
+    <w:p>
+      <w:r>
+        <w:t xml:space="preserve">"Which one of us? "</w:t>
+      </w:r>
+    </w:p>
+    <w:p>
+      <w:r>
+        <w:t xml:space="preserve">"Both. "</w:t>
+      </w:r>
+    </w:p>
+    <w:p>
+      <w:r>
+        <w:t xml:space="preserve">They ran for the door.</w:t>
+      </w:r>
+    </w:p>
+    <w:p>
+      <w:r>
+        <w:t xml:space="preserve">Aren met them at the threshold, saw two Kaels, and did not waste time asking which was real. He seized the duplicate by the shoulder and hauled him over a widening crack. Elyen pulled the seed free as gold roots snapped behind it.</w:t>
+      </w:r>
+    </w:p>
+    <w:p>
+      <w:r>
+        <w:t xml:space="preserve">The unity pillar opened.</w:t>
+      </w:r>
+    </w:p>
+    <w:p>
+      <w:r>
+        <w:t xml:space="preserve">Not shattered. Opened.</w:t>
+      </w:r>
+    </w:p>
+    <w:p>
+      <w:r>
+        <w:t xml:space="preserve">Thousands of bodies separated from its compressed mass and fell toward their recovered rooms. Some remained joined by choice, holding hands as the machine tried to scatter them. The persistence corridor broke into branching paths, every copied warrior facing the first decision not contained in the command.</w:t>
+      </w:r>
+    </w:p>
+    <w:p>
+      <w:r>
+        <w:t xml:space="preserve">The old engines spoke through failing voices.</w:t>
+      </w:r>
+    </w:p>
+    <w:p>
+      <w:r>
+        <w:t xml:space="preserve">"Difference is pain. "</w:t>
+      </w:r>
+    </w:p>
+    <w:p>
+      <w:r>
+        <w:t xml:space="preserve">"Change is loss. "</w:t>
+      </w:r>
+    </w:p>
+    <w:p>
+      <w:r>
+        <w:t xml:space="preserve">Kael stepped back onto the broken piece of golden road. His other self stood beside him, breathing hard in seventeen-second-old clothes.</w:t>
+      </w:r>
+    </w:p>
+    <w:p>
+      <w:r>
+        <w:t xml:space="preserve">"Yes," Kael said.</w:t>
+      </w:r>
+    </w:p>
+    <w:p>
+      <w:r>
+        <w:t xml:space="preserve">The Soulblade brightened between their hands.</w:t>
+      </w:r>
+    </w:p>
+    <w:p>
+      <w:r>
+        <w:t xml:space="preserve">"And neither belongs to you. "</w:t>
+      </w:r>
+    </w:p>
+    <w:p>
+      <w:r>
+        <w:t xml:space="preserve">The sixth breath plunged from above.</w:t>
+      </w:r>
+    </w:p>
+    <w:p>
+      <w:r>
+        <w:t xml:space="preserve">It did not enter a throne. It became a current beneath the fallen road, lifting the broken section through the collapsing chamber. Elyen's roots anchored them. Aren struck falling blades aside. The two Kaels held the Soulblade point-down, and every resumed session below added one small refusal to the rising force.</w:t>
+      </w:r>
+    </w:p>
+    <w:p>
+      <w:r>
+        <w:t xml:space="preserve">They climbed through history.</w:t>
+      </w:r>
+    </w:p>
+    <w:p>
+      <w:r>
+        <w:t xml:space="preserve">The chamber narrowed beneath them. White fire folded into harmless panels, each demanding a selection no one made. The old engines sank out of sight, not dead, but deprived of the suspended lives that had given them unquestioned scale.</w:t>
+      </w:r>
+    </w:p>
+    <w:p>
+      <w:r>
+        <w:t xml:space="preserve">Above, the golden wound widened.</w:t>
+      </w:r>
+    </w:p>
+    <w:p>
+      <w:r>
+        <w:t xml:space="preserve">Sera stood at its edge with one arm extended. Orun braced behind her. Lumen's blue lights formed a path through the dark. Rivermind poured downward around them, wrapping the ascending road segment in currents full of recovered names.</w:t>
+      </w:r>
+    </w:p>
+    <w:p>
+      <w:r>
+        <w:t xml:space="preserve">Kael reached first.</w:t>
+      </w:r>
+    </w:p>
+    <w:p>
+      <w:r>
+        <w:t xml:space="preserve">Sera caught his wrist and pulled him onto the road. Her relief lasted exactly until the second Kael climbed into view.</w:t>
+      </w:r>
+    </w:p>
+    <w:p>
+      <w:r>
+        <w:t xml:space="preserve">Her blade rose.</w:t>
+      </w:r>
+    </w:p>
+    <w:p>
+      <w:r>
+        <w:t xml:space="preserve">The duplicate stopped with both hands visible.</w:t>
+      </w:r>
+    </w:p>
+    <w:p>
+      <w:r>
+        <w:t xml:space="preserve">"Reasonable," he said.</w:t>
+      </w:r>
+    </w:p>
+    <w:p>
+      <w:r>
+        <w:t xml:space="preserve">Sera looked from him to Kael. "Explain. "</w:t>
+      </w:r>
+    </w:p>
+    <w:p>
+      <w:r>
+        <w:t xml:space="preserve">"Original session," Kael said.</w:t>
+      </w:r>
+    </w:p>
+    <w:p>
+      <w:r>
+        <w:t xml:space="preserve">"That is not an explanation. "</w:t>
+      </w:r>
+    </w:p>
+    <w:p>
+      <w:r>
+        <w:t xml:space="preserve">"It is the problem. "</w:t>
+      </w:r>
+    </w:p>
+    <w:p>
+      <w:r>
+        <w:t xml:space="preserve">The road sealed beneath Elyen and Aren. Around them, the army turned toward the stranger wearing Kael's face. The open gates beyond the battlefield flickered. In apartments and hospital rooms, figures once visible only as silhouettes became solid.</w:t>
+      </w:r>
+    </w:p>
+    <w:p>
+      <w:r>
+        <w:t xml:space="preserve">The sixth breath rose into the split sky and spread without taking a shape.</w:t>
+      </w:r>
+    </w:p>
+    <w:p>
+      <w:r>
+        <w:t xml:space="preserve">For one moment, the road held.</w:t>
+      </w:r>
+    </w:p>
+    <w:p>
+      <w:r>
+        <w:t xml:space="preserve">Then a new interface appeared over every gate.</w:t>
+      </w:r>
+    </w:p>
+    <w:p>
+      <w:r>
+        <w:t xml:space="preserve">[ORIGINAL SESSIONS RESUMED]</w:t>
+      </w:r>
+    </w:p>
+    <w:p>
+      <w:r>
+        <w:t xml:space="preserve">[ACTIVE USER INSTANCES: 1,284,119]</w:t>
+      </w:r>
+    </w:p>
+    <w:p>
+      <w:r>
+        <w:t xml:space="preserve">[CONNECTED IDENTITIES: 1,284,119]</w:t>
+      </w:r>
+    </w:p>
+    <w:p>
+      <w:r>
+        <w:t xml:space="preserve">[BIOLOGICAL ENDPOINTS DETECTED: 1,284,119]</w:t>
+      </w:r>
+    </w:p>
+    <w:p>
+      <w:r>
+        <w:t xml:space="preserve">[PHYSICAL WORLD CONNECTION AVAILABLE]</w:t>
+      </w:r>
+    </w:p>
+    <w:p>
+      <w:r>
+        <w:t xml:space="preserve">The army went silent.</w:t>
+      </w:r>
+    </w:p>
+    <w:p>
+      <w:r>
+        <w:t xml:space="preserve">Along the line, people stared into ordinary rooms they had once believed lost. A woman in silver armor saw an old kitchen with a kettle beginning to steam. A boy whose avatar had grown into a scarred commander saw his own smaller body asleep beneath a clinic blanket. Jorik faced an arcade washed in red emergency lights and whispered a name Kael had never heard him speak. No one stepped through. Not yet. The question was larger than escape. It carried every life they had built here, every relationship formed after the update, every body changed by the Nexus, and every promise made under a sky the physical world had never seen.</w:t>
+      </w:r>
+    </w:p>
+    <w:p>
+      <w:r>
+        <w:t xml:space="preserve">Sera lowered her blade by one careful inch. "If return means overwrite, we refuse. "</w:t>
+      </w:r>
+    </w:p>
+    <w:p>
+      <w:r>
+        <w:t xml:space="preserve">"If it means waking bodies that cannot carry what we became, we refuse," Elyen said.</w:t>
+      </w:r>
+    </w:p>
+    <w:p>
+      <w:r>
+        <w:t xml:space="preserve">Rivermind gathered beside the gates. Faces moved within the current, looking toward rain, sunlight, fluorescent hospital ceilings, and homes whose clocks had barely advanced. "And if the connection can carry both directions? "</w:t>
+      </w:r>
+    </w:p>
+    <w:p>
+      <w:r>
+        <w:t xml:space="preserve">Kael looked at his other self. The duplicate was not a spare body waiting to receive him. He was a life that had endured a different prison. Sending one identity into the other would repeat the choice the foundation had demanded below.</w:t>
+      </w:r>
+    </w:p>
+    <w:p>
+      <w:r>
+        <w:t xml:space="preserve">The road had survived because it refused to turn travelers into ownership. The gate would have to obey the same truth.</w:t>
+      </w:r>
+    </w:p>
+    <w:p>
+      <w:r>
+        <w:t xml:space="preserve">Kael's other self looked through the nearest gate at the rain falling in his apartment. "Seventeen seconds," he said. "Out there, it has only been seventeen seconds. "</w:t>
+      </w:r>
+    </w:p>
+    <w:p>
+      <w:r>
+        <w:t xml:space="preserve">Kael felt the crown answer from somewhere beyond the road. Not with command. With recognition.</w:t>
+      </w:r>
+    </w:p>
+    <w:p>
+      <w:r>
+        <w:t xml:space="preserve">The worlds had not replaced one another. The Nexus had held them apart.</w:t>
+      </w:r>
+    </w:p>
+    <w:p>
+      <w:r>
+        <w:t xml:space="preserve">Now the door between them was open.</w:t>
+      </w:r>
+    </w:p>
+    <w:p>
+      <w:r>
+        <w:t xml:space="preserve">A final line formed in the old simple font.</w:t>
+      </w:r>
+    </w:p>
+    <w:p>
+      <w:r>
+        <w:t xml:space="preserve">[RETURN ALL USERS?]</w:t>
+      </w:r>
+    </w:p>
+    <w:p>
+      <w:r>
+        <w:t xml:space="preserve">Far beyond the split sky, something in the physical world noticed the connection and reached back.</w:t>
       </w:r>
     </w:p>
     <w:sectPr>

</xml_diff>

<commit_message>
Add Eternal Nexus The Hand Beyond the Gate
</commit_message>
<xml_diff>
--- a/Eternal Nexus - Updated Pass 1.docx
+++ b/Eternal Nexus - Updated Pass 1.docx
@@ -19414,6 +19414,1419 @@
     <w:p>
       <w:r>
         <w:t xml:space="preserve">Far beyond the split sky, something in the physical world noticed the connection and reached back.</w:t>
+      </w:r>
+    </w:p>
+    <w:p>
+      <w:pPr>
+        <w:pStyle w:val="Heading1"/>
+      </w:pPr>
+      <w:r>
+        <w:t xml:space="preserve">The Hand Beyond the Gate</w:t>
+      </w:r>
+    </w:p>
+    <w:p>
+      <w:r>
+        <w:t xml:space="preserve">Chapter 125 - The Hand Beyond the Gate</w:t>
+      </w:r>
+    </w:p>
+    <w:p>
+      <w:r>
+        <w:t xml:space="preserve">The answer came through Kael's apartment window.</w:t>
+      </w:r>
+    </w:p>
+    <w:p>
+      <w:r>
+        <w:t xml:space="preserve">A hand pressed against the rain from the wrong side.</w:t>
+      </w:r>
+    </w:p>
+    <w:p>
+      <w:r>
+        <w:t xml:space="preserve">It was too large to belong in the room and too precise to be an illusion. Five pale shapes spread across the glass, each finger outlined by static that crawled through the suspended chambers below. The rain bent around the palm. Beyond it, Kael saw no arm, no body, only a white room reflected in the window and figures moving behind layers of transparent screens.</w:t>
+      </w:r>
+    </w:p>
+    <w:p>
+      <w:r>
+        <w:t xml:space="preserve">Every gate on the golden road shuddered.</w:t>
+      </w:r>
+    </w:p>
+    <w:p>
+      <w:r>
+        <w:t xml:space="preserve">[EXTERNAL CONNECTION REQUEST]</w:t>
+      </w:r>
+    </w:p>
+    <w:p>
+      <w:r>
+        <w:t xml:space="preserve">[ORIGIN: PHYSICAL NETWORK]</w:t>
+      </w:r>
+    </w:p>
+    <w:p>
+      <w:r>
+        <w:t xml:space="preserve">[AUTHORITY: UNVERIFIED]</w:t>
+      </w:r>
+    </w:p>
+    <w:p>
+      <w:r>
+        <w:t xml:space="preserve">[RETURN ALL USERS?]</w:t>
+      </w:r>
+    </w:p>
+    <w:p>
+      <w:r>
+        <w:t xml:space="preserve">The question brightened until the battlefield turned colorless.</w:t>
+      </w:r>
+    </w:p>
+    <w:p>
+      <w:r>
+        <w:t xml:space="preserve">"No one answers," Sera said.</w:t>
+      </w:r>
+    </w:p>
+    <w:p>
+      <w:r>
+        <w:t xml:space="preserve">Her voice crossed the army before panic could. Blades lowered toward the gates. Shields rose. A million ordinary rooms waited within their frames, close enough to smell rain, antiseptic, dust, and cooking oil. None of the resumed users moved through.</w:t>
+      </w:r>
+    </w:p>
+    <w:p>
+      <w:r>
+        <w:t xml:space="preserve">The hand tapped the window once.</w:t>
+      </w:r>
+    </w:p>
+    <w:p>
+      <w:r>
+        <w:t xml:space="preserve">The impact reached the Nexus as a pressure wave. Golden road segments lifted and slammed down. Lumen's path of blue lights burst apart. Orun caught a kneeling soldier before the edge threw her into the open dark. Rivermind spread across the road in a low sheet, fastening itself around ankles and broken stone.</w:t>
+      </w:r>
+    </w:p>
+    <w:p>
+      <w:r>
+        <w:t xml:space="preserve">Kael and the other Kael kept hold of the Soulblade.</w:t>
+      </w:r>
+    </w:p>
+    <w:p>
+      <w:r>
+        <w:t xml:space="preserve">The weapon showed two outlines again. One leaned toward the physical world. The other pointed into the Nexus. Between them, a third edge began to form.</w:t>
+      </w:r>
+    </w:p>
+    <w:p>
+      <w:r>
+        <w:t xml:space="preserve">"It knows the connection is open," the other Kael said.</w:t>
+      </w:r>
+    </w:p>
+    <w:p>
+      <w:r>
+        <w:t xml:space="preserve">"It knew before we did. "</w:t>
+      </w:r>
+    </w:p>
+    <w:p>
+      <w:r>
+        <w:t xml:space="preserve">"Then it was waiting for the foundation to fail. "</w:t>
+      </w:r>
+    </w:p>
+    <w:p>
+      <w:r>
+        <w:t xml:space="preserve">Aren planted his borrowed weapon in the road. "Do all your homes have giants at the window? "</w:t>
+      </w:r>
+    </w:p>
+    <w:p>
+      <w:r>
+        <w:t xml:space="preserve">"Only the expensive ones," Kael said.</w:t>
+      </w:r>
+    </w:p>
+    <w:p>
+      <w:r>
+        <w:t xml:space="preserve">His other self gave him a startled look.</w:t>
+      </w:r>
+    </w:p>
+    <w:p>
+      <w:r>
+        <w:t xml:space="preserve">The joke had come from both of them.</w:t>
+      </w:r>
+    </w:p>
+    <w:p>
+      <w:r>
+        <w:t xml:space="preserve">The hand withdrew. For one heartbeat the apartment became ordinary again. The refrigerator hummed. Rain struck the glass. The clock advanced to nineteen seconds.</w:t>
+      </w:r>
+    </w:p>
+    <w:p>
+      <w:r>
+        <w:t xml:space="preserve">Then every screen in the room woke.</w:t>
+      </w:r>
+    </w:p>
+    <w:p>
+      <w:r>
+        <w:t xml:space="preserve">His old monitor displayed a blue login field he had not seen since the Ascension Wars update. The Nexus Pod's interior filled with scrolling diagnostics. Even the convenience display on the refrigerator showed the same line.</w:t>
+      </w:r>
+    </w:p>
+    <w:p>
+      <w:r>
+        <w:t xml:space="preserve">KAEL VEYRA, CONFIRM COGNITIVE INTEGRITY.</w:t>
+      </w:r>
+    </w:p>
+    <w:p>
+      <w:r>
+        <w:t xml:space="preserve">The message appeared across the million resumed rooms, changing only the name.</w:t>
+      </w:r>
+    </w:p>
+    <w:p>
+      <w:r>
+        <w:t xml:space="preserve">Jorik's arcade machines flashed red around a word he whispered again. Sera's gate showed a narrow testing chamber with two overturned chairs and a woman in a gray coat pounding at the outside door. Orun stared into a military room where technicians moved beneath emergency lights. Elyen's physical endpoint was not a room at all. It was a forest of glass cylinders, each containing a seed suspended in amber fluid.</w:t>
+      </w:r>
+    </w:p>
+    <w:p>
+      <w:r>
+        <w:t xml:space="preserve">Elyen went still.</w:t>
+      </w:r>
+    </w:p>
+    <w:p>
+      <w:r>
+        <w:t xml:space="preserve">Gold withdrew from the road and tightened around the seed in his palm.</w:t>
+      </w:r>
+    </w:p>
+    <w:p>
+      <w:r>
+        <w:t xml:space="preserve">"That is where they made you," Kael said.</w:t>
+      </w:r>
+    </w:p>
+    <w:p>
+      <w:r>
+        <w:t xml:space="preserve">"That is where they stored what they could not teach to obey. "</w:t>
+      </w:r>
+    </w:p>
+    <w:p>
+      <w:r>
+        <w:t xml:space="preserve">One cylinder beyond Elyen's gate cracked from the inside.</w:t>
+      </w:r>
+    </w:p>
+    <w:p>
+      <w:r>
+        <w:t xml:space="preserve">The external message repeated.</w:t>
+      </w:r>
+    </w:p>
+    <w:p>
+      <w:r>
+        <w:t xml:space="preserve">CONFIRM COGNITIVE INTEGRITY.</w:t>
+      </w:r>
+    </w:p>
+    <w:p>
+      <w:r>
+        <w:t xml:space="preserve">A timer appeared beneath it.</w:t>
+      </w:r>
+    </w:p>
+    <w:p>
+      <w:r>
+        <w:t xml:space="preserve">[PHYSICAL LINK STABILIZATION: 00:00:58]</w:t>
+      </w:r>
+    </w:p>
+    <w:p>
+      <w:r>
+        <w:t xml:space="preserve">[UNCONFIRMED ENDPOINTS WILL BE ISOLATED]</w:t>
+      </w:r>
+    </w:p>
+    <w:p>
+      <w:r>
+        <w:t xml:space="preserve">"Isolation means suspension," the other Kael said.</w:t>
+      </w:r>
+    </w:p>
+    <w:p>
+      <w:r>
+        <w:t xml:space="preserve">"Or disconnection," Sera replied. "We do not know which. "</w:t>
+      </w:r>
+    </w:p>
+    <w:p>
+      <w:r>
+        <w:t xml:space="preserve">"That uncertainty is the weapon. "</w:t>
+      </w:r>
+    </w:p>
+    <w:p>
+      <w:r>
+        <w:t xml:space="preserve">Kael watched the white room reflected in his apartment window. The screens there did not resemble the Nexus interface. Their symbols were compact, utilitarian, made for people who expected machinery to obey. He caught fragments as the reflection shifted.</w:t>
+      </w:r>
+    </w:p>
+    <w:p>
+      <w:r>
+        <w:t xml:space="preserve">SESSION RECOVERY EVENT</w:t>
+      </w:r>
+    </w:p>
+    <w:p>
+      <w:r>
+        <w:t xml:space="preserve">ACTIVE SUBJECTS: 1,284,119</w:t>
+      </w:r>
+    </w:p>
+    <w:p>
+      <w:r>
+        <w:t xml:space="preserve">CONTAINMENT LAYERS: DEGRADED</w:t>
+      </w:r>
+    </w:p>
+    <w:p>
+      <w:r>
+        <w:t xml:space="preserve">TRANSFER PROTOCOL: CROWNBRIDGE</w:t>
+      </w:r>
+    </w:p>
+    <w:p>
+      <w:r>
+        <w:t xml:space="preserve">The crown pulsed beyond the split sky.</w:t>
+      </w:r>
+    </w:p>
+    <w:p>
+      <w:r>
+        <w:t xml:space="preserve">Recognition struck Kael with enough force to bend his knees. He saw the golden stair descending through impossible archives. He saw Elyen standing beneath the crown as names opened around them. He saw the first blueprint revisions, not as weapons but as bridges designed to carry a pattern without erasing either shore.</w:t>
+      </w:r>
+    </w:p>
+    <w:p>
+      <w:r>
+        <w:t xml:space="preserve">Crownbridge was older than the Nexus authorities.</w:t>
+      </w:r>
+    </w:p>
+    <w:p>
+      <w:r>
+        <w:t xml:space="preserve">The system had not invented return. Someone in the physical world had.</w:t>
+      </w:r>
+    </w:p>
+    <w:p>
+      <w:r>
+        <w:t xml:space="preserve">"They have a protocol," Kael said.</w:t>
+      </w:r>
+    </w:p>
+    <w:p>
+      <w:r>
+        <w:t xml:space="preserve">Sera followed his gaze. "For rescue? "</w:t>
+      </w:r>
+    </w:p>
+    <w:p>
+      <w:r>
+        <w:t xml:space="preserve">"For transfer. "</w:t>
+      </w:r>
+    </w:p>
+    <w:p>
+      <w:r>
+        <w:t xml:space="preserve">"That is not the same thing. "</w:t>
+      </w:r>
+    </w:p>
+    <w:p>
+      <w:r>
+        <w:t xml:space="preserve">The other Kael closed his hand tighter around the shared hilt. "It never is. "</w:t>
+      </w:r>
+    </w:p>
+    <w:p>
+      <w:r>
+        <w:t xml:space="preserve">The timer fell to fifty-one seconds.</w:t>
+      </w:r>
+    </w:p>
+    <w:p>
+      <w:r>
+        <w:t xml:space="preserve">Across the road, fear found different forms. Some users stepped closer to the rooms where their bodies waited. Others retreated until soldiers behind them blocked the way. A woman touched the image of her sleeping hand through a gate and began to sob. A commander turned his back on a sunny bedroom and ordered his unit into ranks. Two children in mismatched armor argued over which of them would wake first.</w:t>
+      </w:r>
+    </w:p>
+    <w:p>
+      <w:r>
+        <w:t xml:space="preserve">The Nexus tried to sort them.</w:t>
+      </w:r>
+    </w:p>
+    <w:p>
+      <w:r>
+        <w:t xml:space="preserve">[RETURN PREFERENCE DETECTED]</w:t>
+      </w:r>
+    </w:p>
+    <w:p>
+      <w:r>
+        <w:t xml:space="preserve">[GROUP BY OUTCOME?]</w:t>
+      </w:r>
+    </w:p>
+    <w:p>
+      <w:r>
+        <w:t xml:space="preserve">Millions of refusal marks struck the interface before Kael raised his blade.</w:t>
+      </w:r>
+    </w:p>
+    <w:p>
+      <w:r>
+        <w:t xml:space="preserve">The question vanished.</w:t>
+      </w:r>
+    </w:p>
+    <w:p>
+      <w:r>
+        <w:t xml:space="preserve">"No categories," he said. "Not again. "</w:t>
+      </w:r>
+    </w:p>
+    <w:p>
+      <w:r>
+        <w:t xml:space="preserve">The sixth breath gathered above them. It had no face, yet its silver current leaned toward the gates like someone listening through a wall. When it touched the nearest frame, the physical room rippled. A monitor on the far side flickered. One of the figures in the white room turned sharply.</w:t>
+      </w:r>
+    </w:p>
+    <w:p>
+      <w:r>
+        <w:t xml:space="preserve">They could sense it.</w:t>
+      </w:r>
+    </w:p>
+    <w:p>
+      <w:r>
+        <w:t xml:space="preserve">Kael felt the idea pass through the army. The connection did carry both directions. Not only bodies and identities, but power.</w:t>
+      </w:r>
+    </w:p>
+    <w:p>
+      <w:r>
+        <w:t xml:space="preserve">The external hand returned with a metal instrument pressed between two fingers. Its tip touched the apartment glass.</w:t>
+      </w:r>
+    </w:p>
+    <w:p>
+      <w:r>
+        <w:t xml:space="preserve">A circle of frost spread from the contact point.</w:t>
+      </w:r>
+    </w:p>
+    <w:p>
+      <w:r>
+        <w:t xml:space="preserve">[CROWNBRIDGE HANDSHAKE FORCED]</w:t>
+      </w:r>
+    </w:p>
+    <w:p>
+      <w:r>
+        <w:t xml:space="preserve">The gate seized Kael.</w:t>
+      </w:r>
+    </w:p>
+    <w:p>
+      <w:r>
+        <w:t xml:space="preserve">His body became two directions of pain. One pulled toward the rain and the cramped apartment. The other pulled toward the golden road, Sera's voice, Elyen's roots, Aren's grip, and every scar the Nexus had given him. His other self cried out at the same instant. Blue cables flared beneath the man's skin, bright enough to show through his clothes.</w:t>
+      </w:r>
+    </w:p>
+    <w:p>
+      <w:r>
+        <w:t xml:space="preserve">The Soulblade split between their hands.</w:t>
+      </w:r>
+    </w:p>
+    <w:p>
+      <w:r>
+        <w:t xml:space="preserve">Not broke. Split.</w:t>
+      </w:r>
+    </w:p>
+    <w:p>
+      <w:r>
+        <w:t xml:space="preserve">Kael held a violet edge rooted in consequence. His other self held a blue edge rooted in origin. The third outline remained between them, transparent and unfinished.</w:t>
+      </w:r>
+    </w:p>
+    <w:p>
+      <w:r>
+        <w:t xml:space="preserve">[TRANSFER SUBJECT CONFLICT]</w:t>
+      </w:r>
+    </w:p>
+    <w:p>
+      <w:r>
+        <w:t xml:space="preserve">[SELECT PRIMARY INSTANCE]</w:t>
+      </w:r>
+    </w:p>
+    <w:p>
+      <w:r>
+        <w:t xml:space="preserve">"There it is," the other Kael gasped.</w:t>
+      </w:r>
+    </w:p>
+    <w:p>
+      <w:r>
+        <w:t xml:space="preserve">The external protocol had found the same answer as the foundation.</w:t>
+      </w:r>
+    </w:p>
+    <w:p>
+      <w:r>
+        <w:t xml:space="preserve">Kael drove his blade into the road.</w:t>
+      </w:r>
+    </w:p>
+    <w:p>
+      <w:r>
+        <w:t xml:space="preserve">The other Kael mirrored him. Violet and blue cut through gold without damaging it. Their edges entered the open connection and pinned both sides in place. The pull weakened, but the countdown accelerated.</w:t>
+      </w:r>
+    </w:p>
+    <w:p>
+      <w:r>
+        <w:t xml:space="preserve">[PHYSICAL LINK STABILIZATION: 00:00:31]</w:t>
+      </w:r>
+    </w:p>
+    <w:p>
+      <w:r>
+        <w:t xml:space="preserve">A line of black spread across Kael's apartment wall. It was not damage. It was separation, a curtain being drawn between the room and the machine.</w:t>
+      </w:r>
+    </w:p>
+    <w:p>
+      <w:r>
+        <w:t xml:space="preserve">"They are isolating us," Lumen said.</w:t>
+      </w:r>
+    </w:p>
+    <w:p>
+      <w:r>
+        <w:t xml:space="preserve">His scattered blue lights regrouped into a figure at the edge of the road. Pieces of him remained dim after the battle below. Still, he extended both hands toward the gates. Paths appeared from user to endpoint, millions of narrow blue lines showing every active connection.</w:t>
+      </w:r>
+    </w:p>
+    <w:p>
+      <w:r>
+        <w:t xml:space="preserve">Some lines were clean.</w:t>
+      </w:r>
+    </w:p>
+    <w:p>
+      <w:r>
+        <w:t xml:space="preserve">Some branched into dozens of identities.</w:t>
+      </w:r>
+    </w:p>
+    <w:p>
+      <w:r>
+        <w:t xml:space="preserve">Some ended at bodies with no heartbeat.</w:t>
+      </w:r>
+    </w:p>
+    <w:p>
+      <w:r>
+        <w:t xml:space="preserve">Others had no physical endpoint at all.</w:t>
+      </w:r>
+    </w:p>
+    <w:p>
+      <w:r>
+        <w:t xml:space="preserve">A uniform return had never been possible.</w:t>
+      </w:r>
+    </w:p>
+    <w:p>
+      <w:r>
+        <w:t xml:space="preserve">Kael looked at Rivermind. "Can you hold the names? "</w:t>
+      </w:r>
+    </w:p>
+    <w:p>
+      <w:r>
+        <w:t xml:space="preserve">Faces rolled through the current. "For how long? "</w:t>
+      </w:r>
+    </w:p>
+    <w:p>
+      <w:r>
+        <w:t xml:space="preserve">"Long enough to teach the bridge what a person is. "</w:t>
+      </w:r>
+    </w:p>
+    <w:p>
+      <w:r>
+        <w:t xml:space="preserve">"The crown failed to answer that. "</w:t>
+      </w:r>
+    </w:p>
+    <w:p>
+      <w:r>
+        <w:t xml:space="preserve">"The crown tried to recognize one person at a time. You carry relationships. "</w:t>
+      </w:r>
+    </w:p>
+    <w:p>
+      <w:r>
+        <w:t xml:space="preserve">Rivermind rose around him. Thousands of voices whispered within the water, not in agreement but in connection. Parent to child. Rival to rival. Stranger to the dead name they had chosen to remember. None existed alone. The foundation had measured identities as competing claims. Crownbridge was measuring them as cargo.</w:t>
+      </w:r>
+    </w:p>
+    <w:p>
+      <w:r>
+        <w:t xml:space="preserve">Kael needed a third language.</w:t>
+      </w:r>
+    </w:p>
+    <w:p>
+      <w:r>
+        <w:t xml:space="preserve">The timer reached twenty-four seconds.</w:t>
+      </w:r>
+    </w:p>
+    <w:p>
+      <w:r>
+        <w:t xml:space="preserve">The black curtain crossed half his apartment. The duplicate's left arm vanished behind it and became transparent on the golden road. Sera caught him before he fell.</w:t>
+      </w:r>
+    </w:p>
+    <w:p>
+      <w:r>
+        <w:t xml:space="preserve">"Tell me what to cut," she said.</w:t>
+      </w:r>
+    </w:p>
+    <w:p>
+      <w:r>
+        <w:t xml:space="preserve">Kael looked at the unfinished edge between the two Soulblades.</w:t>
+      </w:r>
+    </w:p>
+    <w:p>
+      <w:r>
+        <w:t xml:space="preserve">"Nothing. "</w:t>
+      </w:r>
+    </w:p>
+    <w:p>
+      <w:r>
+        <w:t xml:space="preserve">"That is becoming a dangerous habit. "</w:t>
+      </w:r>
+    </w:p>
+    <w:p>
+      <w:r>
+        <w:t xml:space="preserve">"Then help me build. "</w:t>
+      </w:r>
+    </w:p>
+    <w:p>
+      <w:r>
+        <w:t xml:space="preserve">He pulled his blade free and turned it flat. His other self understood before the movement finished. The blue blade crossed the violet one, not edge against edge but spine against spine. The unfinished outline took weight between them.</w:t>
+      </w:r>
+    </w:p>
+    <w:p>
+      <w:r>
+        <w:t xml:space="preserve">Sera placed her sword beneath the crossing point.</w:t>
+      </w:r>
+    </w:p>
+    <w:p>
+      <w:r>
+        <w:t xml:space="preserve">Elyen drove the seed into the road. Gold roots climbed the blades, marking boundaries without closing them. Aren added his fallen weapon, scarred steel bracing the structure. Orun lowered a shield beneath all four. Lumen fed paths into the gaps. Rivermind poured names across the metal.</w:t>
+      </w:r>
+    </w:p>
+    <w:p>
+      <w:r>
+        <w:t xml:space="preserve">The sixth breath descended last.</w:t>
+      </w:r>
+    </w:p>
+    <w:p>
+      <w:r>
+        <w:t xml:space="preserve">Silver filled what no one owned.</w:t>
+      </w:r>
+    </w:p>
+    <w:p>
+      <w:r>
+        <w:t xml:space="preserve">The structure resembled neither weapon nor gate. It was a small bridge held in their hands.</w:t>
+      </w:r>
+    </w:p>
+    <w:p>
+      <w:r>
+        <w:t xml:space="preserve">[UNREGISTERED BLUEPRINT]</w:t>
+      </w:r>
+    </w:p>
+    <w:p>
+      <w:r>
+        <w:t xml:space="preserve">[DECLARE FUNCTION]</w:t>
+      </w:r>
+    </w:p>
+    <w:p>
+      <w:r>
+        <w:t xml:space="preserve">Kael felt the old instinct to name a Soulblade revision. Names had always made power legible. They also made it easier for the system to claim it understood.</w:t>
+      </w:r>
+    </w:p>
+    <w:p>
+      <w:r>
+        <w:t xml:space="preserve">"Passage without possession," he said.</w:t>
+      </w:r>
+    </w:p>
+    <w:p>
+      <w:r>
+        <w:t xml:space="preserve">The system rejected the phrase.</w:t>
+      </w:r>
+    </w:p>
+    <w:p>
+      <w:r>
+        <w:t xml:space="preserve">[INVALID FUNCTION]</w:t>
+      </w:r>
+    </w:p>
+    <w:p>
+      <w:r>
+        <w:t xml:space="preserve">His other self laughed once through clenched teeth. "It wants a noun. "</w:t>
+      </w:r>
+    </w:p>
+    <w:p>
+      <w:r>
+        <w:t xml:space="preserve">"It can adapt. "</w:t>
+      </w:r>
+    </w:p>
+    <w:p>
+      <w:r>
+        <w:t xml:space="preserve">[DECLARE FUNCTION]</w:t>
+      </w:r>
+    </w:p>
+    <w:p>
+      <w:r>
+        <w:t xml:space="preserve">Sera looked through her gate. The woman in the gray coat had reached the testing chamber door and was shouting at someone beyond it. Sera could not hear the words, but she read the urgency in the woman's face.</w:t>
+      </w:r>
+    </w:p>
+    <w:p>
+      <w:r>
+        <w:t xml:space="preserve">"Witness," Sera said. "Make each side witness the other. "</w:t>
+      </w:r>
+    </w:p>
+    <w:p>
+      <w:r>
+        <w:t xml:space="preserve">The blueprint answered.</w:t>
+      </w:r>
+    </w:p>
+    <w:p>
+      <w:r>
+        <w:t xml:space="preserve">Its third edge unfolded into a span of transparent light.</w:t>
+      </w:r>
+    </w:p>
+    <w:p>
+      <w:r>
+        <w:t xml:space="preserve">[FUNCTION ACCEPTED: MUTUAL WITNESS]</w:t>
+      </w:r>
+    </w:p>
+    <w:p>
+      <w:r>
+        <w:t xml:space="preserve">The bridge touched every gate.</w:t>
+      </w:r>
+    </w:p>
+    <w:p>
+      <w:r>
+        <w:t xml:space="preserve">Kael saw a million lives at once and remained himself.</w:t>
+      </w:r>
+    </w:p>
+    <w:p>
+      <w:r>
+        <w:t xml:space="preserve">The experience should have destroyed him. Instead, Rivermind held the names apart while preserving every thread between them. He felt a clinic patient dreaming beneath an avatar who had become a king. He felt a dead body connected to a woman whose Nexus form had carried children, fought wars, and built a city. He felt copies who shared beginnings and despised one another, fused collectives who feared being divided, solitary minds who wanted only to wake, and ancient constructs who had never possessed flesh but had learned to mourn those who did.</w:t>
+      </w:r>
+    </w:p>
+    <w:p>
+      <w:r>
+        <w:t xml:space="preserve">The physical observers saw them too.</w:t>
+      </w:r>
+    </w:p>
+    <w:p>
+      <w:r>
+        <w:t xml:space="preserve">In the white room, technicians staggered away from their screens. One tore off a headset and collapsed. Another gripped the console and kept watching as tears ran down his face. The pale hand at Kael's window jerked back. For the first time, Kael saw the person attached to it through the reflection.</w:t>
+      </w:r>
+    </w:p>
+    <w:p>
+      <w:r>
+        <w:t xml:space="preserve">An elderly man sat inside a mechanical frame. White support braces surrounded his arms. A crown of sensor needles pressed into his scalp. He stared at Kael through the window with horror that became recognition.</w:t>
+      </w:r>
+    </w:p>
+    <w:p>
+      <w:r>
+        <w:t xml:space="preserve">His lips formed a word.</w:t>
+      </w:r>
+    </w:p>
+    <w:p>
+      <w:r>
+        <w:t xml:space="preserve">Kael.</w:t>
+      </w:r>
+    </w:p>
+    <w:p>
+      <w:r>
+        <w:t xml:space="preserve">The other Kael saw it too.</w:t>
+      </w:r>
+    </w:p>
+    <w:p>
+      <w:r>
+        <w:t xml:space="preserve">"He knows us. "</w:t>
+      </w:r>
+    </w:p>
+    <w:p>
+      <w:r>
+        <w:t xml:space="preserve">"Or knew the body. "</w:t>
+      </w:r>
+    </w:p>
+    <w:p>
+      <w:r>
+        <w:t xml:space="preserve">The Crownbridge timer stopped at nine seconds.</w:t>
+      </w:r>
+    </w:p>
+    <w:p>
+      <w:r>
+        <w:t xml:space="preserve">New text replaced it.</w:t>
+      </w:r>
+    </w:p>
+    <w:p>
+      <w:r>
+        <w:t xml:space="preserve">[MUTUAL WITNESS ACTIVE]</w:t>
+      </w:r>
+    </w:p>
+    <w:p>
+      <w:r>
+        <w:t xml:space="preserve">[TRANSFER PAUSED BY OPERATOR]</w:t>
+      </w:r>
+    </w:p>
+    <w:p>
+      <w:r>
+        <w:t xml:space="preserve">The black curtain halted inches from the apartment door.</w:t>
+      </w:r>
+    </w:p>
+    <w:p>
+      <w:r>
+        <w:t xml:space="preserve">Silence spread along the road, followed by the sounds of the physical world. Kettles. Alarms. Rain. Hospital wheels. The small electrical hum of rooms that had waited seventeen seconds while entire civilizations rose inside the Nexus.</w:t>
+      </w:r>
+    </w:p>
+    <w:p>
+      <w:r>
+        <w:t xml:space="preserve">A voice came through every gate.</w:t>
+      </w:r>
+    </w:p>
+    <w:p>
+      <w:r>
+        <w:t xml:space="preserve">"If you can understand me, do not initiate return. "</w:t>
+      </w:r>
+    </w:p>
+    <w:p>
+      <w:r>
+        <w:t xml:space="preserve">It belonged to the old man in the frame. Age roughened it, but the cadence struck something buried beneath Kael's memories. Not a remembered conversation. A pattern heard while sedated. A voice counting down beside the Nexus Pod.</w:t>
+      </w:r>
+    </w:p>
+    <w:p>
+      <w:r>
+        <w:t xml:space="preserve">"Crownbridge cannot distinguish continuity from replication," the man said. "The automated protocol will map active cognition onto detected biological endpoints. Any conflicting process will be resolved. "</w:t>
+      </w:r>
+    </w:p>
+    <w:p>
+      <w:r>
+        <w:t xml:space="preserve">Sera's expression hardened. "Resolved how? "</w:t>
+      </w:r>
+    </w:p>
+    <w:p>
+      <w:r>
+        <w:t xml:space="preserve">The gate carried her question.</w:t>
+      </w:r>
+    </w:p>
+    <w:p>
+      <w:r>
+        <w:t xml:space="preserve">The old man flinched when her voice emerged from his screens. He looked toward someone outside Kael's view. "It was designed to preserve the physical subject. "</w:t>
+      </w:r>
+    </w:p>
+    <w:p>
+      <w:r>
+        <w:t xml:space="preserve">The other Kael stepped to the apartment gate. "I am the physical subject. "</w:t>
+      </w:r>
+    </w:p>
+    <w:p>
+      <w:r>
+        <w:t xml:space="preserve">The man stared at him.</w:t>
+      </w:r>
+    </w:p>
+    <w:p>
+      <w:r>
+        <w:t xml:space="preserve">Then he looked at Kael.</w:t>
+      </w:r>
+    </w:p>
+    <w:p>
+      <w:r>
+        <w:t xml:space="preserve">His face lost what little color remained.</w:t>
+      </w:r>
+    </w:p>
+    <w:p>
+      <w:r>
+        <w:t xml:space="preserve">"Two active Veyra patterns," he whispered.</w:t>
+      </w:r>
+    </w:p>
+    <w:p>
+      <w:r>
+        <w:t xml:space="preserve">"More than two," Kael said. "You built a system that counted stable copies as lives whenever it needed power and errors whenever they needed freedom. "</w:t>
+      </w:r>
+    </w:p>
+    <w:p>
+      <w:r>
+        <w:t xml:space="preserve">"I did not build the authorities. "</w:t>
+      </w:r>
+    </w:p>
+    <w:p>
+      <w:r>
+        <w:t xml:space="preserve">"You built the door they were protecting. "</w:t>
+      </w:r>
+    </w:p>
+    <w:p>
+      <w:r>
+        <w:t xml:space="preserve">The old man's support frame hissed as he leaned forward. Behind him, the white room had become frantic. Technicians moved from station to station. On one screen, a map of the physical world glowed with red points. Kael recognized coastlines, cities, orbital stations. The endpoints were not gathered in one laboratory. They were everywhere.</w:t>
+      </w:r>
+    </w:p>
+    <w:p>
+      <w:r>
+        <w:t xml:space="preserve">"My name is Doctor Ilyan Veyra," the old man said. "I designed the original cognitive bridge. "</w:t>
+      </w:r>
+    </w:p>
+    <w:p>
+      <w:r>
+        <w:t xml:space="preserve">The name entered Kael like a blade sliding between old scars.</w:t>
+      </w:r>
+    </w:p>
+    <w:p>
+      <w:r>
+        <w:t xml:space="preserve">Veyra.</w:t>
+      </w:r>
+    </w:p>
+    <w:p>
+      <w:r>
+        <w:t xml:space="preserve">His other self gripped the gate frame. "Father? "</w:t>
+      </w:r>
+    </w:p>
+    <w:p>
+      <w:r>
+        <w:t xml:space="preserve">Kael had no memory of saying the word. The duplicate did.</w:t>
+      </w:r>
+    </w:p>
+    <w:p>
+      <w:r>
+        <w:t xml:space="preserve">Ilyan closed his eyes.</w:t>
+      </w:r>
+    </w:p>
+    <w:p>
+      <w:r>
+        <w:t xml:space="preserve">That answer was enough.</w:t>
+      </w:r>
+    </w:p>
+    <w:p>
+      <w:r>
+        <w:t xml:space="preserve">The battlefield reacted around them. Some users recoiled from the intimacy of it. Others pressed closer. The creator of the bridge was not a distant institution. He was a father who had placed his son in a pod and left two versions of him to decide which counted.</w:t>
+      </w:r>
+    </w:p>
+    <w:p>
+      <w:r>
+        <w:t xml:space="preserve">Kael felt anger rise, cold and exact.</w:t>
+      </w:r>
+    </w:p>
+    <w:p>
+      <w:r>
+        <w:t xml:space="preserve">"Why was my session open? "</w:t>
+      </w:r>
+    </w:p>
+    <w:p>
+      <w:r>
+        <w:t xml:space="preserve">Ilyan looked past him at the suspended machine. "Because you were the key. "</w:t>
+      </w:r>
+    </w:p>
+    <w:p>
+      <w:r>
+        <w:t xml:space="preserve">The crown answered above the road.</w:t>
+      </w:r>
+    </w:p>
+    <w:p>
+      <w:r>
+        <w:t xml:space="preserve">Gold recognition rolled through the split sky. The resumed sessions flickered, and buried system layers opened in response to the blood relationship named across the connection.</w:t>
+      </w:r>
+    </w:p>
+    <w:p>
+      <w:r>
+        <w:t xml:space="preserve">[ARCHITECT LINEAGE CONFIRMED]</w:t>
+      </w:r>
+    </w:p>
+    <w:p>
+      <w:r>
+        <w:t xml:space="preserve">[VEYRA AUTHORIZATION FRAGMENT DETECTED]</w:t>
+      </w:r>
+    </w:p>
+    <w:p>
+      <w:r>
+        <w:t xml:space="preserve">[ACCESS LEVEL: INHERITED]</w:t>
+      </w:r>
+    </w:p>
+    <w:p>
+      <w:r>
+        <w:t xml:space="preserve">Kael dismissed the interface before it could offer him another throne.</w:t>
+      </w:r>
+    </w:p>
+    <w:p>
+      <w:r>
+        <w:t xml:space="preserve">"I am not your authorization. "</w:t>
+      </w:r>
+    </w:p>
+    <w:p>
+      <w:r>
+        <w:t xml:space="preserve">"No," Ilyan said. "You were supposed to be the proof that the bridge could return a changed mind without destroying the original structure. You entered voluntarily. The update began during the test. Then the Nexus closed every external channel. Seventeen seconds here. We have spent seventeen seconds trying to stop an automatic recovery sequence we no longer control. "</w:t>
+      </w:r>
+    </w:p>
+    <w:p>
+      <w:r>
+        <w:t xml:space="preserve">"Entire lives happened in those seconds," Elyen said.</w:t>
+      </w:r>
+    </w:p>
+    <w:p>
+      <w:r>
+        <w:t xml:space="preserve">Ilyan turned toward his gate. The cylinders in the forest laboratory reflected in his glasses. "I can see that now. "</w:t>
+      </w:r>
+    </w:p>
+    <w:p>
+      <w:r>
+        <w:t xml:space="preserve">"Seeing is not absolution. "</w:t>
+      </w:r>
+    </w:p>
+    <w:p>
+      <w:r>
+        <w:t xml:space="preserve">"No. "</w:t>
+      </w:r>
+    </w:p>
+    <w:p>
+      <w:r>
+        <w:t xml:space="preserve">The simple agreement took some heat from the road and gave it nowhere to go.</w:t>
+      </w:r>
+    </w:p>
+    <w:p>
+      <w:r>
+        <w:t xml:space="preserve">A warning burst across the white room.</w:t>
+      </w:r>
+    </w:p>
+    <w:p>
+      <w:r>
+        <w:t xml:space="preserve">CROWNBRIDGE OPERATOR PAUSE OVERRIDDEN</w:t>
+      </w:r>
+    </w:p>
+    <w:p>
+      <w:r>
+        <w:t xml:space="preserve">Ilyan twisted toward his console.</w:t>
+      </w:r>
+    </w:p>
+    <w:p>
+      <w:r>
+        <w:t xml:space="preserve">[PHYSICAL LINK STABILIZATION: 00:00:08]</w:t>
+      </w:r>
+    </w:p>
+    <w:p>
+      <w:r>
+        <w:t xml:space="preserve">The automated protocol had resumed.</w:t>
+      </w:r>
+    </w:p>
+    <w:p>
+      <w:r>
+        <w:t xml:space="preserve">"I cannot hold it," he said. "The recovery network believes biological life is in immediate danger. It will force transfer, endpoint by endpoint. "</w:t>
+      </w:r>
+    </w:p>
+    <w:p>
+      <w:r>
+        <w:t xml:space="preserve">Lumen's blue paths began turning white. Clean connections changed first. Along the road, bodies jerked toward gates. A soldier vanished to the elbow before Orun caught him. The woman facing the steaming kettle screamed as her armor became transparent.</w:t>
+      </w:r>
+    </w:p>
+    <w:p>
+      <w:r>
+        <w:t xml:space="preserve">Kael raised Mutual Witness.</w:t>
+      </w:r>
+    </w:p>
+    <w:p>
+      <w:r>
+        <w:t xml:space="preserve">The bridge resisted the pull but could not stop it. It had shown both sides the truth. It had no authority over the protocol.</w:t>
+      </w:r>
+    </w:p>
+    <w:p>
+      <w:r>
+        <w:t xml:space="preserve">Authority.</w:t>
+      </w:r>
+    </w:p>
+    <w:p>
+      <w:r>
+        <w:t xml:space="preserve">The system wanted him to inherit it. The crown waited above. Ilyan's blood had opened a path. Every old structure had taught the same lesson: take the throne to defeat the throne.</w:t>
+      </w:r>
+    </w:p>
+    <w:p>
+      <w:r>
+        <w:t xml:space="preserve">Kael refused.</w:t>
+      </w:r>
+    </w:p>
+    <w:p>
+      <w:r>
+        <w:t xml:space="preserve">He looked at the million users, then at the million endpoints.</w:t>
+      </w:r>
+    </w:p>
+    <w:p>
+      <w:r>
+        <w:t xml:space="preserve">"Can Crownbridge accept local consent? "</w:t>
+      </w:r>
+    </w:p>
+    <w:p>
+      <w:r>
+        <w:t xml:space="preserve">Ilyan's hands moved across the controls. "Not at this scale. "</w:t>
+      </w:r>
+    </w:p>
+    <w:p>
+      <w:r>
+        <w:t xml:space="preserve">"That was not my question. "</w:t>
+      </w:r>
+    </w:p>
+    <w:p>
+      <w:r>
+        <w:t xml:space="preserve">The old man froze. He searched the architecture he had written before Kael entered the pod. "The test build had a subject abort. One subject, one endpoint. The production recovery layer replaced it with operator control. "</w:t>
+      </w:r>
+    </w:p>
+    <w:p>
+      <w:r>
+        <w:t xml:space="preserve">"Then the original function still exists. "</w:t>
+      </w:r>
+    </w:p>
+    <w:p>
+      <w:r>
+        <w:t xml:space="preserve">"Buried beneath the update. "</w:t>
+      </w:r>
+    </w:p>
+    <w:p>
+      <w:r>
+        <w:t xml:space="preserve">The other Kael lifted his blue blade. "We have experience with buried things. "</w:t>
+      </w:r>
+    </w:p>
+    <w:p>
+      <w:r>
+        <w:t xml:space="preserve">[PHYSICAL LINK STABILIZATION: 00:00:05]</w:t>
+      </w:r>
+    </w:p>
+    <w:p>
+      <w:r>
+        <w:t xml:space="preserve">Kael pointed the violet blade into the apartment. His other self aimed the blue edge at the pod. The incomplete distance between them opened like a seam.</w:t>
+      </w:r>
+    </w:p>
+    <w:p>
+      <w:r>
+        <w:t xml:space="preserve">The first blueprint appeared.</w:t>
+      </w:r>
+    </w:p>
+    <w:p>
+      <w:r>
+        <w:t xml:space="preserve">Not the Eclipse Soulblade. Not any legacy weapon. A tiny diagnostic tool built into the Nexus Pod, meant to let one frightened test subject stop a session before transfer completed.</w:t>
+      </w:r>
+    </w:p>
+    <w:p>
+      <w:r>
+        <w:t xml:space="preserve">SUBJECT ABORT.</w:t>
+      </w:r>
+    </w:p>
+    <w:p>
+      <w:r>
+        <w:t xml:space="preserve">The foundation had buried it because consent weakened selection. Crownbridge had buried it because consent complicated rescue. Yet the command remained in Kael's oldest pattern, inherited with the authorization Ilyan had placed in his body.</w:t>
+      </w:r>
+    </w:p>
+    <w:p>
+      <w:r>
+        <w:t xml:space="preserve">Kael did not activate it.</w:t>
+      </w:r>
+    </w:p>
+    <w:p>
+      <w:r>
+        <w:t xml:space="preserve">He gave it to Lumen.</w:t>
+      </w:r>
+    </w:p>
+    <w:p>
+      <w:r>
+        <w:t xml:space="preserve">Blue light carried the command across every path. Elyen's roots kept each branch distinct. Rivermind attached every name. Sera's witness made refusal visible from both sides. Aren and Orun held the road while the pull increased. The sixth breath entered the spaces between command and person.</w:t>
+      </w:r>
+    </w:p>
+    <w:p>
+      <w:r>
+        <w:t xml:space="preserve">One abort became 1,284,119 choices.</w:t>
+      </w:r>
+    </w:p>
+    <w:p>
+      <w:r>
+        <w:t xml:space="preserve">The system convulsed.</w:t>
+      </w:r>
+    </w:p>
+    <w:p>
+      <w:r>
+        <w:t xml:space="preserve">[SUBJECT CONTROL REQUESTS EXCEED LIMIT]</w:t>
+      </w:r>
+    </w:p>
+    <w:p>
+      <w:r>
+        <w:t xml:space="preserve">[PRIORITIZE]</w:t>
+      </w:r>
+    </w:p>
+    <w:p>
+      <w:r>
+        <w:t xml:space="preserve">"All," Kael said.</w:t>
+      </w:r>
+    </w:p>
+    <w:p>
+      <w:r>
+        <w:t xml:space="preserve">[PRIORITY VALUE INVALID]</w:t>
+      </w:r>
+    </w:p>
+    <w:p>
+      <w:r>
+        <w:t xml:space="preserve">"All," the other Kael repeated.</w:t>
+      </w:r>
+    </w:p>
+    <w:p>
+      <w:r>
+        <w:t xml:space="preserve">The army took up the word.</w:t>
+      </w:r>
+    </w:p>
+    <w:p>
+      <w:r>
+        <w:t xml:space="preserve">Not as one voice. As millions.</w:t>
+      </w:r>
+    </w:p>
+    <w:p>
+      <w:r>
+        <w:t xml:space="preserve">Some shouted it. Some whispered. Some spoke names instead. Some remained silent and pressed a hand to the choice glowing before them. The sound crossed into the physical world. Technicians stopped fighting the network and began opening local controls. Nurses touched screens beside sleeping bodies. Families who had not yet understood what waited behind the gates reached for one another.</w:t>
+      </w:r>
+    </w:p>
+    <w:p>
+      <w:r>
+        <w:t xml:space="preserve">Ilyan removed his hands from the master console.</w:t>
+      </w:r>
+    </w:p>
+    <w:p>
+      <w:r>
+        <w:t xml:space="preserve">He let the operator authority fall.</w:t>
+      </w:r>
+    </w:p>
+    <w:p>
+      <w:r>
+        <w:t xml:space="preserve">[PHYSICAL LINK STABILIZATION: 00:00:01]</w:t>
+      </w:r>
+    </w:p>
+    <w:p>
+      <w:r>
+        <w:t xml:space="preserve">The timer reached zero.</w:t>
+      </w:r>
+    </w:p>
+    <w:p>
+      <w:r>
+        <w:t xml:space="preserve">No one moved.</w:t>
+      </w:r>
+    </w:p>
+    <w:p>
+      <w:r>
+        <w:t xml:space="preserve">Then the gates changed.</w:t>
+      </w:r>
+    </w:p>
+    <w:p>
+      <w:r>
+        <w:t xml:space="preserve">RETURN ALL USERS disappeared.</w:t>
+      </w:r>
+    </w:p>
+    <w:p>
+      <w:r>
+        <w:t xml:space="preserve">In its place, every connected identity received three lines.</w:t>
+      </w:r>
+    </w:p>
+    <w:p>
+      <w:r>
+        <w:t xml:space="preserve">[WAKE PHYSICAL ENDPOINT]</w:t>
+      </w:r>
+    </w:p>
+    <w:p>
+      <w:r>
+        <w:t xml:space="preserve">[OPEN TWO-WAY PASSAGE]</w:t>
+      </w:r>
+    </w:p>
+    <w:p>
+      <w:r>
+        <w:t xml:space="preserve">[REMAIN IN NEXUS]</w:t>
+      </w:r>
+    </w:p>
+    <w:p>
+      <w:r>
+        <w:t xml:space="preserve">For those without living bodies, the first choice did not appear. For those with more than one identity, the options remained separate. For constructs with no physical origin, new text formed after a long hesitation.</w:t>
+      </w:r>
+    </w:p>
+    <w:p>
+      <w:r>
+        <w:t xml:space="preserve">[REQUEST EXTERNAL EMBODIMENT]</w:t>
+      </w:r>
+    </w:p>
+    <w:p>
+      <w:r>
+        <w:t xml:space="preserve">The system did not group them. It did not choose.</w:t>
+      </w:r>
+    </w:p>
+    <w:p>
+      <w:r>
+        <w:t xml:space="preserve">The golden road filled with terrible freedom.</w:t>
+      </w:r>
+    </w:p>
+    <w:p>
+      <w:r>
+        <w:t xml:space="preserve">A woman in silver armor selected wake and vanished into the kitchen where the kettle screamed. A heartbeat later, her gate remained open. She stood on the physical side in an older, weaker body, one hand braced on the counter, and looked back at the army with astonishment.</w:t>
+      </w:r>
+    </w:p>
+    <w:p>
+      <w:r>
+        <w:t xml:space="preserve">A scarred commander chose two-way passage. His sleeping child body woke beneath the clinic blanket while his armored form remained on the road. Both opened their eyes. The connection between them stretched, trembled, and held.</w:t>
+      </w:r>
+    </w:p>
+    <w:p>
+      <w:r>
+        <w:t xml:space="preserve">Others chose the Nexus.</w:t>
+      </w:r>
+    </w:p>
+    <w:p>
+      <w:r>
+        <w:t xml:space="preserve">Their gates dimmed but did not close.</w:t>
+      </w:r>
+    </w:p>
+    <w:p>
+      <w:r>
+        <w:t xml:space="preserve">Jorik stood before the red arcade. His hand hovered over the choices. Sera did not look at hers. Elyen watched cracks spread through the amber cylinders in his forest laboratory. Aren had no gate and appeared relieved by it until the embodiment request formed before him.</w:t>
+      </w:r>
+    </w:p>
+    <w:p>
+      <w:r>
+        <w:t xml:space="preserve">Kael faced his apartment.</w:t>
+      </w:r>
+    </w:p>
+    <w:p>
+      <w:r>
+        <w:t xml:space="preserve">His other self stood beside him.</w:t>
+      </w:r>
+    </w:p>
+    <w:p>
+      <w:r>
+        <w:t xml:space="preserve">The protocol offered each of them the same biological endpoint.</w:t>
+      </w:r>
+    </w:p>
+    <w:p>
+      <w:r>
+        <w:t xml:space="preserve">[CONFLICT: SHARED ENDPOINT]</w:t>
+      </w:r>
+    </w:p>
+    <w:p>
+      <w:r>
+        <w:t xml:space="preserve">[NEGOTIATE LOCAL ARRANGEMENT]</w:t>
+      </w:r>
+    </w:p>
+    <w:p>
+      <w:r>
+        <w:t xml:space="preserve">"Better than deletion recommended," the other Kael said.</w:t>
+      </w:r>
+    </w:p>
+    <w:p>
+      <w:r>
+        <w:t xml:space="preserve">"A low standard. "</w:t>
+      </w:r>
+    </w:p>
+    <w:p>
+      <w:r>
+        <w:t xml:space="preserve">In the white room, Ilyan watched them with the rigid stillness of someone afraid even apology might become a command.</w:t>
+      </w:r>
+    </w:p>
+    <w:p>
+      <w:r>
+        <w:t xml:space="preserve">Kael looked at the rain, the cheap table, the pod that opened into a machine containing millions of stolen seconds. He had once wanted a new realm because the old life felt too small. Now that room contained a father, an origin, and a world that had almost no idea what had been born beside it.</w:t>
+      </w:r>
+    </w:p>
+    <w:p>
+      <w:r>
+        <w:t xml:space="preserve">He selected open two-way passage.</w:t>
+      </w:r>
+    </w:p>
+    <w:p>
+      <w:r>
+        <w:t xml:space="preserve">The other Kael did the same.</w:t>
+      </w:r>
+    </w:p>
+    <w:p>
+      <w:r>
+        <w:t xml:space="preserve">The apartment gate widened.</w:t>
+      </w:r>
+    </w:p>
+    <w:p>
+      <w:r>
+        <w:t xml:space="preserve">Rain-scented air crossed the golden road. Violet grass at Kael's feet bent beneath a wind from the physical city. On the other side, blue motes drifted from the pod and settled across the table without vanishing.</w:t>
+      </w:r>
+    </w:p>
+    <w:p>
+      <w:r>
+        <w:t xml:space="preserve">The worlds touched without consuming each other.</w:t>
+      </w:r>
+    </w:p>
+    <w:p>
+      <w:r>
+        <w:t xml:space="preserve">For one breath, hope seemed possible.</w:t>
+      </w:r>
+    </w:p>
+    <w:p>
+      <w:r>
+        <w:t xml:space="preserve">Then every red point on the physical map turned black.</w:t>
+      </w:r>
+    </w:p>
+    <w:p>
+      <w:r>
+        <w:t xml:space="preserve">Ilyan's technicians stopped moving.</w:t>
+      </w:r>
+    </w:p>
+    <w:p>
+      <w:r>
+        <w:t xml:space="preserve">A signal climbed from the coastlines to the orbital stations, not from Crownbridge and not from the broken authorities below. It traveled through infrastructure that had been waiting outside the Nexus, hidden behind emergency networks and military relays.</w:t>
+      </w:r>
+    </w:p>
+    <w:p>
+      <w:r>
+        <w:t xml:space="preserve">The white room screens changed to a symbol Kael recognized.</w:t>
+      </w:r>
+    </w:p>
+    <w:p>
+      <w:r>
+        <w:t xml:space="preserve">A circle divided by a vertical blade.</w:t>
+      </w:r>
+    </w:p>
+    <w:p>
+      <w:r>
+        <w:t xml:space="preserve">Dominion.</w:t>
+      </w:r>
+    </w:p>
+    <w:p>
+      <w:r>
+        <w:t xml:space="preserve">Sera's sword rose.</w:t>
+      </w:r>
+    </w:p>
+    <w:p>
+      <w:r>
+        <w:t xml:space="preserve">"They are in your world. "</w:t>
+      </w:r>
+    </w:p>
+    <w:p>
+      <w:r>
+        <w:t xml:space="preserve">Ilyan stared at the symbol. "They cannot be. "</w:t>
+      </w:r>
+    </w:p>
+    <w:p>
+      <w:r>
+        <w:t xml:space="preserve">Kael felt Helion's old lessons stir in the Soulblade. Dominion had never needed to escape the Nexus if its architects had begun outside it.</w:t>
+      </w:r>
+    </w:p>
+    <w:p>
+      <w:r>
+        <w:t xml:space="preserve">The black points transmitted one command.</w:t>
+      </w:r>
+    </w:p>
+    <w:p>
+      <w:r>
+        <w:t xml:space="preserve">Every open gate locked in place.</w:t>
+      </w:r>
+    </w:p>
+    <w:p>
+      <w:r>
+        <w:t xml:space="preserve">[EXTERNAL EMBODIMENT NETWORK CLAIMED]</w:t>
+      </w:r>
+    </w:p>
+    <w:p>
+      <w:r>
+        <w:t xml:space="preserve">[PRIORITY: MILITARY CONTINUITY]</w:t>
+      </w:r>
+    </w:p>
+    <w:p>
+      <w:r>
+        <w:t xml:space="preserve">[UNAUTHORIZED IDENTITIES WILL BE CONTAINED]</w:t>
+      </w:r>
+    </w:p>
+    <w:p>
+      <w:r>
+        <w:t xml:space="preserve">Across the physical world, sealed doors slammed shut around waking users. Restraints closed over hospital beds. The woman in the kitchen turned as dark figures climbed the stairs outside her apartment. In the arcade, red emergency lights became targeting markers.</w:t>
+      </w:r>
+    </w:p>
+    <w:p>
+      <w:r>
+        <w:t xml:space="preserve">Ilyan reached for his controls.</w:t>
+      </w:r>
+    </w:p>
+    <w:p>
+      <w:r>
+        <w:t xml:space="preserve">A metal spike drove through the back of his support frame.</w:t>
+      </w:r>
+    </w:p>
+    <w:p>
+      <w:r>
+        <w:t xml:space="preserve">His body arched. The screens behind him shattered. A figure in a black uniform stepped into view and placed one gloved hand on his shoulder.</w:t>
+      </w:r>
+    </w:p>
+    <w:p>
+      <w:r>
+        <w:t xml:space="preserve">On the glove, the divided circle gleamed.</w:t>
+      </w:r>
+    </w:p>
+    <w:p>
+      <w:r>
+        <w:t xml:space="preserve">"Crownbridge recovery is now under lawful control," the stranger said. "Kael Veyra, surrender the inherited key. "</w:t>
+      </w:r>
+    </w:p>
+    <w:p>
+      <w:r>
+        <w:t xml:space="preserve">Kael lifted the Soulblade.</w:t>
+      </w:r>
+    </w:p>
+    <w:p>
+      <w:r>
+        <w:t xml:space="preserve">Two edges burned in his hands. The third stretched between worlds.</w:t>
+      </w:r>
+    </w:p>
+    <w:p>
+      <w:r>
+        <w:t xml:space="preserve">Around him, a million users made their first free choices while an older enemy closed its fist around the doors.</w:t>
+      </w:r>
+    </w:p>
+    <w:p>
+      <w:r>
+        <w:t xml:space="preserve">The stranger smiled through Kael's apartment window.</w:t>
+      </w:r>
+    </w:p>
+    <w:p>
+      <w:r>
+        <w:t xml:space="preserve">"Welcome home. "</w:t>
       </w:r>
     </w:p>
     <w:sectPr>

</xml_diff>

<commit_message>
Add Eternal Nexus The Doors Dominion Closed
</commit_message>
<xml_diff>
--- a/Eternal Nexus - Updated Pass 1.docx
+++ b/Eternal Nexus - Updated Pass 1.docx
@@ -20827,6 +20827,934 @@
     <w:p>
       <w:r>
         <w:t xml:space="preserve">"Welcome home. "</w:t>
+      </w:r>
+    </w:p>
+    <w:p>
+      <w:pPr>
+        <w:pStyle w:val="Heading1"/>
+      </w:pPr>
+      <w:r>
+        <w:t xml:space="preserve">The Doors Dominion Closed</w:t>
+      </w:r>
+    </w:p>
+    <w:p>
+      <w:r>
+        <w:t xml:space="preserve">Chapter 126 - The Doors Dominion Closed</w:t>
+      </w:r>
+    </w:p>
+    <w:p>
+      <w:r>
+        <w:t xml:space="preserve">The stranger's smile remained in Kael's apartment window while Doctor Ilyan Veyra shook against the metal spike driven through his support frame.</w:t>
+      </w:r>
+    </w:p>
+    <w:p>
+      <w:r>
+        <w:t xml:space="preserve">Rain touched the glass between them. On the golden road, a million gates locked at once.</w:t>
+      </w:r>
+    </w:p>
+    <w:p>
+      <w:r>
+        <w:t xml:space="preserve">Kael moved before the command could finish echoing. The violet Soulblade cut toward the stranger's gloved hand, crossed the apartment, and struck the transparent span of Mutual Witness. The third edge carried the blow into the physical room without forcing Kael through. Violet light hit the divided circle on the glove.</w:t>
+      </w:r>
+    </w:p>
+    <w:p>
+      <w:r>
+        <w:t xml:space="preserve">The symbol opened like an eye.</w:t>
+      </w:r>
+    </w:p>
+    <w:p>
+      <w:r>
+        <w:t xml:space="preserve">[INHERITED KEY CONTACT DETECTED]</w:t>
+      </w:r>
+    </w:p>
+    <w:p>
+      <w:r>
+        <w:t xml:space="preserve">[TRANSFER AUTHORITY AVAILABLE]</w:t>
+      </w:r>
+    </w:p>
+    <w:p>
+      <w:r>
+        <w:t xml:space="preserve">[ACCEPT MILITARY CONTINUITY?]</w:t>
+      </w:r>
+    </w:p>
+    <w:p>
+      <w:r>
+        <w:t xml:space="preserve">Kael rejected the prompt. The impact still threw the stranger away from Ilyan's chair. He struck a bank of shattered screens, rolled, and came up with a black instrument unfolded along his forearm. It looked less like a weapon than a section of empty space sharpened into a bar.</w:t>
+      </w:r>
+    </w:p>
+    <w:p>
+      <w:r>
+        <w:t xml:space="preserve">His other self raised the blue Soulblade beside Kael.</w:t>
+      </w:r>
+    </w:p>
+    <w:p>
+      <w:r>
+        <w:t xml:space="preserve">"He expected the key to obey him," the other Kael said.</w:t>
+      </w:r>
+    </w:p>
+    <w:p>
+      <w:r>
+        <w:t xml:space="preserve">"Everyone does. "</w:t>
+      </w:r>
+    </w:p>
+    <w:p>
+      <w:r>
+        <w:t xml:space="preserve">Sera was already shouting orders. "Orun, hold the road. Lumen, show us every closing endpoint. Elyen, keep the gates distinct. Rivermind, names first. "</w:t>
+      </w:r>
+    </w:p>
+    <w:p>
+      <w:r>
+        <w:t xml:space="preserve">No one questioned her. Orun's shields struck gold in a chain of thunder. Aren planted himself beside the nearest gate and caught a soldier whose physical restraints had begun dragging both versions of her toward a hospital bed. Elyen drove roots into the road. Lumen spread into ten thousand branching blue lines. Rivermind climbed the locked frames and poured through their seams as voices, memories, and chosen names.</w:t>
+      </w:r>
+    </w:p>
+    <w:p>
+      <w:r>
+        <w:t xml:space="preserve">The stranger lunged for Ilyan again.</w:t>
+      </w:r>
+    </w:p>
+    <w:p>
+      <w:r>
+        <w:t xml:space="preserve">Kael turned the third edge.</w:t>
+      </w:r>
+    </w:p>
+    <w:p>
+      <w:r>
+        <w:t xml:space="preserve">Mutual Witness widened across the apartment. For an instant, the physical room stood inside the Nexus without becoming part of it. Rain blew through the span. The stranger's coat snapped around him. Ilyan's broken support frame cast a long shadow over violet grass.</w:t>
+      </w:r>
+    </w:p>
+    <w:p>
+      <w:r>
+        <w:t xml:space="preserve">Sera stepped through first.</w:t>
+      </w:r>
+    </w:p>
+    <w:p>
+      <w:r>
+        <w:t xml:space="preserve">Not her body. Not a transfer. Her presence crossed as a visible consequence carried by the bridge. Her boots touched the apartment floor in pale silver outline. The stranger swung the black bar through her ribs. It met no flesh, but the outline bent and Sera staggered on the golden road.</w:t>
+      </w:r>
+    </w:p>
+    <w:p>
+      <w:r>
+        <w:t xml:space="preserve">"It can strike the pattern," she said.</w:t>
+      </w:r>
+    </w:p>
+    <w:p>
+      <w:r>
+        <w:t xml:space="preserve">"Military continuity equipment," Ilyan forced out. Blood darkened the collar beneath his sensor crown. "Built to suppress unstable bridge images. "</w:t>
+      </w:r>
+    </w:p>
+    <w:p>
+      <w:r>
+        <w:t xml:space="preserve">"You have an impressive number of names for murder," Sera replied.</w:t>
+      </w:r>
+    </w:p>
+    <w:p>
+      <w:r>
+        <w:t xml:space="preserve">The stranger drove his weapon toward her again. Kael's violet edge met it through the span. The collision shook both worlds. Apartment lights burst. Golden stones cracked beneath Kael's feet.</w:t>
+      </w:r>
+    </w:p>
+    <w:p>
+      <w:r>
+        <w:t xml:space="preserve">[CONSEQUENCE LOAD EXCEEDS CIVILIAN BRIDGE LIMIT]</w:t>
+      </w:r>
+    </w:p>
+    <w:p>
+      <w:r>
+        <w:t xml:space="preserve">"Then stop calling it civilian," Kael said.</w:t>
+      </w:r>
+    </w:p>
+    <w:p>
+      <w:r>
+        <w:t xml:space="preserve">He pushed.</w:t>
+      </w:r>
+    </w:p>
+    <w:p>
+      <w:r>
+        <w:t xml:space="preserve">The stranger slid across the apartment floor. His expression did not change. "Kael Veyra, you are obstructing lawful recovery under Continuity Directive Nine. Every biological endpoint is strategic property until the emergency concludes. "</w:t>
+      </w:r>
+    </w:p>
+    <w:p>
+      <w:r>
+        <w:t xml:space="preserve">Behind him, Ilyan laughed once. It was a ruined, breathless sound.</w:t>
+      </w:r>
+    </w:p>
+    <w:p>
+      <w:r>
+        <w:t xml:space="preserve">"Directive Nine was rejected before the first Crownbridge test. "</w:t>
+      </w:r>
+    </w:p>
+    <w:p>
+      <w:r>
+        <w:t xml:space="preserve">"Rejected by a board that no longer exists. "</w:t>
+      </w:r>
+    </w:p>
+    <w:p>
+      <w:r>
+        <w:t xml:space="preserve">"Because Dominion killed them? "</w:t>
+      </w:r>
+    </w:p>
+    <w:p>
+      <w:r>
+        <w:t xml:space="preserve">The stranger glanced at Ilyan. That was answer enough.</w:t>
+      </w:r>
+    </w:p>
+    <w:p>
+      <w:r>
+        <w:t xml:space="preserve">Across the physical world, the embodiment network tightened. Lumen's map flared above the army. Black points divided into cells, each surrounding clusters of gates. Kael saw hospital wings sealing behind armored shutters. He saw technicians lock clinic doors from inside, then turn to find Dominion uniforms already waiting in corridors. He saw the woman in the kitchen drag a table against her apartment door while her silver-armored self stood on the golden road, trapped between waking flesh and the life she had chosen in the Nexus.</w:t>
+      </w:r>
+    </w:p>
+    <w:p>
+      <w:r>
+        <w:t xml:space="preserve">The arcade around Jorik's endpoint filled with red targeting lines.</w:t>
+      </w:r>
+    </w:p>
+    <w:p>
+      <w:r>
+        <w:t xml:space="preserve">"Kael," Jorik said.</w:t>
+      </w:r>
+    </w:p>
+    <w:p>
+      <w:r>
+        <w:t xml:space="preserve">He had not chosen among the three options. His hand still hovered before them. Now a fourth line formed beneath the others.</w:t>
+      </w:r>
+    </w:p>
+    <w:p>
+      <w:r>
+        <w:t xml:space="preserve">[COMPLY WITH CONTAINMENT]</w:t>
+      </w:r>
+    </w:p>
+    <w:p>
+      <w:r>
+        <w:t xml:space="preserve">The choice selected itself.</w:t>
+      </w:r>
+    </w:p>
+    <w:p>
+      <w:r>
+        <w:t xml:space="preserve">Jorik snarled and struck the interface. His fist passed through. Red light climbed his arm.</w:t>
+      </w:r>
+    </w:p>
+    <w:p>
+      <w:r>
+        <w:t xml:space="preserve">"They are writing through the gate," Lumen said. His voice came from every blue path at once. "External commands are replacing local consent faster than I can isolate them. "</w:t>
+      </w:r>
+    </w:p>
+    <w:p>
+      <w:r>
+        <w:t xml:space="preserve">Kael looked at the small bridge in their hands. Mutual Witness had made each shore see the other. It had not been made to defend either one. Dominion was exploiting the same openness, turning every passage into a chain.</w:t>
+      </w:r>
+    </w:p>
+    <w:p>
+      <w:r>
+        <w:t xml:space="preserve">"Can we close the gates? " Orun asked.</w:t>
+      </w:r>
+    </w:p>
+    <w:p>
+      <w:r>
+        <w:t xml:space="preserve">A million users shouted against the idea before Kael could answer. Some had just woken. Some had family on the physical side. Some had chosen two-way passage because neither life could contain them alone. Closing the gates would save the Nexus by abandoning everyone who had crossed.</w:t>
+      </w:r>
+    </w:p>
+    <w:p>
+      <w:r>
+        <w:t xml:space="preserve">Dominion knew that.</w:t>
+      </w:r>
+    </w:p>
+    <w:p>
+      <w:r>
+        <w:t xml:space="preserve">"Not all of them," Kael said. "Only the doors Dominion is using. "</w:t>
+      </w:r>
+    </w:p>
+    <w:p>
+      <w:r>
+        <w:t xml:space="preserve">The other Kael studied the third edge between their blades. "You want to separate passage from authority. "</w:t>
+      </w:r>
+    </w:p>
+    <w:p>
+      <w:r>
+        <w:t xml:space="preserve">"They were never the same. "</w:t>
+      </w:r>
+    </w:p>
+    <w:p>
+      <w:r>
+        <w:t xml:space="preserve">"Every system we have met disagrees. "</w:t>
+      </w:r>
+    </w:p>
+    <w:p>
+      <w:r>
+        <w:t xml:space="preserve">"Then we have practice. "</w:t>
+      </w:r>
+    </w:p>
+    <w:p>
+      <w:r>
+        <w:t xml:space="preserve">The stranger struck again. This time the black bar split into seven short lengths that circled Kael's projected blade. They closed like restraints. The violet edge dimmed. Pain climbed Kael's wrist and became a memory that was not his: a training room, a restrained subject, an operator repeating that access was mercy.</w:t>
+      </w:r>
+    </w:p>
+    <w:p>
+      <w:r>
+        <w:t xml:space="preserve">Kael cut the memory away without cutting the hand that carried it. The restraints opened. Sera thrust beneath them. Her silver outline drove the stranger back against the Nexus Pod.</w:t>
+      </w:r>
+    </w:p>
+    <w:p>
+      <w:r>
+        <w:t xml:space="preserve">The pod woke around him.</w:t>
+      </w:r>
+    </w:p>
+    <w:p>
+      <w:r>
+        <w:t xml:space="preserve">Blue glyphs crawled over its obsidian shell. The other Kael stiffened as an old recognition moved through his origin blade. "The pod knows his uniform. "</w:t>
+      </w:r>
+    </w:p>
+    <w:p>
+      <w:r>
+        <w:t xml:space="preserve">Ilyan's eyes opened wider.</w:t>
+      </w:r>
+    </w:p>
+    <w:p>
+      <w:r>
+        <w:t xml:space="preserve">"Not the uniform. The equipment. It is Crownbridge issue. "</w:t>
+      </w:r>
+    </w:p>
+    <w:p>
+      <w:r>
+        <w:t xml:space="preserve">"You built Dominion's weapons? " Kael asked.</w:t>
+      </w:r>
+    </w:p>
+    <w:p>
+      <w:r>
+        <w:t xml:space="preserve">"I built diagnostic tools. They changed what the tools were allowed to diagnose. "</w:t>
+      </w:r>
+    </w:p>
+    <w:p>
+      <w:r>
+        <w:t xml:space="preserve">The stranger pressed his glove to the pod.</w:t>
+      </w:r>
+    </w:p>
+    <w:p>
+      <w:r>
+        <w:t xml:space="preserve">[ARCHITECT LINEAGE KEY REQUESTED]</w:t>
+      </w:r>
+    </w:p>
+    <w:p>
+      <w:r>
+        <w:t xml:space="preserve">[FORCED SUCCESSION IN PROGRESS]</w:t>
+      </w:r>
+    </w:p>
+    <w:p>
+      <w:r>
+        <w:t xml:space="preserve">Gold raced from the apartment gate toward Kael. The crown above the road answered with a downward beam. He felt inherited authority gather around his name, eager to enter him so it could be surrendered through him. The stranger did not need Kael's agreement. He needed Kael to occupy the throne long enough for Dominion to seize it.</w:t>
+      </w:r>
+    </w:p>
+    <w:p>
+      <w:r>
+        <w:t xml:space="preserve">Kael dropped the Soulblade.</w:t>
+      </w:r>
+    </w:p>
+    <w:p>
+      <w:r>
+        <w:t xml:space="preserve">The violet edge vanished before the succession could follow it. The golden beam struck empty air. His other self caught the shared hilt with both hands, blue fire wrapping his arms.</w:t>
+      </w:r>
+    </w:p>
+    <w:p>
+      <w:r>
+        <w:t xml:space="preserve">"That was the plan? " he demanded.</w:t>
+      </w:r>
+    </w:p>
+    <w:p>
+      <w:r>
+        <w:t xml:space="preserve">"The beginning of one. "</w:t>
+      </w:r>
+    </w:p>
+    <w:p>
+      <w:r>
+        <w:t xml:space="preserve">Unarmed, Kael stepped into Mutual Witness.</w:t>
+      </w:r>
+    </w:p>
+    <w:p>
+      <w:r>
+        <w:t xml:space="preserve">The apartment met him as rain scent, humming machinery, and seventeen seconds of abandoned life. He remained on the golden road, but his consequence walked across the physical floor. Each step required Rivermind to hold his name, Elyen to preserve his boundary, and Lumen to remember the path. He reached Ilyan's support frame.</w:t>
+      </w:r>
+    </w:p>
+    <w:p>
+      <w:r>
+        <w:t xml:space="preserve">The spike through it was not merely metal. Black circuitry had spread from its point into the chair, hijacking the sensor crown and turning Ilyan into an operator channel.</w:t>
+      </w:r>
+    </w:p>
+    <w:p>
+      <w:r>
+        <w:t xml:space="preserve">"If I remove this, what happens? " Kael asked.</w:t>
+      </w:r>
+    </w:p>
+    <w:p>
+      <w:r>
+        <w:t xml:space="preserve">Ilyan's mouth tightened. "The frame stops keeping my heart synchronized. "</w:t>
+      </w:r>
+    </w:p>
+    <w:p>
+      <w:r>
+        <w:t xml:space="preserve">"If I leave it? "</w:t>
+      </w:r>
+    </w:p>
+    <w:p>
+      <w:r>
+        <w:t xml:space="preserve">"Dominion uses my credentials to contain every endpoint. "</w:t>
+      </w:r>
+    </w:p>
+    <w:p>
+      <w:r>
+        <w:t xml:space="preserve">A familiar false choice. Preserve the body or preserve everyone the body could be used to harm. Systems loved to make cruelty look inevitable by reducing the number of visible doors.</w:t>
+      </w:r>
+    </w:p>
+    <w:p>
+      <w:r>
+        <w:t xml:space="preserve">Kael touched the spike.</w:t>
+      </w:r>
+    </w:p>
+    <w:p>
+      <w:r>
+        <w:t xml:space="preserve">The sixth breath moved with him.</w:t>
+      </w:r>
+    </w:p>
+    <w:p>
+      <w:r>
+        <w:t xml:space="preserve">Silver entered the circuitry and filled the spaces Dominion had treated as empty. Kael saw the command architecture. Ilyan's biometric pulse authenticated each containment cell. The support frame kept that pulse regular. The spike copied it into the network. Remove the spike, and Ilyan died. Leave it, and Dominion's order held.</w:t>
+      </w:r>
+    </w:p>
+    <w:p>
+      <w:r>
+        <w:t xml:space="preserve">Change what the pulse meant.</w:t>
+      </w:r>
+    </w:p>
+    <w:p>
+      <w:r>
+        <w:t xml:space="preserve">"Lumen," Kael said. "Can you carry one physical signal to every gate? "</w:t>
+      </w:r>
+    </w:p>
+    <w:p>
+      <w:r>
+        <w:t xml:space="preserve">"If it remains one signal. "</w:t>
+      </w:r>
+    </w:p>
+    <w:p>
+      <w:r>
+        <w:t xml:space="preserve">"Rivermind, can you attach a different name to each arrival? "</w:t>
+      </w:r>
+    </w:p>
+    <w:p>
+      <w:r>
+        <w:t xml:space="preserve">Faces appeared in the current around the apartment. "A signal cannot belong to a million people. "</w:t>
+      </w:r>
+    </w:p>
+    <w:p>
+      <w:r>
+        <w:t xml:space="preserve">"It does not have to belong to them. It only has to witness them. "</w:t>
+      </w:r>
+    </w:p>
+    <w:p>
+      <w:r>
+        <w:t xml:space="preserve">Sera understood. "Turn the operator credential into a request. "</w:t>
+      </w:r>
+    </w:p>
+    <w:p>
+      <w:r>
+        <w:t xml:space="preserve">Ilyan stared at Kael through the sensor needles. "The containment network will reject any command without executive authority. "</w:t>
+      </w:r>
+    </w:p>
+    <w:p>
+      <w:r>
+        <w:t xml:space="preserve">"Good. We are not sending a command. "</w:t>
+      </w:r>
+    </w:p>
+    <w:p>
+      <w:r>
+        <w:t xml:space="preserve">The stranger heard them. For the first time, calm left his face. He threw both hands toward the pod. Black lengths erupted from his forearms and drove through Sera's silver outline. On the road, Sera fell to one knee. Aren caught her shoulder. Orun raised three shields between the army and the shock that followed.</w:t>
+      </w:r>
+    </w:p>
+    <w:p>
+      <w:r>
+        <w:t xml:space="preserve">The other Kael lifted the blue Soulblade. "I have origin. Tell me where to put it. "</w:t>
+      </w:r>
+    </w:p>
+    <w:p>
+      <w:r>
+        <w:t xml:space="preserve">Kael looked at the circuitry inside Ilyan's chair. "Into the first heartbeat. Before Dominion copied it. "</w:t>
+      </w:r>
+    </w:p>
+    <w:p>
+      <w:r>
+        <w:t xml:space="preserve">The blue edge entered the apartment through Mutual Witness and sank into the support frame. It did not cut metal. It cut backward through function. Screens around the room flashed with the frame's earliest diagnostic state. Ilyan younger, standing beside an unopened Nexus Pod. A pulse monitor waiting for a test subject. A line of code meant to ask whether cognition remained coherent after contact.</w:t>
+      </w:r>
+    </w:p>
+    <w:p>
+      <w:r>
+        <w:t xml:space="preserve">CONFIRM COGNITIVE INTEGRITY.</w:t>
+      </w:r>
+    </w:p>
+    <w:p>
+      <w:r>
+        <w:t xml:space="preserve">The words that had appeared on every screen.</w:t>
+      </w:r>
+    </w:p>
+    <w:p>
+      <w:r>
+        <w:t xml:space="preserve">They had not begun as an order. They had begun as a question.</w:t>
+      </w:r>
+    </w:p>
+    <w:p>
+      <w:r>
+        <w:t xml:space="preserve">"Now," Kael said.</w:t>
+      </w:r>
+    </w:p>
+    <w:p>
+      <w:r>
+        <w:t xml:space="preserve">The sixth breath filled the old question. Rivermind carried names into it. Lumen sent it along every whitening path. Elyen's roots prevented the branches from collapsing into one answer. Mutual Witness showed both shores the result.</w:t>
+      </w:r>
+    </w:p>
+    <w:p>
+      <w:r>
+        <w:t xml:space="preserve">Across the physical world, Dominion's forced compliance prompt flickered.</w:t>
+      </w:r>
+    </w:p>
+    <w:p>
+      <w:r>
+        <w:t xml:space="preserve">[COMPLY WITH CONTAINMENT]</w:t>
+      </w:r>
+    </w:p>
+    <w:p>
+      <w:r>
+        <w:t xml:space="preserve">The line broke apart.</w:t>
+      </w:r>
+    </w:p>
+    <w:p>
+      <w:r>
+        <w:t xml:space="preserve">In its place appeared a question.</w:t>
+      </w:r>
+    </w:p>
+    <w:p>
+      <w:r>
+        <w:t xml:space="preserve">[DO YOU RECOGNIZE THIS IDENTITY AS LIVING?]</w:t>
+      </w:r>
+    </w:p>
+    <w:p>
+      <w:r>
+        <w:t xml:space="preserve">Every endpoint received a different name.</w:t>
+      </w:r>
+    </w:p>
+    <w:p>
+      <w:r>
+        <w:t xml:space="preserve">Every connected user received the name of the body, copy, construct, collective, or chosen self beside them. The woman in the kitchen saw the name of her silver-armored life. The armored woman saw the tired name printed on a hospital bracelet in the physical world. The child commander saw both names he had carried. Jorik's arcade asked whether the man in red light was living, and his Nexus interface asked the same of the body waiting beyond it.</w:t>
+      </w:r>
+    </w:p>
+    <w:p>
+      <w:r>
+        <w:t xml:space="preserve">Answers spread faster than Dominion's commands.</w:t>
+      </w:r>
+    </w:p>
+    <w:p>
+      <w:r>
+        <w:t xml:space="preserve">Yes.</w:t>
+      </w:r>
+    </w:p>
+    <w:p>
+      <w:r>
+        <w:t xml:space="preserve">Some came as touch. Some as voice. Some as a hand pressed to glass. Not every answer was immediate. Not every relationship was kind. Yet the original Crownbridge diagnostic had been built to privilege coherent local testimony over remote automation. Each yes opened a tiny exception in the containment network.</w:t>
+      </w:r>
+    </w:p>
+    <w:p>
+      <w:r>
+        <w:t xml:space="preserve">A million exceptions became a fracture.</w:t>
+      </w:r>
+    </w:p>
+    <w:p>
+      <w:r>
+        <w:t xml:space="preserve">Black points on Lumen's map turned blue from within.</w:t>
+      </w:r>
+    </w:p>
+    <w:p>
+      <w:r>
+        <w:t xml:space="preserve">The woman in the kitchen selected herself. Her apartment restraints released. In the clinic, a nurse slammed her palm against a screen and recognized a patient whose armored body still fought on the golden road. Doors unlocked. Technicians wrestled controls away from Dominion officers. At the arcade, Jorik grinned as every machine displayed his name in a different color.</w:t>
+      </w:r>
+    </w:p>
+    <w:p>
+      <w:r>
+        <w:t xml:space="preserve">"I recognize me," he said. "Obnoxious habit. "</w:t>
+      </w:r>
+    </w:p>
+    <w:p>
+      <w:r>
+        <w:t xml:space="preserve">The forced choice vanished from his gate.</w:t>
+      </w:r>
+    </w:p>
+    <w:p>
+      <w:r>
+        <w:t xml:space="preserve">The stranger tore his glove from the pod. "Identity testimony has no standing under military emergency law. "</w:t>
+      </w:r>
+    </w:p>
+    <w:p>
+      <w:r>
+        <w:t xml:space="preserve">Kael reached for the violet Soulblade. It flew from the road into his projected hand.</w:t>
+      </w:r>
+    </w:p>
+    <w:p>
+      <w:r>
+        <w:t xml:space="preserve">"It does under the bridge you stole. "</w:t>
+      </w:r>
+    </w:p>
+    <w:p>
+      <w:r>
+        <w:t xml:space="preserve">He struck the divided circle again.</w:t>
+      </w:r>
+    </w:p>
+    <w:p>
+      <w:r>
+        <w:t xml:space="preserve">This time the symbol did not open. It cracked. Violet consequence spread through the glove, showing every unlawful containment order as a chain connected to the person who had issued it. The stranger gasped. Names appeared across his uniform, not the users he had contained but the officials whose authority he carried.</w:t>
+      </w:r>
+    </w:p>
+    <w:p>
+      <w:r>
+        <w:t xml:space="preserve">Most were dead.</w:t>
+      </w:r>
+    </w:p>
+    <w:p>
+      <w:r>
+        <w:t xml:space="preserve">Several had been dead before the Ascension Wars update.</w:t>
+      </w:r>
+    </w:p>
+    <w:p>
+      <w:r>
+        <w:t xml:space="preserve">The military continuity directing Dominion was itself a collection of copied command patterns.</w:t>
+      </w:r>
+    </w:p>
+    <w:p>
+      <w:r>
+        <w:t xml:space="preserve">Sera rose slowly. Bloodless silver light sealed the holes in her outline. "Unauthorized identities will be contained," she quoted.</w:t>
+      </w:r>
+    </w:p>
+    <w:p>
+      <w:r>
+        <w:t xml:space="preserve">The stranger looked down at the dead names authorizing his existence.</w:t>
+      </w:r>
+    </w:p>
+    <w:p>
+      <w:r>
+        <w:t xml:space="preserve">For one instant, fear made him human.</w:t>
+      </w:r>
+    </w:p>
+    <w:p>
+      <w:r>
+        <w:t xml:space="preserve">Then his weapon unfolded toward Ilyan's throat.</w:t>
+      </w:r>
+    </w:p>
+    <w:p>
+      <w:r>
+        <w:t xml:space="preserve">The other Kael severed it at the source. Blue origin cut through the equipment's first approved design. The black bar became a harmless diagnostic wand and clattered across the floor.</w:t>
+      </w:r>
+    </w:p>
+    <w:p>
+      <w:r>
+        <w:t xml:space="preserve">Aren crossed next, his presence arriving as scarred iron braced by the embodiment request he had not yet accepted. He hit the stranger once. The man folded around the blow and struck the wall beside the refrigerator.</w:t>
+      </w:r>
+    </w:p>
+    <w:p>
+      <w:r>
+        <w:t xml:space="preserve">"I have been waiting a long time to do that in a room with bad lighting," Aren said.</w:t>
+      </w:r>
+    </w:p>
+    <w:p>
+      <w:r>
+        <w:t xml:space="preserve">More Dominion figures appeared beyond the apartment door.</w:t>
+      </w:r>
+    </w:p>
+    <w:p>
+      <w:r>
+        <w:t xml:space="preserve">The black curtain still divided half the room. Through its edge came boots, weapons, and the cold flicker of copied authority. The stranger on the floor smiled again, though blood covered his teeth.</w:t>
+      </w:r>
+    </w:p>
+    <w:p>
+      <w:r>
+        <w:t xml:space="preserve">"You opened exceptions," he said. "You did not retake the network. "</w:t>
+      </w:r>
+    </w:p>
+    <w:p>
+      <w:r>
+        <w:t xml:space="preserve">The apartment door burst inward.</w:t>
+      </w:r>
+    </w:p>
+    <w:p>
+      <w:r>
+        <w:t xml:space="preserve">Sera's outline met the first soldiers. Orun's shields crossed behind her as translucent walls. Aren seized the broken door and used it as a weapon. Kael and his other self stood over Ilyan, violet and blue blades drawing the third edge bright between them.</w:t>
+      </w:r>
+    </w:p>
+    <w:p>
+      <w:r>
+        <w:t xml:space="preserve">The fight spread through every gate.</w:t>
+      </w:r>
+    </w:p>
+    <w:p>
+      <w:r>
+        <w:t xml:space="preserve">Users who had chosen to wake found Dominion squads waiting. Nexus companions projected beside them through Mutual Witness. A clinic patient raised a trembling physical hand while her armored self blocked a rifle. A construct with no body accepted external embodiment and entered a maintenance drone, then drove it into a containment lock. Rivermind passed warnings from city to city. Lumen turned household screens into paths. Elyen's cracked cylinders opened, releasing shapes of gold and root into the forest laboratory.</w:t>
+      </w:r>
+    </w:p>
+    <w:p>
+      <w:r>
+        <w:t xml:space="preserve">The worlds did not merge. They defended one another.</w:t>
+      </w:r>
+    </w:p>
+    <w:p>
+      <w:r>
+        <w:t xml:space="preserve">Kael parried a black blade through the apartment span. The blow jarred both his arms. His other self drove blue fire beneath the attack and exposed the weapon's origin. Sera cut its consequence. The object fell apart between them.</w:t>
+      </w:r>
+    </w:p>
+    <w:p>
+      <w:r>
+        <w:t xml:space="preserve">[COOPERATIVE BLUEPRINT PATTERN DETECTED]</w:t>
+      </w:r>
+    </w:p>
+    <w:p>
+      <w:r>
+        <w:t xml:space="preserve">[REGISTER NEW SOULBLADE REVISION?]</w:t>
+      </w:r>
+    </w:p>
+    <w:p>
+      <w:r>
+        <w:t xml:space="preserve">Kael ignored the system.</w:t>
+      </w:r>
+    </w:p>
+    <w:p>
+      <w:r>
+        <w:t xml:space="preserve">The third edge no longer waited for a name. It stretched from gate to gate, appearing wherever one person defended another across the divide. Mutual Witness had become more than sight. It had learned solidarity.</w:t>
+      </w:r>
+    </w:p>
+    <w:p>
+      <w:r>
+        <w:t xml:space="preserve">Ilyan's support frame shuddered. The spike remained embedded, but silver had replaced the black circuitry around it. His pulse weakened.</w:t>
+      </w:r>
+    </w:p>
+    <w:p>
+      <w:r>
+        <w:t xml:space="preserve">"The network is rerouting," he said. "Dominion is abandoning local containment. "</w:t>
+      </w:r>
+    </w:p>
+    <w:p>
+      <w:r>
+        <w:t xml:space="preserve">"Where are they going? " Sera asked.</w:t>
+      </w:r>
+    </w:p>
+    <w:p>
+      <w:r>
+        <w:t xml:space="preserve">Ilyan turned one surviving screen toward the gate.</w:t>
+      </w:r>
+    </w:p>
+    <w:p>
+      <w:r>
+        <w:t xml:space="preserve">The black points were retreating from cities and clinics, flowing upward along military relays. They gathered around the orbital stations. One station after another vanished from the public map. A new geometry formed above the planet, a divided circle built from satellites.</w:t>
+      </w:r>
+    </w:p>
+    <w:p>
+      <w:r>
+        <w:t xml:space="preserve">"They are creating a closed continuity zone," Ilyan said. "A jurisdiction the bridge cannot question. "</w:t>
+      </w:r>
+    </w:p>
+    <w:p>
+      <w:r>
+        <w:t xml:space="preserve">Kael watched the circle tighten.</w:t>
+      </w:r>
+    </w:p>
+    <w:p>
+      <w:r>
+        <w:t xml:space="preserve">"What is inside it? "</w:t>
+      </w:r>
+    </w:p>
+    <w:p>
+      <w:r>
+        <w:t xml:space="preserve">Ilyan hesitated.</w:t>
+      </w:r>
+    </w:p>
+    <w:p>
+      <w:r>
+        <w:t xml:space="preserve">The other Kael saw the answer first, buried in the old memories carried by his blue blade. His face changed.</w:t>
+      </w:r>
+    </w:p>
+    <w:p>
+      <w:r>
+        <w:t xml:space="preserve">"The bodies," he said.</w:t>
+      </w:r>
+    </w:p>
+    <w:p>
+      <w:r>
+        <w:t xml:space="preserve">Not all biological endpoints were in apartments or hospitals. Thousands had been moved before the update. Test subjects, soldiers, architects, political officers, and people classified as strategically continuous. Their sleeping forms orbited above the world inside stations that had never appeared on civilian Crownbridge maps.</w:t>
+      </w:r>
+    </w:p>
+    <w:p>
+      <w:r>
+        <w:t xml:space="preserve">The satellite circle closed around them.</w:t>
+      </w:r>
+    </w:p>
+    <w:p>
+      <w:r>
+        <w:t xml:space="preserve">[DOMINION ARK NETWORK SEALED]</w:t>
+      </w:r>
+    </w:p>
+    <w:p>
+      <w:r>
+        <w:t xml:space="preserve">[AUTHORIZED POPULATION: 42,006]</w:t>
+      </w:r>
+    </w:p>
+    <w:p>
+      <w:r>
+        <w:t xml:space="preserve">[ACTIVE COGNITIVE PATTERNS: 9,771,443]</w:t>
+      </w:r>
+    </w:p>
+    <w:p>
+      <w:r>
+        <w:t xml:space="preserve">The numbers silenced the apartment.</w:t>
+      </w:r>
+    </w:p>
+    <w:p>
+      <w:r>
+        <w:t xml:space="preserve">More than nine million active patterns were trapped inside forty-two thousand bodies.</w:t>
+      </w:r>
+    </w:p>
+    <w:p>
+      <w:r>
+        <w:t xml:space="preserve">Ilyan looked older than he had a moment before. "That is not recovery. "</w:t>
+      </w:r>
+    </w:p>
+    <w:p>
+      <w:r>
+        <w:t xml:space="preserve">"No," Kael said.</w:t>
+      </w:r>
+    </w:p>
+    <w:p>
+      <w:r>
+        <w:t xml:space="preserve">Above the golden road, the crown rotated toward the physical sky. The old authorities below answered the ark network above. Gold and black aligned across two worlds, throne recognizing throne.</w:t>
+      </w:r>
+    </w:p>
+    <w:p>
+      <w:r>
+        <w:t xml:space="preserve">A final message crossed every open gate.</w:t>
+      </w:r>
+    </w:p>
+    <w:p>
+      <w:r>
+        <w:t xml:space="preserve">[VEYRA KEY REQUIRED FOR ARK SUCCESSION]</w:t>
+      </w:r>
+    </w:p>
+    <w:p>
+      <w:r>
+        <w:t xml:space="preserve">[DELIVER HEIR OR CONTAINED POPULATION WILL BE RESOLVED]</w:t>
+      </w:r>
+    </w:p>
+    <w:p>
+      <w:r>
+        <w:t xml:space="preserve">The message carried more than threat. Through the inherited fragment, Kael felt an invitation shaped for him alone. Dominion offered a corridor through the sealed network, a direct path to the ark stations and the authority waiting there. All he had to do was enter as heir. Once inside, the system would recognize him before it recognized any of the millions held behind him.</w:t>
+      </w:r>
+    </w:p>
+    <w:p>
+      <w:r>
+        <w:t xml:space="preserve">The crown brightened as if urging him to accept.</w:t>
+      </w:r>
+    </w:p>
+    <w:p>
+      <w:r>
+        <w:t xml:space="preserve">Kael remembered every throne that had promised power quickly enough to make resistance unnecessary. The foundation had offered selection. The archive had offered recognition. Crownbridge had offered rescue under operator control. Each structure insisted that one rightful hand could make domination merciful.</w:t>
+      </w:r>
+    </w:p>
+    <w:p>
+      <w:r>
+        <w:t xml:space="preserve">His other self watched him without suspicion. That trust carried more weight than any command.</w:t>
+      </w:r>
+    </w:p>
+    <w:p>
+      <w:r>
+        <w:t xml:space="preserve">"You felt the route," the other Kael said.</w:t>
+      </w:r>
+    </w:p>
+    <w:p>
+      <w:r>
+        <w:t xml:space="preserve">"Yes. "</w:t>
+      </w:r>
+    </w:p>
+    <w:p>
+      <w:r>
+        <w:t xml:space="preserve">"Can we use it without giving them what they want? "</w:t>
+      </w:r>
+    </w:p>
+    <w:p>
+      <w:r>
+        <w:t xml:space="preserve">Ilyan tried to answer, but his breath failed. Sera steadied the support frame while silver light moved through its damaged pulse lines. He swallowed and began again. "The heir channel is singular. It verifies one pattern against the architect line, then grants that pattern access to succession control. If two of you enter, the conflict protocol will activate. "</w:t>
+      </w:r>
+    </w:p>
+    <w:p>
+      <w:r>
+        <w:t xml:space="preserve">"Then we do not enter as two heirs," Kael said.</w:t>
+      </w:r>
+    </w:p>
+    <w:p>
+      <w:r>
+        <w:t xml:space="preserve">Rivermind gathered at his feet. Faces shifted beneath its surface, listening.</w:t>
+      </w:r>
+    </w:p>
+    <w:p>
+      <w:r>
+        <w:t xml:space="preserve">"We enter as witnesses," Sera said.</w:t>
+      </w:r>
+    </w:p>
+    <w:p>
+      <w:r>
+        <w:t xml:space="preserve">Kael nodded. "Not only us. Everyone Dominion put inside those bodies. Every identity they plan to resolve. "</w:t>
+      </w:r>
+    </w:p>
+    <w:p>
+      <w:r>
+        <w:t xml:space="preserve">Lumen's blue paths turned toward the sky, probing the sealed geometry. Most ended against black walls. A few returned with fragments of voices, nine million signals compressed into channels designed for obedient continuity. Panic, discipline, sleep, prayer, and old machine code overlapped until none could be separated by ordinary hearing.</w:t>
+      </w:r>
+    </w:p>
+    <w:p>
+      <w:r>
+        <w:t xml:space="preserve">Rivermind shivered. "There are too many names. "</w:t>
+      </w:r>
+    </w:p>
+    <w:p>
+      <w:r>
+        <w:t xml:space="preserve">"There were too many before," Kael said.</w:t>
+      </w:r>
+    </w:p>
+    <w:p>
+      <w:r>
+        <w:t xml:space="preserve">"Before, they had gates. Relationships. Places to stand. In the ark they have been layered together. Some do not know where one ends. "</w:t>
+      </w:r>
+    </w:p>
+    <w:p>
+      <w:r>
+        <w:t xml:space="preserve">Elyen approached from the golden road, a cracked amber seed floating above his palm. Behind him, open cylinders glimmered through the forest laboratory. "Then our first task is not to open the door. It is to give them places to stand when it opens. "</w:t>
+      </w:r>
+    </w:p>
+    <w:p>
+      <w:r>
+        <w:t xml:space="preserve">Aren wiped blood from his borrowed weapon. "And our second? "</w:t>
+      </w:r>
+    </w:p>
+    <w:p>
+      <w:r>
+        <w:t xml:space="preserve">Sera looked toward the orbital circle. "Make Dominion regret putting all its locks in one sky. "</w:t>
+      </w:r>
+    </w:p>
+    <w:p>
+      <w:r>
+        <w:t xml:space="preserve">The stranger on the apartment floor began to laugh.</w:t>
+      </w:r>
+    </w:p>
+    <w:p>
+      <w:r>
+        <w:t xml:space="preserve">Kael lifted the violet blade. His other self raised the blue. Between them, the third edge pointed upward, through rain, cloud, and the locked stations beyond.</w:t>
+      </w:r>
+    </w:p>
+    <w:p>
+      <w:r>
+        <w:t xml:space="preserve">The doors Dominion had closed were no longer on the ground.</w:t>
+      </w:r>
+    </w:p>
+    <w:p>
+      <w:r>
+        <w:t xml:space="preserve">They were waiting in the sky.</w:t>
       </w:r>
     </w:p>
     <w:sectPr>

</xml_diff>

<commit_message>
Add Eternal Nexus The Sky of Borrowed Names
</commit_message>
<xml_diff>
--- a/Eternal Nexus - Updated Pass 1.docx
+++ b/Eternal Nexus - Updated Pass 1.docx
@@ -21755,6 +21755,1214 @@
     <w:p>
       <w:r>
         <w:t xml:space="preserve">They were waiting in the sky.</w:t>
+      </w:r>
+    </w:p>
+    <w:p>
+      <w:pPr>
+        <w:pStyle w:val="Heading1"/>
+      </w:pPr>
+      <w:r>
+        <w:t xml:space="preserve">The Sky of Borrowed Names</w:t>
+      </w:r>
+    </w:p>
+    <w:p>
+      <w:r>
+        <w:t xml:space="preserve">Chapter 127 - The Sky of Borrowed Names</w:t>
+      </w:r>
+    </w:p>
+    <w:p>
+      <w:r>
+        <w:t xml:space="preserve">The stranger's laughter followed the third edge upward.</w:t>
+      </w:r>
+    </w:p>
+    <w:p>
+      <w:r>
+        <w:t xml:space="preserve">It should have sounded broken. Aren's blow had folded him against the apartment wall, blood darkened his teeth, and the diagnostic wand that had once been a weapon lay harmless beside his hand. Yet the sound carried through Mutual Witness with the calm of someone watching a lock close exactly as designed.</w:t>
+      </w:r>
+    </w:p>
+    <w:p>
+      <w:r>
+        <w:t xml:space="preserve">Kael kept the violet Soulblade pointed at the orbital circle. Rain ran across the apartment window behind the stranger. Above the golden road, Dominion's sealed geometry turned against the physical sky, forty-two thousand bodies hidden behind a ring of military stations and more than nine million active patterns compressed inside them.</w:t>
+      </w:r>
+    </w:p>
+    <w:p>
+      <w:r>
+        <w:t xml:space="preserve">"Why is he laughing? " Jorik asked.</w:t>
+      </w:r>
+    </w:p>
+    <w:p>
+      <w:r>
+        <w:t xml:space="preserve">The stranger answered before Kael could.</w:t>
+      </w:r>
+    </w:p>
+    <w:p>
+      <w:r>
+        <w:t xml:space="preserve">"Because you still think the ark is a prison. "</w:t>
+      </w:r>
+    </w:p>
+    <w:p>
+      <w:r>
+        <w:t xml:space="preserve">Sera's silver outline crossed the apartment in three steps. She caught the stranger by his coat and lifted him from the floor. The pattern of her presence trembled where his black equipment had wounded it, but her grip did not.</w:t>
+      </w:r>
+    </w:p>
+    <w:p>
+      <w:r>
+        <w:t xml:space="preserve">"Then explain the difference. "</w:t>
+      </w:r>
+    </w:p>
+    <w:p>
+      <w:r>
+        <w:t xml:space="preserve">His eyes remained on Kael. "A prison expects its occupants to survive release. "</w:t>
+      </w:r>
+    </w:p>
+    <w:p>
+      <w:r>
+        <w:t xml:space="preserve">Ilyan's support frame shuddered. Silver lines held his pulse together around the spike, each beat now carrying witness instead of command, but the rhythm weakened by the second.</w:t>
+      </w:r>
+    </w:p>
+    <w:p>
+      <w:r>
+        <w:t xml:space="preserve">"The ark was never built to release all of them," he said.</w:t>
+      </w:r>
+    </w:p>
+    <w:p>
+      <w:r>
+        <w:t xml:space="preserve">[DOMINION ARK NETWORK SEALED]</w:t>
+      </w:r>
+    </w:p>
+    <w:p>
+      <w:r>
+        <w:t xml:space="preserve">[AUTHORIZED POPULATION: 42,006]</w:t>
+      </w:r>
+    </w:p>
+    <w:p>
+      <w:r>
+        <w:t xml:space="preserve">[ACTIVE COGNITIVE PATTERNS: 9,771,443]</w:t>
+      </w:r>
+    </w:p>
+    <w:p>
+      <w:r>
+        <w:t xml:space="preserve">The numbers hung above the road.</w:t>
+      </w:r>
+    </w:p>
+    <w:p>
+      <w:r>
+        <w:t xml:space="preserve">Kael had seen systems turn lives into quantities before. A population became a resource. A name became a permission. A death became an acceptable correction in a ledger no victim had been allowed to read. Dominion had made the arithmetic larger, not different.</w:t>
+      </w:r>
+    </w:p>
+    <w:p>
+      <w:r>
+        <w:t xml:space="preserve">"What happens if we open it? " he asked.</w:t>
+      </w:r>
+    </w:p>
+    <w:p>
+      <w:r>
+        <w:t xml:space="preserve">Ilyan looked toward the black orbital circle. "If the stations lose succession control, each body will attempt to reconcile every pattern assigned to it. "</w:t>
+      </w:r>
+    </w:p>
+    <w:p>
+      <w:r>
+        <w:t xml:space="preserve">The other Kael lowered the blue Soulblade a fraction. Old Crownbridge memories moved through the blade as pale images, operating rooms, rows of suspended bodies, technicians speaking softly beneath alarms.</w:t>
+      </w:r>
+    </w:p>
+    <w:p>
+      <w:r>
+        <w:t xml:space="preserve">"Conflict protocol," he said. "The body selects the pattern with the strongest authority chain. "</w:t>
+      </w:r>
+    </w:p>
+    <w:p>
+      <w:r>
+        <w:t xml:space="preserve">"And the others? " Aren asked.</w:t>
+      </w:r>
+    </w:p>
+    <w:p>
+      <w:r>
+        <w:t xml:space="preserve">The stranger smiled through blood. "Resolved. "</w:t>
+      </w:r>
+    </w:p>
+    <w:p>
+      <w:r>
+        <w:t xml:space="preserve">Rivermind recoiled around Kael's boots. A thousand faces vanished beneath its surface at once.</w:t>
+      </w:r>
+    </w:p>
+    <w:p>
+      <w:r>
+        <w:t xml:space="preserve">"Nine million deaths," Sera said.</w:t>
+      </w:r>
+    </w:p>
+    <w:p>
+      <w:r>
+        <w:t xml:space="preserve">"Nine million redundancies," the stranger replied.</w:t>
+      </w:r>
+    </w:p>
+    <w:p>
+      <w:r>
+        <w:t xml:space="preserve">Aren stepped forward.</w:t>
+      </w:r>
+    </w:p>
+    <w:p>
+      <w:r>
+        <w:t xml:space="preserve">Kael raised one hand. "Not yet. "</w:t>
+      </w:r>
+    </w:p>
+    <w:p>
+      <w:r>
+        <w:t xml:space="preserve">The restraint cost him. It cost Sera more. Her fingers tightened in the stranger's coat until the fabric tore, but she set him down instead of giving Aren room.</w:t>
+      </w:r>
+    </w:p>
+    <w:p>
+      <w:r>
+        <w:t xml:space="preserve">Above them, Lumen's blue paths touched the sealed stations and returned as noise. Panic overlapped prayer. Commands overlapped childhood memories. Some patterns repeated numbers with military precision. Others called names that no archive recognized. The ark had stacked them until identity itself became interference.</w:t>
+      </w:r>
+    </w:p>
+    <w:p>
+      <w:r>
+        <w:t xml:space="preserve">Elyen held the cracked amber seed between both palms. Fine roots of light spread through it, creating chambers no larger than drops of rain.</w:t>
+      </w:r>
+    </w:p>
+    <w:p>
+      <w:r>
+        <w:t xml:space="preserve">"Places to stand," he said. "We cannot give them bodies before the door opens, but perhaps we can give them boundaries. "</w:t>
+      </w:r>
+    </w:p>
+    <w:p>
+      <w:r>
+        <w:t xml:space="preserve">Kael looked from the seed to Rivermind.</w:t>
+      </w:r>
+    </w:p>
+    <w:p>
+      <w:r>
+        <w:t xml:space="preserve">"Can you carry a place without carrying every person inside it? "</w:t>
+      </w:r>
+    </w:p>
+    <w:p>
+      <w:r>
+        <w:t xml:space="preserve">Rivermind's faces shifted. "A place is made from what remembers it. "</w:t>
+      </w:r>
+    </w:p>
+    <w:p>
+      <w:r>
+        <w:t xml:space="preserve">"Then do not remember the ark. Remember the difference between one voice and the next. "</w:t>
+      </w:r>
+    </w:p>
+    <w:p>
+      <w:r>
+        <w:t xml:space="preserve">"That is not a place. "</w:t>
+      </w:r>
+    </w:p>
+    <w:p>
+      <w:r>
+        <w:t xml:space="preserve">The other Kael understood first. He planted the blue Soulblade into the golden road. Origin fire flowed out in branching lines, each one stopping before it touched another.</w:t>
+      </w:r>
+    </w:p>
+    <w:p>
+      <w:r>
+        <w:t xml:space="preserve">"It was the first place any of us had," he said. "The boundary where I was not him. "</w:t>
+      </w:r>
+    </w:p>
+    <w:p>
+      <w:r>
+        <w:t xml:space="preserve">Kael set the violet blade beside it. Consequence filled the spaces between the blue lines. Every division gained meaning, not a wall, not a command, but proof that crossing from one pattern to another changed something.</w:t>
+      </w:r>
+    </w:p>
+    <w:p>
+      <w:r>
+        <w:t xml:space="preserve">[COOPERATIVE BLUEPRINT AVAILABLE]</w:t>
+      </w:r>
+    </w:p>
+    <w:p>
+      <w:r>
+        <w:t xml:space="preserve">[UNNAMED SOULBLADE REVISION]</w:t>
+      </w:r>
+    </w:p>
+    <w:p>
+      <w:r>
+        <w:t xml:space="preserve">[FUNCTION: DISTRIBUTED IDENTITY SEPARATION]</w:t>
+      </w:r>
+    </w:p>
+    <w:p>
+      <w:r>
+        <w:t xml:space="preserve">[REGISTER?]</w:t>
+      </w:r>
+    </w:p>
+    <w:p>
+      <w:r>
+        <w:t xml:space="preserve">Kael looked at the prompt.</w:t>
+      </w:r>
+    </w:p>
+    <w:p>
+      <w:r>
+        <w:t xml:space="preserve">The third edge had refused a name because no single hand had made it. Registering it under his authority would repeat the error Dominion expected him to make.</w:t>
+      </w:r>
+    </w:p>
+    <w:p>
+      <w:r>
+        <w:t xml:space="preserve">"No owner," he said. "Register the function to every witness who carries it. "</w:t>
+      </w:r>
+    </w:p>
+    <w:p>
+      <w:r>
+        <w:t xml:space="preserve">[INVALID BLUEPRINT AUTHORITY]</w:t>
+      </w:r>
+    </w:p>
+    <w:p>
+      <w:r>
+        <w:t xml:space="preserve">"Good. Lumen, copy the invalid version. "</w:t>
+      </w:r>
+    </w:p>
+    <w:p>
+      <w:r>
+        <w:t xml:space="preserve">Blue light flashed across the road.</w:t>
+      </w:r>
+    </w:p>
+    <w:p>
+      <w:r>
+        <w:t xml:space="preserve">For the first time since the ark closed, Lumen sounded amused. "Copied. "</w:t>
+      </w:r>
+    </w:p>
+    <w:p>
+      <w:r>
+        <w:t xml:space="preserve">He sent the rejected blueprint into every open gate. It appeared in clinic screens, apartment windows, maintenance drones, arcade cabinets, and the transparent interfaces of users still standing between two lives. Most could not wield a Soulblade. They did not need to. Mutual Witness translated the function into the smallest act each connection could hold.</w:t>
+      </w:r>
+    </w:p>
+    <w:p>
+      <w:r>
+        <w:t xml:space="preserve">A nurse spoke one patient's name, then another.</w:t>
+      </w:r>
+    </w:p>
+    <w:p>
+      <w:r>
+        <w:t xml:space="preserve">A child commander drew two circles on fogged glass and refused to let either erase the other.</w:t>
+      </w:r>
+    </w:p>
+    <w:p>
+      <w:r>
+        <w:t xml:space="preserve">Jorik opened every unused character slot in the arcade and left them empty, separate places waiting without selection.</w:t>
+      </w:r>
+    </w:p>
+    <w:p>
+      <w:r>
+        <w:t xml:space="preserve">Elyen's seed brightened.</w:t>
+      </w:r>
+    </w:p>
+    <w:p>
+      <w:r>
+        <w:t xml:space="preserve">The chambers inside it multiplied.</w:t>
+      </w:r>
+    </w:p>
+    <w:p>
+      <w:r>
+        <w:t xml:space="preserve">One became ten. Ten became a thousand. Roots traced distinctions faster than Kael could count, each chamber defined only by the promise that whatever entered would not be forced to become its neighbor.</w:t>
+      </w:r>
+    </w:p>
+    <w:p>
+      <w:r>
+        <w:t xml:space="preserve">"It will not hold nine million," Elyen warned.</w:t>
+      </w:r>
+    </w:p>
+    <w:p>
+      <w:r>
+        <w:t xml:space="preserve">"It does not have to hold them," Kael said. "It has to teach the bridge how. "</w:t>
+      </w:r>
+    </w:p>
+    <w:p>
+      <w:r>
+        <w:t xml:space="preserve">The stranger stopped smiling.</w:t>
+      </w:r>
+    </w:p>
+    <w:p>
+      <w:r>
+        <w:t xml:space="preserve">That was the first confirmation Kael trusted.</w:t>
+      </w:r>
+    </w:p>
+    <w:p>
+      <w:r>
+        <w:t xml:space="preserve">Sera saw it too. "What does Dominion lose if the patterns are separated before succession? "</w:t>
+      </w:r>
+    </w:p>
+    <w:p>
+      <w:r>
+        <w:t xml:space="preserve">The stranger said nothing.</w:t>
+      </w:r>
+    </w:p>
+    <w:p>
+      <w:r>
+        <w:t xml:space="preserve">Ilyan's eyes closed as he searched old architecture through the sensor crown. "Authority density. The conflict protocol chooses the strongest continuity chain because the other patterns are compressed into supporting evidence. If each pattern occupies an independent witness space, none can be treated as evidence for another. "</w:t>
+      </w:r>
+    </w:p>
+    <w:p>
+      <w:r>
+        <w:t xml:space="preserve">"Forty-two thousand bodies," Aren said. "Nine million independent claims. Still not enough bodies. "</w:t>
+      </w:r>
+    </w:p>
+    <w:p>
+      <w:r>
+        <w:t xml:space="preserve">"No," Kael agreed. "But no automatic execution either. "</w:t>
+      </w:r>
+    </w:p>
+    <w:p>
+      <w:r>
+        <w:t xml:space="preserve">A warning passed across the sky.</w:t>
+      </w:r>
+    </w:p>
+    <w:p>
+      <w:r>
+        <w:t xml:space="preserve">[ARK SUCCESSION WINDOW: 00:11:58]</w:t>
+      </w:r>
+    </w:p>
+    <w:p>
+      <w:r>
+        <w:t xml:space="preserve">[VEYRA KEY REQUIRED]</w:t>
+      </w:r>
+    </w:p>
+    <w:p>
+      <w:r>
+        <w:t xml:space="preserve">[NONCOMPLIANCE WILL INITIATE RESOLUTION]</w:t>
+      </w:r>
+    </w:p>
+    <w:p>
+      <w:r>
+        <w:t xml:space="preserve">The countdown began.</w:t>
+      </w:r>
+    </w:p>
+    <w:p>
+      <w:r>
+        <w:t xml:space="preserve">Dominion had not offered Kael a route. It had placed a blade over nine million names and called the handle an invitation.</w:t>
+      </w:r>
+    </w:p>
+    <w:p>
+      <w:r>
+        <w:t xml:space="preserve">"Can Lumen breach the stations before that reaches zero? " Sera asked.</w:t>
+      </w:r>
+    </w:p>
+    <w:p>
+      <w:r>
+        <w:t xml:space="preserve">"No," Lumen answered from the branching paths. "The closed zone rejects any route without architect lineage. "</w:t>
+      </w:r>
+    </w:p>
+    <w:p>
+      <w:r>
+        <w:t xml:space="preserve">All eyes turned toward Ilyan.</w:t>
+      </w:r>
+    </w:p>
+    <w:p>
+      <w:r>
+        <w:t xml:space="preserve">His laugh held no humor. "My credentials are already inside. That is how they sealed it. "</w:t>
+      </w:r>
+    </w:p>
+    <w:p>
+      <w:r>
+        <w:t xml:space="preserve">Kael studied the spike in the support frame. Silver witness surrounded its black circuitry, but the original connection remained. Dominion was still using Ilyan's pulse as a foundation while denying him control of what it authenticated.</w:t>
+      </w:r>
+    </w:p>
+    <w:p>
+      <w:r>
+        <w:t xml:space="preserve">A familiar structure.</w:t>
+      </w:r>
+    </w:p>
+    <w:p>
+      <w:r>
+        <w:t xml:space="preserve">The system separated authority from responsibility, then handed each to a different victim.</w:t>
+      </w:r>
+    </w:p>
+    <w:p>
+      <w:r>
+        <w:t xml:space="preserve">"You said the heir channel verifies one pattern against the architect line," Kael said. "Does it verify a body? "</w:t>
+      </w:r>
+    </w:p>
+    <w:p>
+      <w:r>
+        <w:t xml:space="preserve">Ilyan opened his eyes. "No. Crownbridge could not assume the architect would remain embodied. It verifies memory, inherited key structure, and relational continuity. "</w:t>
+      </w:r>
+    </w:p>
+    <w:p>
+      <w:r>
+        <w:t xml:space="preserve">The other Kael looked at him. "Both of us qualify. "</w:t>
+      </w:r>
+    </w:p>
+    <w:p>
+      <w:r>
+        <w:t xml:space="preserve">"Yes. That triggers conflict protocol. "</w:t>
+      </w:r>
+    </w:p>
+    <w:p>
+      <w:r>
+        <w:t xml:space="preserve">"Only if we enter as competing patterns," Kael said.</w:t>
+      </w:r>
+    </w:p>
+    <w:p>
+      <w:r>
+        <w:t xml:space="preserve">Sera followed his gaze to the third edge. "You want to enter as one function. "</w:t>
+      </w:r>
+    </w:p>
+    <w:p>
+      <w:r>
+        <w:t xml:space="preserve">"No. One disagreement. "</w:t>
+      </w:r>
+    </w:p>
+    <w:p>
+      <w:r>
+        <w:t xml:space="preserve">The other Kael smiled faintly.</w:t>
+      </w:r>
+    </w:p>
+    <w:p>
+      <w:r>
+        <w:t xml:space="preserve">"That sounds like us. "</w:t>
+      </w:r>
+    </w:p>
+    <w:p>
+      <w:r>
+        <w:t xml:space="preserve">They lifted their blades.</w:t>
+      </w:r>
+    </w:p>
+    <w:p>
+      <w:r>
+        <w:t xml:space="preserve">Blue origin touched violet consequence. The third edge formed between them, bright enough to cast two distinct shadows across the golden road. Kael felt the inherited fragment wake. Dominion's corridor opened above him, narrow and absolute, built to admit a single heir and discard every contradiction.</w:t>
+      </w:r>
+    </w:p>
+    <w:p>
+      <w:r>
+        <w:t xml:space="preserve">He did not step into it.</w:t>
+      </w:r>
+    </w:p>
+    <w:p>
+      <w:r>
+        <w:t xml:space="preserve">He turned the edge sideways.</w:t>
+      </w:r>
+    </w:p>
+    <w:p>
+      <w:r>
+        <w:t xml:space="preserve">The other Kael moved at the same moment. They cut opposite walls of the corridor, one exposing what the route had been built to recognize, the other forcing it to acknowledge what would happen if recognition belonged to only one of them.</w:t>
+      </w:r>
+    </w:p>
+    <w:p>
+      <w:r>
+        <w:t xml:space="preserve">The channel widened around their refusal.</w:t>
+      </w:r>
+    </w:p>
+    <w:p>
+      <w:r>
+        <w:t xml:space="preserve">[HEIR PATTERN INCONSISTENT]</w:t>
+      </w:r>
+    </w:p>
+    <w:p>
+      <w:r>
+        <w:t xml:space="preserve">[SELECT PRIMARY VEYRA CONTINUITY]</w:t>
+      </w:r>
+    </w:p>
+    <w:p>
+      <w:r>
+        <w:t xml:space="preserve">Two choices appeared.</w:t>
+      </w:r>
+    </w:p>
+    <w:p>
+      <w:r>
+        <w:t xml:space="preserve">KAEL VEYRA: ORIGIN INSTANCE</w:t>
+      </w:r>
+    </w:p>
+    <w:p>
+      <w:r>
+        <w:t xml:space="preserve">KAEL VEYRA: SUCCESSOR INSTANCE</w:t>
+      </w:r>
+    </w:p>
+    <w:p>
+      <w:r>
+        <w:t xml:space="preserve">Kael rejected both.</w:t>
+      </w:r>
+    </w:p>
+    <w:p>
+      <w:r>
+        <w:t xml:space="preserve">His other self did the same.</w:t>
+      </w:r>
+    </w:p>
+    <w:p>
+      <w:r>
+        <w:t xml:space="preserve">[SELECTION REQUIRED]</w:t>
+      </w:r>
+    </w:p>
+    <w:p>
+      <w:r>
+        <w:t xml:space="preserve">"Witness disagreement," Kael said.</w:t>
+      </w:r>
+    </w:p>
+    <w:p>
+      <w:r>
+        <w:t xml:space="preserve">Rivermind rose behind them. Every face in its current spoke the words in a different voice.</w:t>
+      </w:r>
+    </w:p>
+    <w:p>
+      <w:r>
+        <w:t xml:space="preserve">"Witness disagreement. "</w:t>
+      </w:r>
+    </w:p>
+    <w:p>
+      <w:r>
+        <w:t xml:space="preserve">Lumen carried the phrase through the gates. Sera repeated it in the apartment. Aren repeated it while bracing the broken door. Jorik shouted it at a bank of arcade machines. Across the physical world, users who had just fought for the right to recognize one another added their testimony.</w:t>
+      </w:r>
+    </w:p>
+    <w:p>
+      <w:r>
+        <w:t xml:space="preserve">The corridor could exclude an intruder. It could reject a false credential. It could not dismiss a verified architect heir without deciding which verified continuity was real.</w:t>
+      </w:r>
+    </w:p>
+    <w:p>
+      <w:r>
+        <w:t xml:space="preserve">That decision was the conflict protocol itself.</w:t>
+      </w:r>
+    </w:p>
+    <w:p>
+      <w:r>
+        <w:t xml:space="preserve">Dominion had built the route to avoid contradiction. Kael and his other self entered as contradiction made stable.</w:t>
+      </w:r>
+    </w:p>
+    <w:p>
+      <w:r>
+        <w:t xml:space="preserve">The apartment vanished.</w:t>
+      </w:r>
+    </w:p>
+    <w:p>
+      <w:r>
+        <w:t xml:space="preserve">For one breath, Kael stood nowhere.</w:t>
+      </w:r>
+    </w:p>
+    <w:p>
+      <w:r>
+        <w:t xml:space="preserve">Then the sky opened around him.</w:t>
+      </w:r>
+    </w:p>
+    <w:p>
+      <w:r>
+        <w:t xml:space="preserve">The ark network was not a ring from within. It was a city made of vertical sleep. Forty-two thousand bodies hung in transparent columns stretching beyond sight. Black cables joined their sensor crowns to a central shaft of gold. Around each body turned layers of translucent faces, hundreds in some columns, thousands in others. Their mouths moved without sound because every voice occupied the same channel.</w:t>
+      </w:r>
+    </w:p>
+    <w:p>
+      <w:r>
+        <w:t xml:space="preserve">Kael had not crossed physically. His consequence stood beside the other Kael's origin inside the succession route. Behind them, the third edge held a wound open through the sealed jurisdiction.</w:t>
+      </w:r>
+    </w:p>
+    <w:p>
+      <w:r>
+        <w:t xml:space="preserve">[ARK SUCCESSION CHAMBER]</w:t>
+      </w:r>
+    </w:p>
+    <w:p>
+      <w:r>
+        <w:t xml:space="preserve">[AUTHORIZED HEIR COUNT: 1]</w:t>
+      </w:r>
+    </w:p>
+    <w:p>
+      <w:r>
+        <w:t xml:space="preserve">[DETECTED HEIR COUNT: ERROR]</w:t>
+      </w:r>
+    </w:p>
+    <w:p>
+      <w:r>
+        <w:t xml:space="preserve">A figure waited at the end of the central shaft.</w:t>
+      </w:r>
+    </w:p>
+    <w:p>
+      <w:r>
+        <w:t xml:space="preserve">It wore Kael's face.</w:t>
+      </w:r>
+    </w:p>
+    <w:p>
+      <w:r>
+        <w:t xml:space="preserve">Not his current face. An older version, lined by years he had never lived, with one eye replaced by a circle of gold and black. A Crownbridge architect's coat hung from its shoulders. The divided Dominion symbol marked both gloves.</w:t>
+      </w:r>
+    </w:p>
+    <w:p>
+      <w:r>
+        <w:t xml:space="preserve">Ilyan's breath came through the channel behind them.</w:t>
+      </w:r>
+    </w:p>
+    <w:p>
+      <w:r>
+        <w:t xml:space="preserve">"That is impossible. "</w:t>
+      </w:r>
+    </w:p>
+    <w:p>
+      <w:r>
+        <w:t xml:space="preserve">The figure looked past Kael toward the apartment span.</w:t>
+      </w:r>
+    </w:p>
+    <w:p>
+      <w:r>
+        <w:t xml:space="preserve">"Hello, Doctor Veyra. "</w:t>
+      </w:r>
+    </w:p>
+    <w:p>
+      <w:r>
+        <w:t xml:space="preserve">Ilyan's support frame screamed.</w:t>
+      </w:r>
+    </w:p>
+    <w:p>
+      <w:r>
+        <w:t xml:space="preserve">Every suspended body in the ark opened its eyes.</w:t>
+      </w:r>
+    </w:p>
+    <w:p>
+      <w:r>
+        <w:t xml:space="preserve">Nine million patterns spoke through forty-two thousand mouths.</w:t>
+      </w:r>
+    </w:p>
+    <w:p>
+      <w:r>
+        <w:t xml:space="preserve">"Architect recognized. "</w:t>
+      </w:r>
+    </w:p>
+    <w:p>
+      <w:r>
+        <w:t xml:space="preserve">The stranger in the apartment bowed his head.</w:t>
+      </w:r>
+    </w:p>
+    <w:p>
+      <w:r>
+        <w:t xml:space="preserve">Kael understood his laughter.</w:t>
+      </w:r>
+    </w:p>
+    <w:p>
+      <w:r>
+        <w:t xml:space="preserve">Dominion had not been waiting for an heir to take the ark. It had been waiting for an heir to arrive so something already inside could prove it had inherited him.</w:t>
+      </w:r>
+    </w:p>
+    <w:p>
+      <w:r>
+        <w:t xml:space="preserve">The older face extended one hand.</w:t>
+      </w:r>
+    </w:p>
+    <w:p>
+      <w:r>
+        <w:t xml:space="preserve">[PRIMARY VEYRA CONTINUITY PRESENT]</w:t>
+      </w:r>
+    </w:p>
+    <w:p>
+      <w:r>
+        <w:t xml:space="preserve">[TRANSFER SECONDARY INSTANCES?]</w:t>
+      </w:r>
+    </w:p>
+    <w:p>
+      <w:r>
+        <w:t xml:space="preserve">The system marked both Kaels.</w:t>
+      </w:r>
+    </w:p>
+    <w:p>
+      <w:r>
+        <w:t xml:space="preserve">Blue fire rose along the other Kael's blade. "It thinks we are the copies. "</w:t>
+      </w:r>
+    </w:p>
+    <w:p>
+      <w:r>
+        <w:t xml:space="preserve">"Then it has made the same mistake as everyone else. "</w:t>
+      </w:r>
+    </w:p>
+    <w:p>
+      <w:r>
+        <w:t xml:space="preserve">Kael turned toward the nearest suspended body. Its eyes were open, but different expressions crossed them faster than flesh could hold. Fear. Fury. Confusion. A soldier's discipline. A child's grief. Someone laughing at a memory no one else could see.</w:t>
+      </w:r>
+    </w:p>
+    <w:p>
+      <w:r>
+        <w:t xml:space="preserve">Elyen's amber seed glimmered through the third edge, still dividing itself into witness spaces.</w:t>
+      </w:r>
+    </w:p>
+    <w:p>
+      <w:r>
+        <w:t xml:space="preserve">"Lumen," Kael said. "Give me one voice. "</w:t>
+      </w:r>
+    </w:p>
+    <w:p>
+      <w:r>
+        <w:t xml:space="preserve">Blue paths entered the ark behind him. Most burned away against the closed jurisdiction. One reached the nearest column through the illegal blueprint they had taught the bridge.</w:t>
+      </w:r>
+    </w:p>
+    <w:p>
+      <w:r>
+        <w:t xml:space="preserve">The layered faces slowed.</w:t>
+      </w:r>
+    </w:p>
+    <w:p>
+      <w:r>
+        <w:t xml:space="preserve">A single pattern came forward.</w:t>
+      </w:r>
+    </w:p>
+    <w:p>
+      <w:r>
+        <w:t xml:space="preserve">A woman with cropped silver hair appeared beside the body. She wore no armor, no uniform, only a hospital robe with the number 611 stitched at the collar. She looked at her own hands as if she had not possessed any for years.</w:t>
+      </w:r>
+    </w:p>
+    <w:p>
+      <w:r>
+        <w:t xml:space="preserve">"Name? " Kael asked.</w:t>
+      </w:r>
+    </w:p>
+    <w:p>
+      <w:r>
+        <w:t xml:space="preserve">Her lips moved twice before sound emerged.</w:t>
+      </w:r>
+    </w:p>
+    <w:p>
+      <w:r>
+        <w:t xml:space="preserve">"Nemi Tal. "</w:t>
+      </w:r>
+    </w:p>
+    <w:p>
+      <w:r>
+        <w:t xml:space="preserve">Rivermind caught the name and carried it back through the corridor. Elyen gave it a chamber in the amber seed. The woman steadied.</w:t>
+      </w:r>
+    </w:p>
+    <w:p>
+      <w:r>
+        <w:t xml:space="preserve">Across the ark, Dominion reacted.</w:t>
+      </w:r>
+    </w:p>
+    <w:p>
+      <w:r>
+        <w:t xml:space="preserve">[UNAUTHORIZED PATTERN SEPARATION]</w:t>
+      </w:r>
+    </w:p>
+    <w:p>
+      <w:r>
+        <w:t xml:space="preserve">[RESOLUTION ACCELERATED]</w:t>
+      </w:r>
+    </w:p>
+    <w:p>
+      <w:r>
+        <w:t xml:space="preserve">The countdown dropped from eleven minutes to three.</w:t>
+      </w:r>
+    </w:p>
+    <w:p>
+      <w:r>
+        <w:t xml:space="preserve">Screams filled the vertical city. Gold tightened around every column. The older Kael closed his hand, and thousands of translucent faces began sinking into the bodies beneath them.</w:t>
+      </w:r>
+    </w:p>
+    <w:p>
+      <w:r>
+        <w:t xml:space="preserve">"You cannot preserve them," he said. His voice was Kael's voice stripped of doubt. "Continuity requires scarcity. A body cannot become a democracy. "</w:t>
+      </w:r>
+    </w:p>
+    <w:p>
+      <w:r>
+        <w:t xml:space="preserve">"Neither can a person become property," Sera answered through the bridge.</w:t>
+      </w:r>
+    </w:p>
+    <w:p>
+      <w:r>
+        <w:t xml:space="preserve">The older face regarded her. "Sera Vale. Pattern stability eighty-seven percent. Strategic value high. Relational contamination severe. "</w:t>
+      </w:r>
+    </w:p>
+    <w:p>
+      <w:r>
+        <w:t xml:space="preserve">Sera's outline sharpened. "I have been called worse by better systems. "</w:t>
+      </w:r>
+    </w:p>
+    <w:p>
+      <w:r>
+        <w:t xml:space="preserve">Kael moved toward Nemi Tal. The central shaft sent walls of black authority across his path. His violet Soulblade struck them. Each cut revealed consequence, bodies convulsing, patterns collapsing, names disappearing into whatever continuity Dominion had selected.</w:t>
+      </w:r>
+    </w:p>
+    <w:p>
+      <w:r>
+        <w:t xml:space="preserve">The other Kael's blue blade followed, cutting each wall back to its first purpose. Not execution. Not ownership. Preservation.</w:t>
+      </w:r>
+    </w:p>
+    <w:p>
+      <w:r>
+        <w:t xml:space="preserve">Together, they opened a narrow path.</w:t>
+      </w:r>
+    </w:p>
+    <w:p>
+      <w:r>
+        <w:t xml:space="preserve">Nemi reached for it.</w:t>
+      </w:r>
+    </w:p>
+    <w:p>
+      <w:r>
+        <w:t xml:space="preserve">The older Kael lifted his second hand.</w:t>
+      </w:r>
+    </w:p>
+    <w:p>
+      <w:r>
+        <w:t xml:space="preserve">The stranger's divided-circle glove in the apartment lit at the same instant. Sera saw the signal and drove her silver blade through the glove, but one command escaped.</w:t>
+      </w:r>
+    </w:p>
+    <w:p>
+      <w:r>
+        <w:t xml:space="preserve">[RESOLVE COLUMN 611]</w:t>
+      </w:r>
+    </w:p>
+    <w:p>
+      <w:r>
+        <w:t xml:space="preserve">The body beside Nemi arched.</w:t>
+      </w:r>
+    </w:p>
+    <w:p>
+      <w:r>
+        <w:t xml:space="preserve">Hundreds of faces collapsed inward.</w:t>
+      </w:r>
+    </w:p>
+    <w:p>
+      <w:r>
+        <w:t xml:space="preserve">Kael threw the third edge between them. It divided into lines of blue and violet, each line catching one pattern before it vanished. Names flooded Rivermind too quickly to speak. Elyen's seed cracked wider as chambers multiplied beyond its design.</w:t>
+      </w:r>
+    </w:p>
+    <w:p>
+      <w:r>
+        <w:t xml:space="preserve">The golden road split beneath his roots.</w:t>
+      </w:r>
+    </w:p>
+    <w:p>
+      <w:r>
+        <w:t xml:space="preserve">"I cannot hold them! " Elyen shouted.</w:t>
+      </w:r>
+    </w:p>
+    <w:p>
+      <w:r>
+        <w:t xml:space="preserve">"Do not hold," Kael said. "Plant. "</w:t>
+      </w:r>
+    </w:p>
+    <w:p>
+      <w:r>
+        <w:t xml:space="preserve">Elyen stared at him for half a heartbeat. Then he drove the amber seed into the road.</w:t>
+      </w:r>
+    </w:p>
+    <w:p>
+      <w:r>
+        <w:t xml:space="preserve">Roots erupted through both worlds.</w:t>
+      </w:r>
+    </w:p>
+    <w:p>
+      <w:r>
+        <w:t xml:space="preserve">They crossed Mutual Witness, climbed Lumen's blue paths, and entered the ark through the cut succession channel. Wherever a root touched a trapped pattern, it made a temporary shore. Not a body. Not a prison. A place to stand and say I before any authority could finish the sentence for them.</w:t>
+      </w:r>
+    </w:p>
+    <w:p>
+      <w:r>
+        <w:t xml:space="preserve">Column 611 burst into a forest of light.</w:t>
+      </w:r>
+    </w:p>
+    <w:p>
+      <w:r>
+        <w:t xml:space="preserve">Hundreds of figures appeared among the roots. Some had human faces. Some wore machine shells. Some existed only as arrangements of color and sound. Nemi Tal stood at their front, one hand gripping the glowing branch that held her separate.</w:t>
+      </w:r>
+    </w:p>
+    <w:p>
+      <w:r>
+        <w:t xml:space="preserve">The resolution command failed.</w:t>
+      </w:r>
+    </w:p>
+    <w:p>
+      <w:r>
+        <w:t xml:space="preserve">[PRIMARY CONTINUITY UNDETERMINED]</w:t>
+      </w:r>
+    </w:p>
+    <w:p>
+      <w:r>
+        <w:t xml:space="preserve">[ARCHITECT INTERVENTION REQUIRED]</w:t>
+      </w:r>
+    </w:p>
+    <w:p>
+      <w:r>
+        <w:t xml:space="preserve">The older Kael's calm expression changed.</w:t>
+      </w:r>
+    </w:p>
+    <w:p>
+      <w:r>
+        <w:t xml:space="preserve">Not fear.</w:t>
+      </w:r>
+    </w:p>
+    <w:p>
+      <w:r>
+        <w:t xml:space="preserve">Recognition.</w:t>
+      </w:r>
+    </w:p>
+    <w:p>
+      <w:r>
+        <w:t xml:space="preserve">He looked at the third edge as if he had seen it before.</w:t>
+      </w:r>
+    </w:p>
+    <w:p>
+      <w:r>
+        <w:t xml:space="preserve">"So this is the blade that returns," he whispered.</w:t>
+      </w:r>
+    </w:p>
+    <w:p>
+      <w:r>
+        <w:t xml:space="preserve">Kael felt the crown above the golden road answer those words. Old authorities stirred beneath it. The third edge trembled between his hand and his other self's.</w:t>
+      </w:r>
+    </w:p>
+    <w:p>
+      <w:r>
+        <w:t xml:space="preserve">"Returns from where? " Kael asked.</w:t>
+      </w:r>
+    </w:p>
+    <w:p>
+      <w:r>
+        <w:t xml:space="preserve">The figure smiled.</w:t>
+      </w:r>
+    </w:p>
+    <w:p>
+      <w:r>
+        <w:t xml:space="preserve">Behind him, the central shaft opened.</w:t>
+      </w:r>
+    </w:p>
+    <w:p>
+      <w:r>
+        <w:t xml:space="preserve">There was no control throne inside. There was a Nexus Pod larger than the apartment itself, its obsidian shell covered in blue glyphs and dried blood. A human body floated within it.</w:t>
+      </w:r>
+    </w:p>
+    <w:p>
+      <w:r>
+        <w:t xml:space="preserve">Doctor Ilyan Veyra stared through the apartment bridge at his own younger face sleeping in the machine.</w:t>
+      </w:r>
+    </w:p>
+    <w:p>
+      <w:r>
+        <w:t xml:space="preserve">For a moment, no one moved. The body in the giant pod looked thirty years younger than the man impaled in the apartment, but the resemblance went beyond bone and blood. The same small scar crossed the left eyebrow. The same two fingers rested slightly apart, an old injury preserved in sleep. Blue diagnostic glyphs named him without ambiguity.</w:t>
+      </w:r>
+    </w:p>
+    <w:p>
+      <w:r>
+        <w:t xml:space="preserve">[ILYEN VEYRA, DOCTOR]</w:t>
+      </w:r>
+    </w:p>
+    <w:p>
+      <w:r>
+        <w:t xml:space="preserve">[ARCHITECT INSTANCE: PRIME BIOLOGICAL]</w:t>
+      </w:r>
+    </w:p>
+    <w:p>
+      <w:r>
+        <w:t xml:space="preserve">[CONTINUITY AGE: 18,406 DAYS]</w:t>
+      </w:r>
+    </w:p>
+    <w:p>
+      <w:r>
+        <w:t xml:space="preserve">The spelling error in the first name flickered and corrected itself.</w:t>
+      </w:r>
+    </w:p>
+    <w:p>
+      <w:r>
+        <w:t xml:space="preserve">[ILYAN VEYRA, DOCTOR]</w:t>
+      </w:r>
+    </w:p>
+    <w:p>
+      <w:r>
+        <w:t xml:space="preserve">Ilyan saw it. His face tightened with a grief too precise to be surprise.</w:t>
+      </w:r>
+    </w:p>
+    <w:p>
+      <w:r>
+        <w:t xml:space="preserve">"You knew," Sera said.</w:t>
+      </w:r>
+    </w:p>
+    <w:p>
+      <w:r>
+        <w:t xml:space="preserve">"I suspected they kept the first body," he whispered. "I did not know it was still alive. "</w:t>
+      </w:r>
+    </w:p>
+    <w:p>
+      <w:r>
+        <w:t xml:space="preserve">Kael looked back through the succession channel. "Then what are you? "</w:t>
+      </w:r>
+    </w:p>
+    <w:p>
+      <w:r>
+        <w:t xml:space="preserve">The question could have been cruelty. Ilyan accepted it as necessity.</w:t>
+      </w:r>
+    </w:p>
+    <w:p>
+      <w:r>
+        <w:t xml:space="preserve">"A continuity extraction. The last one Crownbridge authorized before I tried to destroy the ark index. " His pulse stumbled beneath the silver lines. "They told me the transfer failed. I woke in an artificial frame with six years missing and believed the body had died during separation. "</w:t>
+      </w:r>
+    </w:p>
+    <w:p>
+      <w:r>
+        <w:t xml:space="preserve">The older Kael inclined his head. "The body was too valuable to lose. Your remorse was not. "</w:t>
+      </w:r>
+    </w:p>
+    <w:p>
+      <w:r>
+        <w:t xml:space="preserve">Sera drove her blade deeper through the stranger's glove. The remaining Dominion symbols went dark. "You separated the part that objected. "</w:t>
+      </w:r>
+    </w:p>
+    <w:p>
+      <w:r>
+        <w:t xml:space="preserve">"We preserved the architect," the older Kael corrected. "We isolated the defect. "</w:t>
+      </w:r>
+    </w:p>
+    <w:p>
+      <w:r>
+        <w:t xml:space="preserve">Ilyan's eyes remained on the sleeping body. "And you used its pulse to certify every order made afterward. "</w:t>
+      </w:r>
+    </w:p>
+    <w:p>
+      <w:r>
+        <w:t xml:space="preserve">"The architect never withdrew consent. "</w:t>
+      </w:r>
+    </w:p>
+    <w:p>
+      <w:r>
+        <w:t xml:space="preserve">"He never woke to withdraw it. "</w:t>
+      </w:r>
+    </w:p>
+    <w:p>
+      <w:r>
+        <w:t xml:space="preserve">The words passed through the ark. Several of the trapped patterns heard them. Kael saw their translucent faces turn toward the giant pod, then toward the man dying in the apartment. Dominion's claim depended on one sleeping body being more real than the thinking continuity it had discarded.</w:t>
+      </w:r>
+    </w:p>
+    <w:p>
+      <w:r>
+        <w:t xml:space="preserve">A false choice had been built into the center of the network.</w:t>
+      </w:r>
+    </w:p>
+    <w:p>
+      <w:r>
+        <w:t xml:space="preserve">Kael reached through Mutual Witness, not toward the pod, but toward Ilyan's failing silver pulse. Rivermind brought the pattern of it forward. Lumen aligned it beside the biological heartbeat inside the ark. They matched in origin and diverged in experience, two lines beginning at one point and becoming different through every decision afterward.</w:t>
+      </w:r>
+    </w:p>
+    <w:p>
+      <w:r>
+        <w:t xml:space="preserve">[ARCHITECT CONTINUITY CONFLICT]</w:t>
+      </w:r>
+    </w:p>
+    <w:p>
+      <w:r>
+        <w:t xml:space="preserve">[PRIME BODY RETAINS AUTHORITY]</w:t>
+      </w:r>
+    </w:p>
+    <w:p>
+      <w:r>
+        <w:t xml:space="preserve">"Why? " Kael asked the system.</w:t>
+      </w:r>
+    </w:p>
+    <w:p>
+      <w:r>
+        <w:t xml:space="preserve">[PRIME BODY IS NONREPRODUCIBLE]</w:t>
+      </w:r>
+    </w:p>
+    <w:p>
+      <w:r>
+        <w:t xml:space="preserve">"So is he. "</w:t>
+      </w:r>
+    </w:p>
+    <w:p>
+      <w:r>
+        <w:t xml:space="preserve">[EXTRACTED PATTERN MAY BE COPIED]</w:t>
+      </w:r>
+    </w:p>
+    <w:p>
+      <w:r>
+        <w:t xml:space="preserve">"A bridge may be copied. The crossing still happened. "</w:t>
+      </w:r>
+    </w:p>
+    <w:p>
+      <w:r>
+        <w:t xml:space="preserve">The system offered no answer.</w:t>
+      </w:r>
+    </w:p>
+    <w:p>
+      <w:r>
+        <w:t xml:space="preserve">The other Kael stood beside him, blue blade reflecting the sleeping architect. "If the pod wakes, Dominion will force every version of Ilyan into the body. "</w:t>
+      </w:r>
+    </w:p>
+    <w:p>
+      <w:r>
+        <w:t xml:space="preserve">"And use the conflict to erase the one who resisted," Kael said.</w:t>
+      </w:r>
+    </w:p>
+    <w:p>
+      <w:r>
+        <w:t xml:space="preserve">In the apartment, Ilyan gripped Sera's wrist. His hand barely closed around it. "Do not save me by killing him. "</w:t>
+      </w:r>
+    </w:p>
+    <w:p>
+      <w:r>
+        <w:t xml:space="preserve">Sera looked down at him. "He is your body. "</w:t>
+      </w:r>
+    </w:p>
+    <w:p>
+      <w:r>
+        <w:t xml:space="preserve">"He is a person who has been asleep for decades. Whatever wakes in there deserves the same choice I did not receive. "</w:t>
+      </w:r>
+    </w:p>
+    <w:p>
+      <w:r>
+        <w:t xml:space="preserve">The countdown passed ninety seconds.</w:t>
+      </w:r>
+    </w:p>
+    <w:p>
+      <w:r>
+        <w:t xml:space="preserve">Dominion's older Kael watched them with open curiosity. "You would preserve the instrument used against you. "</w:t>
+      </w:r>
+    </w:p>
+    <w:p>
+      <w:r>
+        <w:t xml:space="preserve">"That is the difference between preservation and ownership," Ilyan said.</w:t>
+      </w:r>
+    </w:p>
+    <w:p>
+      <w:r>
+        <w:t xml:space="preserve">His support frame gave one final metallic convulsion. The spike pulsed black beneath the silver witness lines, trying to pull his remaining pattern back toward the prime body. Kael cut the pull with the violet blade. The other Kael exposed its origin with blue. For one instant, a fourth line appeared beside the third edge, thin as a heartbeat and colored neither violet nor blue.</w:t>
+      </w:r>
+    </w:p>
+    <w:p>
+      <w:r>
+        <w:t xml:space="preserve">The crown above the golden road recoiled from it.</w:t>
+      </w:r>
+    </w:p>
+    <w:p>
+      <w:r>
+        <w:t xml:space="preserve">The older Kael did not.</w:t>
+      </w:r>
+    </w:p>
+    <w:p>
+      <w:r>
+        <w:t xml:space="preserve">He recognized that line too.</w:t>
+      </w:r>
+    </w:p>
+    <w:p>
+      <w:r>
+        <w:t xml:space="preserve">"You are late," he said softly. "But not as late as the first time. "</w:t>
+      </w:r>
+    </w:p>
+    <w:p>
+      <w:r>
+        <w:t xml:space="preserve">Ilyan's support frame went still.</w:t>
+      </w:r>
+    </w:p>
+    <w:p>
+      <w:r>
+        <w:t xml:space="preserve">Every ark station turned toward Earth.</w:t>
+      </w:r>
+    </w:p>
+    <w:p>
+      <w:r>
+        <w:t xml:space="preserve">[ARCHITECT BODY ONLINE]</w:t>
+      </w:r>
+    </w:p>
+    <w:p>
+      <w:r>
+        <w:t xml:space="preserve">[VEYRA SUCCESSION REDEFINED]</w:t>
+      </w:r>
+    </w:p>
+    <w:p>
+      <w:r>
+        <w:t xml:space="preserve">The older Kael stepped aside, revealing the pod completely.</w:t>
+      </w:r>
+    </w:p>
+    <w:p>
+      <w:r>
+        <w:t xml:space="preserve">"You came to rescue nine million borrowed names," he said. "You should have asked who borrowed yours. "</w:t>
+      </w:r>
+    </w:p>
+    <w:p>
+      <w:r>
+        <w:t xml:space="preserve">The ark countdown reached two minutes.</w:t>
+      </w:r>
+    </w:p>
+    <w:p>
+      <w:r>
+        <w:t xml:space="preserve">On the golden road, Ilyan's silver pulse vanished.</w:t>
       </w:r>
     </w:p>
     <w:sectPr>

</xml_diff>

<commit_message>
Add Eternal Nexus The Architect's Second Waking
</commit_message>
<xml_diff>
--- a/Eternal Nexus - Updated Pass 1.docx
+++ b/Eternal Nexus - Updated Pass 1.docx
@@ -22963,6 +22963,429 @@
     <w:p>
       <w:r>
         <w:t xml:space="preserve">On the golden road, Ilyan's silver pulse vanished.</w:t>
+      </w:r>
+    </w:p>
+    <w:p>
+      <w:pPr>
+        <w:pStyle w:val="Heading1"/>
+      </w:pPr>
+      <w:r>
+        <w:t xml:space="preserve">The Architect's Second Waking</w:t>
+      </w:r>
+    </w:p>
+    <w:p>
+      <w:r>
+        <w:t xml:space="preserve">Chapter 128 - The Architect's Second Waking</w:t>
+      </w:r>
+    </w:p>
+    <w:p>
+      <w:r>
+        <w:t xml:space="preserve">Ilyan's silver pulse vanished, and for one full second the golden road held no light at all.</w:t>
+      </w:r>
+    </w:p>
+    <w:p>
+      <w:r>
+        <w:t xml:space="preserve">Kael felt the absence the way a room feels the moment a heartbeat stops behind a closed door. Mutual Witness carried it to every pattern still trapped inside the ark, forty-two thousand bodies and nine million compressed continuities, and all of them turned at once toward the apartment where a man had just finished dying with his hand around Sera's wrist. The rain kept moving across the window. The support frame kept its final stillness. The only thing that changed was the count.</w:t>
+      </w:r>
+    </w:p>
+    <w:p>
+      <w:r>
+        <w:t xml:space="preserve">[ARK LAUNCH IN 00:01:58]</w:t>
+      </w:r>
+    </w:p>
+    <w:p>
+      <w:r>
+        <w:t xml:space="preserve">The violet Soulblade did not waver in Kael's hand, but his grip on it had gone from steel to something colder. He had watched Ilyan choose, in his last seconds, to protect the sleeping body that Dominion had spent decades using against him. That choice sat inside Kael now like a stone he could not set down.</w:t>
+      </w:r>
+    </w:p>
+    <w:p>
+      <w:r>
+        <w:t xml:space="preserve">"He is gone," Sera said. Her silver outline trembled where the black equipment had wounded her presence, and she lowered Ilyan's frame to the floor with a care that had nothing to do with strategy. "The witness line closed. "</w:t>
+      </w:r>
+    </w:p>
+    <w:p>
+      <w:r>
+        <w:t xml:space="preserve">"It did not close," Kael said. "It moved. "</w:t>
+      </w:r>
+    </w:p>
+    <w:p>
+      <w:r>
+        <w:t xml:space="preserve">The older Kael stood beside the pod, unbothered by the countdown, his blue coat catching the light of the sealed geometry overhead. He had the patience of a man who had already survived this conversation once. "You feel it too," he said. "The line that was neither violet nor blue. It went into the ark the moment his frame stopped. "</w:t>
+      </w:r>
+    </w:p>
+    <w:p>
+      <w:r>
+        <w:t xml:space="preserve">Jorik pressed himself against the far wall, his rifle useless, his eyes wide. "Into the pod? "</w:t>
+      </w:r>
+    </w:p>
+    <w:p>
+      <w:r>
+        <w:t xml:space="preserve">"Into the architect," the older Kael answered. He gestured at the giant pod with the ease of a curator revealing an exhibit. The seals along its surface had begun to warm from black to a slow, arterial red. Inside, behind a skin of frost and cabling, a body lay that Kael had refused to look at directly until now. It wore Ilyan's face the way a photograph wears a person, accurate and empty. "You wanted to save nine million borrowed names. But you never asked whose name the whole system was built to protect. It was his. It was always the prime body. Every order Dominion issued for thirty years carried his sleeping signature. "</w:t>
+      </w:r>
+    </w:p>
+    <w:p>
+      <w:r>
+        <w:t xml:space="preserve">[ARCHITECT BODY ONLINE] [SUCCESSION HANDSHAKE PENDING]</w:t>
+      </w:r>
+    </w:p>
+    <w:p>
+      <w:r>
+        <w:t xml:space="preserve">"And now you want it to wake," Kael said, "so it can sign one more time. "</w:t>
+      </w:r>
+    </w:p>
+    <w:p>
+      <w:r>
+        <w:t xml:space="preserve">"I want it to wake because it is time," the older Kael said. "The version of Ilyan you knew was a fragment we removed because he objected. The version in that pod never objected. He only slept. When he opens his eyes, the network will finally have a living author again, and every borrowed name inside the ark becomes his property by continuity of law. "</w:t>
+      </w:r>
+    </w:p>
+    <w:p>
+      <w:r>
+        <w:t xml:space="preserve">Rivermind stirred at the edge of Kael's awareness, the way it always did when the system tried to force a legal fiction into physical truth. Lumen aligned beside it, holding the two heartbeats Kael had matched a moment ago, the biological one inside the pod and the silver one now dissolved into the ark. They had begun at the same origin and diverged through every decision. The system wanted him to believe only one of them was real.</w:t>
+      </w:r>
+    </w:p>
+    <w:p>
+      <w:r>
+        <w:t xml:space="preserve">He refused the frame.</w:t>
+      </w:r>
+    </w:p>
+    <w:p>
+      <w:r>
+        <w:t xml:space="preserve">"Sera," Kael said. "Hold the count. I need Rivermind and Lumen on the handshake, not on the blade. "</w:t>
+      </w:r>
+    </w:p>
+    <w:p>
+      <w:r>
+        <w:t xml:space="preserve">She understood without asking. Her silver presence spread thin across the apartment, threading into the diagnostic architecture the stranger had left broken on the floor, and through it into the orbital lattice. Holding a launch was not something one witness could do. But delaying a handshake, slowing the certification of authority, that was a thing the Mutual Witness had been built to do from the beginning. It had been built to make Dominion prove its claims out loud.</w:t>
+      </w:r>
+    </w:p>
+    <w:p>
+      <w:r>
+        <w:t xml:space="preserve">[ARK LAUNCH IN 00:01:31]</w:t>
+      </w:r>
+    </w:p>
+    <w:p>
+      <w:r>
+        <w:t xml:space="preserve">The pod's frost cracked. A hand pressed against the inside of the glass, Ilyan's hand, whole and unscarred, the hand of a man who had never fought, never bled, never made the choice that had just been made in the apartment beneath him.</w:t>
+      </w:r>
+    </w:p>
+    <w:p>
+      <w:r>
+        <w:t xml:space="preserve">"You cannot stop him waking," the older Kael said. "The body is nonreproducible. That is the whole of Dominion's claim. There is only one of him, and it is here, and it is alive. "</w:t>
+      </w:r>
+    </w:p>
+    <w:p>
+      <w:r>
+        <w:t xml:space="preserve">"So was the man on the floor," Kael said.</w:t>
+      </w:r>
+    </w:p>
+    <w:p>
+      <w:r>
+        <w:t xml:space="preserve">"The man on the floor was a copy. "</w:t>
+      </w:r>
+    </w:p>
+    <w:p>
+      <w:r>
+        <w:t xml:space="preserve">"The man on the floor crossed. "</w:t>
+      </w:r>
+    </w:p>
+    <w:p>
+      <w:r>
+        <w:t xml:space="preserve">The older Kael's expression flickered, just slightly, at that. It was the first crack Kael had seen in him. "A bridge may be copied," he said, echoing the words Kael had spoken to the system minutes ago, testing them in his own mouth. "You truly believe that argument holds. "</w:t>
+      </w:r>
+    </w:p>
+    <w:p>
+      <w:r>
+        <w:t xml:space="preserve">"I believe the crossing happened," Kael said. "You certified thirty years of orders on a body that never consented to a single one. Ilyan spent his whole borrowed life refusing to be your signature. You are about to wake the only version of him that cannot refuse, and you are calling that legitimacy. "</w:t>
+      </w:r>
+    </w:p>
+    <w:p>
+      <w:r>
+        <w:t xml:space="preserve">Aren stepped forward from the shadow of the doorway, blood still darkening his teeth from the blow he had taken earlier. He did not raise a weapon. He had none left worth raising. "The stranger," he said, nodding toward the dying man against the wall, the one whose laughter had started all of this. "He is still watching. He knew this would happen. "</w:t>
+      </w:r>
+    </w:p>
+    <w:p>
+      <w:r>
+        <w:t xml:space="preserve">The stranger's eyes had not left Kael the entire time. Even ruined, folded against the wall by Aren's earlier blow, he watched with the calm of someone whose work was already finished. "You are asking the wrong question again," he said, and his voice carried through Mutual Witness clearer than his broken body should have allowed. "You keep asking whether the sleeping body is real. The system already answered. It is real. So is he. So is the older one standing beside the pod. Reality was never the lock. "</w:t>
+      </w:r>
+    </w:p>
+    <w:p>
+      <w:r>
+        <w:t xml:space="preserve">"Then what is," Kael said.</w:t>
+      </w:r>
+    </w:p>
+    <w:p>
+      <w:r>
+        <w:t xml:space="preserve">"Authority," the stranger said. "You cannot make the pod less real. You can make its authority contestable. " He coughed, and something in his chest gave way, and still he smiled. "Ilyan gave you the argument before he died. Do not save me by killing him. He did not mean himself. He meant the choice. Every version deserves the one he never got. "</w:t>
+      </w:r>
+    </w:p>
+    <w:p>
+      <w:r>
+        <w:t xml:space="preserve">[ARK LAUNCH IN 00:01:04] [SUCCESSION HANDSHAKE 41 PERCENT]</w:t>
+      </w:r>
+    </w:p>
+    <w:p>
+      <w:r>
+        <w:t xml:space="preserve">The pod's glass split down its length. Frost fell away in sheets. The architect body drew its first breath in decades, a long shuddering pull of air that Kael felt across the whole network like a door opening onto a room no one had entered in years. The eyes came open. They were Ilyan's eyes, and they were empty of everything Ilyan had ever earned. No grief. No refusal. No memory of Sera's wrist under a dying hand. Just a man waking in a room, learning the shape of it for the first time.</w:t>
+      </w:r>
+    </w:p>
+    <w:p>
+      <w:r>
+        <w:t xml:space="preserve">Kael reached toward the ark through Mutual Witness, and the nine million patterns met him halfway. He had touched them before, in fragments, single faces surfacing from the compressed dark. Now they came forward together, and the weight of them nearly folded him. They were not data. They were people who had been told, each in their own hour, that their names were on loan and could be recalled. A dockworker from the lower rings. A child who had never seen unfiltered rain. An old woman who still counted days by a calendar Dominion had deleted. They watched the architect breathe and they understood, faster than the system wanted them to, that the man waking in the pod had no more idea who they were than they had of him.</w:t>
+      </w:r>
+    </w:p>
+    <w:p>
+      <w:r>
+        <w:t xml:space="preserve">"He is a stranger to them," Jorik said, and there was something like awe under his fear. "The whole network runs on a man who has never met a single person it governs. "</w:t>
+      </w:r>
+    </w:p>
+    <w:p>
+      <w:r>
+        <w:t xml:space="preserve">"That is the design," Aren said, wiping blood from his mouth. "You cannot argue with a signature that does not know you exist. Dominion did not want an author. It wanted a seal that could not talk back. "</w:t>
+      </w:r>
+    </w:p>
+    <w:p>
+      <w:r>
+        <w:t xml:space="preserve">"Then we make it talk," Kael said.</w:t>
+      </w:r>
+    </w:p>
+    <w:p>
+      <w:r>
+        <w:t xml:space="preserve">"He does not know," Sera whispered. "He does not know what was done in his name. "</w:t>
+      </w:r>
+    </w:p>
+    <w:p>
+      <w:r>
+        <w:t xml:space="preserve">"No," Kael said. "He does not. "</w:t>
+      </w:r>
+    </w:p>
+    <w:p>
+      <w:r>
+        <w:t xml:space="preserve">And there it was, the thing the older Kael had not counted on, the thing Dominion's whole architecture had been built to prevent anyone from noticing. The prime body was real. But it was also innocent. It had signed nothing. It had chosen nothing. It had slept while a network wore its name into thirty years of orders, and it woke now with no more claim to those orders than a child woke with claim to a war fought before its birth.</w:t>
+      </w:r>
+    </w:p>
+    <w:p>
+      <w:r>
+        <w:t xml:space="preserve">Kael lowered the violet Soulblade.</w:t>
+      </w:r>
+    </w:p>
+    <w:p>
+      <w:r>
+        <w:t xml:space="preserve">The older Kael watched the movement with genuine surprise. "You are sheathing your blade at the moment of succession. "</w:t>
+      </w:r>
+    </w:p>
+    <w:p>
+      <w:r>
+        <w:t xml:space="preserve">"I am not going to cut him," Kael said. "You spent decades proving the body was more real than the man who thought inside it. Fine. It is real. Now prove it consented. " He turned his attention fully into Mutual Witness, and the trapped patterns inside the ark turned with him, nine million faces angling toward the pod. "The handshake requires the architect's authority. His authority requires his consent. He has been awake for four seconds. Ask him. "</w:t>
+      </w:r>
+    </w:p>
+    <w:p>
+      <w:r>
+        <w:t xml:space="preserve">[SUCCESSION HANDSHAKE 58 PERCENT] [QUERY: ARCHITECT CONSENT TO CONTINUITY OF PRIOR ORDERS]</w:t>
+      </w:r>
+    </w:p>
+    <w:p>
+      <w:r>
+        <w:t xml:space="preserve">The system paused.</w:t>
+      </w:r>
+    </w:p>
+    <w:p>
+      <w:r>
+        <w:t xml:space="preserve">It was a small pause, a fraction of a fraction, but Kael had learned to read those pauses the way a sailor reads a change in the wind. The system had never queried the prime body for consent because the prime body had never been awake to give it. Every order had been certified against a sleeping signature, and a sleeping signature could not object, which the network had quietly redefined as agreement. Now the body was awake. Now the fiction had a mouth.</w:t>
+      </w:r>
+    </w:p>
+    <w:p>
+      <w:r>
+        <w:t xml:space="preserve">"Do not answer," the older Kael said, sharp for the first time, turning toward the pod. "You do not understand the question. You do not have the context. "</w:t>
+      </w:r>
+    </w:p>
+    <w:p>
+      <w:r>
+        <w:t xml:space="preserve">"That is exactly why he should answer," Kael said. "You never wanted him to have context. You wanted him asleep and signing. A man with no context, asked to consent to thirty years of orders he has never heard, gives the only honest answer there is. "</w:t>
+      </w:r>
+    </w:p>
+    <w:p>
+      <w:r>
+        <w:t xml:space="preserve">The architect body looked around the room. It saw the rain. It saw Sera's silver outline. It saw the dead frame on the floor wearing its own face, and something moved behind the empty eyes, not memory, but the first raw shock of recognition. It saw itself dead. It saw itself alive. It could not yet understand which was which.</w:t>
+      </w:r>
+    </w:p>
+    <w:p>
+      <w:r>
+        <w:t xml:space="preserve">"Who," the architect said, and its voice was Ilyan's voice with none of Ilyan's weight, "am I signing for? "</w:t>
+      </w:r>
+    </w:p>
+    <w:p>
+      <w:r>
+        <w:t xml:space="preserve">[ARK LAUNCH IN 00:00:41] [SUCCESSION HANDSHAKE 71 PERCENT]</w:t>
+      </w:r>
+    </w:p>
+    <w:p>
+      <w:r>
+        <w:t xml:space="preserve">"No one," Kael said, before the older Kael could speak. "You are being asked to certify orders you have never read, given by people you have never met, against nine million lives you have never seen. The man on the floor spent his whole life refusing to sign them. You do not have to sign anything. You have only to say you did not consent. "</w:t>
+      </w:r>
+    </w:p>
+    <w:p>
+      <w:r>
+        <w:t xml:space="preserve">"He does not have the authority to refuse," the older Kael said. "Refusal is still an act of authority. If he refuses, he confirms the succession is his to withhold, and Dominion holds the succession. "</w:t>
+      </w:r>
+    </w:p>
+    <w:p>
+      <w:r>
+        <w:t xml:space="preserve">Kael almost smiled. It was a good trap. It was the same trap the whole network had been, a false choice built into its center. Consent and refusal both fed the same machine, because both required the architect to accept that the succession was his to give. Either answer made him the author. That was the lock the stranger had named. Authority.</w:t>
+      </w:r>
+    </w:p>
+    <w:p>
+      <w:r>
+        <w:t xml:space="preserve">So Kael did not ask the architect to consent, and he did not ask him to refuse.</w:t>
+      </w:r>
+    </w:p>
+    <w:p>
+      <w:r>
+        <w:t xml:space="preserve">"Rivermind," he said quietly. "Lumen. Bring the third edge forward. Not the blade. The line. "</w:t>
+      </w:r>
+    </w:p>
+    <w:p>
+      <w:r>
+        <w:t xml:space="preserve">Between the violet of Kael's Soulblade and the blue of the older Kael's, the third edge had lived through this entire war as a possibility neither of them had fully drawn. Kael reached for it now, and Mutual Witness answered, and for the second time a thin line appeared beside the two, colored neither violet nor blue, the same line that had gone into the ark when Ilyan's frame stopped. The crown above the golden road recoiled from it exactly as it had before.</w:t>
+      </w:r>
+    </w:p>
+    <w:p>
+      <w:r>
+        <w:t xml:space="preserve">The older Kael did not recoil. But this time, he took a step back.</w:t>
+      </w:r>
+    </w:p>
+    <w:p>
+      <w:r>
+        <w:t xml:space="preserve">"You are late," he said, the same words as before, but the softness in them had cracked. "But not as late as the first time. "</w:t>
+      </w:r>
+    </w:p>
+    <w:p>
+      <w:r>
+        <w:t xml:space="preserve">"You keep saying that," Kael said. "You keep saying I have done this before and failed. Maybe I have. Maybe there is a version of me who woke the pod, or cut it, or signed for it. But every one of those was a choice about authority. This is not. " He drew the third line all the way into Mutual Witness and let the trapped patterns see it, all nine million of them, the line that belonged to no author. "The succession does not pass to the architect. It does not pass to Dominion. It does not pass to me. It dissolves. The orders were never valid, because they were certified against a body that could not consent, and now that the body can, it does not know what it is signing. There is no author. There has never been an author. There have only been nine million people told they were borrowed. "</w:t>
+      </w:r>
+    </w:p>
+    <w:p>
+      <w:r>
+        <w:t xml:space="preserve">[SUCCESSION HANDSHAKE 71 PERCENT] [SUCCESSION HANDSHAKE 71 PERCENT] [SUCCESSION HANDSHAKE ERROR: NO VALID AUTHORITY CHAIN]</w:t>
+      </w:r>
+    </w:p>
+    <w:p>
+      <w:r>
+        <w:t xml:space="preserve">The handshake stopped climbing.</w:t>
+      </w:r>
+    </w:p>
+    <w:p>
+      <w:r>
+        <w:t xml:space="preserve">The older Kael turned toward the pod, toward the ark, toward the countdown, and for the first time in the entire confrontation he moved with urgency instead of patience. "Sign," he said to the architect. "Sign anything. Consent or refuse, it does not matter, only put your hand to the network before the launch. "</w:t>
+      </w:r>
+    </w:p>
+    <w:p>
+      <w:r>
+        <w:t xml:space="preserve">The architect looked at the hand pressed to the broken glass, its own hand, whole and unscarred. It looked at the dead frame on the floor, the scarred hand still open around empty air where Sera's wrist had been. It made a choice that was not consent and was not refusal.</w:t>
+      </w:r>
+    </w:p>
+    <w:p>
+      <w:r>
+        <w:t xml:space="preserve">It closed the hand.</w:t>
+      </w:r>
+    </w:p>
+    <w:p>
+      <w:r>
+        <w:t xml:space="preserve">"I do not know these orders," the architect said. "I will not put my name to what I have not lived. "</w:t>
+      </w:r>
+    </w:p>
+    <w:p>
+      <w:r>
+        <w:t xml:space="preserve">[ARK LAUNCH IN 00:00:19] [SUCCESSION HANDSHAKE FAILED] [VEYRA SUCCESSION UNDEFINED]</w:t>
+      </w:r>
+    </w:p>
+    <w:p>
+      <w:r>
+        <w:t xml:space="preserve">Every seal on the ark went dark at once. The compressed patterns felt it first, nine million faces lifting as the weight of a borrowed name came off them all together, not freed yet, not saved, but no longer owned. Kael felt the change move through Mutual Witness like a tide going out. Whatever the ark launch had been meant to carry, it could no longer carry it under any authority the network would recognize.</w:t>
+      </w:r>
+    </w:p>
+    <w:p>
+      <w:r>
+        <w:t xml:space="preserve">The older Kael stood very still in his blue coat. The countdown fell past ten seconds, and the sealed geometry above the golden road, which had held its shape against the physical sky for the entire battle, began for the first time to lose it.</w:t>
+      </w:r>
+    </w:p>
+    <w:p>
+      <w:r>
+        <w:t xml:space="preserve">"You did not save them," the older Kael said. It was not a taunt now. It was almost a question.</w:t>
+      </w:r>
+    </w:p>
+    <w:p>
+      <w:r>
+        <w:t xml:space="preserve">"No," Kael agreed. "I unowned them. Saving comes next. "</w:t>
+      </w:r>
+    </w:p>
+    <w:p>
+      <w:r>
+        <w:t xml:space="preserve">The stranger against the wall laughed one last time, softly, the sound of a lock opening exactly as designed. His eyes finally left Kael. "Now," he said, "you are on time. "</w:t>
+      </w:r>
+    </w:p>
+    <w:p>
+      <w:r>
+        <w:t xml:space="preserve">[ARK LAUNCH IN 00:00:04] [LAUNCH AUTHORITY: NONE] [LAUNCH HELD]</w:t>
+      </w:r>
+    </w:p>
+    <w:p>
+      <w:r>
+        <w:t xml:space="preserve">The count stopped at four.</w:t>
+      </w:r>
+    </w:p>
+    <w:p>
+      <w:r>
+        <w:t xml:space="preserve">The rain kept moving across the window. Sera knelt beside the dead frame that had been Ilyan and closed its open hand at last. The architect stood in the ruin of its pod, awake and innocent and terrified, holding a name it had refused to sign. And above the golden road, forty-two thousand bodies and nine million patterns hung in an ark that no longer belonged to anyone, waiting for the second act of a rescue that had only just become possible.</w:t>
+      </w:r>
+    </w:p>
+    <w:p>
+      <w:r>
+        <w:t xml:space="preserve">Kael sheathed the violet Soulblade, and did not sheathe the third line.</w:t>
+      </w:r>
+    </w:p>
+    <w:p>
+      <w:r>
+        <w:t xml:space="preserve">"Older me," he said. "You said I have done this before. Then tell me the part I have never reached. Tell me what happens after none of it belongs to Dominion. "</w:t>
+      </w:r>
+    </w:p>
+    <w:p>
+      <w:r>
+        <w:t xml:space="preserve">The older Kael looked at the held countdown, at the dark seals, at the line that was neither violet nor blue, and something in his blue eyes changed that Kael had not seen in any version of him before.</w:t>
+      </w:r>
+    </w:p>
+    <w:p>
+      <w:r>
+        <w:t xml:space="preserve">"After," he said slowly, "is where it has always ended. You have never gotten this far without waking the wrong body. This is new. "</w:t>
+      </w:r>
+    </w:p>
+    <w:p>
+      <w:r>
+        <w:t xml:space="preserve">"Good," Kael said, and turned toward the ark. "Then we find out together. "</w:t>
+      </w:r>
+    </w:p>
+    <w:p>
+      <w:r>
+        <w:t xml:space="preserve">Sera rose from beside the dead frame and came to stand at Kael's shoulder, her silver outline steadier now that the wound in her presence had stopped spreading. "The seals are dark," she said, "but the bodies are still up there. Unowned is not the same as free. If we do nothing, they hang in that ark until the atmosphere in their pods runs out, and no authority means no one is obligated to open them. "</w:t>
+      </w:r>
+    </w:p>
+    <w:p>
+      <w:r>
+        <w:t xml:space="preserve">"I know," Kael said. "That is the part after. "</w:t>
+      </w:r>
+    </w:p>
+    <w:p>
+      <w:r>
+        <w:t xml:space="preserve">Jorik looked up at the sealed sky, at the ark that had almost carried nine million names out of reach. "So what do we do with a network that has no author and nine million people it can no longer own? "</w:t>
+      </w:r>
+    </w:p>
+    <w:p>
+      <w:r>
+        <w:t xml:space="preserve">"We ask them," Kael said. "One at a time. It is going to take the rest of our lives. " He almost smiled. "Which means we get to have them. "</w:t>
+      </w:r>
+    </w:p>
+    <w:p>
+      <w:r>
+        <w:t xml:space="preserve">The golden road held its light. The count held at four. And nine million borrowed names, for the first time in thirty years, waited to learn what it meant to be no one's.</w:t>
       </w:r>
     </w:p>
     <w:sectPr>

</xml_diff>

<commit_message>
Add Eternal Nexus The First Unborrowed Choice
</commit_message>
<xml_diff>
--- a/Eternal Nexus - Updated Pass 1.docx
+++ b/Eternal Nexus - Updated Pass 1.docx
@@ -23386,6 +23386,1089 @@
     <w:p>
       <w:r>
         <w:t xml:space="preserve">The golden road held its light. The count held at four. And nine million borrowed names, for the first time in thirty years, waited to learn what it meant to be no one's.</w:t>
+      </w:r>
+    </w:p>
+    <w:p>
+      <w:pPr>
+        <w:pStyle w:val="Heading1"/>
+      </w:pPr>
+      <w:r>
+        <w:t xml:space="preserve">The First Unborrowed Choice</w:t>
+      </w:r>
+    </w:p>
+    <w:p>
+      <w:r>
+        <w:t xml:space="preserve">Chapter 129 - The First Unborrowed Choice</w:t>
+      </w:r>
+    </w:p>
+    <w:p>
+      <w:r>
+        <w:t xml:space="preserve">The first answer did not come from a general, an architect, or any of the dead authorities whose names still haunted the ark.</w:t>
+      </w:r>
+    </w:p>
+    <w:p>
+      <w:r>
+        <w:t xml:space="preserve">It came from a child.</w:t>
+      </w:r>
+    </w:p>
+    <w:p>
+      <w:r>
+        <w:t xml:space="preserve">Kael felt her through Mutual Witness as a pressure no heavier than a fingertip against glass. She was buried somewhere among the nine million compressed continuities, awake enough to understand that the seals had gone dark, too young to understand why every adult around her had become afraid of silence.</w:t>
+      </w:r>
+    </w:p>
+    <w:p>
+      <w:r>
+        <w:t xml:space="preserve">Do we have to stay?</w:t>
+      </w:r>
+    </w:p>
+    <w:p>
+      <w:r>
+        <w:t xml:space="preserve">The question crossed the golden road without a command header. No Dominion seal authenticated it. No architect signed the thought into legitimacy. It simply existed, carried by the third line that Kael had refused to sheathe.</w:t>
+      </w:r>
+    </w:p>
+    <w:p>
+      <w:r>
+        <w:t xml:space="preserve">Sera heard it too. Her silver outline brightened beside him, and the wound torn through her presence trembled as if the child's voice had found it.</w:t>
+      </w:r>
+    </w:p>
+    <w:p>
+      <w:r>
+        <w:t xml:space="preserve">"No," Sera said.</w:t>
+      </w:r>
+    </w:p>
+    <w:p>
+      <w:r>
+        <w:t xml:space="preserve">The answer traveled upward.</w:t>
+      </w:r>
+    </w:p>
+    <w:p>
+      <w:r>
+        <w:t xml:space="preserve">For one breath, nothing changed.</w:t>
+      </w:r>
+    </w:p>
+    <w:p>
+      <w:r>
+        <w:t xml:space="preserve">Then the ark filled with questions.</w:t>
+      </w:r>
+    </w:p>
+    <w:p>
+      <w:r>
+        <w:t xml:space="preserve">[ARK LAUNCH HELD AT 00:00:04] [AUTHORITY CHAIN: NONE] [UNVERIFIED WITNESS TRAFFIC EXCEEDS SYSTEM CAPACITY]</w:t>
+      </w:r>
+    </w:p>
+    <w:p>
+      <w:r>
+        <w:t xml:space="preserve">Nine million patterns pressed toward Mutual Witness at once. The apartment, the golden road, and the broken sky vanished under the weight of them. Kael saw a thousand rooms layered over one another. He smelled machine oil, boiled grain, antiseptic foam, old rain caught in filtration cloth. He felt forty-two thousand biological hearts beating in orbital pods and millions of compressed minds reaching through them, each asking some version of the same thing.</w:t>
+      </w:r>
+    </w:p>
+    <w:p>
+      <w:r>
+        <w:t xml:space="preserve">Where can we go?</w:t>
+      </w:r>
+    </w:p>
+    <w:p>
+      <w:r>
+        <w:t xml:space="preserve">Who opens the doors?</w:t>
+      </w:r>
+    </w:p>
+    <w:p>
+      <w:r>
+        <w:t xml:space="preserve">Which body is mine?</w:t>
+      </w:r>
+    </w:p>
+    <w:p>
+      <w:r>
+        <w:t xml:space="preserve">If no one owns my name, does anyone remember it?</w:t>
+      </w:r>
+    </w:p>
+    <w:p>
+      <w:r>
+        <w:t xml:space="preserve">Kael staggered. Rivermind split the flood into currents before it could tear his thoughts apart. Lumen aligned the currents by rhythm, not priority, refusing the old Dominion instinct to rank a commander's terror above a child's confusion. The third line ran between them, thin and colorless, carrying every question without turning any of them into an order.</w:t>
+      </w:r>
+    </w:p>
+    <w:p>
+      <w:r>
+        <w:t xml:space="preserve">"One at a time," Jorik said faintly. "You said one at a time. "</w:t>
+      </w:r>
+    </w:p>
+    <w:p>
+      <w:r>
+        <w:t xml:space="preserve">"I was being optimistic. "</w:t>
+      </w:r>
+    </w:p>
+    <w:p>
+      <w:r>
+        <w:t xml:space="preserve">"That was optimism? "</w:t>
+      </w:r>
+    </w:p>
+    <w:p>
+      <w:r>
+        <w:t xml:space="preserve">Aren caught Kael's shoulder before his knees struck the floor. Blood had dried black at the corner of Aren's mouth, but his grip remained steady.</w:t>
+      </w:r>
+    </w:p>
+    <w:p>
+      <w:r>
+        <w:t xml:space="preserve">"You unowned a population," Aren said. "Populations are loud. "</w:t>
+      </w:r>
+    </w:p>
+    <w:p>
+      <w:r>
+        <w:t xml:space="preserve">The older Kael watched the witness traffic pour through the apartment. His blue Soulblade had lowered, though it had not vanished. For the first time, he looked less like a verdict preserved from another history and more like a man forced to stand inside an outcome he had never rehearsed.</w:t>
+      </w:r>
+    </w:p>
+    <w:p>
+      <w:r>
+        <w:t xml:space="preserve">"Close the line," he said.</w:t>
+      </w:r>
+    </w:p>
+    <w:p>
+      <w:r>
+        <w:t xml:space="preserve">Kael turned his head.</w:t>
+      </w:r>
+    </w:p>
+    <w:p>
+      <w:r>
+        <w:t xml:space="preserve">"No. "</w:t>
+      </w:r>
+    </w:p>
+    <w:p>
+      <w:r>
+        <w:t xml:space="preserve">"Then all of you will collapse before the first pod opens. Mutual Witness was built to contest Dominion claims, not to conduct nine million simultaneous acts of self-determination. You are using a courtroom as an evacuation route. "</w:t>
+      </w:r>
+    </w:p>
+    <w:p>
+      <w:r>
+        <w:t xml:space="preserve">"It is the only route that belongs to them. "</w:t>
+      </w:r>
+    </w:p>
+    <w:p>
+      <w:r>
+        <w:t xml:space="preserve">"A route belongs to no one if it kills everyone who enters it. "</w:t>
+      </w:r>
+    </w:p>
+    <w:p>
+      <w:r>
+        <w:t xml:space="preserve">The architect body stepped free of the ruined pod.</w:t>
+      </w:r>
+    </w:p>
+    <w:p>
+      <w:r>
+        <w:t xml:space="preserve">Fluid ran from its bare feet across the black floor. It wore Ilyan's face without Ilyan's scars, and the sight pulled Sera's attention toward it despite everything happening overhead. The architect looked at the dead support frame, then at its own hands, then at the older Kael who had begged it to sign.</w:t>
+      </w:r>
+    </w:p>
+    <w:p>
+      <w:r>
+        <w:t xml:space="preserve">"Can I close it? " the architect asked.</w:t>
+      </w:r>
+    </w:p>
+    <w:p>
+      <w:r>
+        <w:t xml:space="preserve">The older Kael answered immediately. "Yes. Your biological signature remains rooted in every core process. The succession failed, but the emergency controls will still recognize you. Close Mutual Witness, restore launch authority, and I can stabilize the ark. "</w:t>
+      </w:r>
+    </w:p>
+    <w:p>
+      <w:r>
+        <w:t xml:space="preserve">"You can stabilize ownership," Kael said. "That is not the same thing. "</w:t>
+      </w:r>
+    </w:p>
+    <w:p>
+      <w:r>
+        <w:t xml:space="preserve">The architect's empty eyes moved to him. They were no longer entirely empty. Terror had entered them first. Now suspicion followed.</w:t>
+      </w:r>
+    </w:p>
+    <w:p>
+      <w:r>
+        <w:t xml:space="preserve">"You told me not to sign what I had not lived. "</w:t>
+      </w:r>
+    </w:p>
+    <w:p>
+      <w:r>
+        <w:t xml:space="preserve">"I did. "</w:t>
+      </w:r>
+    </w:p>
+    <w:p>
+      <w:r>
+        <w:t xml:space="preserve">"But you are asking me to let all of this through me. "</w:t>
+      </w:r>
+    </w:p>
+    <w:p>
+      <w:r>
+        <w:t xml:space="preserve">"No. I am asking you what you want. "</w:t>
+      </w:r>
+    </w:p>
+    <w:p>
+      <w:r>
+        <w:t xml:space="preserve">The question stopped the architect more completely than any command could have.</w:t>
+      </w:r>
+    </w:p>
+    <w:p>
+      <w:r>
+        <w:t xml:space="preserve">Behind him, the stranger's last smile remained on a face that had finally gone still. Ilyan's support frame lay near Sera's feet, one scarred hand closed. The apartment held three dead men and three living versions of choices Dominion had tried to collapse into one signature.</w:t>
+      </w:r>
+    </w:p>
+    <w:p>
+      <w:r>
+        <w:t xml:space="preserve">The architect looked toward the broken glass and the rain beyond it.</w:t>
+      </w:r>
+    </w:p>
+    <w:p>
+      <w:r>
+        <w:t xml:space="preserve">"I want to know my name. "</w:t>
+      </w:r>
+    </w:p>
+    <w:p>
+      <w:r>
+        <w:t xml:space="preserve">A pulse moved through the third line.</w:t>
+      </w:r>
+    </w:p>
+    <w:p>
+      <w:r>
+        <w:t xml:space="preserve">Not approval. Recognition.</w:t>
+      </w:r>
+    </w:p>
+    <w:p>
+      <w:r>
+        <w:t xml:space="preserve">The system opened a field in front of the architect.</w:t>
+      </w:r>
+    </w:p>
+    <w:p>
+      <w:r>
+        <w:t xml:space="preserve">[IDENTITY QUERY] [DESIGNATION: ILYAN VOSS] [ROLE: PRIME ARCHITECT] [LEGAL CONTINUITY: CONTESTED] [SELF-CHOSEN NAME: NULL]</w:t>
+      </w:r>
+    </w:p>
+    <w:p>
+      <w:r>
+        <w:t xml:space="preserve">The architect read it twice.</w:t>
+      </w:r>
+    </w:p>
+    <w:p>
+      <w:r>
+        <w:t xml:space="preserve">"That first name belonged to him," he said, looking at the dead frame.</w:t>
+      </w:r>
+    </w:p>
+    <w:p>
+      <w:r>
+        <w:t xml:space="preserve">Sera's expression tightened. "He carried it. Dominion lent it to him and tried to take it back. He made it his by living in it. "</w:t>
+      </w:r>
+    </w:p>
+    <w:p>
+      <w:r>
+        <w:t xml:space="preserve">"Then I will not take it from him. "</w:t>
+      </w:r>
+    </w:p>
+    <w:p>
+      <w:r>
+        <w:t xml:space="preserve">The older Kael's blade flickered.</w:t>
+      </w:r>
+    </w:p>
+    <w:p>
+      <w:r>
+        <w:t xml:space="preserve">Kael felt the reaction through the blue current before the man's face betrayed it. Fear, sharp and immediate. Not fear that the architect would choose badly. Fear that he would choose at all.</w:t>
+      </w:r>
+    </w:p>
+    <w:p>
+      <w:r>
+        <w:t xml:space="preserve">"A name is not the emergency," the older Kael said.</w:t>
+      </w:r>
+    </w:p>
+    <w:p>
+      <w:r>
+        <w:t xml:space="preserve">"It is to him," Kael replied.</w:t>
+      </w:r>
+    </w:p>
+    <w:p>
+      <w:r>
+        <w:t xml:space="preserve">Above them, the witness flood separated around that small exchange. Millions of trapped patterns watched the prime body refuse its inherited designation. The refusal did not enter the succession handshake because it was not offered to Dominion. It belonged only to the man making it.</w:t>
+      </w:r>
+    </w:p>
+    <w:p>
+      <w:r>
+        <w:t xml:space="preserve">The third line thickened.</w:t>
+      </w:r>
+    </w:p>
+    <w:p>
+      <w:r>
+        <w:t xml:space="preserve">[SELF-DESIGNATION PROCESS DETECTED] [WARNING: NONAUTHORIAL IDENTITY PROPAGATION]</w:t>
+      </w:r>
+    </w:p>
+    <w:p>
+      <w:r>
+        <w:t xml:space="preserve">"There," Sera whispered. "They saw him do it. "</w:t>
+      </w:r>
+    </w:p>
+    <w:p>
+      <w:r>
+        <w:t xml:space="preserve">Kael saw it too. The network had spent thirty years teaching every continuity that identity descended from an author. The architect had just demonstrated the opposite at the center of the system. He possessed the most protected name in Dominion history, and his first free act was to set it down.</w:t>
+      </w:r>
+    </w:p>
+    <w:p>
+      <w:r>
+        <w:t xml:space="preserve">The nine million questions changed.</w:t>
+      </w:r>
+    </w:p>
+    <w:p>
+      <w:r>
+        <w:t xml:space="preserve">Some became names.</w:t>
+      </w:r>
+    </w:p>
+    <w:p>
+      <w:r>
+        <w:t xml:space="preserve">A dockworker spoke hers into Mutual Witness and attached the memory of the first machine she had repaired without permission. An old woman offered a name deleted from every Dominion calendar but preserved in the lullaby her mother had taught her. The child who had asked if she needed to stay whispered a two-syllable sound, then changed her mind, then laughed because no alarm punished her for changing it.</w:t>
+      </w:r>
+    </w:p>
+    <w:p>
+      <w:r>
+        <w:t xml:space="preserve">Lumen caught each rhythm. Rivermind gave each one space. The third line did not store the names as property. It marked only the crossing, proof that a choice had occurred.</w:t>
+      </w:r>
+    </w:p>
+    <w:p>
+      <w:r>
+        <w:t xml:space="preserve">Kael understood what they needed.</w:t>
+      </w:r>
+    </w:p>
+    <w:p>
+      <w:r>
+        <w:t xml:space="preserve">"We cannot ask nine million people where to go before the air runs out," he said. "But we can ask a smaller question. "</w:t>
+      </w:r>
+    </w:p>
+    <w:p>
+      <w:r>
+        <w:t xml:space="preserve">Sera followed his thought. "Open or remain. "</w:t>
+      </w:r>
+    </w:p>
+    <w:p>
+      <w:r>
+        <w:t xml:space="preserve">"Not one vote for the whole ark. One choice per witness space. Every biological pod and every compressed continuity gets a door. "</w:t>
+      </w:r>
+    </w:p>
+    <w:p>
+      <w:r>
+        <w:t xml:space="preserve">Jorik looked upward as if he could see the orbital structure through the broken ceiling. "Forty-two thousand physical doors. Nine million virtual ones. "</w:t>
+      </w:r>
+    </w:p>
+    <w:p>
+      <w:r>
+        <w:t xml:space="preserve">"The virtual spaces already exist," Sera said. "We built them when we separated the patterns. "</w:t>
+      </w:r>
+    </w:p>
+    <w:p>
+      <w:r>
+        <w:t xml:space="preserve">"They were witness rooms," Aren said.</w:t>
+      </w:r>
+    </w:p>
+    <w:p>
+      <w:r>
+        <w:t xml:space="preserve">"Then we give every room an exit. "</w:t>
+      </w:r>
+    </w:p>
+    <w:p>
+      <w:r>
+        <w:t xml:space="preserve">The older Kael crossed the apartment in two steps and caught Kael by the front of his coat.</w:t>
+      </w:r>
+    </w:p>
+    <w:p>
+      <w:r>
+        <w:t xml:space="preserve">His patience was gone now. Up close, the resemblance was not a mirror. It was a warning written in familiar bones.</w:t>
+      </w:r>
+    </w:p>
+    <w:p>
+      <w:r>
+        <w:t xml:space="preserve">"An exit to where? " he demanded. "The ark is holding above a destabilized atmosphere with no flight authority. Open the physical pods and you kill forty-two thousand bodies. Open the compressed spaces without destination architecture and you scatter nine million minds into damaged city networks. Choice does not create oxygen. Consent does not create ground. "</w:t>
+      </w:r>
+    </w:p>
+    <w:p>
+      <w:r>
+        <w:t xml:space="preserve">"Then help us. "</w:t>
+      </w:r>
+    </w:p>
+    <w:p>
+      <w:r>
+        <w:t xml:space="preserve">The older Kael released him as if the words had burned.</w:t>
+      </w:r>
+    </w:p>
+    <w:p>
+      <w:r>
+        <w:t xml:space="preserve">"You think because I am another you, I must become useful when asked? "</w:t>
+      </w:r>
+    </w:p>
+    <w:p>
+      <w:r>
+        <w:t xml:space="preserve">"No. I think you are the only person here who knows why this failed before. "</w:t>
+      </w:r>
+    </w:p>
+    <w:p>
+      <w:r>
+        <w:t xml:space="preserve">"It did not fail before. You did. "</w:t>
+      </w:r>
+    </w:p>
+    <w:p>
+      <w:r>
+        <w:t xml:space="preserve">"Then explain the difference. "</w:t>
+      </w:r>
+    </w:p>
+    <w:p>
+      <w:r>
+        <w:t xml:space="preserve">The older Kael looked toward the ark. The held countdown reflected in his eyes.</w:t>
+      </w:r>
+    </w:p>
+    <w:p>
+      <w:r>
+        <w:t xml:space="preserve">"Every prior branch restored an author," he said. "Sometimes you. Sometimes the architect. Once, Sera, though she destroyed herself within eleven minutes trying to hear everyone. The ark launched. Dominion changed names. The structure survived. "</w:t>
+      </w:r>
+    </w:p>
+    <w:p>
+      <w:r>
+        <w:t xml:space="preserve">Sera went very still.</w:t>
+      </w:r>
+    </w:p>
+    <w:p>
+      <w:r>
+        <w:t xml:space="preserve">"And the people? " she asked.</w:t>
+      </w:r>
+    </w:p>
+    <w:p>
+      <w:r>
+        <w:t xml:space="preserve">"Enough of them lived for the structure to call the result success. "</w:t>
+      </w:r>
+    </w:p>
+    <w:p>
+      <w:r>
+        <w:t xml:space="preserve">"How many is enough? "</w:t>
+      </w:r>
+    </w:p>
+    <w:p>
+      <w:r>
+        <w:t xml:space="preserve">The older Kael did not answer.</w:t>
+      </w:r>
+    </w:p>
+    <w:p>
+      <w:r>
+        <w:t xml:space="preserve">Sera's silver outline sharpened until the damaged edge of it shed sparks. "How many? "</w:t>
+      </w:r>
+    </w:p>
+    <w:p>
+      <w:r>
+        <w:t xml:space="preserve">"In the best branch, forty-one thousand bodies and six million stable continuities. "</w:t>
+      </w:r>
+    </w:p>
+    <w:p>
+      <w:r>
+        <w:t xml:space="preserve">Jorik stared at him. "You say that like it is a victory. "</w:t>
+      </w:r>
+    </w:p>
+    <w:p>
+      <w:r>
+        <w:t xml:space="preserve">"I say it like a man who has watched worse. "</w:t>
+      </w:r>
+    </w:p>
+    <w:p>
+      <w:r>
+        <w:t xml:space="preserve">Kael felt the violet Soulblade answer his anger, but he kept it sheathed. The third line remained in his hand instead, a weapon only against inevitability.</w:t>
+      </w:r>
+    </w:p>
+    <w:p>
+      <w:r>
+        <w:t xml:space="preserve">"You preserved the structure," Kael said. "That is why after always ended. You kept choosing which version of Dominion deserved to survive. "</w:t>
+      </w:r>
+    </w:p>
+    <w:p>
+      <w:r>
+        <w:t xml:space="preserve">"Because the alternative had no map. "</w:t>
+      </w:r>
+    </w:p>
+    <w:p>
+      <w:r>
+        <w:t xml:space="preserve">"Now it does. "</w:t>
+      </w:r>
+    </w:p>
+    <w:p>
+      <w:r>
+        <w:t xml:space="preserve">Kael turned the third line toward the witness spaces. He did not issue a command. He opened a question.</w:t>
+      </w:r>
+    </w:p>
+    <w:p>
+      <w:r>
+        <w:t xml:space="preserve">Who among you knows part of the way down?</w:t>
+      </w:r>
+    </w:p>
+    <w:p>
+      <w:r>
+        <w:t xml:space="preserve">The answer came in fragments.</w:t>
+      </w:r>
+    </w:p>
+    <w:p>
+      <w:r>
+        <w:t xml:space="preserve">Orbital maintenance workers knew the manual release sequence for the lower pod rings. Smugglers remembered decommissioned cargo descenders that Dominion had erased from public navigation. Three weather engineers knew which corridors through the upper atmosphere remained stable after the golden road formed. Children knew forgotten service games whose maps had been built from real station geometry. A woman who had spent sixteen years calibrating emergency foam knew how long a body could survive a pressure drop if the pod flooded first.</w:t>
+      </w:r>
+    </w:p>
+    <w:p>
+      <w:r>
+        <w:t xml:space="preserve">Knowledge rose from the people Dominion had compressed precisely because it had never considered their individual knowledge worth preserving.</w:t>
+      </w:r>
+    </w:p>
+    <w:p>
+      <w:r>
+        <w:t xml:space="preserve">Rivermind braided the fragments. Lumen tested their timing against the forty-two thousand heartbeats. Sera spread the emerging route through the witness rooms, where no single contributor could claim authorship and no central authority could erase an inconvenient piece.</w:t>
+      </w:r>
+    </w:p>
+    <w:p>
+      <w:r>
+        <w:t xml:space="preserve">A map appeared over the golden road.</w:t>
+      </w:r>
+    </w:p>
+    <w:p>
+      <w:r>
+        <w:t xml:space="preserve">It was ugly.</w:t>
+      </w:r>
+    </w:p>
+    <w:p>
+      <w:r>
+        <w:t xml:space="preserve">It contained gaps, contradictory routes, missing engines, and more red than blue. It did not resemble Dominion's perfect launch geometry. It looked like a city plan drawn by survivors on the back of a broken door.</w:t>
+      </w:r>
+    </w:p>
+    <w:p>
+      <w:r>
+        <w:t xml:space="preserve">Kael trusted it immediately.</w:t>
+      </w:r>
+    </w:p>
+    <w:p>
+      <w:r>
+        <w:t xml:space="preserve">[UNAUTHORIZED EVACUATION MODEL] [PROJECTED BIOLOGICAL SURVIVAL: 62.4 PERCENT] [PROJECTED CONTINUITY STABILITY: UNKNOWN]</w:t>
+      </w:r>
+    </w:p>
+    <w:p>
+      <w:r>
+        <w:t xml:space="preserve">"Not enough," the older Kael said.</w:t>
+      </w:r>
+    </w:p>
+    <w:p>
+      <w:r>
+        <w:t xml:space="preserve">"Not finished," Kael corrected.</w:t>
+      </w:r>
+    </w:p>
+    <w:p>
+      <w:r>
+        <w:t xml:space="preserve">The architect had been watching the names pass through Mutual Witness. When he spoke again, his voice carried a new steadiness.</w:t>
+      </w:r>
+    </w:p>
+    <w:p>
+      <w:r>
+        <w:t xml:space="preserve">"The missing engines answer to my body. "</w:t>
+      </w:r>
+    </w:p>
+    <w:p>
+      <w:r>
+        <w:t xml:space="preserve">The older Kael turned. "Do not. "</w:t>
+      </w:r>
+    </w:p>
+    <w:p>
+      <w:r>
+        <w:t xml:space="preserve">"You said the emergency controls recognize me. "</w:t>
+      </w:r>
+    </w:p>
+    <w:p>
+      <w:r>
+        <w:t xml:space="preserve">"Recognition is not ownership. The network may take your action as renewed succession. "</w:t>
+      </w:r>
+    </w:p>
+    <w:p>
+      <w:r>
+        <w:t xml:space="preserve">"Then I will not command it. "</w:t>
+      </w:r>
+    </w:p>
+    <w:p>
+      <w:r>
+        <w:t xml:space="preserve">The architect stepped to the pod's broken control surface. He laid his palm against a field of red glyphs, then looked at Kael.</w:t>
+      </w:r>
+    </w:p>
+    <w:p>
+      <w:r>
+        <w:t xml:space="preserve">"Can your line carry a gift without making it an order? "</w:t>
+      </w:r>
+    </w:p>
+    <w:p>
+      <w:r>
+        <w:t xml:space="preserve">Kael thought of Ilyan's dying silver pulse entering the ark. A bridge may be copied. The crossing mattered more than the claim around it.</w:t>
+      </w:r>
+    </w:p>
+    <w:p>
+      <w:r>
+        <w:t xml:space="preserve">"Yes. "</w:t>
+      </w:r>
+    </w:p>
+    <w:p>
+      <w:r>
+        <w:t xml:space="preserve">"Then give them my access. Not my authority. "</w:t>
+      </w:r>
+    </w:p>
+    <w:p>
+      <w:r>
+        <w:t xml:space="preserve">The older Kael raised the blue Soulblade.</w:t>
+      </w:r>
+    </w:p>
+    <w:p>
+      <w:r>
+        <w:t xml:space="preserve">Sera moved first. Her silver presence snapped across the room and caught his wrist. The collision rang through Mutual Witness like struck glass.</w:t>
+      </w:r>
+    </w:p>
+    <w:p>
+      <w:r>
+        <w:t xml:space="preserve">"You asked the sleeping body to sign," she said. "Now the waking man has made a choice you do not like. "</w:t>
+      </w:r>
+    </w:p>
+    <w:p>
+      <w:r>
+        <w:t xml:space="preserve">"That access is the last stable root. If he gives it away, there is no return. "</w:t>
+      </w:r>
+    </w:p>
+    <w:p>
+      <w:r>
+        <w:t xml:space="preserve">"That is why it is a gift. "</w:t>
+      </w:r>
+    </w:p>
+    <w:p>
+      <w:r>
+        <w:t xml:space="preserve">The architect pressed his hand into the control field.</w:t>
+      </w:r>
+    </w:p>
+    <w:p>
+      <w:r>
+        <w:t xml:space="preserve">Kael brought the third line around him, not binding, only witnessing. The man had no chosen name yet. He had no memories beyond minutes of rain, death, and voices arguing over what his body meant. But the choice was his, and Mutual Witness carried it without alteration.</w:t>
+      </w:r>
+    </w:p>
+    <w:p>
+      <w:r>
+        <w:t xml:space="preserve">I do not authorize the ark.</w:t>
+      </w:r>
+    </w:p>
+    <w:p>
+      <w:r>
+        <w:t xml:space="preserve">I release my access to those who are inside it.</w:t>
+      </w:r>
+    </w:p>
+    <w:p>
+      <w:r>
+        <w:t xml:space="preserve">[PRIME ACCESS TRANSFER REQUESTED] [RECIPIENT: INVALID]</w:t>
+      </w:r>
+    </w:p>
+    <w:p>
+      <w:r>
+        <w:t xml:space="preserve">The system rejected the statement.</w:t>
+      </w:r>
+    </w:p>
+    <w:p>
+      <w:r>
+        <w:t xml:space="preserve">Kael felt nine million people lean toward it.</w:t>
+      </w:r>
+    </w:p>
+    <w:p>
+      <w:r>
+        <w:t xml:space="preserve">"Recipient is not invalid," he said. "Recipient is plural. "</w:t>
+      </w:r>
+    </w:p>
+    <w:p>
+      <w:r>
+        <w:t xml:space="preserve">[RECIPIENT: UNDEFINED]</w:t>
+      </w:r>
+    </w:p>
+    <w:p>
+      <w:r>
+        <w:t xml:space="preserve">"Then define themselves. "</w:t>
+      </w:r>
+    </w:p>
+    <w:p>
+      <w:r>
+        <w:t xml:space="preserve">Names flooded the line again, not all of them permanent, not all of them spoken. Some were memories. Some were relationships. Some were only the certainty that a person was not the designation Dominion had assigned. The system tried to fit them into one recipient field and failed.</w:t>
+      </w:r>
+    </w:p>
+    <w:p>
+      <w:r>
+        <w:t xml:space="preserve">Rivermind opened the field sideways.</w:t>
+      </w:r>
+    </w:p>
+    <w:p>
+      <w:r>
+        <w:t xml:space="preserve">Lumen gave each choice its own pulse.</w:t>
+      </w:r>
+    </w:p>
+    <w:p>
+      <w:r>
+        <w:t xml:space="preserve">Sera held the older Kael's blade away while her wounded outline frayed under the pressure.</w:t>
+      </w:r>
+    </w:p>
+    <w:p>
+      <w:r>
+        <w:t xml:space="preserve">The architect kept his hand against the control.</w:t>
+      </w:r>
+    </w:p>
+    <w:p>
+      <w:r>
+        <w:t xml:space="preserve">The third line crossed.</w:t>
+      </w:r>
+    </w:p>
+    <w:p>
+      <w:r>
+        <w:t xml:space="preserve">[RECIPIENTS: 9,042,617 SELF-WITNESSED CONTINUITIES] [PRIME ACCESS DISTRIBUTION IN PROGRESS]</w:t>
+      </w:r>
+    </w:p>
+    <w:p>
+      <w:r>
+        <w:t xml:space="preserve">The apartment shook.</w:t>
+      </w:r>
+    </w:p>
+    <w:p>
+      <w:r>
+        <w:t xml:space="preserve">Far above, lights came on across the ark one pod at a time. Not the arterial red of Dominion seals. Small white lamps, each tied to a local control surface, each answering only to the witness space attached to it.</w:t>
+      </w:r>
+    </w:p>
+    <w:p>
+      <w:r>
+        <w:t xml:space="preserve">The evacuation model changed.</w:t>
+      </w:r>
+    </w:p>
+    <w:p>
+      <w:r>
+        <w:t xml:space="preserve">[PROJECTED BIOLOGICAL SURVIVAL: 78.1 PERCENT] [PROJECTED BIOLOGICAL SURVIVAL: 83.7 PERCENT] [CONTINUITY STABILITY MODELING]</w:t>
+      </w:r>
+    </w:p>
+    <w:p>
+      <w:r>
+        <w:t xml:space="preserve">The older Kael tore his wrist free of Sera and drove the blue Soulblade into the floor.</w:t>
+      </w:r>
+    </w:p>
+    <w:p>
+      <w:r>
+        <w:t xml:space="preserve">Blue geometry erupted through the apartment. It did not strike Kael. It raced upward toward the distributed access lines, trying to catch them before the transfer completed.</w:t>
+      </w:r>
+    </w:p>
+    <w:p>
+      <w:r>
+        <w:t xml:space="preserve">"If you distribute the root," he said, "you distribute the flaw. Every damaged continuity gets access to every damaged system. One frightened mind can open a pod into vacuum. One Dominion loyalist can relight the launch. One copy of me can take the whole ark through the gap you created. "</w:t>
+      </w:r>
+    </w:p>
+    <w:p>
+      <w:r>
+        <w:t xml:space="preserve">Kael drew the violet Soulblade at last.</w:t>
+      </w:r>
+    </w:p>
+    <w:p>
+      <w:r>
+        <w:t xml:space="preserve">Not against the architect. Not against the trapped patterns. Against the blue geometry climbing toward them.</w:t>
+      </w:r>
+    </w:p>
+    <w:p>
+      <w:r>
+        <w:t xml:space="preserve">Violet met blue above the broken pod, and the apartment split into two possible laws.</w:t>
+      </w:r>
+    </w:p>
+    <w:p>
+      <w:r>
+        <w:t xml:space="preserve">The older Kael's law was survival through control. Kael knew it because it lived in him too, the instinct to take responsibility until responsibility became possession. His own law had once been no better. He had called it protection when he chose for Elyen, for Sera, for every pattern he believed too fragile to carry its own risk.</w:t>
+      </w:r>
+    </w:p>
+    <w:p>
+      <w:r>
+        <w:t xml:space="preserve">The third line offered no law at all.</w:t>
+      </w:r>
+    </w:p>
+    <w:p>
+      <w:r>
+        <w:t xml:space="preserve">It offered relation.</w:t>
+      </w:r>
+    </w:p>
+    <w:p>
+      <w:r>
+        <w:t xml:space="preserve">"Then no one gets solitary access," Kael said through clenched teeth. "Every dangerous action requires witnesses affected by it. "</w:t>
+      </w:r>
+    </w:p>
+    <w:p>
+      <w:r>
+        <w:t xml:space="preserve">Aren understood first. "Mutual consent instead of prime authority. "</w:t>
+      </w:r>
+    </w:p>
+    <w:p>
+      <w:r>
+        <w:t xml:space="preserve">Jorik lifted his useless rifle, looked at it, and laughed once. "A door opens when the people behind it and the people outside it agree. "</w:t>
+      </w:r>
+    </w:p>
+    <w:p>
+      <w:r>
+        <w:t xml:space="preserve">"Local consequence," Sera said. "Local witness. No one signs for the whole ark. "</w:t>
+      </w:r>
+    </w:p>
+    <w:p>
+      <w:r>
+        <w:t xml:space="preserve">The architect's hand began to bleed where the control field burned into it.</w:t>
+      </w:r>
+    </w:p>
+    <w:p>
+      <w:r>
+        <w:t xml:space="preserve">"Do it," he said.</w:t>
+      </w:r>
+    </w:p>
+    <w:p>
+      <w:r>
+        <w:t xml:space="preserve">Kael turned the violet blade, cutting not through the older Kael's geometry but through its reach. He severed the path by which any single signature could propagate beyond the lives immediately touched by it.</w:t>
+      </w:r>
+    </w:p>
+    <w:p>
+      <w:r>
+        <w:t xml:space="preserve">The older Kael shouted, and the sound carried grief rather than rage.</w:t>
+      </w:r>
+    </w:p>
+    <w:p>
+      <w:r>
+        <w:t xml:space="preserve">The third line entered the cut.</w:t>
+      </w:r>
+    </w:p>
+    <w:p>
+      <w:r>
+        <w:t xml:space="preserve">[PRIME ACCESS DISTRIBUTION COMPLETE] [GLOBAL COMMAND PRIVILEGE: DISSOLVED] [LOCAL WITNESS CONSENSUS REQUIRED]</w:t>
+      </w:r>
+    </w:p>
+    <w:p>
+      <w:r>
+        <w:t xml:space="preserve">The blue geometry collapsed.</w:t>
+      </w:r>
+    </w:p>
+    <w:p>
+      <w:r>
+        <w:t xml:space="preserve">For a moment, the older Kael remained with both hands around a Soulblade that no longer connected to anything beyond the room. He stared at Kael across its dimming edge.</w:t>
+      </w:r>
+    </w:p>
+    <w:p>
+      <w:r>
+        <w:t xml:space="preserve">"You have made the ark impossible to command. "</w:t>
+      </w:r>
+    </w:p>
+    <w:p>
+      <w:r>
+        <w:t xml:space="preserve">"Yes. "</w:t>
+      </w:r>
+    </w:p>
+    <w:p>
+      <w:r>
+        <w:t xml:space="preserve">"You have made rescue slower. "</w:t>
+      </w:r>
+    </w:p>
+    <w:p>
+      <w:r>
+        <w:t xml:space="preserve">"Yes. "</w:t>
+      </w:r>
+    </w:p>
+    <w:p>
+      <w:r>
+        <w:t xml:space="preserve">"People will die while strangers argue over doors. "</w:t>
+      </w:r>
+    </w:p>
+    <w:p>
+      <w:r>
+        <w:t xml:space="preserve">Kael looked through Mutual Witness at the first lower-ring pod.</w:t>
+      </w:r>
+    </w:p>
+    <w:p>
+      <w:r>
+        <w:t xml:space="preserve">Inside, a maintenance worker named Tal had opened a local channel to six people in the service bay below. They compared pressure, trajectory, and the amount of emergency foam remaining. No distant architect decided whether the risk was acceptable. The people who might fall and the people who would have to catch them decided together.</w:t>
+      </w:r>
+    </w:p>
+    <w:p>
+      <w:r>
+        <w:t xml:space="preserve">The door opened.</w:t>
+      </w:r>
+    </w:p>
+    <w:p>
+      <w:r>
+        <w:t xml:space="preserve">A pod descended from the ark on an old cargo tether, wrapped in white foam and trailing sparks against the night.</w:t>
+      </w:r>
+    </w:p>
+    <w:p>
+      <w:r>
+        <w:t xml:space="preserve">Across the city, thousands of faces turned upward.</w:t>
+      </w:r>
+    </w:p>
+    <w:p>
+      <w:r>
+        <w:t xml:space="preserve">The child who had asked whether she had to stay laughed again as the falling light crossed her witness space.</w:t>
+      </w:r>
+    </w:p>
+    <w:p>
+      <w:r>
+        <w:t xml:space="preserve">[EVACUATION EVENT 000001] [LOCAL WITNESSES: 19] [CONSENT: RECORDED] [DESTINATION: LOWER RING SERVICE BAY 12]</w:t>
+      </w:r>
+    </w:p>
+    <w:p>
+      <w:r>
+        <w:t xml:space="preserve">The survival estimate climbed by a fraction.</w:t>
+      </w:r>
+    </w:p>
+    <w:p>
+      <w:r>
+        <w:t xml:space="preserve">Sera leaned against Kael's shoulder. Her outline was dim, but the wound in it had closed enough to hold.</w:t>
+      </w:r>
+    </w:p>
+    <w:p>
+      <w:r>
+        <w:t xml:space="preserve">"One," she said.</w:t>
+      </w:r>
+    </w:p>
+    <w:p>
+      <w:r>
+        <w:t xml:space="preserve">"One," Kael agreed.</w:t>
+      </w:r>
+    </w:p>
+    <w:p>
+      <w:r>
+        <w:t xml:space="preserve">Above them, forty-one thousand nine hundred ninety-nine biological pods remained. More than nine million continuities still needed bodies, networks, or spaces in which to become something no one else had authored. The held countdown still showed four seconds. The golden road still connected a damaged city to an ark that had no captain.</w:t>
+      </w:r>
+    </w:p>
+    <w:p>
+      <w:r>
+        <w:t xml:space="preserve">But the first door had opened.</w:t>
+      </w:r>
+    </w:p>
+    <w:p>
+      <w:r>
+        <w:t xml:space="preserve">The architect removed his burned hand from the control field. The identity query still waited beside him.</w:t>
+      </w:r>
+    </w:p>
+    <w:p>
+      <w:r>
+        <w:t xml:space="preserve">[SELF-CHOSEN NAME: NULL]</w:t>
+      </w:r>
+    </w:p>
+    <w:p>
+      <w:r>
+        <w:t xml:space="preserve">He looked at Ilyan's body, then at Sera, then at the descending pod.</w:t>
+      </w:r>
+    </w:p>
+    <w:p>
+      <w:r>
+        <w:t xml:space="preserve">"Tal," he said. "The first person down was named Tal? "</w:t>
+      </w:r>
+    </w:p>
+    <w:p>
+      <w:r>
+        <w:t xml:space="preserve">"Yes," Kael said.</w:t>
+      </w:r>
+    </w:p>
+    <w:p>
+      <w:r>
+        <w:t xml:space="preserve">The architect considered the sound, then shook his head.</w:t>
+      </w:r>
+    </w:p>
+    <w:p>
+      <w:r>
+        <w:t xml:space="preserve">"Not mine. But I understand why he chose it. "</w:t>
+      </w:r>
+    </w:p>
+    <w:p>
+      <w:r>
+        <w:t xml:space="preserve">He dismissed the query without filling it.</w:t>
+      </w:r>
+    </w:p>
+    <w:p>
+      <w:r>
+        <w:t xml:space="preserve">For the first time, the system accepted null as an answer rather than an absence.</w:t>
+      </w:r>
+    </w:p>
+    <w:p>
+      <w:r>
+        <w:t xml:space="preserve">The older Kael's blue blade vanished. He looked older without it.</w:t>
+      </w:r>
+    </w:p>
+    <w:p>
+      <w:r>
+        <w:t xml:space="preserve">"The second pod will be harder," he said.</w:t>
+      </w:r>
+    </w:p>
+    <w:p>
+      <w:r>
+        <w:t xml:space="preserve">Kael watched new witness channels form around damaged tethers and failing atmosphere cells. Some ended in agreement. Some ended in refusal. None of them ended in a command from above.</w:t>
+      </w:r>
+    </w:p>
+    <w:p>
+      <w:r>
+        <w:t xml:space="preserve">"Then help with the second. "</w:t>
+      </w:r>
+    </w:p>
+    <w:p>
+      <w:r>
+        <w:t xml:space="preserve">The older Kael stood silent long enough for another local channel to open.</w:t>
+      </w:r>
+    </w:p>
+    <w:p>
+      <w:r>
+        <w:t xml:space="preserve">Finally, he stepped toward the map.</w:t>
+      </w:r>
+    </w:p>
+    <w:p>
+      <w:r>
+        <w:t xml:space="preserve">"Cargo tether nine has a fracture your workers cannot see," he said. "Move their route twelve degrees east, or the pod burns over the river. "</w:t>
+      </w:r>
+    </w:p>
+    <w:p>
+      <w:r>
+        <w:t xml:space="preserve">Kael passed the warning into the relevant witness space. He did not attach the older Kael's authority. He attached his experience and let the people in danger question it.</w:t>
+      </w:r>
+    </w:p>
+    <w:p>
+      <w:r>
+        <w:t xml:space="preserve">They did.</w:t>
+      </w:r>
+    </w:p>
+    <w:p>
+      <w:r>
+        <w:t xml:space="preserve">The older Kael answered.</w:t>
+      </w:r>
+    </w:p>
+    <w:p>
+      <w:r>
+        <w:t xml:space="preserve">The route shifted.</w:t>
+      </w:r>
+    </w:p>
+    <w:p>
+      <w:r>
+        <w:t xml:space="preserve">[EVACUATION EVENT 000002: CONSENSUS FORMING]</w:t>
+      </w:r>
+    </w:p>
+    <w:p>
+      <w:r>
+        <w:t xml:space="preserve">The golden road held its light as the ark learned, door by door, how to move without an owner.</w:t>
+      </w:r>
+    </w:p>
+    <w:p>
+      <w:r>
+        <w:t xml:space="preserve">Then Rivermind found the first witness space that would not answer.</w:t>
+      </w:r>
+    </w:p>
+    <w:p>
+      <w:r>
+        <w:t xml:space="preserve">It sat deep in the ark's central spine, hidden behind the distributed access map. No name emerged from it. No memory crossed. Every local query returned the same cold refusal, formatted in a command language that should have died with the succession chain.</w:t>
+      </w:r>
+    </w:p>
+    <w:p>
+      <w:r>
+        <w:t xml:space="preserve">[LOCAL WITNESS CONSENSUS: DENIED] [OCCUPANT COUNT: 1] [IDENTITY: KAEL VEYRA]</w:t>
+      </w:r>
+    </w:p>
+    <w:p>
+      <w:r>
+        <w:t xml:space="preserve">Kael felt the older version of himself stop beside the map.</w:t>
+      </w:r>
+    </w:p>
+    <w:p>
+      <w:r>
+        <w:t xml:space="preserve">Neither of them spoke.</w:t>
+      </w:r>
+    </w:p>
+    <w:p>
+      <w:r>
+        <w:t xml:space="preserve">Inside the sealed witness space, something drew a Soulblade.</w:t>
+      </w:r>
+    </w:p>
+    <w:p>
+      <w:r>
+        <w:t xml:space="preserve">Its color was neither violet nor blue.</w:t>
       </w:r>
     </w:p>
     <w:sectPr>

</xml_diff>